<commit_message>
Main fixes for Andijan
</commit_message>
<xml_diff>
--- a/docs/gost/out/01_ТЗ_Техническое_задание.docx
+++ b/docs/gost/out/01_ТЗ_Техническое_задание.docx
@@ -224,7 +224,7 @@
         <w:rPr>
           <w:noProof/>
         </w:rPr>
-        <w:t>28</w:t>
+        <w:t>29</w:t>
       </w:r>
       <w:r>
         <w:fldChar w:fldCharType="end"/>
@@ -306,7 +306,7 @@
       <w:r>
         <w:fldChar w:fldCharType="separate"/>
       </w:r>
-      <w:hyperlink w:anchor="_Toc241772057" w:history="1">
+      <w:hyperlink w:anchor="_Toc242103477" w:history="1">
         <w:r>
           <w:rPr>
             <w:rStyle w:val="aff8"/>
@@ -333,7 +333,7 @@
             <w:noProof/>
             <w:webHidden/>
           </w:rPr>
-          <w:instrText xml:space="preserve"> PAGEREF _Toc241772057 \h </w:instrText>
+          <w:instrText xml:space="preserve"> PAGEREF _Toc242103477 \h </w:instrText>
         </w:r>
         <w:r>
           <w:rPr>
@@ -379,7 +379,7 @@
           <w14:ligatures w14:val="standardContextual"/>
         </w:rPr>
       </w:pPr>
-      <w:hyperlink w:anchor="_Toc241772058" w:history="1">
+      <w:hyperlink w:anchor="_Toc242103478" w:history="1">
         <w:r>
           <w:rPr>
             <w:rStyle w:val="aff8"/>
@@ -406,7 +406,7 @@
             <w:noProof/>
             <w:webHidden/>
           </w:rPr>
-          <w:instrText xml:space="preserve"> PAGEREF _Toc241772058 \h </w:instrText>
+          <w:instrText xml:space="preserve"> PAGEREF _Toc242103478 \h </w:instrText>
         </w:r>
         <w:r>
           <w:rPr>
@@ -452,7 +452,7 @@
           <w14:ligatures w14:val="standardContextual"/>
         </w:rPr>
       </w:pPr>
-      <w:hyperlink w:anchor="_Toc241772059" w:history="1">
+      <w:hyperlink w:anchor="_Toc242103479" w:history="1">
         <w:r>
           <w:rPr>
             <w:rStyle w:val="aff8"/>
@@ -479,7 +479,7 @@
             <w:noProof/>
             <w:webHidden/>
           </w:rPr>
-          <w:instrText xml:space="preserve"> PAGEREF _Toc241772059 \h </w:instrText>
+          <w:instrText xml:space="preserve"> PAGEREF _Toc242103479 \h </w:instrText>
         </w:r>
         <w:r>
           <w:rPr>
@@ -525,7 +525,7 @@
           <w14:ligatures w14:val="standardContextual"/>
         </w:rPr>
       </w:pPr>
-      <w:hyperlink w:anchor="_Toc241772060" w:history="1">
+      <w:hyperlink w:anchor="_Toc242103480" w:history="1">
         <w:r>
           <w:rPr>
             <w:rStyle w:val="aff8"/>
@@ -552,7 +552,7 @@
             <w:noProof/>
             <w:webHidden/>
           </w:rPr>
-          <w:instrText xml:space="preserve"> PAGEREF _Toc241772060 \h </w:instrText>
+          <w:instrText xml:space="preserve"> PAGEREF _Toc242103480 \h </w:instrText>
         </w:r>
         <w:r>
           <w:rPr>
@@ -598,7 +598,7 @@
           <w14:ligatures w14:val="standardContextual"/>
         </w:rPr>
       </w:pPr>
-      <w:hyperlink w:anchor="_Toc241772061" w:history="1">
+      <w:hyperlink w:anchor="_Toc242103481" w:history="1">
         <w:r>
           <w:rPr>
             <w:rStyle w:val="aff8"/>
@@ -625,7 +625,7 @@
             <w:noProof/>
             <w:webHidden/>
           </w:rPr>
-          <w:instrText xml:space="preserve"> PAGEREF _Toc241772061 \h </w:instrText>
+          <w:instrText xml:space="preserve"> PAGEREF _Toc242103481 \h </w:instrText>
         </w:r>
         <w:r>
           <w:rPr>
@@ -671,7 +671,7 @@
           <w14:ligatures w14:val="standardContextual"/>
         </w:rPr>
       </w:pPr>
-      <w:hyperlink w:anchor="_Toc241772062" w:history="1">
+      <w:hyperlink w:anchor="_Toc242103482" w:history="1">
         <w:r>
           <w:rPr>
             <w:rStyle w:val="aff8"/>
@@ -698,7 +698,7 @@
             <w:noProof/>
             <w:webHidden/>
           </w:rPr>
-          <w:instrText xml:space="preserve"> PAGEREF _Toc241772062 \h </w:instrText>
+          <w:instrText xml:space="preserve"> PAGEREF _Toc242103482 \h </w:instrText>
         </w:r>
         <w:r>
           <w:rPr>
@@ -744,7 +744,7 @@
           <w14:ligatures w14:val="standardContextual"/>
         </w:rPr>
       </w:pPr>
-      <w:hyperlink w:anchor="_Toc241772063" w:history="1">
+      <w:hyperlink w:anchor="_Toc242103483" w:history="1">
         <w:r>
           <w:rPr>
             <w:rStyle w:val="aff8"/>
@@ -771,7 +771,7 @@
             <w:noProof/>
             <w:webHidden/>
           </w:rPr>
-          <w:instrText xml:space="preserve"> PAGEREF _Toc241772063 \h </w:instrText>
+          <w:instrText xml:space="preserve"> PAGEREF _Toc242103483 \h </w:instrText>
         </w:r>
         <w:r>
           <w:rPr>
@@ -817,7 +817,7 @@
           <w14:ligatures w14:val="standardContextual"/>
         </w:rPr>
       </w:pPr>
-      <w:hyperlink w:anchor="_Toc241772064" w:history="1">
+      <w:hyperlink w:anchor="_Toc242103484" w:history="1">
         <w:r>
           <w:rPr>
             <w:rStyle w:val="aff8"/>
@@ -844,7 +844,7 @@
             <w:noProof/>
             <w:webHidden/>
           </w:rPr>
-          <w:instrText xml:space="preserve"> PAGEREF _Toc241772064 \h </w:instrText>
+          <w:instrText xml:space="preserve"> PAGEREF _Toc242103484 \h </w:instrText>
         </w:r>
         <w:r>
           <w:rPr>
@@ -890,7 +890,7 @@
           <w14:ligatures w14:val="standardContextual"/>
         </w:rPr>
       </w:pPr>
-      <w:hyperlink w:anchor="_Toc241772065" w:history="1">
+      <w:hyperlink w:anchor="_Toc242103485" w:history="1">
         <w:r>
           <w:rPr>
             <w:rStyle w:val="aff8"/>
@@ -917,7 +917,7 @@
             <w:noProof/>
             <w:webHidden/>
           </w:rPr>
-          <w:instrText xml:space="preserve"> PAGEREF _Toc241772065 \h </w:instrText>
+          <w:instrText xml:space="preserve"> PAGEREF _Toc242103485 \h </w:instrText>
         </w:r>
         <w:r>
           <w:rPr>
@@ -963,7 +963,7 @@
           <w14:ligatures w14:val="standardContextual"/>
         </w:rPr>
       </w:pPr>
-      <w:hyperlink w:anchor="_Toc241772066" w:history="1">
+      <w:hyperlink w:anchor="_Toc242103486" w:history="1">
         <w:r>
           <w:rPr>
             <w:rStyle w:val="aff8"/>
@@ -990,7 +990,7 @@
             <w:noProof/>
             <w:webHidden/>
           </w:rPr>
-          <w:instrText xml:space="preserve"> PAGEREF _Toc241772066 \h </w:instrText>
+          <w:instrText xml:space="preserve"> PAGEREF _Toc242103486 \h </w:instrText>
         </w:r>
         <w:r>
           <w:rPr>
@@ -1036,7 +1036,7 @@
           <w14:ligatures w14:val="standardContextual"/>
         </w:rPr>
       </w:pPr>
-      <w:hyperlink w:anchor="_Toc241772067" w:history="1">
+      <w:hyperlink w:anchor="_Toc242103487" w:history="1">
         <w:r>
           <w:rPr>
             <w:rStyle w:val="aff8"/>
@@ -1063,7 +1063,7 @@
             <w:noProof/>
             <w:webHidden/>
           </w:rPr>
-          <w:instrText xml:space="preserve"> PAGEREF _Toc241772067 \h </w:instrText>
+          <w:instrText xml:space="preserve"> PAGEREF _Toc242103487 \h </w:instrText>
         </w:r>
         <w:r>
           <w:rPr>
@@ -1109,7 +1109,7 @@
           <w14:ligatures w14:val="standardContextual"/>
         </w:rPr>
       </w:pPr>
-      <w:hyperlink w:anchor="_Toc241772068" w:history="1">
+      <w:hyperlink w:anchor="_Toc242103488" w:history="1">
         <w:r>
           <w:rPr>
             <w:rStyle w:val="aff8"/>
@@ -1136,7 +1136,7 @@
             <w:noProof/>
             <w:webHidden/>
           </w:rPr>
-          <w:instrText xml:space="preserve"> PAGEREF _Toc241772068 \h </w:instrText>
+          <w:instrText xml:space="preserve"> PAGEREF _Toc242103488 \h </w:instrText>
         </w:r>
         <w:r>
           <w:rPr>
@@ -1182,7 +1182,7 @@
           <w14:ligatures w14:val="standardContextual"/>
         </w:rPr>
       </w:pPr>
-      <w:hyperlink w:anchor="_Toc241772069" w:history="1">
+      <w:hyperlink w:anchor="_Toc242103489" w:history="1">
         <w:r>
           <w:rPr>
             <w:rStyle w:val="aff8"/>
@@ -1209,7 +1209,7 @@
             <w:noProof/>
             <w:webHidden/>
           </w:rPr>
-          <w:instrText xml:space="preserve"> PAGEREF _Toc241772069 \h </w:instrText>
+          <w:instrText xml:space="preserve"> PAGEREF _Toc242103489 \h </w:instrText>
         </w:r>
         <w:r>
           <w:rPr>
@@ -1255,7 +1255,7 @@
           <w14:ligatures w14:val="standardContextual"/>
         </w:rPr>
       </w:pPr>
-      <w:hyperlink w:anchor="_Toc241772070" w:history="1">
+      <w:hyperlink w:anchor="_Toc242103490" w:history="1">
         <w:r>
           <w:rPr>
             <w:rStyle w:val="aff8"/>
@@ -1282,7 +1282,7 @@
             <w:noProof/>
             <w:webHidden/>
           </w:rPr>
-          <w:instrText xml:space="preserve"> PAGEREF _Toc241772070 \h </w:instrText>
+          <w:instrText xml:space="preserve"> PAGEREF _Toc242103490 \h </w:instrText>
         </w:r>
         <w:r>
           <w:rPr>
@@ -1328,7 +1328,7 @@
           <w14:ligatures w14:val="standardContextual"/>
         </w:rPr>
       </w:pPr>
-      <w:hyperlink w:anchor="_Toc241772071" w:history="1">
+      <w:hyperlink w:anchor="_Toc242103491" w:history="1">
         <w:r>
           <w:rPr>
             <w:rStyle w:val="aff8"/>
@@ -1355,7 +1355,7 @@
             <w:noProof/>
             <w:webHidden/>
           </w:rPr>
-          <w:instrText xml:space="preserve"> PAGEREF _Toc241772071 \h </w:instrText>
+          <w:instrText xml:space="preserve"> PAGEREF _Toc242103491 \h </w:instrText>
         </w:r>
         <w:r>
           <w:rPr>
@@ -1401,7 +1401,7 @@
           <w14:ligatures w14:val="standardContextual"/>
         </w:rPr>
       </w:pPr>
-      <w:hyperlink w:anchor="_Toc241772072" w:history="1">
+      <w:hyperlink w:anchor="_Toc242103492" w:history="1">
         <w:r>
           <w:rPr>
             <w:rStyle w:val="aff8"/>
@@ -1428,7 +1428,7 @@
             <w:noProof/>
             <w:webHidden/>
           </w:rPr>
-          <w:instrText xml:space="preserve"> PAGEREF _Toc241772072 \h </w:instrText>
+          <w:instrText xml:space="preserve"> PAGEREF _Toc242103492 \h </w:instrText>
         </w:r>
         <w:r>
           <w:rPr>
@@ -1474,7 +1474,7 @@
           <w14:ligatures w14:val="standardContextual"/>
         </w:rPr>
       </w:pPr>
-      <w:hyperlink w:anchor="_Toc241772073" w:history="1">
+      <w:hyperlink w:anchor="_Toc242103493" w:history="1">
         <w:r>
           <w:rPr>
             <w:rStyle w:val="aff8"/>
@@ -1501,7 +1501,7 @@
             <w:noProof/>
             <w:webHidden/>
           </w:rPr>
-          <w:instrText xml:space="preserve"> PAGEREF _Toc241772073 \h </w:instrText>
+          <w:instrText xml:space="preserve"> PAGEREF _Toc242103493 \h </w:instrText>
         </w:r>
         <w:r>
           <w:rPr>
@@ -1547,7 +1547,7 @@
           <w14:ligatures w14:val="standardContextual"/>
         </w:rPr>
       </w:pPr>
-      <w:hyperlink w:anchor="_Toc241772074" w:history="1">
+      <w:hyperlink w:anchor="_Toc242103494" w:history="1">
         <w:r>
           <w:rPr>
             <w:rStyle w:val="aff8"/>
@@ -1574,7 +1574,7 @@
             <w:noProof/>
             <w:webHidden/>
           </w:rPr>
-          <w:instrText xml:space="preserve"> PAGEREF _Toc241772074 \h </w:instrText>
+          <w:instrText xml:space="preserve"> PAGEREF _Toc242103494 \h </w:instrText>
         </w:r>
         <w:r>
           <w:rPr>
@@ -1620,7 +1620,7 @@
           <w14:ligatures w14:val="standardContextual"/>
         </w:rPr>
       </w:pPr>
-      <w:hyperlink w:anchor="_Toc241772075" w:history="1">
+      <w:hyperlink w:anchor="_Toc242103495" w:history="1">
         <w:r>
           <w:rPr>
             <w:rStyle w:val="aff8"/>
@@ -1647,7 +1647,7 @@
             <w:noProof/>
             <w:webHidden/>
           </w:rPr>
-          <w:instrText xml:space="preserve"> PAGEREF _Toc241772075 \h </w:instrText>
+          <w:instrText xml:space="preserve"> PAGEREF _Toc242103495 \h </w:instrText>
         </w:r>
         <w:r>
           <w:rPr>
@@ -1693,7 +1693,7 @@
           <w14:ligatures w14:val="standardContextual"/>
         </w:rPr>
       </w:pPr>
-      <w:hyperlink w:anchor="_Toc241772076" w:history="1">
+      <w:hyperlink w:anchor="_Toc242103496" w:history="1">
         <w:r>
           <w:rPr>
             <w:rStyle w:val="aff8"/>
@@ -1720,7 +1720,7 @@
             <w:noProof/>
             <w:webHidden/>
           </w:rPr>
-          <w:instrText xml:space="preserve"> PAGEREF _Toc241772076 \h </w:instrText>
+          <w:instrText xml:space="preserve"> PAGEREF _Toc242103496 \h </w:instrText>
         </w:r>
         <w:r>
           <w:rPr>
@@ -1766,7 +1766,7 @@
           <w14:ligatures w14:val="standardContextual"/>
         </w:rPr>
       </w:pPr>
-      <w:hyperlink w:anchor="_Toc241772077" w:history="1">
+      <w:hyperlink w:anchor="_Toc242103497" w:history="1">
         <w:r>
           <w:rPr>
             <w:rStyle w:val="aff8"/>
@@ -1793,7 +1793,7 @@
             <w:noProof/>
             <w:webHidden/>
           </w:rPr>
-          <w:instrText xml:space="preserve"> PAGEREF _Toc241772077 \h </w:instrText>
+          <w:instrText xml:space="preserve"> PAGEREF _Toc242103497 \h </w:instrText>
         </w:r>
         <w:r>
           <w:rPr>
@@ -1839,7 +1839,7 @@
           <w14:ligatures w14:val="standardContextual"/>
         </w:rPr>
       </w:pPr>
-      <w:hyperlink w:anchor="_Toc241772078" w:history="1">
+      <w:hyperlink w:anchor="_Toc242103498" w:history="1">
         <w:r>
           <w:rPr>
             <w:rStyle w:val="aff8"/>
@@ -1866,7 +1866,7 @@
             <w:noProof/>
             <w:webHidden/>
           </w:rPr>
-          <w:instrText xml:space="preserve"> PAGEREF _Toc241772078 \h </w:instrText>
+          <w:instrText xml:space="preserve"> PAGEREF _Toc242103498 \h </w:instrText>
         </w:r>
         <w:r>
           <w:rPr>
@@ -1912,7 +1912,7 @@
           <w14:ligatures w14:val="standardContextual"/>
         </w:rPr>
       </w:pPr>
-      <w:hyperlink w:anchor="_Toc241772079" w:history="1">
+      <w:hyperlink w:anchor="_Toc242103499" w:history="1">
         <w:r>
           <w:rPr>
             <w:rStyle w:val="aff8"/>
@@ -1939,7 +1939,7 @@
             <w:noProof/>
             <w:webHidden/>
           </w:rPr>
-          <w:instrText xml:space="preserve"> PAGEREF _Toc241772079 \h </w:instrText>
+          <w:instrText xml:space="preserve"> PAGEREF _Toc242103499 \h </w:instrText>
         </w:r>
         <w:r>
           <w:rPr>
@@ -1985,7 +1985,7 @@
           <w14:ligatures w14:val="standardContextual"/>
         </w:rPr>
       </w:pPr>
-      <w:hyperlink w:anchor="_Toc241772080" w:history="1">
+      <w:hyperlink w:anchor="_Toc242103500" w:history="1">
         <w:r>
           <w:rPr>
             <w:rStyle w:val="aff8"/>
@@ -2012,7 +2012,7 @@
             <w:noProof/>
             <w:webHidden/>
           </w:rPr>
-          <w:instrText xml:space="preserve"> PAGEREF _Toc241772080 \h </w:instrText>
+          <w:instrText xml:space="preserve"> PAGEREF _Toc242103500 \h </w:instrText>
         </w:r>
         <w:r>
           <w:rPr>
@@ -2058,7 +2058,7 @@
           <w14:ligatures w14:val="standardContextual"/>
         </w:rPr>
       </w:pPr>
-      <w:hyperlink w:anchor="_Toc241772081" w:history="1">
+      <w:hyperlink w:anchor="_Toc242103501" w:history="1">
         <w:r>
           <w:rPr>
             <w:rStyle w:val="aff8"/>
@@ -2085,7 +2085,7 @@
             <w:noProof/>
             <w:webHidden/>
           </w:rPr>
-          <w:instrText xml:space="preserve"> PAGEREF _Toc241772081 \h </w:instrText>
+          <w:instrText xml:space="preserve"> PAGEREF _Toc242103501 \h </w:instrText>
         </w:r>
         <w:r>
           <w:rPr>
@@ -2131,7 +2131,7 @@
           <w14:ligatures w14:val="standardContextual"/>
         </w:rPr>
       </w:pPr>
-      <w:hyperlink w:anchor="_Toc241772082" w:history="1">
+      <w:hyperlink w:anchor="_Toc242103502" w:history="1">
         <w:r>
           <w:rPr>
             <w:rStyle w:val="aff8"/>
@@ -2158,7 +2158,7 @@
             <w:noProof/>
             <w:webHidden/>
           </w:rPr>
-          <w:instrText xml:space="preserve"> PAGEREF _Toc241772082 \h </w:instrText>
+          <w:instrText xml:space="preserve"> PAGEREF _Toc242103502 \h </w:instrText>
         </w:r>
         <w:r>
           <w:rPr>
@@ -2204,7 +2204,7 @@
           <w14:ligatures w14:val="standardContextual"/>
         </w:rPr>
       </w:pPr>
-      <w:hyperlink w:anchor="_Toc241772083" w:history="1">
+      <w:hyperlink w:anchor="_Toc242103503" w:history="1">
         <w:r>
           <w:rPr>
             <w:rStyle w:val="aff8"/>
@@ -2231,7 +2231,7 @@
             <w:noProof/>
             <w:webHidden/>
           </w:rPr>
-          <w:instrText xml:space="preserve"> PAGEREF _Toc241772083 \h </w:instrText>
+          <w:instrText xml:space="preserve"> PAGEREF _Toc242103503 \h </w:instrText>
         </w:r>
         <w:r>
           <w:rPr>
@@ -2277,7 +2277,7 @@
           <w14:ligatures w14:val="standardContextual"/>
         </w:rPr>
       </w:pPr>
-      <w:hyperlink w:anchor="_Toc241772084" w:history="1">
+      <w:hyperlink w:anchor="_Toc242103504" w:history="1">
         <w:r>
           <w:rPr>
             <w:rStyle w:val="aff8"/>
@@ -2304,7 +2304,7 @@
             <w:noProof/>
             <w:webHidden/>
           </w:rPr>
-          <w:instrText xml:space="preserve"> PAGEREF _Toc241772084 \h </w:instrText>
+          <w:instrText xml:space="preserve"> PAGEREF _Toc242103504 \h </w:instrText>
         </w:r>
         <w:r>
           <w:rPr>
@@ -2350,7 +2350,7 @@
           <w14:ligatures w14:val="standardContextual"/>
         </w:rPr>
       </w:pPr>
-      <w:hyperlink w:anchor="_Toc241772085" w:history="1">
+      <w:hyperlink w:anchor="_Toc242103505" w:history="1">
         <w:r>
           <w:rPr>
             <w:rStyle w:val="aff8"/>
@@ -2377,7 +2377,7 @@
             <w:noProof/>
             <w:webHidden/>
           </w:rPr>
-          <w:instrText xml:space="preserve"> PAGEREF _Toc241772085 \h </w:instrText>
+          <w:instrText xml:space="preserve"> PAGEREF _Toc242103505 \h </w:instrText>
         </w:r>
         <w:r>
           <w:rPr>
@@ -2423,7 +2423,7 @@
           <w14:ligatures w14:val="standardContextual"/>
         </w:rPr>
       </w:pPr>
-      <w:hyperlink w:anchor="_Toc241772086" w:history="1">
+      <w:hyperlink w:anchor="_Toc242103506" w:history="1">
         <w:r>
           <w:rPr>
             <w:rStyle w:val="aff8"/>
@@ -2450,7 +2450,7 @@
             <w:noProof/>
             <w:webHidden/>
           </w:rPr>
-          <w:instrText xml:space="preserve"> PAGEREF _Toc241772086 \h </w:instrText>
+          <w:instrText xml:space="preserve"> PAGEREF _Toc242103506 \h </w:instrText>
         </w:r>
         <w:r>
           <w:rPr>
@@ -2496,7 +2496,7 @@
           <w14:ligatures w14:val="standardContextual"/>
         </w:rPr>
       </w:pPr>
-      <w:hyperlink w:anchor="_Toc241772087" w:history="1">
+      <w:hyperlink w:anchor="_Toc242103507" w:history="1">
         <w:r>
           <w:rPr>
             <w:rStyle w:val="aff8"/>
@@ -2523,7 +2523,7 @@
             <w:noProof/>
             <w:webHidden/>
           </w:rPr>
-          <w:instrText xml:space="preserve"> PAGEREF _Toc241772087 \h </w:instrText>
+          <w:instrText xml:space="preserve"> PAGEREF _Toc242103507 \h </w:instrText>
         </w:r>
         <w:r>
           <w:rPr>
@@ -2569,7 +2569,7 @@
           <w14:ligatures w14:val="standardContextual"/>
         </w:rPr>
       </w:pPr>
-      <w:hyperlink w:anchor="_Toc241772088" w:history="1">
+      <w:hyperlink w:anchor="_Toc242103508" w:history="1">
         <w:r>
           <w:rPr>
             <w:rStyle w:val="aff8"/>
@@ -2596,7 +2596,7 @@
             <w:noProof/>
             <w:webHidden/>
           </w:rPr>
-          <w:instrText xml:space="preserve"> PAGEREF _Toc241772088 \h </w:instrText>
+          <w:instrText xml:space="preserve"> PAGEREF _Toc242103508 \h </w:instrText>
         </w:r>
         <w:r>
           <w:rPr>
@@ -2616,7 +2616,7 @@
             <w:noProof/>
             <w:webHidden/>
           </w:rPr>
-          <w:t>16</w:t>
+          <w:t>17</w:t>
         </w:r>
         <w:r>
           <w:rPr>
@@ -2642,7 +2642,7 @@
           <w14:ligatures w14:val="standardContextual"/>
         </w:rPr>
       </w:pPr>
-      <w:hyperlink w:anchor="_Toc241772089" w:history="1">
+      <w:hyperlink w:anchor="_Toc242103509" w:history="1">
         <w:r>
           <w:rPr>
             <w:rStyle w:val="aff8"/>
@@ -2669,7 +2669,7 @@
             <w:noProof/>
             <w:webHidden/>
           </w:rPr>
-          <w:instrText xml:space="preserve"> PAGEREF _Toc241772089 \h </w:instrText>
+          <w:instrText xml:space="preserve"> PAGEREF _Toc242103509 \h </w:instrText>
         </w:r>
         <w:r>
           <w:rPr>
@@ -2715,7 +2715,7 @@
           <w14:ligatures w14:val="standardContextual"/>
         </w:rPr>
       </w:pPr>
-      <w:hyperlink w:anchor="_Toc241772090" w:history="1">
+      <w:hyperlink w:anchor="_Toc242103510" w:history="1">
         <w:r>
           <w:rPr>
             <w:rStyle w:val="aff8"/>
@@ -2742,7 +2742,7 @@
             <w:noProof/>
             <w:webHidden/>
           </w:rPr>
-          <w:instrText xml:space="preserve"> PAGEREF _Toc241772090 \h </w:instrText>
+          <w:instrText xml:space="preserve"> PAGEREF _Toc242103510 \h </w:instrText>
         </w:r>
         <w:r>
           <w:rPr>
@@ -2788,7 +2788,7 @@
           <w14:ligatures w14:val="standardContextual"/>
         </w:rPr>
       </w:pPr>
-      <w:hyperlink w:anchor="_Toc241772091" w:history="1">
+      <w:hyperlink w:anchor="_Toc242103511" w:history="1">
         <w:r>
           <w:rPr>
             <w:rStyle w:val="aff8"/>
@@ -2815,7 +2815,7 @@
             <w:noProof/>
             <w:webHidden/>
           </w:rPr>
-          <w:instrText xml:space="preserve"> PAGEREF _Toc241772091 \h </w:instrText>
+          <w:instrText xml:space="preserve"> PAGEREF _Toc242103511 \h </w:instrText>
         </w:r>
         <w:r>
           <w:rPr>
@@ -2835,7 +2835,7 @@
             <w:noProof/>
             <w:webHidden/>
           </w:rPr>
-          <w:t>17</w:t>
+          <w:t>18</w:t>
         </w:r>
         <w:r>
           <w:rPr>
@@ -2861,7 +2861,7 @@
           <w14:ligatures w14:val="standardContextual"/>
         </w:rPr>
       </w:pPr>
-      <w:hyperlink w:anchor="_Toc241772092" w:history="1">
+      <w:hyperlink w:anchor="_Toc242103512" w:history="1">
         <w:r>
           <w:rPr>
             <w:rStyle w:val="aff8"/>
@@ -2888,7 +2888,7 @@
             <w:noProof/>
             <w:webHidden/>
           </w:rPr>
-          <w:instrText xml:space="preserve"> PAGEREF _Toc241772092 \h </w:instrText>
+          <w:instrText xml:space="preserve"> PAGEREF _Toc242103512 \h </w:instrText>
         </w:r>
         <w:r>
           <w:rPr>
@@ -2934,7 +2934,7 @@
           <w14:ligatures w14:val="standardContextual"/>
         </w:rPr>
       </w:pPr>
-      <w:hyperlink w:anchor="_Toc241772093" w:history="1">
+      <w:hyperlink w:anchor="_Toc242103513" w:history="1">
         <w:r>
           <w:rPr>
             <w:rStyle w:val="aff8"/>
@@ -2961,7 +2961,7 @@
             <w:noProof/>
             <w:webHidden/>
           </w:rPr>
-          <w:instrText xml:space="preserve"> PAGEREF _Toc241772093 \h </w:instrText>
+          <w:instrText xml:space="preserve"> PAGEREF _Toc242103513 \h </w:instrText>
         </w:r>
         <w:r>
           <w:rPr>
@@ -2981,7 +2981,7 @@
             <w:noProof/>
             <w:webHidden/>
           </w:rPr>
-          <w:t>18</w:t>
+          <w:t>19</w:t>
         </w:r>
         <w:r>
           <w:rPr>
@@ -3007,7 +3007,7 @@
           <w14:ligatures w14:val="standardContextual"/>
         </w:rPr>
       </w:pPr>
-      <w:hyperlink w:anchor="_Toc241772094" w:history="1">
+      <w:hyperlink w:anchor="_Toc242103514" w:history="1">
         <w:r>
           <w:rPr>
             <w:rStyle w:val="aff8"/>
@@ -3034,7 +3034,7 @@
             <w:noProof/>
             <w:webHidden/>
           </w:rPr>
-          <w:instrText xml:space="preserve"> PAGEREF _Toc241772094 \h </w:instrText>
+          <w:instrText xml:space="preserve"> PAGEREF _Toc242103514 \h </w:instrText>
         </w:r>
         <w:r>
           <w:rPr>
@@ -3080,7 +3080,7 @@
           <w14:ligatures w14:val="standardContextual"/>
         </w:rPr>
       </w:pPr>
-      <w:hyperlink w:anchor="_Toc241772095" w:history="1">
+      <w:hyperlink w:anchor="_Toc242103515" w:history="1">
         <w:r>
           <w:rPr>
             <w:rStyle w:val="aff8"/>
@@ -3107,7 +3107,7 @@
             <w:noProof/>
             <w:webHidden/>
           </w:rPr>
-          <w:instrText xml:space="preserve"> PAGEREF _Toc241772095 \h </w:instrText>
+          <w:instrText xml:space="preserve"> PAGEREF _Toc242103515 \h </w:instrText>
         </w:r>
         <w:r>
           <w:rPr>
@@ -3153,7 +3153,7 @@
           <w14:ligatures w14:val="standardContextual"/>
         </w:rPr>
       </w:pPr>
-      <w:hyperlink w:anchor="_Toc241772096" w:history="1">
+      <w:hyperlink w:anchor="_Toc242103516" w:history="1">
         <w:r>
           <w:rPr>
             <w:rStyle w:val="aff8"/>
@@ -3180,7 +3180,7 @@
             <w:noProof/>
             <w:webHidden/>
           </w:rPr>
-          <w:instrText xml:space="preserve"> PAGEREF _Toc241772096 \h </w:instrText>
+          <w:instrText xml:space="preserve"> PAGEREF _Toc242103516 \h </w:instrText>
         </w:r>
         <w:r>
           <w:rPr>
@@ -3200,7 +3200,7 @@
             <w:noProof/>
             <w:webHidden/>
           </w:rPr>
-          <w:t>19</w:t>
+          <w:t>20</w:t>
         </w:r>
         <w:r>
           <w:rPr>
@@ -3226,7 +3226,7 @@
           <w14:ligatures w14:val="standardContextual"/>
         </w:rPr>
       </w:pPr>
-      <w:hyperlink w:anchor="_Toc241772097" w:history="1">
+      <w:hyperlink w:anchor="_Toc242103517" w:history="1">
         <w:r>
           <w:rPr>
             <w:rStyle w:val="aff8"/>
@@ -3253,7 +3253,7 @@
             <w:noProof/>
             <w:webHidden/>
           </w:rPr>
-          <w:instrText xml:space="preserve"> PAGEREF _Toc241772097 \h </w:instrText>
+          <w:instrText xml:space="preserve"> PAGEREF _Toc242103517 \h </w:instrText>
         </w:r>
         <w:r>
           <w:rPr>
@@ -3273,7 +3273,7 @@
             <w:noProof/>
             <w:webHidden/>
           </w:rPr>
-          <w:t>19</w:t>
+          <w:t>20</w:t>
         </w:r>
         <w:r>
           <w:rPr>
@@ -3299,7 +3299,7 @@
           <w14:ligatures w14:val="standardContextual"/>
         </w:rPr>
       </w:pPr>
-      <w:hyperlink w:anchor="_Toc241772098" w:history="1">
+      <w:hyperlink w:anchor="_Toc242103518" w:history="1">
         <w:r>
           <w:rPr>
             <w:rStyle w:val="aff8"/>
@@ -3326,7 +3326,7 @@
             <w:noProof/>
             <w:webHidden/>
           </w:rPr>
-          <w:instrText xml:space="preserve"> PAGEREF _Toc241772098 \h </w:instrText>
+          <w:instrText xml:space="preserve"> PAGEREF _Toc242103518 \h </w:instrText>
         </w:r>
         <w:r>
           <w:rPr>
@@ -3372,7 +3372,7 @@
           <w14:ligatures w14:val="standardContextual"/>
         </w:rPr>
       </w:pPr>
-      <w:hyperlink w:anchor="_Toc241772099" w:history="1">
+      <w:hyperlink w:anchor="_Toc242103519" w:history="1">
         <w:r>
           <w:rPr>
             <w:rStyle w:val="aff8"/>
@@ -3399,7 +3399,7 @@
             <w:noProof/>
             <w:webHidden/>
           </w:rPr>
-          <w:instrText xml:space="preserve"> PAGEREF _Toc241772099 \h </w:instrText>
+          <w:instrText xml:space="preserve"> PAGEREF _Toc242103519 \h </w:instrText>
         </w:r>
         <w:r>
           <w:rPr>
@@ -3445,7 +3445,7 @@
           <w14:ligatures w14:val="standardContextual"/>
         </w:rPr>
       </w:pPr>
-      <w:hyperlink w:anchor="_Toc241772100" w:history="1">
+      <w:hyperlink w:anchor="_Toc242103520" w:history="1">
         <w:r>
           <w:rPr>
             <w:rStyle w:val="aff8"/>
@@ -3472,7 +3472,7 @@
             <w:noProof/>
             <w:webHidden/>
           </w:rPr>
-          <w:instrText xml:space="preserve"> PAGEREF _Toc241772100 \h </w:instrText>
+          <w:instrText xml:space="preserve"> PAGEREF _Toc242103520 \h </w:instrText>
         </w:r>
         <w:r>
           <w:rPr>
@@ -3518,7 +3518,7 @@
           <w14:ligatures w14:val="standardContextual"/>
         </w:rPr>
       </w:pPr>
-      <w:hyperlink w:anchor="_Toc241772101" w:history="1">
+      <w:hyperlink w:anchor="_Toc242103521" w:history="1">
         <w:r>
           <w:rPr>
             <w:rStyle w:val="aff8"/>
@@ -3545,7 +3545,7 @@
             <w:noProof/>
             <w:webHidden/>
           </w:rPr>
-          <w:instrText xml:space="preserve"> PAGEREF _Toc241772101 \h </w:instrText>
+          <w:instrText xml:space="preserve"> PAGEREF _Toc242103521 \h </w:instrText>
         </w:r>
         <w:r>
           <w:rPr>
@@ -3565,7 +3565,7 @@
             <w:noProof/>
             <w:webHidden/>
           </w:rPr>
-          <w:t>20</w:t>
+          <w:t>21</w:t>
         </w:r>
         <w:r>
           <w:rPr>
@@ -3591,7 +3591,7 @@
           <w14:ligatures w14:val="standardContextual"/>
         </w:rPr>
       </w:pPr>
-      <w:hyperlink w:anchor="_Toc241772102" w:history="1">
+      <w:hyperlink w:anchor="_Toc242103522" w:history="1">
         <w:r>
           <w:rPr>
             <w:rStyle w:val="aff8"/>
@@ -3618,7 +3618,7 @@
             <w:noProof/>
             <w:webHidden/>
           </w:rPr>
-          <w:instrText xml:space="preserve"> PAGEREF _Toc241772102 \h </w:instrText>
+          <w:instrText xml:space="preserve"> PAGEREF _Toc242103522 \h </w:instrText>
         </w:r>
         <w:r>
           <w:rPr>
@@ -3638,7 +3638,7 @@
             <w:noProof/>
             <w:webHidden/>
           </w:rPr>
-          <w:t>20</w:t>
+          <w:t>21</w:t>
         </w:r>
         <w:r>
           <w:rPr>
@@ -3664,7 +3664,7 @@
           <w14:ligatures w14:val="standardContextual"/>
         </w:rPr>
       </w:pPr>
-      <w:hyperlink w:anchor="_Toc241772103" w:history="1">
+      <w:hyperlink w:anchor="_Toc242103523" w:history="1">
         <w:r>
           <w:rPr>
             <w:rStyle w:val="aff8"/>
@@ -3691,7 +3691,7 @@
             <w:noProof/>
             <w:webHidden/>
           </w:rPr>
-          <w:instrText xml:space="preserve"> PAGEREF _Toc241772103 \h </w:instrText>
+          <w:instrText xml:space="preserve"> PAGEREF _Toc242103523 \h </w:instrText>
         </w:r>
         <w:r>
           <w:rPr>
@@ -3711,7 +3711,7 @@
             <w:noProof/>
             <w:webHidden/>
           </w:rPr>
-          <w:t>20</w:t>
+          <w:t>21</w:t>
         </w:r>
         <w:r>
           <w:rPr>
@@ -3737,7 +3737,7 @@
           <w14:ligatures w14:val="standardContextual"/>
         </w:rPr>
       </w:pPr>
-      <w:hyperlink w:anchor="_Toc241772104" w:history="1">
+      <w:hyperlink w:anchor="_Toc242103524" w:history="1">
         <w:r>
           <w:rPr>
             <w:rStyle w:val="aff8"/>
@@ -3764,7 +3764,7 @@
             <w:noProof/>
             <w:webHidden/>
           </w:rPr>
-          <w:instrText xml:space="preserve"> PAGEREF _Toc241772104 \h </w:instrText>
+          <w:instrText xml:space="preserve"> PAGEREF _Toc242103524 \h </w:instrText>
         </w:r>
         <w:r>
           <w:rPr>
@@ -3810,7 +3810,7 @@
           <w14:ligatures w14:val="standardContextual"/>
         </w:rPr>
       </w:pPr>
-      <w:hyperlink w:anchor="_Toc241772105" w:history="1">
+      <w:hyperlink w:anchor="_Toc242103525" w:history="1">
         <w:r>
           <w:rPr>
             <w:rStyle w:val="aff8"/>
@@ -3837,7 +3837,7 @@
             <w:noProof/>
             <w:webHidden/>
           </w:rPr>
-          <w:instrText xml:space="preserve"> PAGEREF _Toc241772105 \h </w:instrText>
+          <w:instrText xml:space="preserve"> PAGEREF _Toc242103525 \h </w:instrText>
         </w:r>
         <w:r>
           <w:rPr>
@@ -3857,7 +3857,7 @@
             <w:noProof/>
             <w:webHidden/>
           </w:rPr>
-          <w:t>21</w:t>
+          <w:t>22</w:t>
         </w:r>
         <w:r>
           <w:rPr>
@@ -3883,7 +3883,7 @@
           <w14:ligatures w14:val="standardContextual"/>
         </w:rPr>
       </w:pPr>
-      <w:hyperlink w:anchor="_Toc241772106" w:history="1">
+      <w:hyperlink w:anchor="_Toc242103526" w:history="1">
         <w:r>
           <w:rPr>
             <w:rStyle w:val="aff8"/>
@@ -3910,7 +3910,7 @@
             <w:noProof/>
             <w:webHidden/>
           </w:rPr>
-          <w:instrText xml:space="preserve"> PAGEREF _Toc241772106 \h </w:instrText>
+          <w:instrText xml:space="preserve"> PAGEREF _Toc242103526 \h </w:instrText>
         </w:r>
         <w:r>
           <w:rPr>
@@ -3930,7 +3930,7 @@
             <w:noProof/>
             <w:webHidden/>
           </w:rPr>
-          <w:t>21</w:t>
+          <w:t>22</w:t>
         </w:r>
         <w:r>
           <w:rPr>
@@ -3956,7 +3956,7 @@
           <w14:ligatures w14:val="standardContextual"/>
         </w:rPr>
       </w:pPr>
-      <w:hyperlink w:anchor="_Toc241772107" w:history="1">
+      <w:hyperlink w:anchor="_Toc242103527" w:history="1">
         <w:r>
           <w:rPr>
             <w:rStyle w:val="aff8"/>
@@ -3983,7 +3983,7 @@
             <w:noProof/>
             <w:webHidden/>
           </w:rPr>
-          <w:instrText xml:space="preserve"> PAGEREF _Toc241772107 \h </w:instrText>
+          <w:instrText xml:space="preserve"> PAGEREF _Toc242103527 \h </w:instrText>
         </w:r>
         <w:r>
           <w:rPr>
@@ -4003,7 +4003,7 @@
             <w:noProof/>
             <w:webHidden/>
           </w:rPr>
-          <w:t>21</w:t>
+          <w:t>22</w:t>
         </w:r>
         <w:r>
           <w:rPr>
@@ -4029,7 +4029,7 @@
           <w14:ligatures w14:val="standardContextual"/>
         </w:rPr>
       </w:pPr>
-      <w:hyperlink w:anchor="_Toc241772108" w:history="1">
+      <w:hyperlink w:anchor="_Toc242103528" w:history="1">
         <w:r>
           <w:rPr>
             <w:rStyle w:val="aff8"/>
@@ -4056,7 +4056,7 @@
             <w:noProof/>
             <w:webHidden/>
           </w:rPr>
-          <w:instrText xml:space="preserve"> PAGEREF _Toc241772108 \h </w:instrText>
+          <w:instrText xml:space="preserve"> PAGEREF _Toc242103528 \h </w:instrText>
         </w:r>
         <w:r>
           <w:rPr>
@@ -4076,7 +4076,7 @@
             <w:noProof/>
             <w:webHidden/>
           </w:rPr>
-          <w:t>22</w:t>
+          <w:t>23</w:t>
         </w:r>
         <w:r>
           <w:rPr>
@@ -4102,7 +4102,7 @@
           <w14:ligatures w14:val="standardContextual"/>
         </w:rPr>
       </w:pPr>
-      <w:hyperlink w:anchor="_Toc241772109" w:history="1">
+      <w:hyperlink w:anchor="_Toc242103529" w:history="1">
         <w:r>
           <w:rPr>
             <w:rStyle w:val="aff8"/>
@@ -4129,7 +4129,7 @@
             <w:noProof/>
             <w:webHidden/>
           </w:rPr>
-          <w:instrText xml:space="preserve"> PAGEREF _Toc241772109 \h </w:instrText>
+          <w:instrText xml:space="preserve"> PAGEREF _Toc242103529 \h </w:instrText>
         </w:r>
         <w:r>
           <w:rPr>
@@ -4149,7 +4149,7 @@
             <w:noProof/>
             <w:webHidden/>
           </w:rPr>
-          <w:t>23</w:t>
+          <w:t>24</w:t>
         </w:r>
         <w:r>
           <w:rPr>
@@ -4175,7 +4175,7 @@
           <w14:ligatures w14:val="standardContextual"/>
         </w:rPr>
       </w:pPr>
-      <w:hyperlink w:anchor="_Toc241772110" w:history="1">
+      <w:hyperlink w:anchor="_Toc242103530" w:history="1">
         <w:r>
           <w:rPr>
             <w:rStyle w:val="aff8"/>
@@ -4202,7 +4202,7 @@
             <w:noProof/>
             <w:webHidden/>
           </w:rPr>
-          <w:instrText xml:space="preserve"> PAGEREF _Toc241772110 \h </w:instrText>
+          <w:instrText xml:space="preserve"> PAGEREF _Toc242103530 \h </w:instrText>
         </w:r>
         <w:r>
           <w:rPr>
@@ -4222,7 +4222,7 @@
             <w:noProof/>
             <w:webHidden/>
           </w:rPr>
-          <w:t>24</w:t>
+          <w:t>25</w:t>
         </w:r>
         <w:r>
           <w:rPr>
@@ -4248,7 +4248,7 @@
           <w14:ligatures w14:val="standardContextual"/>
         </w:rPr>
       </w:pPr>
-      <w:hyperlink w:anchor="_Toc241772111" w:history="1">
+      <w:hyperlink w:anchor="_Toc242103531" w:history="1">
         <w:r>
           <w:rPr>
             <w:rStyle w:val="aff8"/>
@@ -4275,7 +4275,7 @@
             <w:noProof/>
             <w:webHidden/>
           </w:rPr>
-          <w:instrText xml:space="preserve"> PAGEREF _Toc241772111 \h </w:instrText>
+          <w:instrText xml:space="preserve"> PAGEREF _Toc242103531 \h </w:instrText>
         </w:r>
         <w:r>
           <w:rPr>
@@ -4295,7 +4295,7 @@
             <w:noProof/>
             <w:webHidden/>
           </w:rPr>
-          <w:t>25</w:t>
+          <w:t>26</w:t>
         </w:r>
         <w:r>
           <w:rPr>
@@ -4321,7 +4321,7 @@
           <w14:ligatures w14:val="standardContextual"/>
         </w:rPr>
       </w:pPr>
-      <w:hyperlink w:anchor="_Toc241772112" w:history="1">
+      <w:hyperlink w:anchor="_Toc242103532" w:history="1">
         <w:r>
           <w:rPr>
             <w:rStyle w:val="aff8"/>
@@ -4348,7 +4348,7 @@
             <w:noProof/>
             <w:webHidden/>
           </w:rPr>
-          <w:instrText xml:space="preserve"> PAGEREF _Toc241772112 \h </w:instrText>
+          <w:instrText xml:space="preserve"> PAGEREF _Toc242103532 \h </w:instrText>
         </w:r>
         <w:r>
           <w:rPr>
@@ -4368,7 +4368,7 @@
             <w:noProof/>
             <w:webHidden/>
           </w:rPr>
-          <w:t>26</w:t>
+          <w:t>27</w:t>
         </w:r>
         <w:r>
           <w:rPr>
@@ -4394,7 +4394,7 @@
           <w14:ligatures w14:val="standardContextual"/>
         </w:rPr>
       </w:pPr>
-      <w:hyperlink w:anchor="_Toc241772113" w:history="1">
+      <w:hyperlink w:anchor="_Toc242103533" w:history="1">
         <w:r>
           <w:rPr>
             <w:rStyle w:val="aff8"/>
@@ -4421,7 +4421,7 @@
             <w:noProof/>
             <w:webHidden/>
           </w:rPr>
-          <w:instrText xml:space="preserve"> PAGEREF _Toc241772113 \h </w:instrText>
+          <w:instrText xml:space="preserve"> PAGEREF _Toc242103533 \h </w:instrText>
         </w:r>
         <w:r>
           <w:rPr>
@@ -4441,7 +4441,7 @@
             <w:noProof/>
             <w:webHidden/>
           </w:rPr>
-          <w:t>27</w:t>
+          <w:t>28</w:t>
         </w:r>
         <w:r>
           <w:rPr>
@@ -4467,7 +4467,7 @@
           <w14:ligatures w14:val="standardContextual"/>
         </w:rPr>
       </w:pPr>
-      <w:hyperlink w:anchor="_Toc241772114" w:history="1">
+      <w:hyperlink w:anchor="_Toc242103534" w:history="1">
         <w:r>
           <w:rPr>
             <w:rStyle w:val="aff8"/>
@@ -4494,7 +4494,7 @@
             <w:noProof/>
             <w:webHidden/>
           </w:rPr>
-          <w:instrText xml:space="preserve"> PAGEREF _Toc241772114 \h </w:instrText>
+          <w:instrText xml:space="preserve"> PAGEREF _Toc242103534 \h </w:instrText>
         </w:r>
         <w:r>
           <w:rPr>
@@ -4514,7 +4514,7 @@
             <w:noProof/>
             <w:webHidden/>
           </w:rPr>
-          <w:t>28</w:t>
+          <w:t>29</w:t>
         </w:r>
         <w:r>
           <w:rPr>
@@ -4540,7 +4540,7 @@
         <w:ind w:firstLine="0"/>
         <w:jc w:val="center"/>
       </w:pPr>
-      <w:bookmarkStart w:id="0" w:name="_Toc241772057"/>
+      <w:bookmarkStart w:id="0" w:name="_Toc242103477"/>
       <w:r>
         <w:lastRenderedPageBreak/>
         <w:t>ПЕРЕЧЕНЬ ТЕРМИНОВ И СОКРАЩЕНИЙ</w:t>
@@ -5802,7 +5802,7 @@
         <w:pStyle w:val="1"/>
         <w:pageBreakBefore/>
       </w:pPr>
-      <w:bookmarkStart w:id="1" w:name="_Toc241772058"/>
+      <w:bookmarkStart w:id="1" w:name="_Toc242103478"/>
       <w:r>
         <w:lastRenderedPageBreak/>
         <w:t>1 Общие сведения</w:t>
@@ -5813,7 +5813,7 @@
       <w:pPr>
         <w:pStyle w:val="21"/>
       </w:pPr>
-      <w:bookmarkStart w:id="2" w:name="_Toc241772059"/>
+      <w:bookmarkStart w:id="2" w:name="_Toc242103479"/>
       <w:r>
         <w:t>1.1 Полное наименование системы и её условное обозначение</w:t>
       </w:r>
@@ -5833,7 +5833,7 @@
       <w:pPr>
         <w:pStyle w:val="21"/>
       </w:pPr>
-      <w:bookmarkStart w:id="3" w:name="_Toc241772060"/>
+      <w:bookmarkStart w:id="3" w:name="_Toc242103480"/>
       <w:r>
         <w:t>1.2 Шифр темы и номер договора</w:t>
       </w:r>
@@ -5848,7 +5848,7 @@
       <w:pPr>
         <w:pStyle w:val="21"/>
       </w:pPr>
-      <w:bookmarkStart w:id="4" w:name="_Toc241772061"/>
+      <w:bookmarkStart w:id="4" w:name="_Toc242103481"/>
       <w:r>
         <w:t>1.3 Наименования организаций заказчика и разработчика</w:t>
       </w:r>
@@ -5868,7 +5868,7 @@
       <w:pPr>
         <w:pStyle w:val="21"/>
       </w:pPr>
-      <w:bookmarkStart w:id="5" w:name="_Toc241772062"/>
+      <w:bookmarkStart w:id="5" w:name="_Toc242103482"/>
       <w:r>
         <w:t>1.4 Основания для создания системы</w:t>
       </w:r>
@@ -5893,7 +5893,7 @@
       <w:pPr>
         <w:pStyle w:val="21"/>
       </w:pPr>
-      <w:bookmarkStart w:id="6" w:name="_Toc241772063"/>
+      <w:bookmarkStart w:id="6" w:name="_Toc242103483"/>
       <w:r>
         <w:t>1.5 Плановые сроки начала и окончания работ</w:t>
       </w:r>
@@ -5908,7 +5908,7 @@
       <w:pPr>
         <w:pStyle w:val="21"/>
       </w:pPr>
-      <w:bookmarkStart w:id="7" w:name="_Toc241772064"/>
+      <w:bookmarkStart w:id="7" w:name="_Toc242103484"/>
       <w:r>
         <w:t>1.6 Сведения об источниках и порядке финансирования</w:t>
       </w:r>
@@ -5923,7 +5923,7 @@
       <w:pPr>
         <w:pStyle w:val="21"/>
       </w:pPr>
-      <w:bookmarkStart w:id="8" w:name="_Toc241772065"/>
+      <w:bookmarkStart w:id="8" w:name="_Toc242103485"/>
       <w:r>
         <w:lastRenderedPageBreak/>
         <w:t>1.7 Порядок оформления и предъявления результатов работ</w:t>
@@ -5939,7 +5939,7 @@
       <w:pPr>
         <w:pStyle w:val="21"/>
       </w:pPr>
-      <w:bookmarkStart w:id="9" w:name="_Toc241772066"/>
+      <w:bookmarkStart w:id="9" w:name="_Toc242103486"/>
       <w:r>
         <w:t>1.8 Перечень нормативно-технических документов</w:t>
       </w:r>
@@ -6003,7 +6003,7 @@
         <w:pStyle w:val="1"/>
         <w:pageBreakBefore/>
       </w:pPr>
-      <w:bookmarkStart w:id="10" w:name="_Toc241772067"/>
+      <w:bookmarkStart w:id="10" w:name="_Toc242103487"/>
       <w:r>
         <w:lastRenderedPageBreak/>
         <w:t>2 Цели и назначение создания автоматизированной системы</w:t>
@@ -6014,7 +6014,7 @@
       <w:pPr>
         <w:pStyle w:val="21"/>
       </w:pPr>
-      <w:bookmarkStart w:id="11" w:name="_Toc241772068"/>
+      <w:bookmarkStart w:id="11" w:name="_Toc242103488"/>
       <w:r>
         <w:t>2.1 Назначение системы</w:t>
       </w:r>
@@ -6074,7 +6074,7 @@
       <w:pPr>
         <w:pStyle w:val="21"/>
       </w:pPr>
-      <w:bookmarkStart w:id="12" w:name="_Toc241772069"/>
+      <w:bookmarkStart w:id="12" w:name="_Toc242103489"/>
       <w:r>
         <w:t>2.2 Цели создания системы</w:t>
       </w:r>
@@ -6120,7 +6120,7 @@
         <w:pStyle w:val="1"/>
         <w:pageBreakBefore/>
       </w:pPr>
-      <w:bookmarkStart w:id="13" w:name="_Toc241772070"/>
+      <w:bookmarkStart w:id="13" w:name="_Toc242103490"/>
       <w:r>
         <w:lastRenderedPageBreak/>
         <w:t>3 Характеристика объекта автоматизации</w:t>
@@ -6131,7 +6131,7 @@
       <w:pPr>
         <w:pStyle w:val="21"/>
       </w:pPr>
-      <w:bookmarkStart w:id="14" w:name="_Toc241772071"/>
+      <w:bookmarkStart w:id="14" w:name="_Toc242103491"/>
       <w:r>
         <w:t>3.1 Краткие сведения об объекте автоматизации</w:t>
       </w:r>
@@ -6221,7 +6221,7 @@
       <w:pPr>
         <w:pStyle w:val="21"/>
       </w:pPr>
-      <w:bookmarkStart w:id="15" w:name="_Toc241772072"/>
+      <w:bookmarkStart w:id="15" w:name="_Toc242103492"/>
       <w:r>
         <w:t>3.2 Сведения об условиях эксплуатации</w:t>
       </w:r>
@@ -6237,7 +6237,7 @@
         <w:pStyle w:val="1"/>
         <w:pageBreakBefore/>
       </w:pPr>
-      <w:bookmarkStart w:id="16" w:name="_Toc241772073"/>
+      <w:bookmarkStart w:id="16" w:name="_Toc242103493"/>
       <w:r>
         <w:lastRenderedPageBreak/>
         <w:t>4 Требования к автоматизированной системе</w:t>
@@ -6248,7 +6248,7 @@
       <w:pPr>
         <w:pStyle w:val="21"/>
       </w:pPr>
-      <w:bookmarkStart w:id="17" w:name="_Toc241772074"/>
+      <w:bookmarkStart w:id="17" w:name="_Toc242103494"/>
       <w:r>
         <w:t>4.1 Требования к системе в целом</w:t>
       </w:r>
@@ -6258,7 +6258,7 @@
       <w:pPr>
         <w:pStyle w:val="31"/>
       </w:pPr>
-      <w:bookmarkStart w:id="18" w:name="_Toc241772075"/>
+      <w:bookmarkStart w:id="18" w:name="_Toc242103495"/>
       <w:r>
         <w:t>4.1.1 Требования к структуре и функционированию системы</w:t>
       </w:r>
@@ -6563,7 +6563,7 @@
               <w:pStyle w:val="GostTable"/>
             </w:pPr>
             <w:r>
-              <w:t>Графики платежей, отметка оплат, просрочка, возвраты, справочники типов платежей и счетов получателей</w:t>
+              <w:t>Графики платежей, отметка оплат, просрочка, возвраты, справочники типов платежей и счетов получателей, валюты и курсы</w:t>
             </w:r>
           </w:p>
         </w:tc>
@@ -6788,7 +6788,7 @@
               <w:pStyle w:val="GostTable"/>
             </w:pPr>
             <w:r>
-              <w:t>Пересчёт просрочки платежей, снятие истёкших броней, закрытие забытых встреч</w:t>
+              <w:t>Пересчёт просрочки платежей, снятие истёкших броней, закрытие забытых встреч, загрузка курсов валют</w:t>
             </w:r>
           </w:p>
         </w:tc>
@@ -6831,7 +6831,13 @@
     </w:p>
     <w:p>
       <w:r>
-        <w:t>– внешние системы партнёров обращаются к публичному API с аутентификацией по API-ключу.</w:t>
+        <w:t>– внешние системы партнёров обращаются к публичному API с аутентификацией по API-ключу;</w:t>
+      </w:r>
+    </w:p>
+    <w:p>
+      <w:r>
+        <w:lastRenderedPageBreak/>
+        <w:t>– серверная часть получает курсы валют с сайта ЦБ Узбекистана и отправляет почту; эти исходящие соединения выполняются через отдельную сеть, остальные компоненты выхода в Интернет не имеют.</w:t>
       </w:r>
     </w:p>
     <w:p>
@@ -6846,7 +6852,6 @@
     </w:p>
     <w:p>
       <w:r>
-        <w:lastRenderedPageBreak/>
         <w:t>– режим обслуживания — обновление ПО, применение изменений структуры БД, восстановление из резервной копии; пользователи на время обслуживания отключаются;</w:t>
       </w:r>
     </w:p>
@@ -6862,49 +6867,44 @@
     </w:p>
     <w:p>
       <w:r>
-        <w:t>а) обеспечить формирование графика платежей в валюте договора: в текущей версии строки графика создаются в узбекских сумах (UZS), а сервер требует совпадения валюты платежей с валютой договора, поэтому для сделок в USD и EUR график сохранить нельзя;</w:t>
-      </w:r>
-    </w:p>
-    <w:p>
-      <w:r>
-        <w:t>б) обеспечить вход пользователей при недоступности хранилища в оперативной памяти: в текущей версии отказ этого хранилища делает вход в систему невозможным;</w:t>
-      </w:r>
-    </w:p>
-    <w:p>
-      <w:r>
-        <w:t>в) ввести проверку типа и размера файлов, прикрепляемых к карточкам клиентов, сделкам и задачам;</w:t>
-      </w:r>
-    </w:p>
-    <w:p>
-      <w:r>
-        <w:t>г) обеспечить контроль работоспособности службы регламентных заданий (сигнал о том, что задания выполняются);</w:t>
-      </w:r>
-    </w:p>
-    <w:p>
-      <w:r>
-        <w:t>д) при переводе сотрудника в другую компанию предупреждать о ролях, которые перестают действовать в новой компании;</w:t>
-      </w:r>
-    </w:p>
-    <w:p>
-      <w:r>
-        <w:t>е) локализовать сообщения серверной части и журналы изменений: в текущей версии они формируются на русском языке независимо от языка интерфейса;</w:t>
-      </w:r>
-    </w:p>
-    <w:p>
-      <w:r>
-        <w:t>ж) обеспечить ежедневное резервное копирование БД и резервное копирование файлового хранилища (в текущей конфигурации БД копируется еженедельно, файлы отдельно не копируются);</w:t>
-      </w:r>
-    </w:p>
-    <w:p>
-      <w:r>
-        <w:t>и) скрывать кнопки действий, недоступных пользователю, во всех разделах: в текущей версии они скрываются в разделах клиентов, заявок, проектов, домов, скидок и настроек, а в разделах встреч, задач, сделок, платежей и отчётов видны всем, и недоступное действие отклоняется сервером с сообщением.</w:t>
+        <w:t>а) обеспечить вход пользователей при недоступности хранилища в оперативной памяти: в текущей версии отказ этого хранилища делает вход в систему невозможным;</w:t>
+      </w:r>
+    </w:p>
+    <w:p>
+      <w:r>
+        <w:t>б) ввести проверку типа и размера файлов, прикрепляемых к карточкам клиентов, сделкам и задачам;</w:t>
+      </w:r>
+    </w:p>
+    <w:p>
+      <w:r>
+        <w:t>в) обеспечить контроль работоспособности службы регламентных заданий (сигнал о том, что задания выполняются);</w:t>
+      </w:r>
+    </w:p>
+    <w:p>
+      <w:r>
+        <w:t>г) при переводе сотрудника в другую компанию предупреждать о ролях, которые перестают действовать в новой компании;</w:t>
+      </w:r>
+    </w:p>
+    <w:p>
+      <w:r>
+        <w:t>д) локализовать сообщения серверной части и журналы изменений: в текущей версии они формируются на русском языке независимо от языка интерфейса;</w:t>
+      </w:r>
+    </w:p>
+    <w:p>
+      <w:r>
+        <w:t>е) обеспечить ежедневное резервное копирование БД и резервное копирование файлового хранилища (в текущей конфигурации БД копируется еженедельно, файлы отдельно не копируются);</w:t>
+      </w:r>
+    </w:p>
+    <w:p>
+      <w:r>
+        <w:t>ж) скрывать кнопки действий, недоступных пользователю, во всех разделах: в текущей версии они скрываются в разделах клиентов, заявок, проектов, домов, скидок и настроек, а в разделах встреч, задач, сделок, платежей и отчётов видны всем, и недоступное действие отклоняется сервером с сообщением.</w:t>
       </w:r>
     </w:p>
     <w:p>
       <w:pPr>
         <w:pStyle w:val="31"/>
       </w:pPr>
-      <w:bookmarkStart w:id="19" w:name="_Toc241772076"/>
+      <w:bookmarkStart w:id="19" w:name="_Toc242103496"/>
       <w:r>
         <w:t>4.1.2 Требования к численности и квалификации персонала</w:t>
       </w:r>
@@ -7003,6 +7003,7 @@
               <w:pStyle w:val="GostTable"/>
             </w:pPr>
             <w:r>
+              <w:lastRenderedPageBreak/>
               <w:t>Системный администратор (сервер)</w:t>
             </w:r>
           </w:p>
@@ -7048,7 +7049,6 @@
               <w:pStyle w:val="GostTable"/>
             </w:pPr>
             <w:r>
-              <w:lastRenderedPageBreak/>
               <w:t>Администратор системы</w:t>
             </w:r>
           </w:p>
@@ -7185,7 +7185,7 @@
       <w:pPr>
         <w:pStyle w:val="31"/>
       </w:pPr>
-      <w:bookmarkStart w:id="20" w:name="_Toc241772077"/>
+      <w:bookmarkStart w:id="20" w:name="_Toc242103497"/>
       <w:r>
         <w:t>4.1.3 Показатели назначения</w:t>
       </w:r>
@@ -7233,7 +7233,7 @@
       <w:pPr>
         <w:pStyle w:val="31"/>
       </w:pPr>
-      <w:bookmarkStart w:id="21" w:name="_Toc241772078"/>
+      <w:bookmarkStart w:id="21" w:name="_Toc242103498"/>
       <w:r>
         <w:t>4.1.4 Требования к надёжности</w:t>
       </w:r>
@@ -7251,12 +7251,15 @@
     </w:p>
     <w:p>
       <w:r>
-        <w:t>Контейнеры системы должны автоматически перезапускаться после сбоя и после перезагрузки сервера. Для серверной части, СУБД, хранилища в оперативной памяти, клиентского приложения и обратного прокси должны выполняться периодические проверки работоспособности.</w:t>
-      </w:r>
-    </w:p>
-    <w:p>
+        <w:t xml:space="preserve">Контейнеры системы должны автоматически перезапускаться после сбоя и после перезагрузки сервера. Для серверной части, СУБД, хранилища в оперативной памяти, </w:t>
+      </w:r>
       <w:r>
         <w:lastRenderedPageBreak/>
+        <w:t>клиентского приложения и обратного прокси должны выполняться периодические проверки работоспособности.</w:t>
+      </w:r>
+    </w:p>
+    <w:p>
+      <w:r>
         <w:t>Время восстановления системы после отказа сервера при наличии резервной копии — не более 4 ч.</w:t>
       </w:r>
     </w:p>
@@ -7264,7 +7267,7 @@
       <w:pPr>
         <w:pStyle w:val="31"/>
       </w:pPr>
-      <w:bookmarkStart w:id="22" w:name="_Toc241772079"/>
+      <w:bookmarkStart w:id="22" w:name="_Toc242103499"/>
       <w:r>
         <w:t>4.1.5 Требования к безопасности</w:t>
       </w:r>
@@ -7279,7 +7282,7 @@
       <w:pPr>
         <w:pStyle w:val="31"/>
       </w:pPr>
-      <w:bookmarkStart w:id="23" w:name="_Toc241772080"/>
+      <w:bookmarkStart w:id="23" w:name="_Toc242103500"/>
       <w:r>
         <w:t>4.1.6 Требования к эргономике и технической эстетике</w:t>
       </w:r>
@@ -7324,7 +7327,7 @@
       <w:pPr>
         <w:pStyle w:val="31"/>
       </w:pPr>
-      <w:bookmarkStart w:id="24" w:name="_Toc241772081"/>
+      <w:bookmarkStart w:id="24" w:name="_Toc242103501"/>
       <w:r>
         <w:t>4.1.7 Требования к эксплуатации и техническому обслуживанию</w:t>
       </w:r>
@@ -7354,7 +7357,7 @@
       <w:pPr>
         <w:pStyle w:val="31"/>
       </w:pPr>
-      <w:bookmarkStart w:id="25" w:name="_Toc241772082"/>
+      <w:bookmarkStart w:id="25" w:name="_Toc242103502"/>
       <w:r>
         <w:t>4.1.8 Требования к защите информации от несанкционированного доступа</w:t>
       </w:r>
@@ -7367,627 +7370,650 @@
     </w:p>
     <w:p>
       <w:r>
+        <w:lastRenderedPageBreak/>
         <w:t>а) идентификацию и аутентификацию пользователей по имени пользователя и паролю (минимальная длина пароля — 8 символов, проверка по типовым словарям);</w:t>
       </w:r>
     </w:p>
     <w:p>
       <w:r>
+        <w:t>б) временную блокировку входа после 10 неудачных попыток подряд на 5 минут (значения настраиваются);</w:t>
+      </w:r>
+    </w:p>
+    <w:p>
+      <w:r>
+        <w:t>в) выдачу краткоживущего токена доступа (30 минут) и токена обновления (1 сутки); токен доступа хранится только в памяти браузера, токен обновления — в cookie, недоступной сценариям страницы; токены обновления заменяются при каждом использовании, а использованные заносятся в чёрный список;</w:t>
+      </w:r>
+    </w:p>
+    <w:p>
+      <w:r>
+        <w:t>г) отзыв всех выданных токенов пользователя при смене пароля и запрет входа деактивированным пользователям и сотрудникам деактивированных компаний;</w:t>
+      </w:r>
+    </w:p>
+    <w:p>
+      <w:r>
+        <w:t>д) разграничение доступа к каждому ресурсу по разрешению «действие — ресурс — область видимости» (подраздел 4.2, подсистема ОРГ);</w:t>
+      </w:r>
+    </w:p>
+    <w:p>
+      <w:r>
+        <w:t>е) изоляцию данных компаний: сотрудник одной компании не должен видеть и изменять данные и справочники другой компании; одинаковые сведения о клиенте в разных компаниях хранятся в независимых карточках;</w:t>
+      </w:r>
+    </w:p>
+    <w:p>
+      <w:r>
+        <w:t>ж) выдачу файлов с персональными данными (сканы паспортов, договоры, вложения) только по ссылке с цифровой подписью и ограниченным сроком действия (по умолчанию 1 ч); общедоступными являются только изображения проектов, домов, планировок и аватары;</w:t>
+      </w:r>
+    </w:p>
+    <w:p>
+      <w:r>
+        <w:t>и) доступ партнёров к публичному API только по API-ключу в заголовке запроса, только по HTTPS, с ограничением по списку IP-адресов, набору разрешённых действий, компаниям и частоте запросов; в БД должны храниться хеш ключа и его зашифрованное значение, но не ключ в открытом виде;</w:t>
+      </w:r>
+    </w:p>
+    <w:p>
+      <w:r>
+        <w:t>к) журналирование изменений бизнес-записей (заявки, клиенты, встречи, сделки, платежи, дома, скидки, задачи) и изменений прав доступа с указанием автора и времени;</w:t>
+      </w:r>
+    </w:p>
+    <w:p>
+      <w:r>
+        <w:t>л) ограничение частоты запросов к серверной части (подраздел «Показатели назначения»);</w:t>
+      </w:r>
+    </w:p>
+    <w:p>
+      <w:r>
+        <w:t>м) передачу данных между браузером и сервером только по протоколу HTTPS в промышленной эксплуатации.</w:t>
+      </w:r>
+    </w:p>
+    <w:p>
+      <w:pPr>
+        <w:pStyle w:val="31"/>
+      </w:pPr>
+      <w:bookmarkStart w:id="26" w:name="_Toc242103503"/>
+      <w:r>
+        <w:t>4.1.9 Требования по сохранности информации при авариях</w:t>
+      </w:r>
+      <w:bookmarkEnd w:id="26"/>
+    </w:p>
+    <w:p>
+      <w:r>
+        <w:t>Должно выполняться автоматическое резервное копирование БД с хранением не менее четырёх еженедельных и трёх ежемесячных копий. Файловое хранилище должно копироваться средствами площадки размещения. Порядок восстановления приводится в документе «Руководство системного программиста».</w:t>
+      </w:r>
+    </w:p>
+    <w:p>
+      <w:r>
         <w:lastRenderedPageBreak/>
-        <w:t>б) временную блокировку входа после 10 неудачных попыток подряд на 5 минут (значения настраиваются);</w:t>
-      </w:r>
-    </w:p>
-    <w:p>
-      <w:r>
-        <w:t>в) выдачу краткоживущего токена доступа (30 минут) и токена обновления (1 сутки); токен доступа хранится только в памяти браузера, токен обновления — в cookie, недоступной сценариям страницы; токены обновления заменяются при каждом использовании, а использованные заносятся в чёрный список;</w:t>
-      </w:r>
-    </w:p>
-    <w:p>
-      <w:r>
-        <w:t>г) отзыв всех выданных токенов пользователя при смене пароля и запрет входа деактивированным пользователям и сотрудникам деактивированных компаний;</w:t>
-      </w:r>
-    </w:p>
-    <w:p>
-      <w:r>
-        <w:t>д) разграничение доступа к каждому ресурсу по разрешению «действие — ресурс — область видимости» (подраздел 4.2, подсистема ОРГ);</w:t>
-      </w:r>
-    </w:p>
-    <w:p>
-      <w:r>
-        <w:t>е) изоляцию данных компаний: сотрудник одной компании не должен видеть и изменять данные и справочники другой компании; одинаковые сведения о клиенте в разных компаниях хранятся в независимых карточках;</w:t>
-      </w:r>
-    </w:p>
-    <w:p>
-      <w:r>
-        <w:t>ж) выдачу файлов с персональными данными (сканы паспортов, договоры, вложения) только по ссылке с цифровой подписью и ограниченным сроком действия (по умолчанию 1 ч); общедоступными являются только изображения проектов, домов, планировок и аватары;</w:t>
-      </w:r>
-    </w:p>
-    <w:p>
-      <w:r>
-        <w:t>и) доступ партнёров к публичному API только по API-ключу в заголовке запроса, только по HTTPS, с ограничением по списку IP-адресов, набору разрешённых действий, компаниям и частоте запросов; в БД должны храниться хеш ключа и его зашифрованное значение, но не ключ в открытом виде;</w:t>
-      </w:r>
-    </w:p>
-    <w:p>
-      <w:r>
-        <w:t>к) журналирование изменений бизнес-записей (заявки, клиенты, встречи, сделки, платежи, дома, скидки, задачи) и изменений прав доступа с указанием автора и времени;</w:t>
-      </w:r>
-    </w:p>
-    <w:p>
-      <w:r>
-        <w:t>л) ограничение частоты запросов к серверной части (подраздел «Показатели назначения»);</w:t>
-      </w:r>
-    </w:p>
-    <w:p>
-      <w:r>
-        <w:t>м) передачу данных между браузером и сервером только по протоколу HTTPS в промышленной эксплуатации.</w:t>
+        <w:t>Удаление заявок и встреч должно выполняться как мягкое удаление с возможностью восстановления. Клиенты должны переводиться в архив, а не удаляться. Записи, на которые ссылаются сделки и платежи (проекты, дома, объекты, использованные справочники), не должны удаляться.</w:t>
       </w:r>
     </w:p>
     <w:p>
       <w:pPr>
         <w:pStyle w:val="31"/>
       </w:pPr>
-      <w:bookmarkStart w:id="26" w:name="_Toc241772083"/>
-      <w:r>
-        <w:t>4.1.9 Требования по сохранности информации при авариях</w:t>
-      </w:r>
-      <w:bookmarkEnd w:id="26"/>
-    </w:p>
-    <w:p>
-      <w:r>
-        <w:t>Должно выполняться автоматическое резервное копирование БД с хранением не менее четырёх еженедельных и трёх ежемесячных копий. Файловое хранилище должно копироваться средствами площадки размещения. Порядок восстановления приводится в документе «Руководство системного программиста».</w:t>
-      </w:r>
-    </w:p>
-    <w:p>
-      <w:r>
-        <w:t xml:space="preserve">Удаление заявок и встреч должно выполняться как мягкое удаление с возможностью восстановления. Клиенты должны переводиться в архив, а не удаляться. Записи, на </w:t>
-      </w:r>
+      <w:bookmarkStart w:id="27" w:name="_Toc242103504"/>
+      <w:r>
+        <w:t>4.1.10 Требования к защите от влияния внешних воздействий</w:t>
+      </w:r>
+      <w:bookmarkEnd w:id="27"/>
+    </w:p>
+    <w:p>
+      <w:r>
+        <w:t>Специальные требования не предъявляются. Защита от перебоев электропитания и сетевых атак обеспечивается средствами площадки размещения.</w:t>
+      </w:r>
+    </w:p>
+    <w:p>
+      <w:pPr>
+        <w:pStyle w:val="31"/>
+      </w:pPr>
+      <w:bookmarkStart w:id="28" w:name="_Toc242103505"/>
+      <w:r>
+        <w:t>4.1.11 Требования к патентной чистоте</w:t>
+      </w:r>
+      <w:bookmarkEnd w:id="28"/>
+    </w:p>
+    <w:p>
+      <w:r>
+        <w:t>В системе должны использоваться программные компоненты, лицензии которых допускают безвозмездное использование в собственной инфраструктуре заказчика в коммерческих целях: BSD, MIT, Apache 2.0, LGPL, PostgreSQL License и подобные. Для хранилища Redis версий 7.4 и выше действуют лицензии RSALv2 и SSPLv1, которые такое использование допускают, но запрещают предоставлять Redis третьим лицам как услугу. Перечень компонентов и их лицензий приводится в документе «Описание программного обеспечения»; при обновлении</w:t>
+      </w:r>
+      <w:r>
+        <w:t xml:space="preserve"> компонентов лицензии подлежат повторной проверке.</w:t>
+      </w:r>
+    </w:p>
+    <w:p>
+      <w:pPr>
+        <w:pStyle w:val="31"/>
+      </w:pPr>
+      <w:bookmarkStart w:id="29" w:name="_Toc242103506"/>
+      <w:r>
+        <w:t>4.1.12 Требования по стандартизации и унификации</w:t>
+      </w:r>
+      <w:bookmarkEnd w:id="29"/>
+    </w:p>
+    <w:p>
+      <w:r>
+        <w:t>Программный интерфейс серверной части должен быть описан в формате OpenAPI 3 и публиковаться самой системой. Обмен данными с клиентским приложением и партнёрами должен выполняться в формате JSON, выгрузка табличных данных — в формате XLSX, загрузка объектов и планов продаж — из XLSX-шаблонов, выдаваемых системой, формирование договоров — в формате DOCX.</w:t>
+      </w:r>
+    </w:p>
+    <w:p>
+      <w:pPr>
+        <w:pStyle w:val="31"/>
+      </w:pPr>
+      <w:bookmarkStart w:id="30" w:name="_Toc242103507"/>
+      <w:r>
+        <w:t>4.1.13 Дополнительные требования</w:t>
+      </w:r>
+      <w:bookmarkEnd w:id="30"/>
+    </w:p>
+    <w:p>
+      <w:r>
+        <w:t>Система должна поддерживать работу нескольких компаний в одном экземпляре. Справочники должны принадлежать компании; общесистемные записи справочников, видимые всем компаниям, может создавать и изменять только системный администратор.</w:t>
+      </w:r>
+    </w:p>
+    <w:p>
+      <w:r>
+        <w:t>Время в системе должно учитываться в часовом поясе, задаваемом настройкой (по умолчанию Asia/Tashkent): по нему определяются «сегодня», просрочка платежей и даты оплаты.</w:t>
+      </w:r>
+    </w:p>
+    <w:p>
+      <w:pPr>
+        <w:pStyle w:val="21"/>
+      </w:pPr>
+      <w:bookmarkStart w:id="31" w:name="_Toc242103508"/>
       <w:r>
         <w:lastRenderedPageBreak/>
-        <w:t>которые ссылаются сделки и платежи (проекты, дома, объекты, использованные справочники), не должны удаляться.</w:t>
+        <w:t>4.2 Требования к функциям, выполняемым системой</w:t>
+      </w:r>
+      <w:bookmarkEnd w:id="31"/>
+    </w:p>
+    <w:p>
+      <w:r>
+        <w:t>Перечень функций приводится ниже по подсистемам. Подробное описание функций, входной и выходной информации и правил обработки приводится в документе «Описание автоматизированных функций».</w:t>
       </w:r>
     </w:p>
     <w:p>
       <w:pPr>
         <w:pStyle w:val="31"/>
       </w:pPr>
-      <w:bookmarkStart w:id="27" w:name="_Toc241772084"/>
-      <w:r>
-        <w:t>4.1.10 Требования к защите от влияния внешних воздействий</w:t>
-      </w:r>
-      <w:bookmarkEnd w:id="27"/>
-    </w:p>
-    <w:p>
-      <w:r>
-        <w:t>Специальные требования не предъявляются. Защита от перебоев электропитания и сетевых атак обеспечивается средствами площадки размещения.</w:t>
+      <w:bookmarkStart w:id="32" w:name="_Toc242103509"/>
+      <w:r>
+        <w:t>4.2.1 Подсистема «Организационная структура и права доступа»</w:t>
+      </w:r>
+      <w:bookmarkEnd w:id="32"/>
+    </w:p>
+    <w:p>
+      <w:r>
+        <w:t>Подсистема должна обеспечивать:</w:t>
+      </w:r>
+    </w:p>
+    <w:p>
+      <w:r>
+        <w:t>– ведение компаний, иерархии отделов, учётных записей пользователей и их профилей (компания, отдел, должность, роли);</w:t>
+      </w:r>
+    </w:p>
+    <w:p>
+      <w:r>
+        <w:t>– ведение ролей как наборов разрешений; разрешение задаётся сочетанием действия (просмотр, добавление, редактирование, удаление, экспорт, импорт, утверждение, назначение и специальные действия над задачами), ресурса и области видимости (свои записи, отдел, компания, вся система);</w:t>
+      </w:r>
+    </w:p>
+    <w:p>
+      <w:r>
+        <w:t>– наличие типовых ролей: системный администратор, администратор компании, руководитель отдела, менеджер, наблюдатель; защиту типовых ролей от изменения;</w:t>
+      </w:r>
+    </w:p>
+    <w:p>
+      <w:r>
+        <w:t>– блокировку, деактивацию и мягкое удаление пользователей с сохранением авторства записей;</w:t>
+      </w:r>
+    </w:p>
+    <w:p>
+      <w:r>
+        <w:t>– смену пароля администратором и самостоятельное восстановление пароля по электронной почте;</w:t>
+      </w:r>
+    </w:p>
+    <w:p>
+      <w:r>
+        <w:t>– журнал изменений ролей и прав.</w:t>
       </w:r>
     </w:p>
     <w:p>
       <w:pPr>
         <w:pStyle w:val="31"/>
       </w:pPr>
-      <w:bookmarkStart w:id="28" w:name="_Toc241772085"/>
-      <w:r>
-        <w:t>4.1.11 Требования к патентной чистоте</w:t>
-      </w:r>
-      <w:bookmarkEnd w:id="28"/>
-    </w:p>
-    <w:p>
-      <w:r>
-        <w:t>В системе должны использоваться программные компоненты, лицензии которых допускают безвозмездное использование в собственной инфраструктуре заказчика в коммерческих целях: BSD, MIT, Apache 2.0, LGPL, PostgreSQL License и подобные. Для хранилища Redis версий 7.4 и выше действуют лицензии RSALv2 и SSPLv1, которые такое использование допускают, но запрещают предоставлять Redis третьим лицам как услугу. Перечень компонентов и их лицензий приводится в документе «Описание программного обеспечения»; при обновлении</w:t>
-      </w:r>
-      <w:r>
-        <w:t xml:space="preserve"> компонентов лицензии подлежат повторной проверке.</w:t>
+      <w:bookmarkStart w:id="33" w:name="_Toc242103510"/>
+      <w:r>
+        <w:t>4.2.2 Подсистема «Каталог недвижимости»</w:t>
+      </w:r>
+      <w:bookmarkEnd w:id="33"/>
+    </w:p>
+    <w:p>
+      <w:r>
+        <w:t>Подсистема должна обеспечивать:</w:t>
+      </w:r>
+    </w:p>
+    <w:p>
+      <w:r>
+        <w:t>– ведение проектов (ЖК) с описанием, УТП, юридической информацией, реквизитами застройщика, галереей и валютой прайса, в которой задаются цены объектов;</w:t>
+      </w:r>
+    </w:p>
+    <w:p>
+      <w:r>
+        <w:t>– ведение домов проекта с этажностью, типом, датой старта продаж и галереей;</w:t>
+      </w:r>
+    </w:p>
+    <w:p>
+      <w:r>
+        <w:t>– загрузку и обновление объектов дома из XLSX-шаблона; уникальность номера объекта в пределах дома; запрет изменения загрузкой объектов, занятых сделкой;</w:t>
+      </w:r>
+    </w:p>
+    <w:p>
+      <w:r>
+        <w:t>– ведение планировок с четырьмя изображениями и их массовую загрузку по имени файла;</w:t>
+      </w:r>
+    </w:p>
+    <w:p>
+      <w:r>
+        <w:t>– отображение объектов дома в виде шахматки со статусами: подбор, резерв, бронь, сделка в работе, сделка проведена;</w:t>
+      </w:r>
+    </w:p>
+    <w:p>
+      <w:r>
+        <w:t>– вывод объекта из продажи (резерв) и возврат в продажу;</w:t>
+      </w:r>
+    </w:p>
+    <w:p>
+      <w:r>
+        <w:t>– ведение скидок с процентом, сроком действия и ограничениями по типу объекта и домам.</w:t>
       </w:r>
     </w:p>
     <w:p>
       <w:pPr>
         <w:pStyle w:val="31"/>
       </w:pPr>
-      <w:bookmarkStart w:id="29" w:name="_Toc241772086"/>
-      <w:r>
-        <w:t>4.1.12 Требования по стандартизации и унификации</w:t>
-      </w:r>
-      <w:bookmarkEnd w:id="29"/>
-    </w:p>
-    <w:p>
-      <w:r>
-        <w:t>Программный интерфейс серверной части должен быть описан в формате OpenAPI 3 и публиковаться самой системой. Обмен данными с клиентским приложением и партнёрами должен выполняться в формате JSON, выгрузка табличных данных — в формате XLSX, загрузка объектов и планов продаж — из XLSX-шаблонов, выдаваемых системой, формирование договоров — в формате DOCX.</w:t>
+      <w:bookmarkStart w:id="34" w:name="_Toc242103511"/>
+      <w:r>
+        <w:lastRenderedPageBreak/>
+        <w:t>4.2.3 Подсистема «Работа с клиентами»</w:t>
+      </w:r>
+      <w:bookmarkEnd w:id="34"/>
+    </w:p>
+    <w:p>
+      <w:r>
+        <w:t>Подсистема должна обеспечивать:</w:t>
+      </w:r>
+    </w:p>
+    <w:p>
+      <w:r>
+        <w:t>– ведение карточек клиентов с личными и паспортными данными, несколькими телефонами и файлами; приведение телефонов к единому виду; уникальность адреса электронной почты в пределах компании; перевод в архив вместо удаления;</w:t>
+      </w:r>
+    </w:p>
+    <w:p>
+      <w:r>
+        <w:t>– ведение заявок с источником, интересами клиента и статусами воронки; обязательное указание причины при статусах «Отказ» и «Нецелевая»; запрет редактирования закрытой заявки; мягкое удаление и восстановление;</w:t>
+      </w:r>
+    </w:p>
+    <w:p>
+      <w:r>
+        <w:t>– представление заявок списком и канбан-доской;</w:t>
+      </w:r>
+    </w:p>
+    <w:p>
+      <w:r>
+        <w:t>– ведение встреч с исполнителем, плановой датой и результатом; признак просрочки; мягкое удаление и восстановление;</w:t>
+      </w:r>
+    </w:p>
+    <w:p>
+      <w:r>
+        <w:t>– ведение справочников статусов заявок, причин отказа и нецелевых обращений, точных источников.</w:t>
       </w:r>
     </w:p>
     <w:p>
       <w:pPr>
         <w:pStyle w:val="31"/>
       </w:pPr>
-      <w:bookmarkStart w:id="30" w:name="_Toc241772087"/>
-      <w:r>
-        <w:t>4.1.13 Дополнительные требования</w:t>
-      </w:r>
-      <w:bookmarkEnd w:id="30"/>
-    </w:p>
-    <w:p>
-      <w:r>
-        <w:t>Система должна поддерживать работу нескольких компаний в одном экземпляре. Справочники должны принадлежать компании; общесистемные записи справочников, видимые всем компаниям, может создавать и изменять только системный администратор.</w:t>
-      </w:r>
-    </w:p>
-    <w:p>
-      <w:r>
-        <w:t>Время в системе должно учитываться в часовом поясе, задаваемом настройкой (по умолчанию Asia/Tashkent): по нему определяются «сегодня», просрочка платежей и даты оплаты.</w:t>
+      <w:bookmarkStart w:id="35" w:name="_Toc242103512"/>
+      <w:r>
+        <w:t>4.2.4 Подсистема «Сделки»</w:t>
+      </w:r>
+      <w:bookmarkEnd w:id="35"/>
+    </w:p>
+    <w:p>
+      <w:r>
+        <w:t>Подсистема должна обеспечивать:</w:t>
+      </w:r>
+    </w:p>
+    <w:p>
+      <w:r>
+        <w:t>– создание брони по объекту в статусе «Подбор» или «Резерв» с фиксацией цены объекта на момент брони в валюте сделок компании: если прайс проекта в другой валюте, цена пересчитывается по курсу на день брони, а цена по прайсу и курс сохраняются в сделке; запрет второй сделки по объекту, у которого есть сделка в статусе «Бронь», «В работе» или «Успешно закрыта»;</w:t>
+      </w:r>
+    </w:p>
+    <w:p>
+      <w:r>
+        <w:t>– ведение сделки по четырём последовательным шагам: информация, условия, график платежей, документы;</w:t>
+      </w:r>
+    </w:p>
+    <w:p>
+      <w:r>
+        <w:t>– применение только тех скидок, которые действуют для объекта на текущую дату; ограничение суммы скидок 100 % и стоимости по договору ценой со скидками;</w:t>
+      </w:r>
+    </w:p>
+    <w:p>
+      <w:r>
+        <w:t>– уникальность номера договора в пределах компании;</w:t>
+      </w:r>
+    </w:p>
+    <w:p>
+      <w:r>
+        <w:t>– автоматическую смену статусов сделки и объекта по факту действий: сохранение графика — «В работе»; заполнение обеих дат подписания — «Успешно закрыта» с закрытием связанной заявки;</w:t>
+      </w:r>
+    </w:p>
+    <w:p>
+      <w:r>
+        <w:t>– отмену сделки без платежей и подписи клиента с указанием причины и расторжение сделки с документом-основанием при наличии платежей или подписи; перевод оплаченных платежей в статус «К возврату»; освобождение объекта после завершения возвратов; возврат связанной заявки в работу.</w:t>
+      </w:r>
+    </w:p>
+    <w:p>
+      <w:pPr>
+        <w:pStyle w:val="31"/>
+      </w:pPr>
+      <w:bookmarkStart w:id="36" w:name="_Toc242103513"/>
+      <w:r>
+        <w:lastRenderedPageBreak/>
+        <w:t>4.2.5 Подсистема «Финансы»</w:t>
+      </w:r>
+      <w:bookmarkEnd w:id="36"/>
+    </w:p>
+    <w:p>
+      <w:r>
+        <w:t>Подсистема должна обеспечивать:</w:t>
+      </w:r>
+    </w:p>
+    <w:p>
+      <w:r>
+        <w:t>– создание и изменение графика платежей только в составе сделки; равенство суммы графика стоимости по договору; хранение всего графика в валюте сделки;</w:t>
+      </w:r>
+    </w:p>
+    <w:p>
+      <w:r>
+        <w:t>– ввод строк графика в любой из поддерживаемых валют компании с пересчётом в валюту сделки по курсу на день сохранения и сохранением введённой суммы, валюты и курса; отнесение расхождения от округления на последнюю пересчитанную строку;</w:t>
+      </w:r>
+    </w:p>
+    <w:p>
+      <w:r>
+        <w:t>– сохранение проведённых платежей при изменении графика и запрет их удаления;</w:t>
+      </w:r>
+    </w:p>
+    <w:p>
+      <w:r>
+        <w:t>– отметку оплаты текущей датой и её отмену; запрет оплаты по отменённой или расторгнутой сделке;</w:t>
+      </w:r>
+    </w:p>
+    <w:p>
+      <w:r>
+        <w:t>– автоматический перевод платежей в статус «Просрочен»;</w:t>
+      </w:r>
+    </w:p>
+    <w:p>
+      <w:r>
+        <w:t>– отметку возврата платежей в статусе «К возврату»;</w:t>
+      </w:r>
+    </w:p>
+    <w:p>
+      <w:r>
+        <w:t>– список платежей с фильтрами по плановой и фактической дате, сводную таблицу с группировкой и выгрузку в Excel; итоги по каждой валюте отдельно и общий итог в валюте сделок компании;</w:t>
+      </w:r>
+    </w:p>
+    <w:p>
+      <w:r>
+        <w:t>– настройку валюты сделок компании (одна на компанию) и перечня поддерживаемых валют; загрузку курсов ЦБ Узбекистана автоматически и по запросу пользователя; ручной ввод курса компании на дату, действующего вместо курса ЦБ только в этой компании.</w:t>
+      </w:r>
+    </w:p>
+    <w:p>
+      <w:pPr>
+        <w:pStyle w:val="31"/>
+      </w:pPr>
+      <w:bookmarkStart w:id="37" w:name="_Toc242103514"/>
+      <w:r>
+        <w:t>4.2.6 Подсистема «Шаблоны документов»</w:t>
+      </w:r>
+      <w:bookmarkEnd w:id="37"/>
+    </w:p>
+    <w:p>
+      <w:r>
+        <w:t>Подсистема должна обеспечивать хранение шаблонов договоров в формате DOCX с областью применения (проекты, дома, типы объектов) и формирование документа по сделке с подстановкой данных клиента, объекта, дома, проекта, сделки и менеджера. Формирование должно быть доступно после сохранения номера и даты договора и недоступно для отменённых и расторгнутых сделок.</w:t>
+      </w:r>
+    </w:p>
+    <w:p>
+      <w:pPr>
+        <w:pStyle w:val="31"/>
+      </w:pPr>
+      <w:bookmarkStart w:id="38" w:name="_Toc242103515"/>
+      <w:r>
+        <w:t>4.2.7 Подсистема «Задачи»</w:t>
+      </w:r>
+      <w:bookmarkEnd w:id="38"/>
+    </w:p>
+    <w:p>
+      <w:r>
+        <w:t>Подсистема должна обеспечивать постановку задач с исполнителем, сроком, приоритетом, наблюдателями, тегами и оценкой времени; подзадачи; комментарии; статусы «Новая», «В работе», «На проверке», «Завершена», «Отменена», «Заблокирована»; запрет завершения задачи при открытых подзадачах; представления списком, канбан-доской и календарём; журнал изменений.</w:t>
+      </w:r>
+    </w:p>
+    <w:p>
+      <w:pPr>
+        <w:pStyle w:val="31"/>
+      </w:pPr>
+      <w:bookmarkStart w:id="39" w:name="_Toc242103516"/>
+      <w:r>
+        <w:lastRenderedPageBreak/>
+        <w:t>4.2.8 Подсистема «Аналитика и отчётность»</w:t>
+      </w:r>
+      <w:bookmarkEnd w:id="39"/>
+    </w:p>
+    <w:p>
+      <w:r>
+        <w:t>Подсистема должна обеспечивать:</w:t>
+      </w:r>
+    </w:p>
+    <w:p>
+      <w:r>
+        <w:t>– дашборд с показателями дня и месяца в пределах области видимости пользователя;</w:t>
+      </w:r>
+    </w:p>
+    <w:p>
+      <w:r>
+        <w:t>– сводные таблицы по заявкам, встречам, сделкам и платежам с группировкой и выгрузкой в Excel; отбор «забытых» заявок и просроченных встреч;</w:t>
+      </w:r>
+    </w:p>
+    <w:p>
+      <w:r>
+        <w:t>– загрузку планов продаж по проектам и по сотрудникам из XLSX-шаблонов;</w:t>
+      </w:r>
+    </w:p>
+    <w:p>
+      <w:r>
+        <w:t>– отчёты «план-факт» по количеству, контрактации и поступлениям с процентом выполнения и прогнозом выполнения к концу периода;</w:t>
+      </w:r>
+    </w:p>
+    <w:p>
+      <w:r>
+        <w:t>– приведение денежных показателей дашборда, общего итога финансов и денежного факта отчётов «план-факт» к валюте сделок компании по курсу на дату события; предупреждение о валютах, для которых нет курса и суммы которых поэтому не учтены.</w:t>
+      </w:r>
+    </w:p>
+    <w:p>
+      <w:pPr>
+        <w:pStyle w:val="31"/>
+      </w:pPr>
+      <w:bookmarkStart w:id="40" w:name="_Toc242103517"/>
+      <w:r>
+        <w:t>4.2.9 Подсистема «Интеграция с партнёрами»</w:t>
+      </w:r>
+      <w:bookmarkEnd w:id="40"/>
+    </w:p>
+    <w:p>
+      <w:r>
+        <w:t>Подсистема должна обеспечивать выдачу партнёрам по API-ключу сведений о проектах, домах и планировках и приём заявок; отказ от создания дубля заявки при повторной отправке формы в течение 24 ч; управление API-ключами (создание, изменение, отключение, перевыпуск, показ ключа один раз при выдаче).</w:t>
+      </w:r>
+    </w:p>
+    <w:p>
+      <w:pPr>
+        <w:pStyle w:val="31"/>
+      </w:pPr>
+      <w:bookmarkStart w:id="41" w:name="_Toc242103518"/>
+      <w:r>
+        <w:t>4.2.10 Подсистема «Регламентные задания»</w:t>
+      </w:r>
+      <w:bookmarkEnd w:id="41"/>
+    </w:p>
+    <w:p>
+      <w:r>
+        <w:t>Подсистема должна не реже одного раза в час выполнять: перевод неоплаченных платежей с прошедшим сроком в статус «Просрочен»; отмену сделок в статусе «Бронь» с истёкшей датой окончания брони и возврат объектов в продажу; закрытие встреч, просроченных более чем на 7 дней, результатом «Не состоялась»; загрузку курсов валют ЦБ Узбекистана.</w:t>
       </w:r>
     </w:p>
     <w:p>
       <w:pPr>
         <w:pStyle w:val="21"/>
       </w:pPr>
-      <w:bookmarkStart w:id="31" w:name="_Toc241772088"/>
-      <w:r>
-        <w:t>4.2 Требования к функциям, выполняемым системой</w:t>
-      </w:r>
-      <w:bookmarkEnd w:id="31"/>
-    </w:p>
-    <w:p>
-      <w:r>
-        <w:t>Перечень функций приводится ниже по подсистемам. Подробное описание функций, входной и выходной информации и правил обработки приводится в документе «Описание автоматизированных функций».</w:t>
-      </w:r>
+      <w:bookmarkStart w:id="42" w:name="_Toc242103519"/>
+      <w:r>
+        <w:t>4.3 Требования к видам обеспечения</w:t>
+      </w:r>
+      <w:bookmarkEnd w:id="42"/>
     </w:p>
     <w:p>
       <w:pPr>
         <w:pStyle w:val="31"/>
       </w:pPr>
-      <w:bookmarkStart w:id="32" w:name="_Toc241772089"/>
+      <w:bookmarkStart w:id="43" w:name="_Toc242103520"/>
+      <w:r>
+        <w:t>4.3.1 Требования к математическому обеспечению</w:t>
+      </w:r>
+      <w:bookmarkEnd w:id="43"/>
+    </w:p>
+    <w:p>
+      <w:r>
+        <w:t>Специальные математические методы не применяются. Расчёт показателей выполняется по правилам:</w:t>
+      </w:r>
+    </w:p>
+    <w:p>
+      <w:r>
+        <w:t>– процент выполнения плана: факт / план × 100;</w:t>
+      </w:r>
+    </w:p>
+    <w:p>
+      <w:r>
+        <w:t>– прогноз к концу периода: факт / число прошедших дней периода × число дней периода; процент прогноза: прогноз / план × 100;</w:t>
+      </w:r>
+    </w:p>
+    <w:p>
+      <w:r>
+        <w:t>– продажи месяца учитываются по дате закрытия сделки;</w:t>
+      </w:r>
+    </w:p>
+    <w:p>
       <w:r>
         <w:lastRenderedPageBreak/>
-        <w:t>4.2.1 Подсистема «Организационная структура и права доступа»</w:t>
-      </w:r>
-      <w:bookmarkEnd w:id="32"/>
-    </w:p>
-    <w:p>
-      <w:r>
-        <w:t>Подсистема должна обеспечивать:</w:t>
-      </w:r>
-    </w:p>
-    <w:p>
-      <w:r>
-        <w:t>– ведение компаний, иерархии отделов, учётных записей пользователей и их профилей (компания, отдел, должность, роли);</w:t>
-      </w:r>
-    </w:p>
-    <w:p>
-      <w:r>
-        <w:t>– ведение ролей как наборов разрешений; разрешение задаётся сочетанием действия (просмотр, добавление, редактирование, удаление, экспорт, импорт, утверждение, назначение и специальные действия над задачами), ресурса и области видимости (свои записи, отдел, компания, вся система);</w:t>
-      </w:r>
-    </w:p>
-    <w:p>
-      <w:r>
-        <w:t>– наличие типовых ролей: системный администратор, администратор компании, руководитель отдела, менеджер, наблюдатель; защиту типовых ролей от изменения;</w:t>
-      </w:r>
-    </w:p>
-    <w:p>
-      <w:r>
-        <w:t>– блокировку, деактивацию и мягкое удаление пользователей с сохранением авторства записей;</w:t>
-      </w:r>
-    </w:p>
-    <w:p>
-      <w:r>
-        <w:t>– смену пароля администратором и самостоятельное восстановление пароля по электронной почте;</w:t>
-      </w:r>
-    </w:p>
-    <w:p>
-      <w:r>
-        <w:t>– журнал изменений ролей и прав.</w:t>
+        <w:t>– пересчёт суммы из одной валюты в другую выполняется через узбекский сум: сумма × курс исходной валюты / курс валюты назначения, где курс — число сумов за единицу валюты; кросс-курс в вычислении не округляется, результат округляется до 0,01 по правилу «половина вверх»;</w:t>
+      </w:r>
+    </w:p>
+    <w:p>
+      <w:r>
+        <w:t>– для пересчёта на дату берётся последний курс не позже этой даты; ручной курс компании на ту же дату имеет приоритет над курсом ЦБ.</w:t>
       </w:r>
     </w:p>
     <w:p>
       <w:pPr>
         <w:pStyle w:val="31"/>
       </w:pPr>
-      <w:bookmarkStart w:id="33" w:name="_Toc241772090"/>
-      <w:r>
-        <w:t>4.2.2 Подсистема «Каталог недвижимости»</w:t>
-      </w:r>
-      <w:bookmarkEnd w:id="33"/>
-    </w:p>
-    <w:p>
-      <w:r>
-        <w:t>Подсистема должна обеспечивать:</w:t>
-      </w:r>
-    </w:p>
-    <w:p>
-      <w:r>
-        <w:t>– ведение проектов (ЖК) с описанием, УТП, юридической информацией, реквизитами застройщика и галереей;</w:t>
-      </w:r>
-    </w:p>
-    <w:p>
-      <w:r>
-        <w:t>– ведение домов проекта с этажностью, типом, датой старта продаж и галереей;</w:t>
-      </w:r>
-    </w:p>
-    <w:p>
-      <w:r>
-        <w:t>– загрузку и обновление объектов дома из XLSX-шаблона; уникальность номера объекта в пределах дома; запрет изменения загрузкой объектов, занятых сделкой;</w:t>
-      </w:r>
-    </w:p>
-    <w:p>
-      <w:r>
-        <w:t>– ведение планировок с четырьмя изображениями и их массовую загрузку по имени файла;</w:t>
-      </w:r>
-    </w:p>
-    <w:p>
-      <w:r>
-        <w:t>– отображение объектов дома в виде шахматки со статусами: подбор, резерв, бронь, сделка в работе, сделка проведена;</w:t>
-      </w:r>
-    </w:p>
-    <w:p>
-      <w:r>
-        <w:t>– вывод объекта из продажи (резерв) и возврат в продажу;</w:t>
-      </w:r>
-    </w:p>
-    <w:p>
-      <w:r>
-        <w:t>– ведение скидок с процентом, сроком действия и ограничениями по типу объекта и домам.</w:t>
+      <w:bookmarkStart w:id="44" w:name="_Toc242103521"/>
+      <w:r>
+        <w:t>4.3.2 Требования к информационному обеспечению</w:t>
+      </w:r>
+      <w:bookmarkEnd w:id="44"/>
+    </w:p>
+    <w:p>
+      <w:r>
+        <w:t>Данные системы должны храниться в одной реляционной БД. Структура БД должна изменяться только миграциями, хранящимися вместе с исходными текстами. Классификаторы (статусы, типы, валюты) должны задаваться в программе кодами латиницей; наименования для пользователя — через файлы локализации. Состав и структура данных приводятся в документе «Описание информационного обеспечения системы».</w:t>
       </w:r>
     </w:p>
     <w:p>
       <w:pPr>
         <w:pStyle w:val="31"/>
       </w:pPr>
-      <w:bookmarkStart w:id="34" w:name="_Toc241772091"/>
-      <w:r>
-        <w:t>4.2.3 Подсистема «Работа с клиентами»</w:t>
-      </w:r>
-      <w:bookmarkEnd w:id="34"/>
-    </w:p>
-    <w:p>
-      <w:r>
-        <w:t>Подсистема должна обеспечивать:</w:t>
-      </w:r>
-    </w:p>
-    <w:p>
+      <w:bookmarkStart w:id="45" w:name="_Toc242103522"/>
+      <w:r>
+        <w:t>4.3.3 Требования к лингвистическому обеспечению</w:t>
+      </w:r>
+      <w:bookmarkEnd w:id="45"/>
+    </w:p>
+    <w:p>
+      <w:r>
+        <w:t>Языки программирования: Python (серверная часть), TypeScript (клиентская часть), SQL (через средства отображения моделей). Интерфейс пользователя — на русском, английском и узбекском языках; все надписи интерфейса должны браться из файлов локализации.</w:t>
+      </w:r>
+    </w:p>
+    <w:p>
+      <w:pPr>
+        <w:pStyle w:val="31"/>
+      </w:pPr>
+      <w:bookmarkStart w:id="46" w:name="_Toc242103523"/>
+      <w:r>
+        <w:t>4.3.4 Требования к программному обеспечению</w:t>
+      </w:r>
+      <w:bookmarkEnd w:id="46"/>
+    </w:p>
+    <w:p>
+      <w:r>
+        <w:t>Система должна функционировать на следующем ПО: ОС семейства Linux на сервере, Docker и Docker Compose, PostgreSQL 16, Redis 7, nginx; в серверной части — Python 3.12, Django 5.2, Django REST framework; клиентская часть — React 19, MUI, TypeScript. На рабочих местах — актуальные версии браузеров Google Chrome, Microsoft Edge, Mozilla Firefox, Safari. Состав ПО приводится в документе «Описание программного обеспечения».</w:t>
+      </w:r>
+    </w:p>
+    <w:p>
+      <w:pPr>
+        <w:pStyle w:val="31"/>
+      </w:pPr>
+      <w:bookmarkStart w:id="47" w:name="_Toc242103524"/>
+      <w:r>
+        <w:t>4.3.5 Требования к техническому обеспечению</w:t>
+      </w:r>
+      <w:bookmarkEnd w:id="47"/>
+    </w:p>
+    <w:p>
+      <w:r>
+        <w:t>Минимальная конфигурация сервера: 2 процессорных ядра, 4 ГБ оперативной памяти, 40 ГБ дискового пространства плюс объём для файлов и резервных копий; постоянный IP-адрес или доменное имя; доступ из сети Интернет по портам 80 и 443. Рабочее место пользователя — любое устройство с современным браузером и доступом к сети Интернет.</w:t>
+      </w:r>
+    </w:p>
+    <w:p>
+      <w:pPr>
+        <w:pStyle w:val="31"/>
+      </w:pPr>
+      <w:bookmarkStart w:id="48" w:name="_Toc242103525"/>
       <w:r>
         <w:lastRenderedPageBreak/>
-        <w:t>– ведение карточек клиентов с личными и паспортными данными, несколькими телефонами и файлами; приведение телефонов к единому виду; уникальность адреса электронной почты в пределах компании; перевод в архив вместо удаления;</w:t>
-      </w:r>
-    </w:p>
-    <w:p>
-      <w:r>
-        <w:t>– ведение заявок с источником, интересами клиента и статусами воронки; обязательное указание причины при статусах «Отказ» и «Нецелевая»; запрет редактирования закрытой заявки; мягкое удаление и восстановление;</w:t>
-      </w:r>
-    </w:p>
-    <w:p>
-      <w:r>
-        <w:t>– представление заявок списком и канбан-доской;</w:t>
-      </w:r>
-    </w:p>
-    <w:p>
-      <w:r>
-        <w:t>– ведение встреч с исполнителем, плановой датой и результатом; признак просрочки; мягкое удаление и восстановление;</w:t>
-      </w:r>
-    </w:p>
-    <w:p>
-      <w:r>
-        <w:t>– ведение справочников статусов заявок, причин отказа и нецелевых обращений, точных источников.</w:t>
+        <w:t>4.3.6 Требования к метрологическому обеспечению</w:t>
+      </w:r>
+      <w:bookmarkEnd w:id="48"/>
+    </w:p>
+    <w:p>
+      <w:r>
+        <w:t>Требования не предъявляются.</w:t>
       </w:r>
     </w:p>
     <w:p>
       <w:pPr>
         <w:pStyle w:val="31"/>
       </w:pPr>
-      <w:bookmarkStart w:id="35" w:name="_Toc241772092"/>
-      <w:r>
-        <w:t>4.2.4 Подсистема «Сделки»</w:t>
-      </w:r>
-      <w:bookmarkEnd w:id="35"/>
-    </w:p>
-    <w:p>
-      <w:r>
-        <w:t>Подсистема должна обеспечивать:</w:t>
-      </w:r>
-    </w:p>
-    <w:p>
-      <w:r>
-        <w:t>– создание брони по объекту в статусе «Подбор» или «Резерв» с фиксацией цены объекта на момент брони; запрет второй сделки по объекту, у которого есть сделка в статусе «Бронь», «В работе» или «Успешно закрыта»;</w:t>
-      </w:r>
-    </w:p>
-    <w:p>
-      <w:r>
-        <w:t>– ведение сделки по четырём последовательным шагам: информация, условия, график платежей, документы;</w:t>
-      </w:r>
-    </w:p>
-    <w:p>
-      <w:r>
-        <w:t>– применение только тех скидок, которые действуют для объекта на текущую дату; ограничение суммы скидок 100 % и стоимости по договору ценой со скидками;</w:t>
-      </w:r>
-    </w:p>
-    <w:p>
-      <w:r>
-        <w:t>– уникальность номера договора в пределах компании;</w:t>
-      </w:r>
-    </w:p>
-    <w:p>
-      <w:r>
-        <w:t>– автоматическую смену статусов сделки и объекта по факту действий: сохранение графика — «В работе»; заполнение обеих дат подписания — «Успешно закрыта» с закрытием связанной заявки;</w:t>
-      </w:r>
-    </w:p>
-    <w:p>
-      <w:r>
-        <w:t>– отмену сделки без платежей и подписи клиента с указанием причины и расторжение сделки с документом-основанием при наличии платежей или подписи; перевод оплаченных платежей в статус «К возврату»; освобождение объекта после завершения возвратов; возврат связанной заявки в работу.</w:t>
+      <w:bookmarkStart w:id="49" w:name="_Toc242103526"/>
+      <w:r>
+        <w:t>4.3.7 Требования к организационному обеспечению</w:t>
+      </w:r>
+      <w:bookmarkEnd w:id="49"/>
+    </w:p>
+    <w:p>
+      <w:r>
+        <w:t>Заказчик назначает администратора системы в каждой компании и ответственного за сервер. Порядок выдачи прав доступа, увольнения сотрудников и выдачи API-ключей партнёрам устанавливается распорядительным документом заказчика с учётом рекомендаций руководства администратора.</w:t>
       </w:r>
     </w:p>
     <w:p>
       <w:pPr>
         <w:pStyle w:val="31"/>
       </w:pPr>
-      <w:bookmarkStart w:id="36" w:name="_Toc241772093"/>
-      <w:r>
-        <w:t>4.2.5 Подсистема «Финансы»</w:t>
-      </w:r>
-      <w:bookmarkEnd w:id="36"/>
-    </w:p>
-    <w:p>
-      <w:r>
-        <w:t>Подсистема должна обеспечивать:</w:t>
-      </w:r>
-    </w:p>
-    <w:p>
-      <w:r>
-        <w:t>– создание и изменение графика платежей только в составе сделки; равенство суммы графика стоимости по договору; единую валюту графика и договора;</w:t>
-      </w:r>
-    </w:p>
-    <w:p>
-      <w:r>
-        <w:t>– сохранение проведённых платежей при изменении графика и запрет их удаления;</w:t>
-      </w:r>
-    </w:p>
-    <w:p>
-      <w:r>
-        <w:lastRenderedPageBreak/>
-        <w:t>– отметку оплаты текущей датой и её отмену; запрет оплаты по отменённой или расторгнутой сделке;</w:t>
-      </w:r>
-    </w:p>
-    <w:p>
-      <w:r>
-        <w:t>– автоматический перевод платежей в статус «Просрочен»;</w:t>
-      </w:r>
-    </w:p>
-    <w:p>
-      <w:r>
-        <w:t>– отметку возврата платежей в статусе «К возврату»;</w:t>
-      </w:r>
-    </w:p>
-    <w:p>
-      <w:r>
-        <w:t>– список платежей с фильтрами по плановой и фактической дате, сводную таблицу с группировкой и выгрузку в Excel; итоги по каждой валюте отдельно.</w:t>
-      </w:r>
-    </w:p>
-    <w:p>
-      <w:pPr>
-        <w:pStyle w:val="31"/>
-      </w:pPr>
-      <w:bookmarkStart w:id="37" w:name="_Toc241772094"/>
-      <w:r>
-        <w:t>4.2.6 Подсистема «Шаблоны документов»</w:t>
-      </w:r>
-      <w:bookmarkEnd w:id="37"/>
-    </w:p>
-    <w:p>
-      <w:r>
-        <w:t>Подсистема должна обеспечивать хранение шаблонов договоров в формате DOCX с областью применения (проекты, дома, типы объектов) и формирование документа по сделке с подстановкой данных клиента, объекта, дома, проекта, сделки и менеджера. Формирование должно быть доступно после сохранения номера и даты договора и недоступно для отменённых и расторгнутых сделок.</w:t>
-      </w:r>
-    </w:p>
-    <w:p>
-      <w:pPr>
-        <w:pStyle w:val="31"/>
-      </w:pPr>
-      <w:bookmarkStart w:id="38" w:name="_Toc241772095"/>
-      <w:r>
-        <w:t>4.2.7 Подсистема «Задачи»</w:t>
-      </w:r>
-      <w:bookmarkEnd w:id="38"/>
-    </w:p>
-    <w:p>
-      <w:r>
-        <w:t>Подсистема должна обеспечивать постановку задач с исполнителем, сроком, приоритетом, наблюдателями, тегами и оценкой времени; подзадачи; комментарии; статусы «Новая», «В работе», «На проверке», «Завершена», «Отменена», «Заблокирована»; запрет завершения задачи при открытых подзадачах; представления списком, канбан-доской и календарём; журнал изменений.</w:t>
-      </w:r>
-    </w:p>
-    <w:p>
-      <w:pPr>
-        <w:pStyle w:val="31"/>
-      </w:pPr>
-      <w:bookmarkStart w:id="39" w:name="_Toc241772096"/>
-      <w:r>
-        <w:t>4.2.8 Подсистема «Аналитика и отчётность»</w:t>
-      </w:r>
-      <w:bookmarkEnd w:id="39"/>
-    </w:p>
-    <w:p>
-      <w:r>
-        <w:t>Подсистема должна обеспечивать:</w:t>
-      </w:r>
-    </w:p>
-    <w:p>
-      <w:r>
-        <w:t>– дашборд с показателями дня и месяца в пределах области видимости пользователя;</w:t>
-      </w:r>
-    </w:p>
-    <w:p>
-      <w:r>
-        <w:t>– сводные таблицы по заявкам, встречам, сделкам и платежам с группировкой и выгрузкой в Excel; отбор «забытых» заявок и просроченных встреч;</w:t>
-      </w:r>
-    </w:p>
-    <w:p>
-      <w:r>
-        <w:t>– загрузку планов продаж по проектам и по сотрудникам из XLSX-шаблонов;</w:t>
-      </w:r>
-    </w:p>
-    <w:p>
-      <w:r>
-        <w:t>– отчёты «план-факт» по количеству, контрактации и поступлениям с процентом выполнения и прогнозом выполнения к концу периода.</w:t>
-      </w:r>
-    </w:p>
-    <w:p>
-      <w:pPr>
-        <w:pStyle w:val="31"/>
-      </w:pPr>
-      <w:bookmarkStart w:id="40" w:name="_Toc241772097"/>
-      <w:r>
-        <w:t>4.2.9 Подсистема «Интеграция с партнёрами»</w:t>
-      </w:r>
-      <w:bookmarkEnd w:id="40"/>
-    </w:p>
-    <w:p>
-      <w:r>
-        <w:t>Подсистема должна обеспечивать выдачу партнёрам по API-ключу сведений о проектах, домах и планировках и приём заявок; отказ от создания дубля заявки при повторной отправке формы в течение 24 ч; управление API-ключами (создание, изменение, отключение, перевыпуск, показ ключа один раз при выдаче).</w:t>
-      </w:r>
-    </w:p>
-    <w:p>
-      <w:pPr>
-        <w:pStyle w:val="31"/>
-      </w:pPr>
-      <w:bookmarkStart w:id="41" w:name="_Toc241772098"/>
-      <w:r>
-        <w:lastRenderedPageBreak/>
-        <w:t>4.2.10 Подсистема «Регламентные задания»</w:t>
-      </w:r>
-      <w:bookmarkEnd w:id="41"/>
-    </w:p>
-    <w:p>
-      <w:r>
-        <w:t>Подсистема должна не реже одного раза в час выполнять: перевод неоплаченных платежей с прошедшим сроком в статус «Просрочен»; отмену сделок в статусе «Бронь» с истёкшей датой окончания брони и возврат объектов в продажу; закрытие встреч, просроченных более чем на 7 дней, результатом «Не состоялась».</w:t>
-      </w:r>
-    </w:p>
-    <w:p>
-      <w:pPr>
-        <w:pStyle w:val="21"/>
-      </w:pPr>
-      <w:bookmarkStart w:id="42" w:name="_Toc241772099"/>
-      <w:r>
-        <w:t>4.3 Требования к видам обеспечения</w:t>
-      </w:r>
-      <w:bookmarkEnd w:id="42"/>
-    </w:p>
-    <w:p>
-      <w:pPr>
-        <w:pStyle w:val="31"/>
-      </w:pPr>
-      <w:bookmarkStart w:id="43" w:name="_Toc241772100"/>
-      <w:r>
-        <w:t>4.3.1 Требования к математическому обеспечению</w:t>
-      </w:r>
-      <w:bookmarkEnd w:id="43"/>
-    </w:p>
-    <w:p>
-      <w:r>
-        <w:t>Специальные математические методы не применяются. Расчёт показателей выполняется по правилам:</w:t>
-      </w:r>
-    </w:p>
-    <w:p>
-      <w:r>
-        <w:t>– процент выполнения плана: факт / план × 100;</w:t>
-      </w:r>
-    </w:p>
-    <w:p>
-      <w:r>
-        <w:t>– прогноз к концу периода: факт / число прошедших дней периода × число дней периода; процент прогноза: прогноз / план × 100;</w:t>
-      </w:r>
-    </w:p>
-    <w:p>
-      <w:r>
-        <w:t>– продажи месяца учитываются по дате закрытия сделки.</w:t>
-      </w:r>
-    </w:p>
-    <w:p>
-      <w:pPr>
-        <w:pStyle w:val="31"/>
-      </w:pPr>
-      <w:bookmarkStart w:id="44" w:name="_Toc241772101"/>
-      <w:r>
-        <w:t>4.3.2 Требования к информационному обеспечению</w:t>
-      </w:r>
-      <w:bookmarkEnd w:id="44"/>
-    </w:p>
-    <w:p>
-      <w:r>
-        <w:t>Данные системы должны храниться в одной реляционной БД. Структура БД должна изменяться только миграциями, хранящимися вместе с исходными текстами. Классификаторы (статусы, типы, валюты) должны задаваться в программе кодами латиницей; наименования для пользователя — через файлы локализации. Состав и структура данных приводятся в документе «Описание информационного обеспечения системы».</w:t>
-      </w:r>
-    </w:p>
-    <w:p>
-      <w:pPr>
-        <w:pStyle w:val="31"/>
-      </w:pPr>
-      <w:bookmarkStart w:id="45" w:name="_Toc241772102"/>
-      <w:r>
-        <w:t>4.3.3 Требования к лингвистическому обеспечению</w:t>
-      </w:r>
-      <w:bookmarkEnd w:id="45"/>
-    </w:p>
-    <w:p>
-      <w:r>
-        <w:t>Языки программирования: Python (серверная часть), TypeScript (клиентская часть), SQL (через средства отображения моделей). Интерфейс пользователя — на русском, английском и узбекском языках; все надписи интерфейса должны браться из файлов локализации.</w:t>
-      </w:r>
-    </w:p>
-    <w:p>
-      <w:pPr>
-        <w:pStyle w:val="31"/>
-      </w:pPr>
-      <w:bookmarkStart w:id="46" w:name="_Toc241772103"/>
-      <w:r>
-        <w:t>4.3.4 Требования к программному обеспечению</w:t>
-      </w:r>
-      <w:bookmarkEnd w:id="46"/>
-    </w:p>
-    <w:p>
-      <w:r>
-        <w:t>Система должна функционировать на следующем ПО: ОС семейства Linux на сервере, Docker и Docker Compose, PostgreSQL 16, Redis 7, nginx; в серверной части — Python 3.12, Django 5.2, Django REST framework; клиентская часть — React 19, MUI, TypeScript. На рабочих местах — актуальные версии браузеров Google Chrome, Microsoft Edge, Mozilla Firefox, Safari. Состав ПО приводится в документе «Описание программного обеспечения».</w:t>
-      </w:r>
-    </w:p>
-    <w:p>
-      <w:pPr>
-        <w:pStyle w:val="31"/>
-      </w:pPr>
-      <w:bookmarkStart w:id="47" w:name="_Toc241772104"/>
-      <w:r>
-        <w:lastRenderedPageBreak/>
-        <w:t>4.3.5 Требования к техническому обеспечению</w:t>
-      </w:r>
-      <w:bookmarkEnd w:id="47"/>
-    </w:p>
-    <w:p>
-      <w:r>
-        <w:t>Минимальная конфигурация сервера: 2 процессорных ядра, 4 ГБ оперативной памяти, 40 ГБ дискового пространства плюс объём для файлов и резервных копий; постоянный IP-адрес или доменное имя; доступ из сети Интернет по портам 80 и 443. Рабочее место пользователя — любое устройство с современным браузером и доступом к сети Интернет.</w:t>
-      </w:r>
-    </w:p>
-    <w:p>
-      <w:pPr>
-        <w:pStyle w:val="31"/>
-      </w:pPr>
-      <w:bookmarkStart w:id="48" w:name="_Toc241772105"/>
-      <w:r>
-        <w:t>4.3.6 Требования к метрологическому обеспечению</w:t>
-      </w:r>
-      <w:bookmarkEnd w:id="48"/>
-    </w:p>
-    <w:p>
-      <w:r>
-        <w:t>Требования не предъявляются.</w:t>
-      </w:r>
-    </w:p>
-    <w:p>
-      <w:pPr>
-        <w:pStyle w:val="31"/>
-      </w:pPr>
-      <w:bookmarkStart w:id="49" w:name="_Toc241772106"/>
-      <w:r>
-        <w:t>4.3.7 Требования к организационному обеспечению</w:t>
-      </w:r>
-      <w:bookmarkEnd w:id="49"/>
-    </w:p>
-    <w:p>
-      <w:r>
-        <w:t>Заказчик назначает администратора системы в каждой компании и ответственного за сервер. Порядок выдачи прав доступа, увольнения сотрудников и выдачи API-ключей партнёрам устанавливается распорядительным документом заказчика с учётом рекомендаций руководства администратора.</w:t>
-      </w:r>
-    </w:p>
-    <w:p>
-      <w:pPr>
-        <w:pStyle w:val="31"/>
-      </w:pPr>
-      <w:bookmarkStart w:id="50" w:name="_Toc241772107"/>
+      <w:bookmarkStart w:id="50" w:name="_Toc242103527"/>
       <w:r>
         <w:t>4.3.8 Требования к методическому обеспечению</w:t>
       </w:r>
@@ -8003,7 +8029,7 @@
         <w:pStyle w:val="1"/>
         <w:pageBreakBefore/>
       </w:pPr>
-      <w:bookmarkStart w:id="51" w:name="_Toc241772108"/>
+      <w:bookmarkStart w:id="51" w:name="_Toc242103528"/>
       <w:r>
         <w:lastRenderedPageBreak/>
         <w:t>5 Состав и содержание работ по созданию системы</w:t>
@@ -8325,7 +8351,7 @@
         <w:pStyle w:val="1"/>
         <w:pageBreakBefore/>
       </w:pPr>
-      <w:bookmarkStart w:id="52" w:name="_Toc241772109"/>
+      <w:bookmarkStart w:id="52" w:name="_Toc242103529"/>
       <w:r>
         <w:lastRenderedPageBreak/>
         <w:t>6 Порядок разработки автоматизированной системы</w:t>
@@ -8372,7 +8398,7 @@
         <w:pStyle w:val="1"/>
         <w:pageBreakBefore/>
       </w:pPr>
-      <w:bookmarkStart w:id="53" w:name="_Toc241772110"/>
+      <w:bookmarkStart w:id="53" w:name="_Toc242103530"/>
       <w:r>
         <w:lastRenderedPageBreak/>
         <w:t>7 Порядок контроля и приёмки автоматизированной системы</w:t>
@@ -8389,7 +8415,7 @@
         <w:pStyle w:val="1"/>
         <w:pageBreakBefore/>
       </w:pPr>
-      <w:bookmarkStart w:id="54" w:name="_Toc241772111"/>
+      <w:bookmarkStart w:id="54" w:name="_Toc242103531"/>
       <w:r>
         <w:lastRenderedPageBreak/>
         <w:t>8 Требования к составу и содержанию работ по подготовке объекта автоматизации к вводу системы в действие</w:t>
@@ -8451,7 +8477,7 @@
         <w:pStyle w:val="1"/>
         <w:pageBreakBefore/>
       </w:pPr>
-      <w:bookmarkStart w:id="55" w:name="_Toc241772112"/>
+      <w:bookmarkStart w:id="55" w:name="_Toc242103532"/>
       <w:r>
         <w:lastRenderedPageBreak/>
         <w:t>9 Требования к документированию</w:t>
@@ -9093,7 +9119,7 @@
         <w:pStyle w:val="1"/>
         <w:pageBreakBefore/>
       </w:pPr>
-      <w:bookmarkStart w:id="56" w:name="_Toc241772113"/>
+      <w:bookmarkStart w:id="56" w:name="_Toc242103533"/>
       <w:r>
         <w:lastRenderedPageBreak/>
         <w:t>10 Источники разработки</w:t>
@@ -9132,7 +9158,7 @@
         <w:ind w:firstLine="0"/>
         <w:jc w:val="center"/>
       </w:pPr>
-      <w:bookmarkStart w:id="57" w:name="_Toc241772114"/>
+      <w:bookmarkStart w:id="57" w:name="_Toc242103534"/>
       <w:r>
         <w:lastRenderedPageBreak/>
         <w:t>ЛИСТ РЕГИСТРАЦИИ ИЗМЕНЕНИЙ</w:t>
@@ -11194,31 +11220,31 @@
       </w:rPr>
     </w:lvl>
   </w:abstractNum>
-  <w:num w:numId="1" w16cid:durableId="1236090109">
+  <w:num w:numId="1" w16cid:durableId="151650442">
     <w:abstractNumId w:val="8"/>
   </w:num>
-  <w:num w:numId="2" w16cid:durableId="1871215705">
+  <w:num w:numId="2" w16cid:durableId="1128812841">
     <w:abstractNumId w:val="6"/>
   </w:num>
-  <w:num w:numId="3" w16cid:durableId="1499343368">
+  <w:num w:numId="3" w16cid:durableId="1710567287">
     <w:abstractNumId w:val="5"/>
   </w:num>
-  <w:num w:numId="4" w16cid:durableId="604462527">
+  <w:num w:numId="4" w16cid:durableId="1385982476">
     <w:abstractNumId w:val="4"/>
   </w:num>
-  <w:num w:numId="5" w16cid:durableId="1619606997">
+  <w:num w:numId="5" w16cid:durableId="1911846907">
     <w:abstractNumId w:val="7"/>
   </w:num>
-  <w:num w:numId="6" w16cid:durableId="246616466">
+  <w:num w:numId="6" w16cid:durableId="628123030">
     <w:abstractNumId w:val="3"/>
   </w:num>
-  <w:num w:numId="7" w16cid:durableId="508643946">
+  <w:num w:numId="7" w16cid:durableId="669989270">
     <w:abstractNumId w:val="2"/>
   </w:num>
-  <w:num w:numId="8" w16cid:durableId="1879052454">
+  <w:num w:numId="8" w16cid:durableId="1630552290">
     <w:abstractNumId w:val="1"/>
   </w:num>
-  <w:num w:numId="9" w16cid:durableId="627666943">
+  <w:num w:numId="9" w16cid:durableId="912083008">
     <w:abstractNumId w:val="0"/>
   </w:num>
 </w:numbering>
@@ -22751,7 +22777,7 @@
     <w:autoRedefine/>
     <w:uiPriority w:val="39"/>
     <w:unhideWhenUsed/>
-    <w:rsid w:val="00BC7542"/>
+    <w:rsid w:val="00D91EB3"/>
     <w:pPr>
       <w:spacing w:after="100"/>
     </w:pPr>
@@ -22763,7 +22789,7 @@
     <w:autoRedefine/>
     <w:uiPriority w:val="39"/>
     <w:unhideWhenUsed/>
-    <w:rsid w:val="00BC7542"/>
+    <w:rsid w:val="00D91EB3"/>
     <w:pPr>
       <w:spacing w:after="100"/>
       <w:ind w:left="240"/>
@@ -22776,7 +22802,7 @@
     <w:autoRedefine/>
     <w:uiPriority w:val="39"/>
     <w:unhideWhenUsed/>
-    <w:rsid w:val="00BC7542"/>
+    <w:rsid w:val="00D91EB3"/>
     <w:pPr>
       <w:spacing w:after="100"/>
       <w:ind w:left="480"/>
@@ -22787,7 +22813,7 @@
     <w:basedOn w:val="a2"/>
     <w:uiPriority w:val="99"/>
     <w:unhideWhenUsed/>
-    <w:rsid w:val="00BC7542"/>
+    <w:rsid w:val="00D91EB3"/>
     <w:rPr>
       <w:color w:val="0000FF" w:themeColor="hyperlink"/>
       <w:u w:val="single"/>

</xml_diff>

<commit_message>
Fix roles and docs
</commit_message>
<xml_diff>
--- a/docs/gost/out/01_ТЗ_Техническое_задание.docx
+++ b/docs/gost/out/01_ТЗ_Техническое_задание.docx
@@ -306,7 +306,7 @@
       <w:r>
         <w:fldChar w:fldCharType="separate"/>
       </w:r>
-      <w:hyperlink w:anchor="_Toc242103477" w:history="1">
+      <w:hyperlink w:anchor="_Toc242105380" w:history="1">
         <w:r>
           <w:rPr>
             <w:rStyle w:val="aff8"/>
@@ -333,7 +333,7 @@
             <w:noProof/>
             <w:webHidden/>
           </w:rPr>
-          <w:instrText xml:space="preserve"> PAGEREF _Toc242103477 \h </w:instrText>
+          <w:instrText xml:space="preserve"> PAGEREF _Toc242105380 \h </w:instrText>
         </w:r>
         <w:r>
           <w:rPr>
@@ -379,7 +379,7 @@
           <w14:ligatures w14:val="standardContextual"/>
         </w:rPr>
       </w:pPr>
-      <w:hyperlink w:anchor="_Toc242103478" w:history="1">
+      <w:hyperlink w:anchor="_Toc242105381" w:history="1">
         <w:r>
           <w:rPr>
             <w:rStyle w:val="aff8"/>
@@ -406,7 +406,7 @@
             <w:noProof/>
             <w:webHidden/>
           </w:rPr>
-          <w:instrText xml:space="preserve"> PAGEREF _Toc242103478 \h </w:instrText>
+          <w:instrText xml:space="preserve"> PAGEREF _Toc242105381 \h </w:instrText>
         </w:r>
         <w:r>
           <w:rPr>
@@ -452,7 +452,7 @@
           <w14:ligatures w14:val="standardContextual"/>
         </w:rPr>
       </w:pPr>
-      <w:hyperlink w:anchor="_Toc242103479" w:history="1">
+      <w:hyperlink w:anchor="_Toc242105382" w:history="1">
         <w:r>
           <w:rPr>
             <w:rStyle w:val="aff8"/>
@@ -479,7 +479,7 @@
             <w:noProof/>
             <w:webHidden/>
           </w:rPr>
-          <w:instrText xml:space="preserve"> PAGEREF _Toc242103479 \h </w:instrText>
+          <w:instrText xml:space="preserve"> PAGEREF _Toc242105382 \h </w:instrText>
         </w:r>
         <w:r>
           <w:rPr>
@@ -525,7 +525,7 @@
           <w14:ligatures w14:val="standardContextual"/>
         </w:rPr>
       </w:pPr>
-      <w:hyperlink w:anchor="_Toc242103480" w:history="1">
+      <w:hyperlink w:anchor="_Toc242105383" w:history="1">
         <w:r>
           <w:rPr>
             <w:rStyle w:val="aff8"/>
@@ -552,7 +552,7 @@
             <w:noProof/>
             <w:webHidden/>
           </w:rPr>
-          <w:instrText xml:space="preserve"> PAGEREF _Toc242103480 \h </w:instrText>
+          <w:instrText xml:space="preserve"> PAGEREF _Toc242105383 \h </w:instrText>
         </w:r>
         <w:r>
           <w:rPr>
@@ -598,7 +598,7 @@
           <w14:ligatures w14:val="standardContextual"/>
         </w:rPr>
       </w:pPr>
-      <w:hyperlink w:anchor="_Toc242103481" w:history="1">
+      <w:hyperlink w:anchor="_Toc242105384" w:history="1">
         <w:r>
           <w:rPr>
             <w:rStyle w:val="aff8"/>
@@ -625,7 +625,7 @@
             <w:noProof/>
             <w:webHidden/>
           </w:rPr>
-          <w:instrText xml:space="preserve"> PAGEREF _Toc242103481 \h </w:instrText>
+          <w:instrText xml:space="preserve"> PAGEREF _Toc242105384 \h </w:instrText>
         </w:r>
         <w:r>
           <w:rPr>
@@ -671,7 +671,7 @@
           <w14:ligatures w14:val="standardContextual"/>
         </w:rPr>
       </w:pPr>
-      <w:hyperlink w:anchor="_Toc242103482" w:history="1">
+      <w:hyperlink w:anchor="_Toc242105385" w:history="1">
         <w:r>
           <w:rPr>
             <w:rStyle w:val="aff8"/>
@@ -698,7 +698,7 @@
             <w:noProof/>
             <w:webHidden/>
           </w:rPr>
-          <w:instrText xml:space="preserve"> PAGEREF _Toc242103482 \h </w:instrText>
+          <w:instrText xml:space="preserve"> PAGEREF _Toc242105385 \h </w:instrText>
         </w:r>
         <w:r>
           <w:rPr>
@@ -744,7 +744,7 @@
           <w14:ligatures w14:val="standardContextual"/>
         </w:rPr>
       </w:pPr>
-      <w:hyperlink w:anchor="_Toc242103483" w:history="1">
+      <w:hyperlink w:anchor="_Toc242105386" w:history="1">
         <w:r>
           <w:rPr>
             <w:rStyle w:val="aff8"/>
@@ -771,7 +771,7 @@
             <w:noProof/>
             <w:webHidden/>
           </w:rPr>
-          <w:instrText xml:space="preserve"> PAGEREF _Toc242103483 \h </w:instrText>
+          <w:instrText xml:space="preserve"> PAGEREF _Toc242105386 \h </w:instrText>
         </w:r>
         <w:r>
           <w:rPr>
@@ -817,7 +817,7 @@
           <w14:ligatures w14:val="standardContextual"/>
         </w:rPr>
       </w:pPr>
-      <w:hyperlink w:anchor="_Toc242103484" w:history="1">
+      <w:hyperlink w:anchor="_Toc242105387" w:history="1">
         <w:r>
           <w:rPr>
             <w:rStyle w:val="aff8"/>
@@ -844,7 +844,7 @@
             <w:noProof/>
             <w:webHidden/>
           </w:rPr>
-          <w:instrText xml:space="preserve"> PAGEREF _Toc242103484 \h </w:instrText>
+          <w:instrText xml:space="preserve"> PAGEREF _Toc242105387 \h </w:instrText>
         </w:r>
         <w:r>
           <w:rPr>
@@ -890,7 +890,7 @@
           <w14:ligatures w14:val="standardContextual"/>
         </w:rPr>
       </w:pPr>
-      <w:hyperlink w:anchor="_Toc242103485" w:history="1">
+      <w:hyperlink w:anchor="_Toc242105388" w:history="1">
         <w:r>
           <w:rPr>
             <w:rStyle w:val="aff8"/>
@@ -917,7 +917,7 @@
             <w:noProof/>
             <w:webHidden/>
           </w:rPr>
-          <w:instrText xml:space="preserve"> PAGEREF _Toc242103485 \h </w:instrText>
+          <w:instrText xml:space="preserve"> PAGEREF _Toc242105388 \h </w:instrText>
         </w:r>
         <w:r>
           <w:rPr>
@@ -963,7 +963,7 @@
           <w14:ligatures w14:val="standardContextual"/>
         </w:rPr>
       </w:pPr>
-      <w:hyperlink w:anchor="_Toc242103486" w:history="1">
+      <w:hyperlink w:anchor="_Toc242105389" w:history="1">
         <w:r>
           <w:rPr>
             <w:rStyle w:val="aff8"/>
@@ -990,7 +990,7 @@
             <w:noProof/>
             <w:webHidden/>
           </w:rPr>
-          <w:instrText xml:space="preserve"> PAGEREF _Toc242103486 \h </w:instrText>
+          <w:instrText xml:space="preserve"> PAGEREF _Toc242105389 \h </w:instrText>
         </w:r>
         <w:r>
           <w:rPr>
@@ -1036,7 +1036,7 @@
           <w14:ligatures w14:val="standardContextual"/>
         </w:rPr>
       </w:pPr>
-      <w:hyperlink w:anchor="_Toc242103487" w:history="1">
+      <w:hyperlink w:anchor="_Toc242105390" w:history="1">
         <w:r>
           <w:rPr>
             <w:rStyle w:val="aff8"/>
@@ -1063,7 +1063,7 @@
             <w:noProof/>
             <w:webHidden/>
           </w:rPr>
-          <w:instrText xml:space="preserve"> PAGEREF _Toc242103487 \h </w:instrText>
+          <w:instrText xml:space="preserve"> PAGEREF _Toc242105390 \h </w:instrText>
         </w:r>
         <w:r>
           <w:rPr>
@@ -1109,7 +1109,7 @@
           <w14:ligatures w14:val="standardContextual"/>
         </w:rPr>
       </w:pPr>
-      <w:hyperlink w:anchor="_Toc242103488" w:history="1">
+      <w:hyperlink w:anchor="_Toc242105391" w:history="1">
         <w:r>
           <w:rPr>
             <w:rStyle w:val="aff8"/>
@@ -1136,7 +1136,7 @@
             <w:noProof/>
             <w:webHidden/>
           </w:rPr>
-          <w:instrText xml:space="preserve"> PAGEREF _Toc242103488 \h </w:instrText>
+          <w:instrText xml:space="preserve"> PAGEREF _Toc242105391 \h </w:instrText>
         </w:r>
         <w:r>
           <w:rPr>
@@ -1182,7 +1182,7 @@
           <w14:ligatures w14:val="standardContextual"/>
         </w:rPr>
       </w:pPr>
-      <w:hyperlink w:anchor="_Toc242103489" w:history="1">
+      <w:hyperlink w:anchor="_Toc242105392" w:history="1">
         <w:r>
           <w:rPr>
             <w:rStyle w:val="aff8"/>
@@ -1209,7 +1209,7 @@
             <w:noProof/>
             <w:webHidden/>
           </w:rPr>
-          <w:instrText xml:space="preserve"> PAGEREF _Toc242103489 \h </w:instrText>
+          <w:instrText xml:space="preserve"> PAGEREF _Toc242105392 \h </w:instrText>
         </w:r>
         <w:r>
           <w:rPr>
@@ -1255,7 +1255,7 @@
           <w14:ligatures w14:val="standardContextual"/>
         </w:rPr>
       </w:pPr>
-      <w:hyperlink w:anchor="_Toc242103490" w:history="1">
+      <w:hyperlink w:anchor="_Toc242105393" w:history="1">
         <w:r>
           <w:rPr>
             <w:rStyle w:val="aff8"/>
@@ -1282,7 +1282,7 @@
             <w:noProof/>
             <w:webHidden/>
           </w:rPr>
-          <w:instrText xml:space="preserve"> PAGEREF _Toc242103490 \h </w:instrText>
+          <w:instrText xml:space="preserve"> PAGEREF _Toc242105393 \h </w:instrText>
         </w:r>
         <w:r>
           <w:rPr>
@@ -1328,7 +1328,7 @@
           <w14:ligatures w14:val="standardContextual"/>
         </w:rPr>
       </w:pPr>
-      <w:hyperlink w:anchor="_Toc242103491" w:history="1">
+      <w:hyperlink w:anchor="_Toc242105394" w:history="1">
         <w:r>
           <w:rPr>
             <w:rStyle w:val="aff8"/>
@@ -1355,7 +1355,7 @@
             <w:noProof/>
             <w:webHidden/>
           </w:rPr>
-          <w:instrText xml:space="preserve"> PAGEREF _Toc242103491 \h </w:instrText>
+          <w:instrText xml:space="preserve"> PAGEREF _Toc242105394 \h </w:instrText>
         </w:r>
         <w:r>
           <w:rPr>
@@ -1401,7 +1401,7 @@
           <w14:ligatures w14:val="standardContextual"/>
         </w:rPr>
       </w:pPr>
-      <w:hyperlink w:anchor="_Toc242103492" w:history="1">
+      <w:hyperlink w:anchor="_Toc242105395" w:history="1">
         <w:r>
           <w:rPr>
             <w:rStyle w:val="aff8"/>
@@ -1428,7 +1428,7 @@
             <w:noProof/>
             <w:webHidden/>
           </w:rPr>
-          <w:instrText xml:space="preserve"> PAGEREF _Toc242103492 \h </w:instrText>
+          <w:instrText xml:space="preserve"> PAGEREF _Toc242105395 \h </w:instrText>
         </w:r>
         <w:r>
           <w:rPr>
@@ -1474,7 +1474,7 @@
           <w14:ligatures w14:val="standardContextual"/>
         </w:rPr>
       </w:pPr>
-      <w:hyperlink w:anchor="_Toc242103493" w:history="1">
+      <w:hyperlink w:anchor="_Toc242105396" w:history="1">
         <w:r>
           <w:rPr>
             <w:rStyle w:val="aff8"/>
@@ -1501,7 +1501,7 @@
             <w:noProof/>
             <w:webHidden/>
           </w:rPr>
-          <w:instrText xml:space="preserve"> PAGEREF _Toc242103493 \h </w:instrText>
+          <w:instrText xml:space="preserve"> PAGEREF _Toc242105396 \h </w:instrText>
         </w:r>
         <w:r>
           <w:rPr>
@@ -1547,7 +1547,7 @@
           <w14:ligatures w14:val="standardContextual"/>
         </w:rPr>
       </w:pPr>
-      <w:hyperlink w:anchor="_Toc242103494" w:history="1">
+      <w:hyperlink w:anchor="_Toc242105397" w:history="1">
         <w:r>
           <w:rPr>
             <w:rStyle w:val="aff8"/>
@@ -1574,7 +1574,7 @@
             <w:noProof/>
             <w:webHidden/>
           </w:rPr>
-          <w:instrText xml:space="preserve"> PAGEREF _Toc242103494 \h </w:instrText>
+          <w:instrText xml:space="preserve"> PAGEREF _Toc242105397 \h </w:instrText>
         </w:r>
         <w:r>
           <w:rPr>
@@ -1620,7 +1620,7 @@
           <w14:ligatures w14:val="standardContextual"/>
         </w:rPr>
       </w:pPr>
-      <w:hyperlink w:anchor="_Toc242103495" w:history="1">
+      <w:hyperlink w:anchor="_Toc242105398" w:history="1">
         <w:r>
           <w:rPr>
             <w:rStyle w:val="aff8"/>
@@ -1647,7 +1647,7 @@
             <w:noProof/>
             <w:webHidden/>
           </w:rPr>
-          <w:instrText xml:space="preserve"> PAGEREF _Toc242103495 \h </w:instrText>
+          <w:instrText xml:space="preserve"> PAGEREF _Toc242105398 \h </w:instrText>
         </w:r>
         <w:r>
           <w:rPr>
@@ -1693,7 +1693,7 @@
           <w14:ligatures w14:val="standardContextual"/>
         </w:rPr>
       </w:pPr>
-      <w:hyperlink w:anchor="_Toc242103496" w:history="1">
+      <w:hyperlink w:anchor="_Toc242105399" w:history="1">
         <w:r>
           <w:rPr>
             <w:rStyle w:val="aff8"/>
@@ -1720,7 +1720,7 @@
             <w:noProof/>
             <w:webHidden/>
           </w:rPr>
-          <w:instrText xml:space="preserve"> PAGEREF _Toc242103496 \h </w:instrText>
+          <w:instrText xml:space="preserve"> PAGEREF _Toc242105399 \h </w:instrText>
         </w:r>
         <w:r>
           <w:rPr>
@@ -1766,7 +1766,7 @@
           <w14:ligatures w14:val="standardContextual"/>
         </w:rPr>
       </w:pPr>
-      <w:hyperlink w:anchor="_Toc242103497" w:history="1">
+      <w:hyperlink w:anchor="_Toc242105400" w:history="1">
         <w:r>
           <w:rPr>
             <w:rStyle w:val="aff8"/>
@@ -1793,7 +1793,7 @@
             <w:noProof/>
             <w:webHidden/>
           </w:rPr>
-          <w:instrText xml:space="preserve"> PAGEREF _Toc242103497 \h </w:instrText>
+          <w:instrText xml:space="preserve"> PAGEREF _Toc242105400 \h </w:instrText>
         </w:r>
         <w:r>
           <w:rPr>
@@ -1839,7 +1839,7 @@
           <w14:ligatures w14:val="standardContextual"/>
         </w:rPr>
       </w:pPr>
-      <w:hyperlink w:anchor="_Toc242103498" w:history="1">
+      <w:hyperlink w:anchor="_Toc242105401" w:history="1">
         <w:r>
           <w:rPr>
             <w:rStyle w:val="aff8"/>
@@ -1866,7 +1866,7 @@
             <w:noProof/>
             <w:webHidden/>
           </w:rPr>
-          <w:instrText xml:space="preserve"> PAGEREF _Toc242103498 \h </w:instrText>
+          <w:instrText xml:space="preserve"> PAGEREF _Toc242105401 \h </w:instrText>
         </w:r>
         <w:r>
           <w:rPr>
@@ -1912,7 +1912,7 @@
           <w14:ligatures w14:val="standardContextual"/>
         </w:rPr>
       </w:pPr>
-      <w:hyperlink w:anchor="_Toc242103499" w:history="1">
+      <w:hyperlink w:anchor="_Toc242105402" w:history="1">
         <w:r>
           <w:rPr>
             <w:rStyle w:val="aff8"/>
@@ -1939,7 +1939,7 @@
             <w:noProof/>
             <w:webHidden/>
           </w:rPr>
-          <w:instrText xml:space="preserve"> PAGEREF _Toc242103499 \h </w:instrText>
+          <w:instrText xml:space="preserve"> PAGEREF _Toc242105402 \h </w:instrText>
         </w:r>
         <w:r>
           <w:rPr>
@@ -1985,7 +1985,7 @@
           <w14:ligatures w14:val="standardContextual"/>
         </w:rPr>
       </w:pPr>
-      <w:hyperlink w:anchor="_Toc242103500" w:history="1">
+      <w:hyperlink w:anchor="_Toc242105403" w:history="1">
         <w:r>
           <w:rPr>
             <w:rStyle w:val="aff8"/>
@@ -2012,7 +2012,7 @@
             <w:noProof/>
             <w:webHidden/>
           </w:rPr>
-          <w:instrText xml:space="preserve"> PAGEREF _Toc242103500 \h </w:instrText>
+          <w:instrText xml:space="preserve"> PAGEREF _Toc242105403 \h </w:instrText>
         </w:r>
         <w:r>
           <w:rPr>
@@ -2058,7 +2058,7 @@
           <w14:ligatures w14:val="standardContextual"/>
         </w:rPr>
       </w:pPr>
-      <w:hyperlink w:anchor="_Toc242103501" w:history="1">
+      <w:hyperlink w:anchor="_Toc242105404" w:history="1">
         <w:r>
           <w:rPr>
             <w:rStyle w:val="aff8"/>
@@ -2085,7 +2085,7 @@
             <w:noProof/>
             <w:webHidden/>
           </w:rPr>
-          <w:instrText xml:space="preserve"> PAGEREF _Toc242103501 \h </w:instrText>
+          <w:instrText xml:space="preserve"> PAGEREF _Toc242105404 \h </w:instrText>
         </w:r>
         <w:r>
           <w:rPr>
@@ -2131,7 +2131,7 @@
           <w14:ligatures w14:val="standardContextual"/>
         </w:rPr>
       </w:pPr>
-      <w:hyperlink w:anchor="_Toc242103502" w:history="1">
+      <w:hyperlink w:anchor="_Toc242105405" w:history="1">
         <w:r>
           <w:rPr>
             <w:rStyle w:val="aff8"/>
@@ -2158,7 +2158,7 @@
             <w:noProof/>
             <w:webHidden/>
           </w:rPr>
-          <w:instrText xml:space="preserve"> PAGEREF _Toc242103502 \h </w:instrText>
+          <w:instrText xml:space="preserve"> PAGEREF _Toc242105405 \h </w:instrText>
         </w:r>
         <w:r>
           <w:rPr>
@@ -2204,7 +2204,7 @@
           <w14:ligatures w14:val="standardContextual"/>
         </w:rPr>
       </w:pPr>
-      <w:hyperlink w:anchor="_Toc242103503" w:history="1">
+      <w:hyperlink w:anchor="_Toc242105406" w:history="1">
         <w:r>
           <w:rPr>
             <w:rStyle w:val="aff8"/>
@@ -2231,7 +2231,7 @@
             <w:noProof/>
             <w:webHidden/>
           </w:rPr>
-          <w:instrText xml:space="preserve"> PAGEREF _Toc242103503 \h </w:instrText>
+          <w:instrText xml:space="preserve"> PAGEREF _Toc242105406 \h </w:instrText>
         </w:r>
         <w:r>
           <w:rPr>
@@ -2277,7 +2277,7 @@
           <w14:ligatures w14:val="standardContextual"/>
         </w:rPr>
       </w:pPr>
-      <w:hyperlink w:anchor="_Toc242103504" w:history="1">
+      <w:hyperlink w:anchor="_Toc242105407" w:history="1">
         <w:r>
           <w:rPr>
             <w:rStyle w:val="aff8"/>
@@ -2304,7 +2304,7 @@
             <w:noProof/>
             <w:webHidden/>
           </w:rPr>
-          <w:instrText xml:space="preserve"> PAGEREF _Toc242103504 \h </w:instrText>
+          <w:instrText xml:space="preserve"> PAGEREF _Toc242105407 \h </w:instrText>
         </w:r>
         <w:r>
           <w:rPr>
@@ -2350,7 +2350,7 @@
           <w14:ligatures w14:val="standardContextual"/>
         </w:rPr>
       </w:pPr>
-      <w:hyperlink w:anchor="_Toc242103505" w:history="1">
+      <w:hyperlink w:anchor="_Toc242105408" w:history="1">
         <w:r>
           <w:rPr>
             <w:rStyle w:val="aff8"/>
@@ -2377,7 +2377,7 @@
             <w:noProof/>
             <w:webHidden/>
           </w:rPr>
-          <w:instrText xml:space="preserve"> PAGEREF _Toc242103505 \h </w:instrText>
+          <w:instrText xml:space="preserve"> PAGEREF _Toc242105408 \h </w:instrText>
         </w:r>
         <w:r>
           <w:rPr>
@@ -2423,7 +2423,7 @@
           <w14:ligatures w14:val="standardContextual"/>
         </w:rPr>
       </w:pPr>
-      <w:hyperlink w:anchor="_Toc242103506" w:history="1">
+      <w:hyperlink w:anchor="_Toc242105409" w:history="1">
         <w:r>
           <w:rPr>
             <w:rStyle w:val="aff8"/>
@@ -2450,7 +2450,7 @@
             <w:noProof/>
             <w:webHidden/>
           </w:rPr>
-          <w:instrText xml:space="preserve"> PAGEREF _Toc242103506 \h </w:instrText>
+          <w:instrText xml:space="preserve"> PAGEREF _Toc242105409 \h </w:instrText>
         </w:r>
         <w:r>
           <w:rPr>
@@ -2496,7 +2496,7 @@
           <w14:ligatures w14:val="standardContextual"/>
         </w:rPr>
       </w:pPr>
-      <w:hyperlink w:anchor="_Toc242103507" w:history="1">
+      <w:hyperlink w:anchor="_Toc242105410" w:history="1">
         <w:r>
           <w:rPr>
             <w:rStyle w:val="aff8"/>
@@ -2523,7 +2523,7 @@
             <w:noProof/>
             <w:webHidden/>
           </w:rPr>
-          <w:instrText xml:space="preserve"> PAGEREF _Toc242103507 \h </w:instrText>
+          <w:instrText xml:space="preserve"> PAGEREF _Toc242105410 \h </w:instrText>
         </w:r>
         <w:r>
           <w:rPr>
@@ -2569,7 +2569,7 @@
           <w14:ligatures w14:val="standardContextual"/>
         </w:rPr>
       </w:pPr>
-      <w:hyperlink w:anchor="_Toc242103508" w:history="1">
+      <w:hyperlink w:anchor="_Toc242105411" w:history="1">
         <w:r>
           <w:rPr>
             <w:rStyle w:val="aff8"/>
@@ -2596,7 +2596,7 @@
             <w:noProof/>
             <w:webHidden/>
           </w:rPr>
-          <w:instrText xml:space="preserve"> PAGEREF _Toc242103508 \h </w:instrText>
+          <w:instrText xml:space="preserve"> PAGEREF _Toc242105411 \h </w:instrText>
         </w:r>
         <w:r>
           <w:rPr>
@@ -2642,7 +2642,7 @@
           <w14:ligatures w14:val="standardContextual"/>
         </w:rPr>
       </w:pPr>
-      <w:hyperlink w:anchor="_Toc242103509" w:history="1">
+      <w:hyperlink w:anchor="_Toc242105412" w:history="1">
         <w:r>
           <w:rPr>
             <w:rStyle w:val="aff8"/>
@@ -2669,7 +2669,7 @@
             <w:noProof/>
             <w:webHidden/>
           </w:rPr>
-          <w:instrText xml:space="preserve"> PAGEREF _Toc242103509 \h </w:instrText>
+          <w:instrText xml:space="preserve"> PAGEREF _Toc242105412 \h </w:instrText>
         </w:r>
         <w:r>
           <w:rPr>
@@ -2715,7 +2715,7 @@
           <w14:ligatures w14:val="standardContextual"/>
         </w:rPr>
       </w:pPr>
-      <w:hyperlink w:anchor="_Toc242103510" w:history="1">
+      <w:hyperlink w:anchor="_Toc242105413" w:history="1">
         <w:r>
           <w:rPr>
             <w:rStyle w:val="aff8"/>
@@ -2742,7 +2742,7 @@
             <w:noProof/>
             <w:webHidden/>
           </w:rPr>
-          <w:instrText xml:space="preserve"> PAGEREF _Toc242103510 \h </w:instrText>
+          <w:instrText xml:space="preserve"> PAGEREF _Toc242105413 \h </w:instrText>
         </w:r>
         <w:r>
           <w:rPr>
@@ -2788,7 +2788,7 @@
           <w14:ligatures w14:val="standardContextual"/>
         </w:rPr>
       </w:pPr>
-      <w:hyperlink w:anchor="_Toc242103511" w:history="1">
+      <w:hyperlink w:anchor="_Toc242105414" w:history="1">
         <w:r>
           <w:rPr>
             <w:rStyle w:val="aff8"/>
@@ -2815,7 +2815,7 @@
             <w:noProof/>
             <w:webHidden/>
           </w:rPr>
-          <w:instrText xml:space="preserve"> PAGEREF _Toc242103511 \h </w:instrText>
+          <w:instrText xml:space="preserve"> PAGEREF _Toc242105414 \h </w:instrText>
         </w:r>
         <w:r>
           <w:rPr>
@@ -2861,7 +2861,7 @@
           <w14:ligatures w14:val="standardContextual"/>
         </w:rPr>
       </w:pPr>
-      <w:hyperlink w:anchor="_Toc242103512" w:history="1">
+      <w:hyperlink w:anchor="_Toc242105415" w:history="1">
         <w:r>
           <w:rPr>
             <w:rStyle w:val="aff8"/>
@@ -2888,7 +2888,7 @@
             <w:noProof/>
             <w:webHidden/>
           </w:rPr>
-          <w:instrText xml:space="preserve"> PAGEREF _Toc242103512 \h </w:instrText>
+          <w:instrText xml:space="preserve"> PAGEREF _Toc242105415 \h </w:instrText>
         </w:r>
         <w:r>
           <w:rPr>
@@ -2934,7 +2934,7 @@
           <w14:ligatures w14:val="standardContextual"/>
         </w:rPr>
       </w:pPr>
-      <w:hyperlink w:anchor="_Toc242103513" w:history="1">
+      <w:hyperlink w:anchor="_Toc242105416" w:history="1">
         <w:r>
           <w:rPr>
             <w:rStyle w:val="aff8"/>
@@ -2961,7 +2961,7 @@
             <w:noProof/>
             <w:webHidden/>
           </w:rPr>
-          <w:instrText xml:space="preserve"> PAGEREF _Toc242103513 \h </w:instrText>
+          <w:instrText xml:space="preserve"> PAGEREF _Toc242105416 \h </w:instrText>
         </w:r>
         <w:r>
           <w:rPr>
@@ -3007,7 +3007,7 @@
           <w14:ligatures w14:val="standardContextual"/>
         </w:rPr>
       </w:pPr>
-      <w:hyperlink w:anchor="_Toc242103514" w:history="1">
+      <w:hyperlink w:anchor="_Toc242105417" w:history="1">
         <w:r>
           <w:rPr>
             <w:rStyle w:val="aff8"/>
@@ -3034,7 +3034,7 @@
             <w:noProof/>
             <w:webHidden/>
           </w:rPr>
-          <w:instrText xml:space="preserve"> PAGEREF _Toc242103514 \h </w:instrText>
+          <w:instrText xml:space="preserve"> PAGEREF _Toc242105417 \h </w:instrText>
         </w:r>
         <w:r>
           <w:rPr>
@@ -3080,7 +3080,7 @@
           <w14:ligatures w14:val="standardContextual"/>
         </w:rPr>
       </w:pPr>
-      <w:hyperlink w:anchor="_Toc242103515" w:history="1">
+      <w:hyperlink w:anchor="_Toc242105418" w:history="1">
         <w:r>
           <w:rPr>
             <w:rStyle w:val="aff8"/>
@@ -3107,7 +3107,7 @@
             <w:noProof/>
             <w:webHidden/>
           </w:rPr>
-          <w:instrText xml:space="preserve"> PAGEREF _Toc242103515 \h </w:instrText>
+          <w:instrText xml:space="preserve"> PAGEREF _Toc242105418 \h </w:instrText>
         </w:r>
         <w:r>
           <w:rPr>
@@ -3153,7 +3153,7 @@
           <w14:ligatures w14:val="standardContextual"/>
         </w:rPr>
       </w:pPr>
-      <w:hyperlink w:anchor="_Toc242103516" w:history="1">
+      <w:hyperlink w:anchor="_Toc242105419" w:history="1">
         <w:r>
           <w:rPr>
             <w:rStyle w:val="aff8"/>
@@ -3180,7 +3180,7 @@
             <w:noProof/>
             <w:webHidden/>
           </w:rPr>
-          <w:instrText xml:space="preserve"> PAGEREF _Toc242103516 \h </w:instrText>
+          <w:instrText xml:space="preserve"> PAGEREF _Toc242105419 \h </w:instrText>
         </w:r>
         <w:r>
           <w:rPr>
@@ -3226,7 +3226,7 @@
           <w14:ligatures w14:val="standardContextual"/>
         </w:rPr>
       </w:pPr>
-      <w:hyperlink w:anchor="_Toc242103517" w:history="1">
+      <w:hyperlink w:anchor="_Toc242105420" w:history="1">
         <w:r>
           <w:rPr>
             <w:rStyle w:val="aff8"/>
@@ -3253,7 +3253,7 @@
             <w:noProof/>
             <w:webHidden/>
           </w:rPr>
-          <w:instrText xml:space="preserve"> PAGEREF _Toc242103517 \h </w:instrText>
+          <w:instrText xml:space="preserve"> PAGEREF _Toc242105420 \h </w:instrText>
         </w:r>
         <w:r>
           <w:rPr>
@@ -3299,7 +3299,7 @@
           <w14:ligatures w14:val="standardContextual"/>
         </w:rPr>
       </w:pPr>
-      <w:hyperlink w:anchor="_Toc242103518" w:history="1">
+      <w:hyperlink w:anchor="_Toc242105421" w:history="1">
         <w:r>
           <w:rPr>
             <w:rStyle w:val="aff8"/>
@@ -3326,7 +3326,7 @@
             <w:noProof/>
             <w:webHidden/>
           </w:rPr>
-          <w:instrText xml:space="preserve"> PAGEREF _Toc242103518 \h </w:instrText>
+          <w:instrText xml:space="preserve"> PAGEREF _Toc242105421 \h </w:instrText>
         </w:r>
         <w:r>
           <w:rPr>
@@ -3372,7 +3372,7 @@
           <w14:ligatures w14:val="standardContextual"/>
         </w:rPr>
       </w:pPr>
-      <w:hyperlink w:anchor="_Toc242103519" w:history="1">
+      <w:hyperlink w:anchor="_Toc242105422" w:history="1">
         <w:r>
           <w:rPr>
             <w:rStyle w:val="aff8"/>
@@ -3399,7 +3399,7 @@
             <w:noProof/>
             <w:webHidden/>
           </w:rPr>
-          <w:instrText xml:space="preserve"> PAGEREF _Toc242103519 \h </w:instrText>
+          <w:instrText xml:space="preserve"> PAGEREF _Toc242105422 \h </w:instrText>
         </w:r>
         <w:r>
           <w:rPr>
@@ -3445,7 +3445,7 @@
           <w14:ligatures w14:val="standardContextual"/>
         </w:rPr>
       </w:pPr>
-      <w:hyperlink w:anchor="_Toc242103520" w:history="1">
+      <w:hyperlink w:anchor="_Toc242105423" w:history="1">
         <w:r>
           <w:rPr>
             <w:rStyle w:val="aff8"/>
@@ -3472,7 +3472,7 @@
             <w:noProof/>
             <w:webHidden/>
           </w:rPr>
-          <w:instrText xml:space="preserve"> PAGEREF _Toc242103520 \h </w:instrText>
+          <w:instrText xml:space="preserve"> PAGEREF _Toc242105423 \h </w:instrText>
         </w:r>
         <w:r>
           <w:rPr>
@@ -3518,7 +3518,7 @@
           <w14:ligatures w14:val="standardContextual"/>
         </w:rPr>
       </w:pPr>
-      <w:hyperlink w:anchor="_Toc242103521" w:history="1">
+      <w:hyperlink w:anchor="_Toc242105424" w:history="1">
         <w:r>
           <w:rPr>
             <w:rStyle w:val="aff8"/>
@@ -3545,7 +3545,7 @@
             <w:noProof/>
             <w:webHidden/>
           </w:rPr>
-          <w:instrText xml:space="preserve"> PAGEREF _Toc242103521 \h </w:instrText>
+          <w:instrText xml:space="preserve"> PAGEREF _Toc242105424 \h </w:instrText>
         </w:r>
         <w:r>
           <w:rPr>
@@ -3591,7 +3591,7 @@
           <w14:ligatures w14:val="standardContextual"/>
         </w:rPr>
       </w:pPr>
-      <w:hyperlink w:anchor="_Toc242103522" w:history="1">
+      <w:hyperlink w:anchor="_Toc242105425" w:history="1">
         <w:r>
           <w:rPr>
             <w:rStyle w:val="aff8"/>
@@ -3618,7 +3618,7 @@
             <w:noProof/>
             <w:webHidden/>
           </w:rPr>
-          <w:instrText xml:space="preserve"> PAGEREF _Toc242103522 \h </w:instrText>
+          <w:instrText xml:space="preserve"> PAGEREF _Toc242105425 \h </w:instrText>
         </w:r>
         <w:r>
           <w:rPr>
@@ -3664,7 +3664,7 @@
           <w14:ligatures w14:val="standardContextual"/>
         </w:rPr>
       </w:pPr>
-      <w:hyperlink w:anchor="_Toc242103523" w:history="1">
+      <w:hyperlink w:anchor="_Toc242105426" w:history="1">
         <w:r>
           <w:rPr>
             <w:rStyle w:val="aff8"/>
@@ -3691,7 +3691,7 @@
             <w:noProof/>
             <w:webHidden/>
           </w:rPr>
-          <w:instrText xml:space="preserve"> PAGEREF _Toc242103523 \h </w:instrText>
+          <w:instrText xml:space="preserve"> PAGEREF _Toc242105426 \h </w:instrText>
         </w:r>
         <w:r>
           <w:rPr>
@@ -3737,7 +3737,7 @@
           <w14:ligatures w14:val="standardContextual"/>
         </w:rPr>
       </w:pPr>
-      <w:hyperlink w:anchor="_Toc242103524" w:history="1">
+      <w:hyperlink w:anchor="_Toc242105427" w:history="1">
         <w:r>
           <w:rPr>
             <w:rStyle w:val="aff8"/>
@@ -3764,7 +3764,7 @@
             <w:noProof/>
             <w:webHidden/>
           </w:rPr>
-          <w:instrText xml:space="preserve"> PAGEREF _Toc242103524 \h </w:instrText>
+          <w:instrText xml:space="preserve"> PAGEREF _Toc242105427 \h </w:instrText>
         </w:r>
         <w:r>
           <w:rPr>
@@ -3810,7 +3810,7 @@
           <w14:ligatures w14:val="standardContextual"/>
         </w:rPr>
       </w:pPr>
-      <w:hyperlink w:anchor="_Toc242103525" w:history="1">
+      <w:hyperlink w:anchor="_Toc242105428" w:history="1">
         <w:r>
           <w:rPr>
             <w:rStyle w:val="aff8"/>
@@ -3837,7 +3837,7 @@
             <w:noProof/>
             <w:webHidden/>
           </w:rPr>
-          <w:instrText xml:space="preserve"> PAGEREF _Toc242103525 \h </w:instrText>
+          <w:instrText xml:space="preserve"> PAGEREF _Toc242105428 \h </w:instrText>
         </w:r>
         <w:r>
           <w:rPr>
@@ -3883,7 +3883,7 @@
           <w14:ligatures w14:val="standardContextual"/>
         </w:rPr>
       </w:pPr>
-      <w:hyperlink w:anchor="_Toc242103526" w:history="1">
+      <w:hyperlink w:anchor="_Toc242105429" w:history="1">
         <w:r>
           <w:rPr>
             <w:rStyle w:val="aff8"/>
@@ -3910,7 +3910,7 @@
             <w:noProof/>
             <w:webHidden/>
           </w:rPr>
-          <w:instrText xml:space="preserve"> PAGEREF _Toc242103526 \h </w:instrText>
+          <w:instrText xml:space="preserve"> PAGEREF _Toc242105429 \h </w:instrText>
         </w:r>
         <w:r>
           <w:rPr>
@@ -3956,7 +3956,7 @@
           <w14:ligatures w14:val="standardContextual"/>
         </w:rPr>
       </w:pPr>
-      <w:hyperlink w:anchor="_Toc242103527" w:history="1">
+      <w:hyperlink w:anchor="_Toc242105430" w:history="1">
         <w:r>
           <w:rPr>
             <w:rStyle w:val="aff8"/>
@@ -3983,7 +3983,7 @@
             <w:noProof/>
             <w:webHidden/>
           </w:rPr>
-          <w:instrText xml:space="preserve"> PAGEREF _Toc242103527 \h </w:instrText>
+          <w:instrText xml:space="preserve"> PAGEREF _Toc242105430 \h </w:instrText>
         </w:r>
         <w:r>
           <w:rPr>
@@ -4029,7 +4029,7 @@
           <w14:ligatures w14:val="standardContextual"/>
         </w:rPr>
       </w:pPr>
-      <w:hyperlink w:anchor="_Toc242103528" w:history="1">
+      <w:hyperlink w:anchor="_Toc242105431" w:history="1">
         <w:r>
           <w:rPr>
             <w:rStyle w:val="aff8"/>
@@ -4056,7 +4056,7 @@
             <w:noProof/>
             <w:webHidden/>
           </w:rPr>
-          <w:instrText xml:space="preserve"> PAGEREF _Toc242103528 \h </w:instrText>
+          <w:instrText xml:space="preserve"> PAGEREF _Toc242105431 \h </w:instrText>
         </w:r>
         <w:r>
           <w:rPr>
@@ -4102,7 +4102,7 @@
           <w14:ligatures w14:val="standardContextual"/>
         </w:rPr>
       </w:pPr>
-      <w:hyperlink w:anchor="_Toc242103529" w:history="1">
+      <w:hyperlink w:anchor="_Toc242105432" w:history="1">
         <w:r>
           <w:rPr>
             <w:rStyle w:val="aff8"/>
@@ -4129,7 +4129,7 @@
             <w:noProof/>
             <w:webHidden/>
           </w:rPr>
-          <w:instrText xml:space="preserve"> PAGEREF _Toc242103529 \h </w:instrText>
+          <w:instrText xml:space="preserve"> PAGEREF _Toc242105432 \h </w:instrText>
         </w:r>
         <w:r>
           <w:rPr>
@@ -4175,7 +4175,7 @@
           <w14:ligatures w14:val="standardContextual"/>
         </w:rPr>
       </w:pPr>
-      <w:hyperlink w:anchor="_Toc242103530" w:history="1">
+      <w:hyperlink w:anchor="_Toc242105433" w:history="1">
         <w:r>
           <w:rPr>
             <w:rStyle w:val="aff8"/>
@@ -4202,7 +4202,7 @@
             <w:noProof/>
             <w:webHidden/>
           </w:rPr>
-          <w:instrText xml:space="preserve"> PAGEREF _Toc242103530 \h </w:instrText>
+          <w:instrText xml:space="preserve"> PAGEREF _Toc242105433 \h </w:instrText>
         </w:r>
         <w:r>
           <w:rPr>
@@ -4248,7 +4248,7 @@
           <w14:ligatures w14:val="standardContextual"/>
         </w:rPr>
       </w:pPr>
-      <w:hyperlink w:anchor="_Toc242103531" w:history="1">
+      <w:hyperlink w:anchor="_Toc242105434" w:history="1">
         <w:r>
           <w:rPr>
             <w:rStyle w:val="aff8"/>
@@ -4275,7 +4275,7 @@
             <w:noProof/>
             <w:webHidden/>
           </w:rPr>
-          <w:instrText xml:space="preserve"> PAGEREF _Toc242103531 \h </w:instrText>
+          <w:instrText xml:space="preserve"> PAGEREF _Toc242105434 \h </w:instrText>
         </w:r>
         <w:r>
           <w:rPr>
@@ -4321,7 +4321,7 @@
           <w14:ligatures w14:val="standardContextual"/>
         </w:rPr>
       </w:pPr>
-      <w:hyperlink w:anchor="_Toc242103532" w:history="1">
+      <w:hyperlink w:anchor="_Toc242105435" w:history="1">
         <w:r>
           <w:rPr>
             <w:rStyle w:val="aff8"/>
@@ -4348,7 +4348,7 @@
             <w:noProof/>
             <w:webHidden/>
           </w:rPr>
-          <w:instrText xml:space="preserve"> PAGEREF _Toc242103532 \h </w:instrText>
+          <w:instrText xml:space="preserve"> PAGEREF _Toc242105435 \h </w:instrText>
         </w:r>
         <w:r>
           <w:rPr>
@@ -4394,7 +4394,7 @@
           <w14:ligatures w14:val="standardContextual"/>
         </w:rPr>
       </w:pPr>
-      <w:hyperlink w:anchor="_Toc242103533" w:history="1">
+      <w:hyperlink w:anchor="_Toc242105436" w:history="1">
         <w:r>
           <w:rPr>
             <w:rStyle w:val="aff8"/>
@@ -4421,7 +4421,7 @@
             <w:noProof/>
             <w:webHidden/>
           </w:rPr>
-          <w:instrText xml:space="preserve"> PAGEREF _Toc242103533 \h </w:instrText>
+          <w:instrText xml:space="preserve"> PAGEREF _Toc242105436 \h </w:instrText>
         </w:r>
         <w:r>
           <w:rPr>
@@ -4467,7 +4467,7 @@
           <w14:ligatures w14:val="standardContextual"/>
         </w:rPr>
       </w:pPr>
-      <w:hyperlink w:anchor="_Toc242103534" w:history="1">
+      <w:hyperlink w:anchor="_Toc242105437" w:history="1">
         <w:r>
           <w:rPr>
             <w:rStyle w:val="aff8"/>
@@ -4494,7 +4494,7 @@
             <w:noProof/>
             <w:webHidden/>
           </w:rPr>
-          <w:instrText xml:space="preserve"> PAGEREF _Toc242103534 \h </w:instrText>
+          <w:instrText xml:space="preserve"> PAGEREF _Toc242105437 \h </w:instrText>
         </w:r>
         <w:r>
           <w:rPr>
@@ -4540,7 +4540,7 @@
         <w:ind w:firstLine="0"/>
         <w:jc w:val="center"/>
       </w:pPr>
-      <w:bookmarkStart w:id="0" w:name="_Toc242103477"/>
+      <w:bookmarkStart w:id="0" w:name="_Toc242105380"/>
       <w:r>
         <w:lastRenderedPageBreak/>
         <w:t>ПЕРЕЧЕНЬ ТЕРМИНОВ И СОКРАЩЕНИЙ</w:t>
@@ -5802,7 +5802,7 @@
         <w:pStyle w:val="1"/>
         <w:pageBreakBefore/>
       </w:pPr>
-      <w:bookmarkStart w:id="1" w:name="_Toc242103478"/>
+      <w:bookmarkStart w:id="1" w:name="_Toc242105381"/>
       <w:r>
         <w:lastRenderedPageBreak/>
         <w:t>1 Общие сведения</w:t>
@@ -5813,7 +5813,7 @@
       <w:pPr>
         <w:pStyle w:val="21"/>
       </w:pPr>
-      <w:bookmarkStart w:id="2" w:name="_Toc242103479"/>
+      <w:bookmarkStart w:id="2" w:name="_Toc242105382"/>
       <w:r>
         <w:t>1.1 Полное наименование системы и её условное обозначение</w:t>
       </w:r>
@@ -5833,7 +5833,7 @@
       <w:pPr>
         <w:pStyle w:val="21"/>
       </w:pPr>
-      <w:bookmarkStart w:id="3" w:name="_Toc242103480"/>
+      <w:bookmarkStart w:id="3" w:name="_Toc242105383"/>
       <w:r>
         <w:t>1.2 Шифр темы и номер договора</w:t>
       </w:r>
@@ -5848,7 +5848,7 @@
       <w:pPr>
         <w:pStyle w:val="21"/>
       </w:pPr>
-      <w:bookmarkStart w:id="4" w:name="_Toc242103481"/>
+      <w:bookmarkStart w:id="4" w:name="_Toc242105384"/>
       <w:r>
         <w:t>1.3 Наименования организаций заказчика и разработчика</w:t>
       </w:r>
@@ -5868,7 +5868,7 @@
       <w:pPr>
         <w:pStyle w:val="21"/>
       </w:pPr>
-      <w:bookmarkStart w:id="5" w:name="_Toc242103482"/>
+      <w:bookmarkStart w:id="5" w:name="_Toc242105385"/>
       <w:r>
         <w:t>1.4 Основания для создания системы</w:t>
       </w:r>
@@ -5893,7 +5893,7 @@
       <w:pPr>
         <w:pStyle w:val="21"/>
       </w:pPr>
-      <w:bookmarkStart w:id="6" w:name="_Toc242103483"/>
+      <w:bookmarkStart w:id="6" w:name="_Toc242105386"/>
       <w:r>
         <w:t>1.5 Плановые сроки начала и окончания работ</w:t>
       </w:r>
@@ -5908,7 +5908,7 @@
       <w:pPr>
         <w:pStyle w:val="21"/>
       </w:pPr>
-      <w:bookmarkStart w:id="7" w:name="_Toc242103484"/>
+      <w:bookmarkStart w:id="7" w:name="_Toc242105387"/>
       <w:r>
         <w:t>1.6 Сведения об источниках и порядке финансирования</w:t>
       </w:r>
@@ -5923,7 +5923,7 @@
       <w:pPr>
         <w:pStyle w:val="21"/>
       </w:pPr>
-      <w:bookmarkStart w:id="8" w:name="_Toc242103485"/>
+      <w:bookmarkStart w:id="8" w:name="_Toc242105388"/>
       <w:r>
         <w:lastRenderedPageBreak/>
         <w:t>1.7 Порядок оформления и предъявления результатов работ</w:t>
@@ -5939,7 +5939,7 @@
       <w:pPr>
         <w:pStyle w:val="21"/>
       </w:pPr>
-      <w:bookmarkStart w:id="9" w:name="_Toc242103486"/>
+      <w:bookmarkStart w:id="9" w:name="_Toc242105389"/>
       <w:r>
         <w:t>1.8 Перечень нормативно-технических документов</w:t>
       </w:r>
@@ -6003,7 +6003,7 @@
         <w:pStyle w:val="1"/>
         <w:pageBreakBefore/>
       </w:pPr>
-      <w:bookmarkStart w:id="10" w:name="_Toc242103487"/>
+      <w:bookmarkStart w:id="10" w:name="_Toc242105390"/>
       <w:r>
         <w:lastRenderedPageBreak/>
         <w:t>2 Цели и назначение создания автоматизированной системы</w:t>
@@ -6014,7 +6014,7 @@
       <w:pPr>
         <w:pStyle w:val="21"/>
       </w:pPr>
-      <w:bookmarkStart w:id="11" w:name="_Toc242103488"/>
+      <w:bookmarkStart w:id="11" w:name="_Toc242105391"/>
       <w:r>
         <w:t>2.1 Назначение системы</w:t>
       </w:r>
@@ -6074,7 +6074,7 @@
       <w:pPr>
         <w:pStyle w:val="21"/>
       </w:pPr>
-      <w:bookmarkStart w:id="12" w:name="_Toc242103489"/>
+      <w:bookmarkStart w:id="12" w:name="_Toc242105392"/>
       <w:r>
         <w:t>2.2 Цели создания системы</w:t>
       </w:r>
@@ -6120,7 +6120,7 @@
         <w:pStyle w:val="1"/>
         <w:pageBreakBefore/>
       </w:pPr>
-      <w:bookmarkStart w:id="13" w:name="_Toc242103490"/>
+      <w:bookmarkStart w:id="13" w:name="_Toc242105393"/>
       <w:r>
         <w:lastRenderedPageBreak/>
         <w:t>3 Характеристика объекта автоматизации</w:t>
@@ -6131,7 +6131,7 @@
       <w:pPr>
         <w:pStyle w:val="21"/>
       </w:pPr>
-      <w:bookmarkStart w:id="14" w:name="_Toc242103491"/>
+      <w:bookmarkStart w:id="14" w:name="_Toc242105394"/>
       <w:r>
         <w:t>3.1 Краткие сведения об объекте автоматизации</w:t>
       </w:r>
@@ -6221,7 +6221,7 @@
       <w:pPr>
         <w:pStyle w:val="21"/>
       </w:pPr>
-      <w:bookmarkStart w:id="15" w:name="_Toc242103492"/>
+      <w:bookmarkStart w:id="15" w:name="_Toc242105395"/>
       <w:r>
         <w:t>3.2 Сведения об условиях эксплуатации</w:t>
       </w:r>
@@ -6237,7 +6237,7 @@
         <w:pStyle w:val="1"/>
         <w:pageBreakBefore/>
       </w:pPr>
-      <w:bookmarkStart w:id="16" w:name="_Toc242103493"/>
+      <w:bookmarkStart w:id="16" w:name="_Toc242105396"/>
       <w:r>
         <w:lastRenderedPageBreak/>
         <w:t>4 Требования к автоматизированной системе</w:t>
@@ -6248,7 +6248,7 @@
       <w:pPr>
         <w:pStyle w:val="21"/>
       </w:pPr>
-      <w:bookmarkStart w:id="17" w:name="_Toc242103494"/>
+      <w:bookmarkStart w:id="17" w:name="_Toc242105397"/>
       <w:r>
         <w:t>4.1 Требования к системе в целом</w:t>
       </w:r>
@@ -6258,7 +6258,7 @@
       <w:pPr>
         <w:pStyle w:val="31"/>
       </w:pPr>
-      <w:bookmarkStart w:id="18" w:name="_Toc242103495"/>
+      <w:bookmarkStart w:id="18" w:name="_Toc242105398"/>
       <w:r>
         <w:t>4.1.1 Требования к структуре и функционированию системы</w:t>
       </w:r>
@@ -6904,7 +6904,7 @@
       <w:pPr>
         <w:pStyle w:val="31"/>
       </w:pPr>
-      <w:bookmarkStart w:id="19" w:name="_Toc242103496"/>
+      <w:bookmarkStart w:id="19" w:name="_Toc242105399"/>
       <w:r>
         <w:t>4.1.2 Требования к численности и квалификации персонала</w:t>
       </w:r>
@@ -7185,7 +7185,7 @@
       <w:pPr>
         <w:pStyle w:val="31"/>
       </w:pPr>
-      <w:bookmarkStart w:id="20" w:name="_Toc242103497"/>
+      <w:bookmarkStart w:id="20" w:name="_Toc242105400"/>
       <w:r>
         <w:t>4.1.3 Показатели назначения</w:t>
       </w:r>
@@ -7233,7 +7233,7 @@
       <w:pPr>
         <w:pStyle w:val="31"/>
       </w:pPr>
-      <w:bookmarkStart w:id="21" w:name="_Toc242103498"/>
+      <w:bookmarkStart w:id="21" w:name="_Toc242105401"/>
       <w:r>
         <w:t>4.1.4 Требования к надёжности</w:t>
       </w:r>
@@ -7267,7 +7267,7 @@
       <w:pPr>
         <w:pStyle w:val="31"/>
       </w:pPr>
-      <w:bookmarkStart w:id="22" w:name="_Toc242103499"/>
+      <w:bookmarkStart w:id="22" w:name="_Toc242105402"/>
       <w:r>
         <w:t>4.1.5 Требования к безопасности</w:t>
       </w:r>
@@ -7282,7 +7282,7 @@
       <w:pPr>
         <w:pStyle w:val="31"/>
       </w:pPr>
-      <w:bookmarkStart w:id="23" w:name="_Toc242103500"/>
+      <w:bookmarkStart w:id="23" w:name="_Toc242105403"/>
       <w:r>
         <w:t>4.1.6 Требования к эргономике и технической эстетике</w:t>
       </w:r>
@@ -7327,7 +7327,7 @@
       <w:pPr>
         <w:pStyle w:val="31"/>
       </w:pPr>
-      <w:bookmarkStart w:id="24" w:name="_Toc242103501"/>
+      <w:bookmarkStart w:id="24" w:name="_Toc242105404"/>
       <w:r>
         <w:t>4.1.7 Требования к эксплуатации и техническому обслуживанию</w:t>
       </w:r>
@@ -7357,7 +7357,7 @@
       <w:pPr>
         <w:pStyle w:val="31"/>
       </w:pPr>
-      <w:bookmarkStart w:id="25" w:name="_Toc242103502"/>
+      <w:bookmarkStart w:id="25" w:name="_Toc242105405"/>
       <w:r>
         <w:t>4.1.8 Требования к защите информации от несанкционированного доступа</w:t>
       </w:r>
@@ -7428,7 +7428,7 @@
       <w:pPr>
         <w:pStyle w:val="31"/>
       </w:pPr>
-      <w:bookmarkStart w:id="26" w:name="_Toc242103503"/>
+      <w:bookmarkStart w:id="26" w:name="_Toc242105406"/>
       <w:r>
         <w:t>4.1.9 Требования по сохранности информации при авариях</w:t>
       </w:r>
@@ -7449,7 +7449,7 @@
       <w:pPr>
         <w:pStyle w:val="31"/>
       </w:pPr>
-      <w:bookmarkStart w:id="27" w:name="_Toc242103504"/>
+      <w:bookmarkStart w:id="27" w:name="_Toc242105407"/>
       <w:r>
         <w:t>4.1.10 Требования к защите от влияния внешних воздействий</w:t>
       </w:r>
@@ -7464,7 +7464,7 @@
       <w:pPr>
         <w:pStyle w:val="31"/>
       </w:pPr>
-      <w:bookmarkStart w:id="28" w:name="_Toc242103505"/>
+      <w:bookmarkStart w:id="28" w:name="_Toc242105408"/>
       <w:r>
         <w:t>4.1.11 Требования к патентной чистоте</w:t>
       </w:r>
@@ -7482,7 +7482,7 @@
       <w:pPr>
         <w:pStyle w:val="31"/>
       </w:pPr>
-      <w:bookmarkStart w:id="29" w:name="_Toc242103506"/>
+      <w:bookmarkStart w:id="29" w:name="_Toc242105409"/>
       <w:r>
         <w:t>4.1.12 Требования по стандартизации и унификации</w:t>
       </w:r>
@@ -7497,7 +7497,7 @@
       <w:pPr>
         <w:pStyle w:val="31"/>
       </w:pPr>
-      <w:bookmarkStart w:id="30" w:name="_Toc242103507"/>
+      <w:bookmarkStart w:id="30" w:name="_Toc242105410"/>
       <w:r>
         <w:t>4.1.13 Дополнительные требования</w:t>
       </w:r>
@@ -7517,7 +7517,7 @@
       <w:pPr>
         <w:pStyle w:val="21"/>
       </w:pPr>
-      <w:bookmarkStart w:id="31" w:name="_Toc242103508"/>
+      <w:bookmarkStart w:id="31" w:name="_Toc242105411"/>
       <w:r>
         <w:lastRenderedPageBreak/>
         <w:t>4.2 Требования к функциям, выполняемым системой</w:t>
@@ -7533,7 +7533,7 @@
       <w:pPr>
         <w:pStyle w:val="31"/>
       </w:pPr>
-      <w:bookmarkStart w:id="32" w:name="_Toc242103509"/>
+      <w:bookmarkStart w:id="32" w:name="_Toc242105412"/>
       <w:r>
         <w:t>4.2.1 Подсистема «Организационная структура и права доступа»</w:t>
       </w:r>
@@ -7578,7 +7578,7 @@
       <w:pPr>
         <w:pStyle w:val="31"/>
       </w:pPr>
-      <w:bookmarkStart w:id="33" w:name="_Toc242103510"/>
+      <w:bookmarkStart w:id="33" w:name="_Toc242105413"/>
       <w:r>
         <w:t>4.2.2 Подсистема «Каталог недвижимости»</w:t>
       </w:r>
@@ -7628,7 +7628,7 @@
       <w:pPr>
         <w:pStyle w:val="31"/>
       </w:pPr>
-      <w:bookmarkStart w:id="34" w:name="_Toc242103511"/>
+      <w:bookmarkStart w:id="34" w:name="_Toc242105414"/>
       <w:r>
         <w:lastRenderedPageBreak/>
         <w:t>4.2.3 Подсистема «Работа с клиентами»</w:t>
@@ -7669,7 +7669,7 @@
       <w:pPr>
         <w:pStyle w:val="31"/>
       </w:pPr>
-      <w:bookmarkStart w:id="35" w:name="_Toc242103512"/>
+      <w:bookmarkStart w:id="35" w:name="_Toc242105415"/>
       <w:r>
         <w:t>4.2.4 Подсистема «Сделки»</w:t>
       </w:r>
@@ -7714,7 +7714,7 @@
       <w:pPr>
         <w:pStyle w:val="31"/>
       </w:pPr>
-      <w:bookmarkStart w:id="36" w:name="_Toc242103513"/>
+      <w:bookmarkStart w:id="36" w:name="_Toc242105416"/>
       <w:r>
         <w:lastRenderedPageBreak/>
         <w:t>4.2.5 Подсистема «Финансы»</w:t>
@@ -7770,7 +7770,7 @@
       <w:pPr>
         <w:pStyle w:val="31"/>
       </w:pPr>
-      <w:bookmarkStart w:id="37" w:name="_Toc242103514"/>
+      <w:bookmarkStart w:id="37" w:name="_Toc242105417"/>
       <w:r>
         <w:t>4.2.6 Подсистема «Шаблоны документов»</w:t>
       </w:r>
@@ -7785,7 +7785,7 @@
       <w:pPr>
         <w:pStyle w:val="31"/>
       </w:pPr>
-      <w:bookmarkStart w:id="38" w:name="_Toc242103515"/>
+      <w:bookmarkStart w:id="38" w:name="_Toc242105418"/>
       <w:r>
         <w:t>4.2.7 Подсистема «Задачи»</w:t>
       </w:r>
@@ -7800,7 +7800,7 @@
       <w:pPr>
         <w:pStyle w:val="31"/>
       </w:pPr>
-      <w:bookmarkStart w:id="39" w:name="_Toc242103516"/>
+      <w:bookmarkStart w:id="39" w:name="_Toc242105419"/>
       <w:r>
         <w:lastRenderedPageBreak/>
         <w:t>4.2.8 Подсистема «Аналитика и отчётность»</w:t>
@@ -7841,7 +7841,7 @@
       <w:pPr>
         <w:pStyle w:val="31"/>
       </w:pPr>
-      <w:bookmarkStart w:id="40" w:name="_Toc242103517"/>
+      <w:bookmarkStart w:id="40" w:name="_Toc242105420"/>
       <w:r>
         <w:t>4.2.9 Подсистема «Интеграция с партнёрами»</w:t>
       </w:r>
@@ -7856,7 +7856,7 @@
       <w:pPr>
         <w:pStyle w:val="31"/>
       </w:pPr>
-      <w:bookmarkStart w:id="41" w:name="_Toc242103518"/>
+      <w:bookmarkStart w:id="41" w:name="_Toc242105421"/>
       <w:r>
         <w:t>4.2.10 Подсистема «Регламентные задания»</w:t>
       </w:r>
@@ -7871,7 +7871,7 @@
       <w:pPr>
         <w:pStyle w:val="21"/>
       </w:pPr>
-      <w:bookmarkStart w:id="42" w:name="_Toc242103519"/>
+      <w:bookmarkStart w:id="42" w:name="_Toc242105422"/>
       <w:r>
         <w:t>4.3 Требования к видам обеспечения</w:t>
       </w:r>
@@ -7881,7 +7881,7 @@
       <w:pPr>
         <w:pStyle w:val="31"/>
       </w:pPr>
-      <w:bookmarkStart w:id="43" w:name="_Toc242103520"/>
+      <w:bookmarkStart w:id="43" w:name="_Toc242105423"/>
       <w:r>
         <w:t>4.3.1 Требования к математическому обеспечению</w:t>
       </w:r>
@@ -7922,7 +7922,7 @@
       <w:pPr>
         <w:pStyle w:val="31"/>
       </w:pPr>
-      <w:bookmarkStart w:id="44" w:name="_Toc242103521"/>
+      <w:bookmarkStart w:id="44" w:name="_Toc242105424"/>
       <w:r>
         <w:t>4.3.2 Требования к информационному обеспечению</w:t>
       </w:r>
@@ -7937,7 +7937,7 @@
       <w:pPr>
         <w:pStyle w:val="31"/>
       </w:pPr>
-      <w:bookmarkStart w:id="45" w:name="_Toc242103522"/>
+      <w:bookmarkStart w:id="45" w:name="_Toc242105425"/>
       <w:r>
         <w:t>4.3.3 Требования к лингвистическому обеспечению</w:t>
       </w:r>
@@ -7952,7 +7952,7 @@
       <w:pPr>
         <w:pStyle w:val="31"/>
       </w:pPr>
-      <w:bookmarkStart w:id="46" w:name="_Toc242103523"/>
+      <w:bookmarkStart w:id="46" w:name="_Toc242105426"/>
       <w:r>
         <w:t>4.3.4 Требования к программному обеспечению</w:t>
       </w:r>
@@ -7967,7 +7967,7 @@
       <w:pPr>
         <w:pStyle w:val="31"/>
       </w:pPr>
-      <w:bookmarkStart w:id="47" w:name="_Toc242103524"/>
+      <w:bookmarkStart w:id="47" w:name="_Toc242105427"/>
       <w:r>
         <w:t>4.3.5 Требования к техническому обеспечению</w:t>
       </w:r>
@@ -7982,7 +7982,7 @@
       <w:pPr>
         <w:pStyle w:val="31"/>
       </w:pPr>
-      <w:bookmarkStart w:id="48" w:name="_Toc242103525"/>
+      <w:bookmarkStart w:id="48" w:name="_Toc242105428"/>
       <w:r>
         <w:lastRenderedPageBreak/>
         <w:t>4.3.6 Требования к метрологическому обеспечению</w:t>
@@ -7998,7 +7998,7 @@
       <w:pPr>
         <w:pStyle w:val="31"/>
       </w:pPr>
-      <w:bookmarkStart w:id="49" w:name="_Toc242103526"/>
+      <w:bookmarkStart w:id="49" w:name="_Toc242105429"/>
       <w:r>
         <w:t>4.3.7 Требования к организационному обеспечению</w:t>
       </w:r>
@@ -8013,7 +8013,7 @@
       <w:pPr>
         <w:pStyle w:val="31"/>
       </w:pPr>
-      <w:bookmarkStart w:id="50" w:name="_Toc242103527"/>
+      <w:bookmarkStart w:id="50" w:name="_Toc242105430"/>
       <w:r>
         <w:t>4.3.8 Требования к методическому обеспечению</w:t>
       </w:r>
@@ -8029,7 +8029,7 @@
         <w:pStyle w:val="1"/>
         <w:pageBreakBefore/>
       </w:pPr>
-      <w:bookmarkStart w:id="51" w:name="_Toc242103528"/>
+      <w:bookmarkStart w:id="51" w:name="_Toc242105431"/>
       <w:r>
         <w:lastRenderedPageBreak/>
         <w:t>5 Состав и содержание работ по созданию системы</w:t>
@@ -8351,7 +8351,7 @@
         <w:pStyle w:val="1"/>
         <w:pageBreakBefore/>
       </w:pPr>
-      <w:bookmarkStart w:id="52" w:name="_Toc242103529"/>
+      <w:bookmarkStart w:id="52" w:name="_Toc242105432"/>
       <w:r>
         <w:lastRenderedPageBreak/>
         <w:t>6 Порядок разработки автоматизированной системы</w:t>
@@ -8398,7 +8398,7 @@
         <w:pStyle w:val="1"/>
         <w:pageBreakBefore/>
       </w:pPr>
-      <w:bookmarkStart w:id="53" w:name="_Toc242103530"/>
+      <w:bookmarkStart w:id="53" w:name="_Toc242105433"/>
       <w:r>
         <w:lastRenderedPageBreak/>
         <w:t>7 Порядок контроля и приёмки автоматизированной системы</w:t>
@@ -8415,7 +8415,7 @@
         <w:pStyle w:val="1"/>
         <w:pageBreakBefore/>
       </w:pPr>
-      <w:bookmarkStart w:id="54" w:name="_Toc242103531"/>
+      <w:bookmarkStart w:id="54" w:name="_Toc242105434"/>
       <w:r>
         <w:lastRenderedPageBreak/>
         <w:t>8 Требования к составу и содержанию работ по подготовке объекта автоматизации к вводу системы в действие</w:t>
@@ -8477,7 +8477,7 @@
         <w:pStyle w:val="1"/>
         <w:pageBreakBefore/>
       </w:pPr>
-      <w:bookmarkStart w:id="55" w:name="_Toc242103532"/>
+      <w:bookmarkStart w:id="55" w:name="_Toc242105435"/>
       <w:r>
         <w:lastRenderedPageBreak/>
         <w:t>9 Требования к документированию</w:t>
@@ -9119,7 +9119,7 @@
         <w:pStyle w:val="1"/>
         <w:pageBreakBefore/>
       </w:pPr>
-      <w:bookmarkStart w:id="56" w:name="_Toc242103533"/>
+      <w:bookmarkStart w:id="56" w:name="_Toc242105436"/>
       <w:r>
         <w:lastRenderedPageBreak/>
         <w:t>10 Источники разработки</w:t>
@@ -9158,7 +9158,7 @@
         <w:ind w:firstLine="0"/>
         <w:jc w:val="center"/>
       </w:pPr>
-      <w:bookmarkStart w:id="57" w:name="_Toc242103534"/>
+      <w:bookmarkStart w:id="57" w:name="_Toc242105437"/>
       <w:r>
         <w:lastRenderedPageBreak/>
         <w:t>ЛИСТ РЕГИСТРАЦИИ ИЗМЕНЕНИЙ</w:t>
@@ -11220,31 +11220,31 @@
       </w:rPr>
     </w:lvl>
   </w:abstractNum>
-  <w:num w:numId="1" w16cid:durableId="151650442">
+  <w:num w:numId="1" w16cid:durableId="1885560220">
     <w:abstractNumId w:val="8"/>
   </w:num>
-  <w:num w:numId="2" w16cid:durableId="1128812841">
+  <w:num w:numId="2" w16cid:durableId="1601797142">
     <w:abstractNumId w:val="6"/>
   </w:num>
-  <w:num w:numId="3" w16cid:durableId="1710567287">
+  <w:num w:numId="3" w16cid:durableId="1463228511">
     <w:abstractNumId w:val="5"/>
   </w:num>
-  <w:num w:numId="4" w16cid:durableId="1385982476">
+  <w:num w:numId="4" w16cid:durableId="579674720">
     <w:abstractNumId w:val="4"/>
   </w:num>
-  <w:num w:numId="5" w16cid:durableId="1911846907">
+  <w:num w:numId="5" w16cid:durableId="1293515521">
     <w:abstractNumId w:val="7"/>
   </w:num>
-  <w:num w:numId="6" w16cid:durableId="628123030">
+  <w:num w:numId="6" w16cid:durableId="899364191">
     <w:abstractNumId w:val="3"/>
   </w:num>
-  <w:num w:numId="7" w16cid:durableId="669989270">
+  <w:num w:numId="7" w16cid:durableId="549154082">
     <w:abstractNumId w:val="2"/>
   </w:num>
-  <w:num w:numId="8" w16cid:durableId="1630552290">
+  <w:num w:numId="8" w16cid:durableId="494416087">
     <w:abstractNumId w:val="1"/>
   </w:num>
-  <w:num w:numId="9" w16cid:durableId="912083008">
+  <w:num w:numId="9" w16cid:durableId="799104554">
     <w:abstractNumId w:val="0"/>
   </w:num>
 </w:numbering>
@@ -22777,7 +22777,7 @@
     <w:autoRedefine/>
     <w:uiPriority w:val="39"/>
     <w:unhideWhenUsed/>
-    <w:rsid w:val="00D91EB3"/>
+    <w:rsid w:val="0030005E"/>
     <w:pPr>
       <w:spacing w:after="100"/>
     </w:pPr>
@@ -22789,7 +22789,7 @@
     <w:autoRedefine/>
     <w:uiPriority w:val="39"/>
     <w:unhideWhenUsed/>
-    <w:rsid w:val="00D91EB3"/>
+    <w:rsid w:val="0030005E"/>
     <w:pPr>
       <w:spacing w:after="100"/>
       <w:ind w:left="240"/>
@@ -22802,7 +22802,7 @@
     <w:autoRedefine/>
     <w:uiPriority w:val="39"/>
     <w:unhideWhenUsed/>
-    <w:rsid w:val="00D91EB3"/>
+    <w:rsid w:val="0030005E"/>
     <w:pPr>
       <w:spacing w:after="100"/>
       <w:ind w:left="480"/>
@@ -22813,7 +22813,7 @@
     <w:basedOn w:val="a2"/>
     <w:uiPriority w:val="99"/>
     <w:unhideWhenUsed/>
-    <w:rsid w:val="00D91EB3"/>
+    <w:rsid w:val="0030005E"/>
     <w:rPr>
       <w:color w:val="0000FF" w:themeColor="hyperlink"/>
       <w:u w:val="single"/>

</xml_diff>

<commit_message>
Add new calc and deal calc in to currency
</commit_message>
<xml_diff>
--- a/docs/gost/out/01_ТЗ_Техническое_задание.docx
+++ b/docs/gost/out/01_ТЗ_Техническое_задание.docx
@@ -306,7 +306,7 @@
       <w:r>
         <w:fldChar w:fldCharType="separate"/>
       </w:r>
-      <w:hyperlink w:anchor="_Toc242105380" w:history="1">
+      <w:hyperlink w:anchor="_Toc242136716" w:history="1">
         <w:r>
           <w:rPr>
             <w:rStyle w:val="aff8"/>
@@ -333,7 +333,7 @@
             <w:noProof/>
             <w:webHidden/>
           </w:rPr>
-          <w:instrText xml:space="preserve"> PAGEREF _Toc242105380 \h </w:instrText>
+          <w:instrText xml:space="preserve"> PAGEREF _Toc242136716 \h </w:instrText>
         </w:r>
         <w:r>
           <w:rPr>
@@ -379,7 +379,7 @@
           <w14:ligatures w14:val="standardContextual"/>
         </w:rPr>
       </w:pPr>
-      <w:hyperlink w:anchor="_Toc242105381" w:history="1">
+      <w:hyperlink w:anchor="_Toc242136717" w:history="1">
         <w:r>
           <w:rPr>
             <w:rStyle w:val="aff8"/>
@@ -406,7 +406,7 @@
             <w:noProof/>
             <w:webHidden/>
           </w:rPr>
-          <w:instrText xml:space="preserve"> PAGEREF _Toc242105381 \h </w:instrText>
+          <w:instrText xml:space="preserve"> PAGEREF _Toc242136717 \h </w:instrText>
         </w:r>
         <w:r>
           <w:rPr>
@@ -452,7 +452,7 @@
           <w14:ligatures w14:val="standardContextual"/>
         </w:rPr>
       </w:pPr>
-      <w:hyperlink w:anchor="_Toc242105382" w:history="1">
+      <w:hyperlink w:anchor="_Toc242136718" w:history="1">
         <w:r>
           <w:rPr>
             <w:rStyle w:val="aff8"/>
@@ -479,7 +479,7 @@
             <w:noProof/>
             <w:webHidden/>
           </w:rPr>
-          <w:instrText xml:space="preserve"> PAGEREF _Toc242105382 \h </w:instrText>
+          <w:instrText xml:space="preserve"> PAGEREF _Toc242136718 \h </w:instrText>
         </w:r>
         <w:r>
           <w:rPr>
@@ -525,7 +525,7 @@
           <w14:ligatures w14:val="standardContextual"/>
         </w:rPr>
       </w:pPr>
-      <w:hyperlink w:anchor="_Toc242105383" w:history="1">
+      <w:hyperlink w:anchor="_Toc242136719" w:history="1">
         <w:r>
           <w:rPr>
             <w:rStyle w:val="aff8"/>
@@ -552,7 +552,7 @@
             <w:noProof/>
             <w:webHidden/>
           </w:rPr>
-          <w:instrText xml:space="preserve"> PAGEREF _Toc242105383 \h </w:instrText>
+          <w:instrText xml:space="preserve"> PAGEREF _Toc242136719 \h </w:instrText>
         </w:r>
         <w:r>
           <w:rPr>
@@ -598,7 +598,7 @@
           <w14:ligatures w14:val="standardContextual"/>
         </w:rPr>
       </w:pPr>
-      <w:hyperlink w:anchor="_Toc242105384" w:history="1">
+      <w:hyperlink w:anchor="_Toc242136720" w:history="1">
         <w:r>
           <w:rPr>
             <w:rStyle w:val="aff8"/>
@@ -625,7 +625,7 @@
             <w:noProof/>
             <w:webHidden/>
           </w:rPr>
-          <w:instrText xml:space="preserve"> PAGEREF _Toc242105384 \h </w:instrText>
+          <w:instrText xml:space="preserve"> PAGEREF _Toc242136720 \h </w:instrText>
         </w:r>
         <w:r>
           <w:rPr>
@@ -671,7 +671,7 @@
           <w14:ligatures w14:val="standardContextual"/>
         </w:rPr>
       </w:pPr>
-      <w:hyperlink w:anchor="_Toc242105385" w:history="1">
+      <w:hyperlink w:anchor="_Toc242136721" w:history="1">
         <w:r>
           <w:rPr>
             <w:rStyle w:val="aff8"/>
@@ -698,7 +698,7 @@
             <w:noProof/>
             <w:webHidden/>
           </w:rPr>
-          <w:instrText xml:space="preserve"> PAGEREF _Toc242105385 \h </w:instrText>
+          <w:instrText xml:space="preserve"> PAGEREF _Toc242136721 \h </w:instrText>
         </w:r>
         <w:r>
           <w:rPr>
@@ -744,7 +744,7 @@
           <w14:ligatures w14:val="standardContextual"/>
         </w:rPr>
       </w:pPr>
-      <w:hyperlink w:anchor="_Toc242105386" w:history="1">
+      <w:hyperlink w:anchor="_Toc242136722" w:history="1">
         <w:r>
           <w:rPr>
             <w:rStyle w:val="aff8"/>
@@ -771,7 +771,7 @@
             <w:noProof/>
             <w:webHidden/>
           </w:rPr>
-          <w:instrText xml:space="preserve"> PAGEREF _Toc242105386 \h </w:instrText>
+          <w:instrText xml:space="preserve"> PAGEREF _Toc242136722 \h </w:instrText>
         </w:r>
         <w:r>
           <w:rPr>
@@ -817,7 +817,7 @@
           <w14:ligatures w14:val="standardContextual"/>
         </w:rPr>
       </w:pPr>
-      <w:hyperlink w:anchor="_Toc242105387" w:history="1">
+      <w:hyperlink w:anchor="_Toc242136723" w:history="1">
         <w:r>
           <w:rPr>
             <w:rStyle w:val="aff8"/>
@@ -844,7 +844,7 @@
             <w:noProof/>
             <w:webHidden/>
           </w:rPr>
-          <w:instrText xml:space="preserve"> PAGEREF _Toc242105387 \h </w:instrText>
+          <w:instrText xml:space="preserve"> PAGEREF _Toc242136723 \h </w:instrText>
         </w:r>
         <w:r>
           <w:rPr>
@@ -890,7 +890,7 @@
           <w14:ligatures w14:val="standardContextual"/>
         </w:rPr>
       </w:pPr>
-      <w:hyperlink w:anchor="_Toc242105388" w:history="1">
+      <w:hyperlink w:anchor="_Toc242136724" w:history="1">
         <w:r>
           <w:rPr>
             <w:rStyle w:val="aff8"/>
@@ -917,7 +917,7 @@
             <w:noProof/>
             <w:webHidden/>
           </w:rPr>
-          <w:instrText xml:space="preserve"> PAGEREF _Toc242105388 \h </w:instrText>
+          <w:instrText xml:space="preserve"> PAGEREF _Toc242136724 \h </w:instrText>
         </w:r>
         <w:r>
           <w:rPr>
@@ -963,7 +963,7 @@
           <w14:ligatures w14:val="standardContextual"/>
         </w:rPr>
       </w:pPr>
-      <w:hyperlink w:anchor="_Toc242105389" w:history="1">
+      <w:hyperlink w:anchor="_Toc242136725" w:history="1">
         <w:r>
           <w:rPr>
             <w:rStyle w:val="aff8"/>
@@ -990,7 +990,7 @@
             <w:noProof/>
             <w:webHidden/>
           </w:rPr>
-          <w:instrText xml:space="preserve"> PAGEREF _Toc242105389 \h </w:instrText>
+          <w:instrText xml:space="preserve"> PAGEREF _Toc242136725 \h </w:instrText>
         </w:r>
         <w:r>
           <w:rPr>
@@ -1036,7 +1036,7 @@
           <w14:ligatures w14:val="standardContextual"/>
         </w:rPr>
       </w:pPr>
-      <w:hyperlink w:anchor="_Toc242105390" w:history="1">
+      <w:hyperlink w:anchor="_Toc242136726" w:history="1">
         <w:r>
           <w:rPr>
             <w:rStyle w:val="aff8"/>
@@ -1063,7 +1063,7 @@
             <w:noProof/>
             <w:webHidden/>
           </w:rPr>
-          <w:instrText xml:space="preserve"> PAGEREF _Toc242105390 \h </w:instrText>
+          <w:instrText xml:space="preserve"> PAGEREF _Toc242136726 \h </w:instrText>
         </w:r>
         <w:r>
           <w:rPr>
@@ -1109,7 +1109,7 @@
           <w14:ligatures w14:val="standardContextual"/>
         </w:rPr>
       </w:pPr>
-      <w:hyperlink w:anchor="_Toc242105391" w:history="1">
+      <w:hyperlink w:anchor="_Toc242136727" w:history="1">
         <w:r>
           <w:rPr>
             <w:rStyle w:val="aff8"/>
@@ -1136,7 +1136,7 @@
             <w:noProof/>
             <w:webHidden/>
           </w:rPr>
-          <w:instrText xml:space="preserve"> PAGEREF _Toc242105391 \h </w:instrText>
+          <w:instrText xml:space="preserve"> PAGEREF _Toc242136727 \h </w:instrText>
         </w:r>
         <w:r>
           <w:rPr>
@@ -1182,7 +1182,7 @@
           <w14:ligatures w14:val="standardContextual"/>
         </w:rPr>
       </w:pPr>
-      <w:hyperlink w:anchor="_Toc242105392" w:history="1">
+      <w:hyperlink w:anchor="_Toc242136728" w:history="1">
         <w:r>
           <w:rPr>
             <w:rStyle w:val="aff8"/>
@@ -1209,7 +1209,7 @@
             <w:noProof/>
             <w:webHidden/>
           </w:rPr>
-          <w:instrText xml:space="preserve"> PAGEREF _Toc242105392 \h </w:instrText>
+          <w:instrText xml:space="preserve"> PAGEREF _Toc242136728 \h </w:instrText>
         </w:r>
         <w:r>
           <w:rPr>
@@ -1255,7 +1255,7 @@
           <w14:ligatures w14:val="standardContextual"/>
         </w:rPr>
       </w:pPr>
-      <w:hyperlink w:anchor="_Toc242105393" w:history="1">
+      <w:hyperlink w:anchor="_Toc242136729" w:history="1">
         <w:r>
           <w:rPr>
             <w:rStyle w:val="aff8"/>
@@ -1282,7 +1282,7 @@
             <w:noProof/>
             <w:webHidden/>
           </w:rPr>
-          <w:instrText xml:space="preserve"> PAGEREF _Toc242105393 \h </w:instrText>
+          <w:instrText xml:space="preserve"> PAGEREF _Toc242136729 \h </w:instrText>
         </w:r>
         <w:r>
           <w:rPr>
@@ -1328,7 +1328,7 @@
           <w14:ligatures w14:val="standardContextual"/>
         </w:rPr>
       </w:pPr>
-      <w:hyperlink w:anchor="_Toc242105394" w:history="1">
+      <w:hyperlink w:anchor="_Toc242136730" w:history="1">
         <w:r>
           <w:rPr>
             <w:rStyle w:val="aff8"/>
@@ -1355,7 +1355,7 @@
             <w:noProof/>
             <w:webHidden/>
           </w:rPr>
-          <w:instrText xml:space="preserve"> PAGEREF _Toc242105394 \h </w:instrText>
+          <w:instrText xml:space="preserve"> PAGEREF _Toc242136730 \h </w:instrText>
         </w:r>
         <w:r>
           <w:rPr>
@@ -1401,7 +1401,7 @@
           <w14:ligatures w14:val="standardContextual"/>
         </w:rPr>
       </w:pPr>
-      <w:hyperlink w:anchor="_Toc242105395" w:history="1">
+      <w:hyperlink w:anchor="_Toc242136731" w:history="1">
         <w:r>
           <w:rPr>
             <w:rStyle w:val="aff8"/>
@@ -1428,7 +1428,7 @@
             <w:noProof/>
             <w:webHidden/>
           </w:rPr>
-          <w:instrText xml:space="preserve"> PAGEREF _Toc242105395 \h </w:instrText>
+          <w:instrText xml:space="preserve"> PAGEREF _Toc242136731 \h </w:instrText>
         </w:r>
         <w:r>
           <w:rPr>
@@ -1474,7 +1474,7 @@
           <w14:ligatures w14:val="standardContextual"/>
         </w:rPr>
       </w:pPr>
-      <w:hyperlink w:anchor="_Toc242105396" w:history="1">
+      <w:hyperlink w:anchor="_Toc242136732" w:history="1">
         <w:r>
           <w:rPr>
             <w:rStyle w:val="aff8"/>
@@ -1501,7 +1501,7 @@
             <w:noProof/>
             <w:webHidden/>
           </w:rPr>
-          <w:instrText xml:space="preserve"> PAGEREF _Toc242105396 \h </w:instrText>
+          <w:instrText xml:space="preserve"> PAGEREF _Toc242136732 \h </w:instrText>
         </w:r>
         <w:r>
           <w:rPr>
@@ -1547,7 +1547,7 @@
           <w14:ligatures w14:val="standardContextual"/>
         </w:rPr>
       </w:pPr>
-      <w:hyperlink w:anchor="_Toc242105397" w:history="1">
+      <w:hyperlink w:anchor="_Toc242136733" w:history="1">
         <w:r>
           <w:rPr>
             <w:rStyle w:val="aff8"/>
@@ -1574,7 +1574,7 @@
             <w:noProof/>
             <w:webHidden/>
           </w:rPr>
-          <w:instrText xml:space="preserve"> PAGEREF _Toc242105397 \h </w:instrText>
+          <w:instrText xml:space="preserve"> PAGEREF _Toc242136733 \h </w:instrText>
         </w:r>
         <w:r>
           <w:rPr>
@@ -1620,7 +1620,7 @@
           <w14:ligatures w14:val="standardContextual"/>
         </w:rPr>
       </w:pPr>
-      <w:hyperlink w:anchor="_Toc242105398" w:history="1">
+      <w:hyperlink w:anchor="_Toc242136734" w:history="1">
         <w:r>
           <w:rPr>
             <w:rStyle w:val="aff8"/>
@@ -1647,7 +1647,7 @@
             <w:noProof/>
             <w:webHidden/>
           </w:rPr>
-          <w:instrText xml:space="preserve"> PAGEREF _Toc242105398 \h </w:instrText>
+          <w:instrText xml:space="preserve"> PAGEREF _Toc242136734 \h </w:instrText>
         </w:r>
         <w:r>
           <w:rPr>
@@ -1693,7 +1693,7 @@
           <w14:ligatures w14:val="standardContextual"/>
         </w:rPr>
       </w:pPr>
-      <w:hyperlink w:anchor="_Toc242105399" w:history="1">
+      <w:hyperlink w:anchor="_Toc242136735" w:history="1">
         <w:r>
           <w:rPr>
             <w:rStyle w:val="aff8"/>
@@ -1720,7 +1720,7 @@
             <w:noProof/>
             <w:webHidden/>
           </w:rPr>
-          <w:instrText xml:space="preserve"> PAGEREF _Toc242105399 \h </w:instrText>
+          <w:instrText xml:space="preserve"> PAGEREF _Toc242136735 \h </w:instrText>
         </w:r>
         <w:r>
           <w:rPr>
@@ -1766,7 +1766,7 @@
           <w14:ligatures w14:val="standardContextual"/>
         </w:rPr>
       </w:pPr>
-      <w:hyperlink w:anchor="_Toc242105400" w:history="1">
+      <w:hyperlink w:anchor="_Toc242136736" w:history="1">
         <w:r>
           <w:rPr>
             <w:rStyle w:val="aff8"/>
@@ -1793,7 +1793,7 @@
             <w:noProof/>
             <w:webHidden/>
           </w:rPr>
-          <w:instrText xml:space="preserve"> PAGEREF _Toc242105400 \h </w:instrText>
+          <w:instrText xml:space="preserve"> PAGEREF _Toc242136736 \h </w:instrText>
         </w:r>
         <w:r>
           <w:rPr>
@@ -1839,7 +1839,7 @@
           <w14:ligatures w14:val="standardContextual"/>
         </w:rPr>
       </w:pPr>
-      <w:hyperlink w:anchor="_Toc242105401" w:history="1">
+      <w:hyperlink w:anchor="_Toc242136737" w:history="1">
         <w:r>
           <w:rPr>
             <w:rStyle w:val="aff8"/>
@@ -1866,7 +1866,7 @@
             <w:noProof/>
             <w:webHidden/>
           </w:rPr>
-          <w:instrText xml:space="preserve"> PAGEREF _Toc242105401 \h </w:instrText>
+          <w:instrText xml:space="preserve"> PAGEREF _Toc242136737 \h </w:instrText>
         </w:r>
         <w:r>
           <w:rPr>
@@ -1912,7 +1912,7 @@
           <w14:ligatures w14:val="standardContextual"/>
         </w:rPr>
       </w:pPr>
-      <w:hyperlink w:anchor="_Toc242105402" w:history="1">
+      <w:hyperlink w:anchor="_Toc242136738" w:history="1">
         <w:r>
           <w:rPr>
             <w:rStyle w:val="aff8"/>
@@ -1939,7 +1939,7 @@
             <w:noProof/>
             <w:webHidden/>
           </w:rPr>
-          <w:instrText xml:space="preserve"> PAGEREF _Toc242105402 \h </w:instrText>
+          <w:instrText xml:space="preserve"> PAGEREF _Toc242136738 \h </w:instrText>
         </w:r>
         <w:r>
           <w:rPr>
@@ -1985,7 +1985,7 @@
           <w14:ligatures w14:val="standardContextual"/>
         </w:rPr>
       </w:pPr>
-      <w:hyperlink w:anchor="_Toc242105403" w:history="1">
+      <w:hyperlink w:anchor="_Toc242136739" w:history="1">
         <w:r>
           <w:rPr>
             <w:rStyle w:val="aff8"/>
@@ -2012,7 +2012,7 @@
             <w:noProof/>
             <w:webHidden/>
           </w:rPr>
-          <w:instrText xml:space="preserve"> PAGEREF _Toc242105403 \h </w:instrText>
+          <w:instrText xml:space="preserve"> PAGEREF _Toc242136739 \h </w:instrText>
         </w:r>
         <w:r>
           <w:rPr>
@@ -2058,7 +2058,7 @@
           <w14:ligatures w14:val="standardContextual"/>
         </w:rPr>
       </w:pPr>
-      <w:hyperlink w:anchor="_Toc242105404" w:history="1">
+      <w:hyperlink w:anchor="_Toc242136740" w:history="1">
         <w:r>
           <w:rPr>
             <w:rStyle w:val="aff8"/>
@@ -2085,7 +2085,7 @@
             <w:noProof/>
             <w:webHidden/>
           </w:rPr>
-          <w:instrText xml:space="preserve"> PAGEREF _Toc242105404 \h </w:instrText>
+          <w:instrText xml:space="preserve"> PAGEREF _Toc242136740 \h </w:instrText>
         </w:r>
         <w:r>
           <w:rPr>
@@ -2131,7 +2131,7 @@
           <w14:ligatures w14:val="standardContextual"/>
         </w:rPr>
       </w:pPr>
-      <w:hyperlink w:anchor="_Toc242105405" w:history="1">
+      <w:hyperlink w:anchor="_Toc242136741" w:history="1">
         <w:r>
           <w:rPr>
             <w:rStyle w:val="aff8"/>
@@ -2158,7 +2158,7 @@
             <w:noProof/>
             <w:webHidden/>
           </w:rPr>
-          <w:instrText xml:space="preserve"> PAGEREF _Toc242105405 \h </w:instrText>
+          <w:instrText xml:space="preserve"> PAGEREF _Toc242136741 \h </w:instrText>
         </w:r>
         <w:r>
           <w:rPr>
@@ -2204,7 +2204,7 @@
           <w14:ligatures w14:val="standardContextual"/>
         </w:rPr>
       </w:pPr>
-      <w:hyperlink w:anchor="_Toc242105406" w:history="1">
+      <w:hyperlink w:anchor="_Toc242136742" w:history="1">
         <w:r>
           <w:rPr>
             <w:rStyle w:val="aff8"/>
@@ -2231,7 +2231,7 @@
             <w:noProof/>
             <w:webHidden/>
           </w:rPr>
-          <w:instrText xml:space="preserve"> PAGEREF _Toc242105406 \h </w:instrText>
+          <w:instrText xml:space="preserve"> PAGEREF _Toc242136742 \h </w:instrText>
         </w:r>
         <w:r>
           <w:rPr>
@@ -2277,7 +2277,7 @@
           <w14:ligatures w14:val="standardContextual"/>
         </w:rPr>
       </w:pPr>
-      <w:hyperlink w:anchor="_Toc242105407" w:history="1">
+      <w:hyperlink w:anchor="_Toc242136743" w:history="1">
         <w:r>
           <w:rPr>
             <w:rStyle w:val="aff8"/>
@@ -2304,7 +2304,7 @@
             <w:noProof/>
             <w:webHidden/>
           </w:rPr>
-          <w:instrText xml:space="preserve"> PAGEREF _Toc242105407 \h </w:instrText>
+          <w:instrText xml:space="preserve"> PAGEREF _Toc242136743 \h </w:instrText>
         </w:r>
         <w:r>
           <w:rPr>
@@ -2350,7 +2350,7 @@
           <w14:ligatures w14:val="standardContextual"/>
         </w:rPr>
       </w:pPr>
-      <w:hyperlink w:anchor="_Toc242105408" w:history="1">
+      <w:hyperlink w:anchor="_Toc242136744" w:history="1">
         <w:r>
           <w:rPr>
             <w:rStyle w:val="aff8"/>
@@ -2377,7 +2377,7 @@
             <w:noProof/>
             <w:webHidden/>
           </w:rPr>
-          <w:instrText xml:space="preserve"> PAGEREF _Toc242105408 \h </w:instrText>
+          <w:instrText xml:space="preserve"> PAGEREF _Toc242136744 \h </w:instrText>
         </w:r>
         <w:r>
           <w:rPr>
@@ -2423,7 +2423,7 @@
           <w14:ligatures w14:val="standardContextual"/>
         </w:rPr>
       </w:pPr>
-      <w:hyperlink w:anchor="_Toc242105409" w:history="1">
+      <w:hyperlink w:anchor="_Toc242136745" w:history="1">
         <w:r>
           <w:rPr>
             <w:rStyle w:val="aff8"/>
@@ -2450,7 +2450,7 @@
             <w:noProof/>
             <w:webHidden/>
           </w:rPr>
-          <w:instrText xml:space="preserve"> PAGEREF _Toc242105409 \h </w:instrText>
+          <w:instrText xml:space="preserve"> PAGEREF _Toc242136745 \h </w:instrText>
         </w:r>
         <w:r>
           <w:rPr>
@@ -2496,7 +2496,7 @@
           <w14:ligatures w14:val="standardContextual"/>
         </w:rPr>
       </w:pPr>
-      <w:hyperlink w:anchor="_Toc242105410" w:history="1">
+      <w:hyperlink w:anchor="_Toc242136746" w:history="1">
         <w:r>
           <w:rPr>
             <w:rStyle w:val="aff8"/>
@@ -2523,7 +2523,7 @@
             <w:noProof/>
             <w:webHidden/>
           </w:rPr>
-          <w:instrText xml:space="preserve"> PAGEREF _Toc242105410 \h </w:instrText>
+          <w:instrText xml:space="preserve"> PAGEREF _Toc242136746 \h </w:instrText>
         </w:r>
         <w:r>
           <w:rPr>
@@ -2569,7 +2569,7 @@
           <w14:ligatures w14:val="standardContextual"/>
         </w:rPr>
       </w:pPr>
-      <w:hyperlink w:anchor="_Toc242105411" w:history="1">
+      <w:hyperlink w:anchor="_Toc242136747" w:history="1">
         <w:r>
           <w:rPr>
             <w:rStyle w:val="aff8"/>
@@ -2596,7 +2596,7 @@
             <w:noProof/>
             <w:webHidden/>
           </w:rPr>
-          <w:instrText xml:space="preserve"> PAGEREF _Toc242105411 \h </w:instrText>
+          <w:instrText xml:space="preserve"> PAGEREF _Toc242136747 \h </w:instrText>
         </w:r>
         <w:r>
           <w:rPr>
@@ -2642,7 +2642,7 @@
           <w14:ligatures w14:val="standardContextual"/>
         </w:rPr>
       </w:pPr>
-      <w:hyperlink w:anchor="_Toc242105412" w:history="1">
+      <w:hyperlink w:anchor="_Toc242136748" w:history="1">
         <w:r>
           <w:rPr>
             <w:rStyle w:val="aff8"/>
@@ -2669,7 +2669,7 @@
             <w:noProof/>
             <w:webHidden/>
           </w:rPr>
-          <w:instrText xml:space="preserve"> PAGEREF _Toc242105412 \h </w:instrText>
+          <w:instrText xml:space="preserve"> PAGEREF _Toc242136748 \h </w:instrText>
         </w:r>
         <w:r>
           <w:rPr>
@@ -2715,7 +2715,7 @@
           <w14:ligatures w14:val="standardContextual"/>
         </w:rPr>
       </w:pPr>
-      <w:hyperlink w:anchor="_Toc242105413" w:history="1">
+      <w:hyperlink w:anchor="_Toc242136749" w:history="1">
         <w:r>
           <w:rPr>
             <w:rStyle w:val="aff8"/>
@@ -2742,7 +2742,7 @@
             <w:noProof/>
             <w:webHidden/>
           </w:rPr>
-          <w:instrText xml:space="preserve"> PAGEREF _Toc242105413 \h </w:instrText>
+          <w:instrText xml:space="preserve"> PAGEREF _Toc242136749 \h </w:instrText>
         </w:r>
         <w:r>
           <w:rPr>
@@ -2788,7 +2788,7 @@
           <w14:ligatures w14:val="standardContextual"/>
         </w:rPr>
       </w:pPr>
-      <w:hyperlink w:anchor="_Toc242105414" w:history="1">
+      <w:hyperlink w:anchor="_Toc242136750" w:history="1">
         <w:r>
           <w:rPr>
             <w:rStyle w:val="aff8"/>
@@ -2815,7 +2815,7 @@
             <w:noProof/>
             <w:webHidden/>
           </w:rPr>
-          <w:instrText xml:space="preserve"> PAGEREF _Toc242105414 \h </w:instrText>
+          <w:instrText xml:space="preserve"> PAGEREF _Toc242136750 \h </w:instrText>
         </w:r>
         <w:r>
           <w:rPr>
@@ -2861,7 +2861,7 @@
           <w14:ligatures w14:val="standardContextual"/>
         </w:rPr>
       </w:pPr>
-      <w:hyperlink w:anchor="_Toc242105415" w:history="1">
+      <w:hyperlink w:anchor="_Toc242136751" w:history="1">
         <w:r>
           <w:rPr>
             <w:rStyle w:val="aff8"/>
@@ -2888,7 +2888,7 @@
             <w:noProof/>
             <w:webHidden/>
           </w:rPr>
-          <w:instrText xml:space="preserve"> PAGEREF _Toc242105415 \h </w:instrText>
+          <w:instrText xml:space="preserve"> PAGEREF _Toc242136751 \h </w:instrText>
         </w:r>
         <w:r>
           <w:rPr>
@@ -2934,7 +2934,7 @@
           <w14:ligatures w14:val="standardContextual"/>
         </w:rPr>
       </w:pPr>
-      <w:hyperlink w:anchor="_Toc242105416" w:history="1">
+      <w:hyperlink w:anchor="_Toc242136752" w:history="1">
         <w:r>
           <w:rPr>
             <w:rStyle w:val="aff8"/>
@@ -2961,7 +2961,7 @@
             <w:noProof/>
             <w:webHidden/>
           </w:rPr>
-          <w:instrText xml:space="preserve"> PAGEREF _Toc242105416 \h </w:instrText>
+          <w:instrText xml:space="preserve"> PAGEREF _Toc242136752 \h </w:instrText>
         </w:r>
         <w:r>
           <w:rPr>
@@ -3007,7 +3007,7 @@
           <w14:ligatures w14:val="standardContextual"/>
         </w:rPr>
       </w:pPr>
-      <w:hyperlink w:anchor="_Toc242105417" w:history="1">
+      <w:hyperlink w:anchor="_Toc242136753" w:history="1">
         <w:r>
           <w:rPr>
             <w:rStyle w:val="aff8"/>
@@ -3034,7 +3034,7 @@
             <w:noProof/>
             <w:webHidden/>
           </w:rPr>
-          <w:instrText xml:space="preserve"> PAGEREF _Toc242105417 \h </w:instrText>
+          <w:instrText xml:space="preserve"> PAGEREF _Toc242136753 \h </w:instrText>
         </w:r>
         <w:r>
           <w:rPr>
@@ -3080,7 +3080,7 @@
           <w14:ligatures w14:val="standardContextual"/>
         </w:rPr>
       </w:pPr>
-      <w:hyperlink w:anchor="_Toc242105418" w:history="1">
+      <w:hyperlink w:anchor="_Toc242136754" w:history="1">
         <w:r>
           <w:rPr>
             <w:rStyle w:val="aff8"/>
@@ -3107,7 +3107,7 @@
             <w:noProof/>
             <w:webHidden/>
           </w:rPr>
-          <w:instrText xml:space="preserve"> PAGEREF _Toc242105418 \h </w:instrText>
+          <w:instrText xml:space="preserve"> PAGEREF _Toc242136754 \h </w:instrText>
         </w:r>
         <w:r>
           <w:rPr>
@@ -3153,7 +3153,7 @@
           <w14:ligatures w14:val="standardContextual"/>
         </w:rPr>
       </w:pPr>
-      <w:hyperlink w:anchor="_Toc242105419" w:history="1">
+      <w:hyperlink w:anchor="_Toc242136755" w:history="1">
         <w:r>
           <w:rPr>
             <w:rStyle w:val="aff8"/>
@@ -3180,7 +3180,7 @@
             <w:noProof/>
             <w:webHidden/>
           </w:rPr>
-          <w:instrText xml:space="preserve"> PAGEREF _Toc242105419 \h </w:instrText>
+          <w:instrText xml:space="preserve"> PAGEREF _Toc242136755 \h </w:instrText>
         </w:r>
         <w:r>
           <w:rPr>
@@ -3226,7 +3226,7 @@
           <w14:ligatures w14:val="standardContextual"/>
         </w:rPr>
       </w:pPr>
-      <w:hyperlink w:anchor="_Toc242105420" w:history="1">
+      <w:hyperlink w:anchor="_Toc242136756" w:history="1">
         <w:r>
           <w:rPr>
             <w:rStyle w:val="aff8"/>
@@ -3253,7 +3253,7 @@
             <w:noProof/>
             <w:webHidden/>
           </w:rPr>
-          <w:instrText xml:space="preserve"> PAGEREF _Toc242105420 \h </w:instrText>
+          <w:instrText xml:space="preserve"> PAGEREF _Toc242136756 \h </w:instrText>
         </w:r>
         <w:r>
           <w:rPr>
@@ -3299,7 +3299,7 @@
           <w14:ligatures w14:val="standardContextual"/>
         </w:rPr>
       </w:pPr>
-      <w:hyperlink w:anchor="_Toc242105421" w:history="1">
+      <w:hyperlink w:anchor="_Toc242136757" w:history="1">
         <w:r>
           <w:rPr>
             <w:rStyle w:val="aff8"/>
@@ -3326,7 +3326,7 @@
             <w:noProof/>
             <w:webHidden/>
           </w:rPr>
-          <w:instrText xml:space="preserve"> PAGEREF _Toc242105421 \h </w:instrText>
+          <w:instrText xml:space="preserve"> PAGEREF _Toc242136757 \h </w:instrText>
         </w:r>
         <w:r>
           <w:rPr>
@@ -3372,7 +3372,7 @@
           <w14:ligatures w14:val="standardContextual"/>
         </w:rPr>
       </w:pPr>
-      <w:hyperlink w:anchor="_Toc242105422" w:history="1">
+      <w:hyperlink w:anchor="_Toc242136758" w:history="1">
         <w:r>
           <w:rPr>
             <w:rStyle w:val="aff8"/>
@@ -3399,7 +3399,7 @@
             <w:noProof/>
             <w:webHidden/>
           </w:rPr>
-          <w:instrText xml:space="preserve"> PAGEREF _Toc242105422 \h </w:instrText>
+          <w:instrText xml:space="preserve"> PAGEREF _Toc242136758 \h </w:instrText>
         </w:r>
         <w:r>
           <w:rPr>
@@ -3445,7 +3445,7 @@
           <w14:ligatures w14:val="standardContextual"/>
         </w:rPr>
       </w:pPr>
-      <w:hyperlink w:anchor="_Toc242105423" w:history="1">
+      <w:hyperlink w:anchor="_Toc242136759" w:history="1">
         <w:r>
           <w:rPr>
             <w:rStyle w:val="aff8"/>
@@ -3472,7 +3472,7 @@
             <w:noProof/>
             <w:webHidden/>
           </w:rPr>
-          <w:instrText xml:space="preserve"> PAGEREF _Toc242105423 \h </w:instrText>
+          <w:instrText xml:space="preserve"> PAGEREF _Toc242136759 \h </w:instrText>
         </w:r>
         <w:r>
           <w:rPr>
@@ -3518,7 +3518,7 @@
           <w14:ligatures w14:val="standardContextual"/>
         </w:rPr>
       </w:pPr>
-      <w:hyperlink w:anchor="_Toc242105424" w:history="1">
+      <w:hyperlink w:anchor="_Toc242136760" w:history="1">
         <w:r>
           <w:rPr>
             <w:rStyle w:val="aff8"/>
@@ -3545,7 +3545,7 @@
             <w:noProof/>
             <w:webHidden/>
           </w:rPr>
-          <w:instrText xml:space="preserve"> PAGEREF _Toc242105424 \h </w:instrText>
+          <w:instrText xml:space="preserve"> PAGEREF _Toc242136760 \h </w:instrText>
         </w:r>
         <w:r>
           <w:rPr>
@@ -3591,7 +3591,7 @@
           <w14:ligatures w14:val="standardContextual"/>
         </w:rPr>
       </w:pPr>
-      <w:hyperlink w:anchor="_Toc242105425" w:history="1">
+      <w:hyperlink w:anchor="_Toc242136761" w:history="1">
         <w:r>
           <w:rPr>
             <w:rStyle w:val="aff8"/>
@@ -3618,7 +3618,7 @@
             <w:noProof/>
             <w:webHidden/>
           </w:rPr>
-          <w:instrText xml:space="preserve"> PAGEREF _Toc242105425 \h </w:instrText>
+          <w:instrText xml:space="preserve"> PAGEREF _Toc242136761 \h </w:instrText>
         </w:r>
         <w:r>
           <w:rPr>
@@ -3664,7 +3664,7 @@
           <w14:ligatures w14:val="standardContextual"/>
         </w:rPr>
       </w:pPr>
-      <w:hyperlink w:anchor="_Toc242105426" w:history="1">
+      <w:hyperlink w:anchor="_Toc242136762" w:history="1">
         <w:r>
           <w:rPr>
             <w:rStyle w:val="aff8"/>
@@ -3691,7 +3691,7 @@
             <w:noProof/>
             <w:webHidden/>
           </w:rPr>
-          <w:instrText xml:space="preserve"> PAGEREF _Toc242105426 \h </w:instrText>
+          <w:instrText xml:space="preserve"> PAGEREF _Toc242136762 \h </w:instrText>
         </w:r>
         <w:r>
           <w:rPr>
@@ -3737,7 +3737,7 @@
           <w14:ligatures w14:val="standardContextual"/>
         </w:rPr>
       </w:pPr>
-      <w:hyperlink w:anchor="_Toc242105427" w:history="1">
+      <w:hyperlink w:anchor="_Toc242136763" w:history="1">
         <w:r>
           <w:rPr>
             <w:rStyle w:val="aff8"/>
@@ -3764,7 +3764,7 @@
             <w:noProof/>
             <w:webHidden/>
           </w:rPr>
-          <w:instrText xml:space="preserve"> PAGEREF _Toc242105427 \h </w:instrText>
+          <w:instrText xml:space="preserve"> PAGEREF _Toc242136763 \h </w:instrText>
         </w:r>
         <w:r>
           <w:rPr>
@@ -3810,7 +3810,7 @@
           <w14:ligatures w14:val="standardContextual"/>
         </w:rPr>
       </w:pPr>
-      <w:hyperlink w:anchor="_Toc242105428" w:history="1">
+      <w:hyperlink w:anchor="_Toc242136764" w:history="1">
         <w:r>
           <w:rPr>
             <w:rStyle w:val="aff8"/>
@@ -3837,7 +3837,7 @@
             <w:noProof/>
             <w:webHidden/>
           </w:rPr>
-          <w:instrText xml:space="preserve"> PAGEREF _Toc242105428 \h </w:instrText>
+          <w:instrText xml:space="preserve"> PAGEREF _Toc242136764 \h </w:instrText>
         </w:r>
         <w:r>
           <w:rPr>
@@ -3883,7 +3883,7 @@
           <w14:ligatures w14:val="standardContextual"/>
         </w:rPr>
       </w:pPr>
-      <w:hyperlink w:anchor="_Toc242105429" w:history="1">
+      <w:hyperlink w:anchor="_Toc242136765" w:history="1">
         <w:r>
           <w:rPr>
             <w:rStyle w:val="aff8"/>
@@ -3910,7 +3910,7 @@
             <w:noProof/>
             <w:webHidden/>
           </w:rPr>
-          <w:instrText xml:space="preserve"> PAGEREF _Toc242105429 \h </w:instrText>
+          <w:instrText xml:space="preserve"> PAGEREF _Toc242136765 \h </w:instrText>
         </w:r>
         <w:r>
           <w:rPr>
@@ -3956,7 +3956,7 @@
           <w14:ligatures w14:val="standardContextual"/>
         </w:rPr>
       </w:pPr>
-      <w:hyperlink w:anchor="_Toc242105430" w:history="1">
+      <w:hyperlink w:anchor="_Toc242136766" w:history="1">
         <w:r>
           <w:rPr>
             <w:rStyle w:val="aff8"/>
@@ -3983,7 +3983,7 @@
             <w:noProof/>
             <w:webHidden/>
           </w:rPr>
-          <w:instrText xml:space="preserve"> PAGEREF _Toc242105430 \h </w:instrText>
+          <w:instrText xml:space="preserve"> PAGEREF _Toc242136766 \h </w:instrText>
         </w:r>
         <w:r>
           <w:rPr>
@@ -4029,7 +4029,7 @@
           <w14:ligatures w14:val="standardContextual"/>
         </w:rPr>
       </w:pPr>
-      <w:hyperlink w:anchor="_Toc242105431" w:history="1">
+      <w:hyperlink w:anchor="_Toc242136767" w:history="1">
         <w:r>
           <w:rPr>
             <w:rStyle w:val="aff8"/>
@@ -4056,7 +4056,7 @@
             <w:noProof/>
             <w:webHidden/>
           </w:rPr>
-          <w:instrText xml:space="preserve"> PAGEREF _Toc242105431 \h </w:instrText>
+          <w:instrText xml:space="preserve"> PAGEREF _Toc242136767 \h </w:instrText>
         </w:r>
         <w:r>
           <w:rPr>
@@ -4102,7 +4102,7 @@
           <w14:ligatures w14:val="standardContextual"/>
         </w:rPr>
       </w:pPr>
-      <w:hyperlink w:anchor="_Toc242105432" w:history="1">
+      <w:hyperlink w:anchor="_Toc242136768" w:history="1">
         <w:r>
           <w:rPr>
             <w:rStyle w:val="aff8"/>
@@ -4129,7 +4129,7 @@
             <w:noProof/>
             <w:webHidden/>
           </w:rPr>
-          <w:instrText xml:space="preserve"> PAGEREF _Toc242105432 \h </w:instrText>
+          <w:instrText xml:space="preserve"> PAGEREF _Toc242136768 \h </w:instrText>
         </w:r>
         <w:r>
           <w:rPr>
@@ -4175,7 +4175,7 @@
           <w14:ligatures w14:val="standardContextual"/>
         </w:rPr>
       </w:pPr>
-      <w:hyperlink w:anchor="_Toc242105433" w:history="1">
+      <w:hyperlink w:anchor="_Toc242136769" w:history="1">
         <w:r>
           <w:rPr>
             <w:rStyle w:val="aff8"/>
@@ -4202,7 +4202,7 @@
             <w:noProof/>
             <w:webHidden/>
           </w:rPr>
-          <w:instrText xml:space="preserve"> PAGEREF _Toc242105433 \h </w:instrText>
+          <w:instrText xml:space="preserve"> PAGEREF _Toc242136769 \h </w:instrText>
         </w:r>
         <w:r>
           <w:rPr>
@@ -4248,7 +4248,7 @@
           <w14:ligatures w14:val="standardContextual"/>
         </w:rPr>
       </w:pPr>
-      <w:hyperlink w:anchor="_Toc242105434" w:history="1">
+      <w:hyperlink w:anchor="_Toc242136770" w:history="1">
         <w:r>
           <w:rPr>
             <w:rStyle w:val="aff8"/>
@@ -4275,7 +4275,7 @@
             <w:noProof/>
             <w:webHidden/>
           </w:rPr>
-          <w:instrText xml:space="preserve"> PAGEREF _Toc242105434 \h </w:instrText>
+          <w:instrText xml:space="preserve"> PAGEREF _Toc242136770 \h </w:instrText>
         </w:r>
         <w:r>
           <w:rPr>
@@ -4321,7 +4321,7 @@
           <w14:ligatures w14:val="standardContextual"/>
         </w:rPr>
       </w:pPr>
-      <w:hyperlink w:anchor="_Toc242105435" w:history="1">
+      <w:hyperlink w:anchor="_Toc242136771" w:history="1">
         <w:r>
           <w:rPr>
             <w:rStyle w:val="aff8"/>
@@ -4348,7 +4348,7 @@
             <w:noProof/>
             <w:webHidden/>
           </w:rPr>
-          <w:instrText xml:space="preserve"> PAGEREF _Toc242105435 \h </w:instrText>
+          <w:instrText xml:space="preserve"> PAGEREF _Toc242136771 \h </w:instrText>
         </w:r>
         <w:r>
           <w:rPr>
@@ -4394,7 +4394,7 @@
           <w14:ligatures w14:val="standardContextual"/>
         </w:rPr>
       </w:pPr>
-      <w:hyperlink w:anchor="_Toc242105436" w:history="1">
+      <w:hyperlink w:anchor="_Toc242136772" w:history="1">
         <w:r>
           <w:rPr>
             <w:rStyle w:val="aff8"/>
@@ -4421,7 +4421,7 @@
             <w:noProof/>
             <w:webHidden/>
           </w:rPr>
-          <w:instrText xml:space="preserve"> PAGEREF _Toc242105436 \h </w:instrText>
+          <w:instrText xml:space="preserve"> PAGEREF _Toc242136772 \h </w:instrText>
         </w:r>
         <w:r>
           <w:rPr>
@@ -4467,7 +4467,7 @@
           <w14:ligatures w14:val="standardContextual"/>
         </w:rPr>
       </w:pPr>
-      <w:hyperlink w:anchor="_Toc242105437" w:history="1">
+      <w:hyperlink w:anchor="_Toc242136773" w:history="1">
         <w:r>
           <w:rPr>
             <w:rStyle w:val="aff8"/>
@@ -4494,7 +4494,7 @@
             <w:noProof/>
             <w:webHidden/>
           </w:rPr>
-          <w:instrText xml:space="preserve"> PAGEREF _Toc242105437 \h </w:instrText>
+          <w:instrText xml:space="preserve"> PAGEREF _Toc242136773 \h </w:instrText>
         </w:r>
         <w:r>
           <w:rPr>
@@ -4540,7 +4540,7 @@
         <w:ind w:firstLine="0"/>
         <w:jc w:val="center"/>
       </w:pPr>
-      <w:bookmarkStart w:id="0" w:name="_Toc242105380"/>
+      <w:bookmarkStart w:id="0" w:name="_Toc242136716"/>
       <w:r>
         <w:lastRenderedPageBreak/>
         <w:t>ПЕРЕЧЕНЬ ТЕРМИНОВ И СОКРАЩЕНИЙ</w:t>
@@ -5802,7 +5802,7 @@
         <w:pStyle w:val="1"/>
         <w:pageBreakBefore/>
       </w:pPr>
-      <w:bookmarkStart w:id="1" w:name="_Toc242105381"/>
+      <w:bookmarkStart w:id="1" w:name="_Toc242136717"/>
       <w:r>
         <w:lastRenderedPageBreak/>
         <w:t>1 Общие сведения</w:t>
@@ -5813,7 +5813,7 @@
       <w:pPr>
         <w:pStyle w:val="21"/>
       </w:pPr>
-      <w:bookmarkStart w:id="2" w:name="_Toc242105382"/>
+      <w:bookmarkStart w:id="2" w:name="_Toc242136718"/>
       <w:r>
         <w:t>1.1 Полное наименование системы и её условное обозначение</w:t>
       </w:r>
@@ -5833,7 +5833,7 @@
       <w:pPr>
         <w:pStyle w:val="21"/>
       </w:pPr>
-      <w:bookmarkStart w:id="3" w:name="_Toc242105383"/>
+      <w:bookmarkStart w:id="3" w:name="_Toc242136719"/>
       <w:r>
         <w:t>1.2 Шифр темы и номер договора</w:t>
       </w:r>
@@ -5848,7 +5848,7 @@
       <w:pPr>
         <w:pStyle w:val="21"/>
       </w:pPr>
-      <w:bookmarkStart w:id="4" w:name="_Toc242105384"/>
+      <w:bookmarkStart w:id="4" w:name="_Toc242136720"/>
       <w:r>
         <w:t>1.3 Наименования организаций заказчика и разработчика</w:t>
       </w:r>
@@ -5868,7 +5868,7 @@
       <w:pPr>
         <w:pStyle w:val="21"/>
       </w:pPr>
-      <w:bookmarkStart w:id="5" w:name="_Toc242105385"/>
+      <w:bookmarkStart w:id="5" w:name="_Toc242136721"/>
       <w:r>
         <w:t>1.4 Основания для создания системы</w:t>
       </w:r>
@@ -5893,7 +5893,7 @@
       <w:pPr>
         <w:pStyle w:val="21"/>
       </w:pPr>
-      <w:bookmarkStart w:id="6" w:name="_Toc242105386"/>
+      <w:bookmarkStart w:id="6" w:name="_Toc242136722"/>
       <w:r>
         <w:t>1.5 Плановые сроки начала и окончания работ</w:t>
       </w:r>
@@ -5908,7 +5908,7 @@
       <w:pPr>
         <w:pStyle w:val="21"/>
       </w:pPr>
-      <w:bookmarkStart w:id="7" w:name="_Toc242105387"/>
+      <w:bookmarkStart w:id="7" w:name="_Toc242136723"/>
       <w:r>
         <w:t>1.6 Сведения об источниках и порядке финансирования</w:t>
       </w:r>
@@ -5923,7 +5923,7 @@
       <w:pPr>
         <w:pStyle w:val="21"/>
       </w:pPr>
-      <w:bookmarkStart w:id="8" w:name="_Toc242105388"/>
+      <w:bookmarkStart w:id="8" w:name="_Toc242136724"/>
       <w:r>
         <w:lastRenderedPageBreak/>
         <w:t>1.7 Порядок оформления и предъявления результатов работ</w:t>
@@ -5939,7 +5939,7 @@
       <w:pPr>
         <w:pStyle w:val="21"/>
       </w:pPr>
-      <w:bookmarkStart w:id="9" w:name="_Toc242105389"/>
+      <w:bookmarkStart w:id="9" w:name="_Toc242136725"/>
       <w:r>
         <w:t>1.8 Перечень нормативно-технических документов</w:t>
       </w:r>
@@ -6003,7 +6003,7 @@
         <w:pStyle w:val="1"/>
         <w:pageBreakBefore/>
       </w:pPr>
-      <w:bookmarkStart w:id="10" w:name="_Toc242105390"/>
+      <w:bookmarkStart w:id="10" w:name="_Toc242136726"/>
       <w:r>
         <w:lastRenderedPageBreak/>
         <w:t>2 Цели и назначение создания автоматизированной системы</w:t>
@@ -6014,7 +6014,7 @@
       <w:pPr>
         <w:pStyle w:val="21"/>
       </w:pPr>
-      <w:bookmarkStart w:id="11" w:name="_Toc242105391"/>
+      <w:bookmarkStart w:id="11" w:name="_Toc242136727"/>
       <w:r>
         <w:t>2.1 Назначение системы</w:t>
       </w:r>
@@ -6074,7 +6074,7 @@
       <w:pPr>
         <w:pStyle w:val="21"/>
       </w:pPr>
-      <w:bookmarkStart w:id="12" w:name="_Toc242105392"/>
+      <w:bookmarkStart w:id="12" w:name="_Toc242136728"/>
       <w:r>
         <w:t>2.2 Цели создания системы</w:t>
       </w:r>
@@ -6120,7 +6120,7 @@
         <w:pStyle w:val="1"/>
         <w:pageBreakBefore/>
       </w:pPr>
-      <w:bookmarkStart w:id="13" w:name="_Toc242105393"/>
+      <w:bookmarkStart w:id="13" w:name="_Toc242136729"/>
       <w:r>
         <w:lastRenderedPageBreak/>
         <w:t>3 Характеристика объекта автоматизации</w:t>
@@ -6131,7 +6131,7 @@
       <w:pPr>
         <w:pStyle w:val="21"/>
       </w:pPr>
-      <w:bookmarkStart w:id="14" w:name="_Toc242105394"/>
+      <w:bookmarkStart w:id="14" w:name="_Toc242136730"/>
       <w:r>
         <w:t>3.1 Краткие сведения об объекте автоматизации</w:t>
       </w:r>
@@ -6221,7 +6221,7 @@
       <w:pPr>
         <w:pStyle w:val="21"/>
       </w:pPr>
-      <w:bookmarkStart w:id="15" w:name="_Toc242105395"/>
+      <w:bookmarkStart w:id="15" w:name="_Toc242136731"/>
       <w:r>
         <w:t>3.2 Сведения об условиях эксплуатации</w:t>
       </w:r>
@@ -6237,7 +6237,7 @@
         <w:pStyle w:val="1"/>
         <w:pageBreakBefore/>
       </w:pPr>
-      <w:bookmarkStart w:id="16" w:name="_Toc242105396"/>
+      <w:bookmarkStart w:id="16" w:name="_Toc242136732"/>
       <w:r>
         <w:lastRenderedPageBreak/>
         <w:t>4 Требования к автоматизированной системе</w:t>
@@ -6248,7 +6248,7 @@
       <w:pPr>
         <w:pStyle w:val="21"/>
       </w:pPr>
-      <w:bookmarkStart w:id="17" w:name="_Toc242105397"/>
+      <w:bookmarkStart w:id="17" w:name="_Toc242136733"/>
       <w:r>
         <w:t>4.1 Требования к системе в целом</w:t>
       </w:r>
@@ -6258,7 +6258,7 @@
       <w:pPr>
         <w:pStyle w:val="31"/>
       </w:pPr>
-      <w:bookmarkStart w:id="18" w:name="_Toc242105398"/>
+      <w:bookmarkStart w:id="18" w:name="_Toc242136734"/>
       <w:r>
         <w:t>4.1.1 Требования к структуре и функционированию системы</w:t>
       </w:r>
@@ -6563,7 +6563,7 @@
               <w:pStyle w:val="GostTable"/>
             </w:pPr>
             <w:r>
-              <w:t>Графики платежей, отметка оплат, просрочка, возвраты, справочники типов платежей и счетов получателей, валюты и курсы</w:t>
+              <w:t>Графики платежей, отметка оплат, просрочка, возвраты, справочники типов платежей и счетов получателей, валюты и курсы, условия рассрочки</w:t>
             </w:r>
           </w:p>
         </w:tc>
@@ -6904,7 +6904,7 @@
       <w:pPr>
         <w:pStyle w:val="31"/>
       </w:pPr>
-      <w:bookmarkStart w:id="19" w:name="_Toc242105399"/>
+      <w:bookmarkStart w:id="19" w:name="_Toc242136735"/>
       <w:r>
         <w:t>4.1.2 Требования к численности и квалификации персонала</w:t>
       </w:r>
@@ -7185,7 +7185,7 @@
       <w:pPr>
         <w:pStyle w:val="31"/>
       </w:pPr>
-      <w:bookmarkStart w:id="20" w:name="_Toc242105400"/>
+      <w:bookmarkStart w:id="20" w:name="_Toc242136736"/>
       <w:r>
         <w:t>4.1.3 Показатели назначения</w:t>
       </w:r>
@@ -7233,7 +7233,7 @@
       <w:pPr>
         <w:pStyle w:val="31"/>
       </w:pPr>
-      <w:bookmarkStart w:id="21" w:name="_Toc242105401"/>
+      <w:bookmarkStart w:id="21" w:name="_Toc242136737"/>
       <w:r>
         <w:t>4.1.4 Требования к надёжности</w:t>
       </w:r>
@@ -7267,7 +7267,7 @@
       <w:pPr>
         <w:pStyle w:val="31"/>
       </w:pPr>
-      <w:bookmarkStart w:id="22" w:name="_Toc242105402"/>
+      <w:bookmarkStart w:id="22" w:name="_Toc242136738"/>
       <w:r>
         <w:t>4.1.5 Требования к безопасности</w:t>
       </w:r>
@@ -7282,7 +7282,7 @@
       <w:pPr>
         <w:pStyle w:val="31"/>
       </w:pPr>
-      <w:bookmarkStart w:id="23" w:name="_Toc242105403"/>
+      <w:bookmarkStart w:id="23" w:name="_Toc242136739"/>
       <w:r>
         <w:t>4.1.6 Требования к эргономике и технической эстетике</w:t>
       </w:r>
@@ -7327,7 +7327,7 @@
       <w:pPr>
         <w:pStyle w:val="31"/>
       </w:pPr>
-      <w:bookmarkStart w:id="24" w:name="_Toc242105404"/>
+      <w:bookmarkStart w:id="24" w:name="_Toc242136740"/>
       <w:r>
         <w:t>4.1.7 Требования к эксплуатации и техническому обслуживанию</w:t>
       </w:r>
@@ -7357,7 +7357,7 @@
       <w:pPr>
         <w:pStyle w:val="31"/>
       </w:pPr>
-      <w:bookmarkStart w:id="25" w:name="_Toc242105405"/>
+      <w:bookmarkStart w:id="25" w:name="_Toc242136741"/>
       <w:r>
         <w:t>4.1.8 Требования к защите информации от несанкционированного доступа</w:t>
       </w:r>
@@ -7428,7 +7428,7 @@
       <w:pPr>
         <w:pStyle w:val="31"/>
       </w:pPr>
-      <w:bookmarkStart w:id="26" w:name="_Toc242105406"/>
+      <w:bookmarkStart w:id="26" w:name="_Toc242136742"/>
       <w:r>
         <w:t>4.1.9 Требования по сохранности информации при авариях</w:t>
       </w:r>
@@ -7449,7 +7449,7 @@
       <w:pPr>
         <w:pStyle w:val="31"/>
       </w:pPr>
-      <w:bookmarkStart w:id="27" w:name="_Toc242105407"/>
+      <w:bookmarkStart w:id="27" w:name="_Toc242136743"/>
       <w:r>
         <w:t>4.1.10 Требования к защите от влияния внешних воздействий</w:t>
       </w:r>
@@ -7464,7 +7464,7 @@
       <w:pPr>
         <w:pStyle w:val="31"/>
       </w:pPr>
-      <w:bookmarkStart w:id="28" w:name="_Toc242105408"/>
+      <w:bookmarkStart w:id="28" w:name="_Toc242136744"/>
       <w:r>
         <w:t>4.1.11 Требования к патентной чистоте</w:t>
       </w:r>
@@ -7482,7 +7482,7 @@
       <w:pPr>
         <w:pStyle w:val="31"/>
       </w:pPr>
-      <w:bookmarkStart w:id="29" w:name="_Toc242105409"/>
+      <w:bookmarkStart w:id="29" w:name="_Toc242136745"/>
       <w:r>
         <w:t>4.1.12 Требования по стандартизации и унификации</w:t>
       </w:r>
@@ -7497,7 +7497,7 @@
       <w:pPr>
         <w:pStyle w:val="31"/>
       </w:pPr>
-      <w:bookmarkStart w:id="30" w:name="_Toc242105410"/>
+      <w:bookmarkStart w:id="30" w:name="_Toc242136746"/>
       <w:r>
         <w:t>4.1.13 Дополнительные требования</w:t>
       </w:r>
@@ -7517,7 +7517,7 @@
       <w:pPr>
         <w:pStyle w:val="21"/>
       </w:pPr>
-      <w:bookmarkStart w:id="31" w:name="_Toc242105411"/>
+      <w:bookmarkStart w:id="31" w:name="_Toc242136747"/>
       <w:r>
         <w:lastRenderedPageBreak/>
         <w:t>4.2 Требования к функциям, выполняемым системой</w:t>
@@ -7533,7 +7533,7 @@
       <w:pPr>
         <w:pStyle w:val="31"/>
       </w:pPr>
-      <w:bookmarkStart w:id="32" w:name="_Toc242105412"/>
+      <w:bookmarkStart w:id="32" w:name="_Toc242136748"/>
       <w:r>
         <w:t>4.2.1 Подсистема «Организационная структура и права доступа»</w:t>
       </w:r>
@@ -7578,7 +7578,7 @@
       <w:pPr>
         <w:pStyle w:val="31"/>
       </w:pPr>
-      <w:bookmarkStart w:id="33" w:name="_Toc242105413"/>
+      <w:bookmarkStart w:id="33" w:name="_Toc242136749"/>
       <w:r>
         <w:t>4.2.2 Подсистема «Каталог недвижимости»</w:t>
       </w:r>
@@ -7628,7 +7628,7 @@
       <w:pPr>
         <w:pStyle w:val="31"/>
       </w:pPr>
-      <w:bookmarkStart w:id="34" w:name="_Toc242105414"/>
+      <w:bookmarkStart w:id="34" w:name="_Toc242136750"/>
       <w:r>
         <w:lastRenderedPageBreak/>
         <w:t>4.2.3 Подсистема «Работа с клиентами»</w:t>
@@ -7669,7 +7669,7 @@
       <w:pPr>
         <w:pStyle w:val="31"/>
       </w:pPr>
-      <w:bookmarkStart w:id="35" w:name="_Toc242105415"/>
+      <w:bookmarkStart w:id="35" w:name="_Toc242136751"/>
       <w:r>
         <w:t>4.2.4 Подсистема «Сделки»</w:t>
       </w:r>
@@ -7714,7 +7714,7 @@
       <w:pPr>
         <w:pStyle w:val="31"/>
       </w:pPr>
-      <w:bookmarkStart w:id="36" w:name="_Toc242105416"/>
+      <w:bookmarkStart w:id="36" w:name="_Toc242136752"/>
       <w:r>
         <w:lastRenderedPageBreak/>
         <w:t>4.2.5 Подсистема «Финансы»</w:t>
@@ -7763,14 +7763,19 @@
     </w:p>
     <w:p>
       <w:r>
-        <w:t>– настройку валюты сделок компании (одна на компанию) и перечня поддерживаемых валют; загрузку курсов ЦБ Узбекистана автоматически и по запросу пользователя; ручной ввод курса компании на дату, действующего вместо курса ЦБ только в этой компании.</w:t>
+        <w:t>– настройку валюты сделок компании (одна на компанию) и перечня поддерживаемых валют; загрузку курсов ЦБ Узбекистана автоматически и по запросу пользователя; ручной ввод курса компании на дату, действующего вместо курса ЦБ только в этой компании;</w:t>
+      </w:r>
+    </w:p>
+    <w:p>
+      <w:r>
+        <w:t>– ведение условий рассрочки компании (срок, скидка за срок, минимальный первоначальный взнос); расчёт и печать вариантов оплаты объекта для клиента; создание графика платежей сделки по выбранному варианту одной операцией с последующей ручной правкой.</w:t>
       </w:r>
     </w:p>
     <w:p>
       <w:pPr>
         <w:pStyle w:val="31"/>
       </w:pPr>
-      <w:bookmarkStart w:id="37" w:name="_Toc242105417"/>
+      <w:bookmarkStart w:id="37" w:name="_Toc242136753"/>
       <w:r>
         <w:t>4.2.6 Подсистема «Шаблоны документов»</w:t>
       </w:r>
@@ -7785,7 +7790,7 @@
       <w:pPr>
         <w:pStyle w:val="31"/>
       </w:pPr>
-      <w:bookmarkStart w:id="38" w:name="_Toc242105418"/>
+      <w:bookmarkStart w:id="38" w:name="_Toc242136754"/>
       <w:r>
         <w:t>4.2.7 Подсистема «Задачи»</w:t>
       </w:r>
@@ -7793,227 +7798,233 @@
     </w:p>
     <w:p>
       <w:r>
-        <w:t>Подсистема должна обеспечивать постановку задач с исполнителем, сроком, приоритетом, наблюдателями, тегами и оценкой времени; подзадачи; комментарии; статусы «Новая», «В работе», «На проверке», «Завершена», «Отменена», «Заблокирована»; запрет завершения задачи при открытых подзадачах; представления списком, канбан-доской и календарём; журнал изменений.</w:t>
+        <w:t xml:space="preserve">Подсистема должна обеспечивать постановку задач с исполнителем, сроком, приоритетом, наблюдателями, тегами и оценкой времени; подзадачи; комментарии; статусы «Новая», «В работе», «На проверке», «Завершена», «Отменена», «Заблокирована»; запрет </w:t>
+      </w:r>
+      <w:r>
+        <w:lastRenderedPageBreak/>
+        <w:t>завершения задачи при открытых подзадачах; представления списком, канбан-доской и календарём; журнал изменений.</w:t>
       </w:r>
     </w:p>
     <w:p>
       <w:pPr>
         <w:pStyle w:val="31"/>
       </w:pPr>
-      <w:bookmarkStart w:id="39" w:name="_Toc242105419"/>
+      <w:bookmarkStart w:id="39" w:name="_Toc242136755"/>
+      <w:r>
+        <w:t>4.2.8 Подсистема «Аналитика и отчётность»</w:t>
+      </w:r>
+      <w:bookmarkEnd w:id="39"/>
+    </w:p>
+    <w:p>
+      <w:r>
+        <w:t>Подсистема должна обеспечивать:</w:t>
+      </w:r>
+    </w:p>
+    <w:p>
+      <w:r>
+        <w:t>– дашборд с показателями дня и месяца в пределах области видимости пользователя;</w:t>
+      </w:r>
+    </w:p>
+    <w:p>
+      <w:r>
+        <w:t>– сводные таблицы по заявкам, встречам, сделкам и платежам с группировкой и выгрузкой в Excel; отбор «забытых» заявок и просроченных встреч;</w:t>
+      </w:r>
+    </w:p>
+    <w:p>
+      <w:r>
+        <w:t>– загрузку планов продаж по проектам и по сотрудникам из XLSX-шаблонов;</w:t>
+      </w:r>
+    </w:p>
+    <w:p>
+      <w:r>
+        <w:t>– отчёты «план-факт» по количеству, контрактации и поступлениям с процентом выполнения и прогнозом выполнения к концу периода;</w:t>
+      </w:r>
+    </w:p>
+    <w:p>
+      <w:r>
+        <w:t>– приведение денежных показателей дашборда, общего итога финансов и денежного факта отчётов «план-факт» к валюте сделок компании по курсу на дату события; предупреждение о валютах, для которых нет курса и суммы которых поэтому не учтены.</w:t>
+      </w:r>
+    </w:p>
+    <w:p>
+      <w:pPr>
+        <w:pStyle w:val="31"/>
+      </w:pPr>
+      <w:bookmarkStart w:id="40" w:name="_Toc242136756"/>
+      <w:r>
+        <w:t>4.2.9 Подсистема «Интеграция с партнёрами»</w:t>
+      </w:r>
+      <w:bookmarkEnd w:id="40"/>
+    </w:p>
+    <w:p>
+      <w:r>
+        <w:t>Подсистема должна обеспечивать выдачу партнёрам по API-ключу сведений о проектах, домах и планировках и приём заявок; отказ от создания дубля заявки при повторной отправке формы в течение 24 ч; управление API-ключами (создание, изменение, отключение, перевыпуск, показ ключа один раз при выдаче).</w:t>
+      </w:r>
+    </w:p>
+    <w:p>
+      <w:pPr>
+        <w:pStyle w:val="31"/>
+      </w:pPr>
+      <w:bookmarkStart w:id="41" w:name="_Toc242136757"/>
+      <w:r>
+        <w:t>4.2.10 Подсистема «Регламентные задания»</w:t>
+      </w:r>
+      <w:bookmarkEnd w:id="41"/>
+    </w:p>
+    <w:p>
+      <w:r>
+        <w:t>Подсистема должна не реже одного раза в час выполнять: перевод неоплаченных платежей с прошедшим сроком в статус «Просрочен»; отмену сделок в статусе «Бронь» с истёкшей датой окончания брони и возврат объектов в продажу; закрытие встреч, просроченных более чем на 7 дней, результатом «Не состоялась»; загрузку курсов валют ЦБ Узбекистана.</w:t>
+      </w:r>
+    </w:p>
+    <w:p>
+      <w:pPr>
+        <w:pStyle w:val="21"/>
+      </w:pPr>
+      <w:bookmarkStart w:id="42" w:name="_Toc242136758"/>
+      <w:r>
+        <w:t>4.3 Требования к видам обеспечения</w:t>
+      </w:r>
+      <w:bookmarkEnd w:id="42"/>
+    </w:p>
+    <w:p>
+      <w:pPr>
+        <w:pStyle w:val="31"/>
+      </w:pPr>
+      <w:bookmarkStart w:id="43" w:name="_Toc242136759"/>
+      <w:r>
+        <w:t>4.3.1 Требования к математическому обеспечению</w:t>
+      </w:r>
+      <w:bookmarkEnd w:id="43"/>
+    </w:p>
+    <w:p>
+      <w:r>
+        <w:t>Специальные математические методы не применяются. Расчёт показателей выполняется по правилам:</w:t>
+      </w:r>
+    </w:p>
+    <w:p>
+      <w:r>
+        <w:t>– процент выполнения плана: факт / план × 100;</w:t>
+      </w:r>
+    </w:p>
+    <w:p>
       <w:r>
         <w:lastRenderedPageBreak/>
-        <w:t>4.2.8 Подсистема «Аналитика и отчётность»</w:t>
-      </w:r>
-      <w:bookmarkEnd w:id="39"/>
-    </w:p>
-    <w:p>
-      <w:r>
-        <w:t>Подсистема должна обеспечивать:</w:t>
-      </w:r>
-    </w:p>
-    <w:p>
-      <w:r>
-        <w:t>– дашборд с показателями дня и месяца в пределах области видимости пользователя;</w:t>
-      </w:r>
-    </w:p>
-    <w:p>
-      <w:r>
-        <w:t>– сводные таблицы по заявкам, встречам, сделкам и платежам с группировкой и выгрузкой в Excel; отбор «забытых» заявок и просроченных встреч;</w:t>
-      </w:r>
-    </w:p>
-    <w:p>
-      <w:r>
-        <w:t>– загрузку планов продаж по проектам и по сотрудникам из XLSX-шаблонов;</w:t>
-      </w:r>
-    </w:p>
-    <w:p>
-      <w:r>
-        <w:t>– отчёты «план-факт» по количеству, контрактации и поступлениям с процентом выполнения и прогнозом выполнения к концу периода;</w:t>
-      </w:r>
-    </w:p>
-    <w:p>
-      <w:r>
-        <w:t>– приведение денежных показателей дашборда, общего итога финансов и денежного факта отчётов «план-факт» к валюте сделок компании по курсу на дату события; предупреждение о валютах, для которых нет курса и суммы которых поэтому не учтены.</w:t>
+        <w:t>– прогноз к концу периода: факт / число прошедших дней периода × число дней периода; процент прогноза: прогноз / план × 100;</w:t>
+      </w:r>
+    </w:p>
+    <w:p>
+      <w:r>
+        <w:t>– продажи месяца учитываются по дате закрытия сделки;</w:t>
+      </w:r>
+    </w:p>
+    <w:p>
+      <w:r>
+        <w:t>– пересчёт суммы из одной валюты в другую выполняется через узбекский сум: сумма × курс исходной валюты / курс валюты назначения, где курс — число сумов за единицу валюты; кросс-курс в вычислении не округляется, результат округляется до 0,01 по правилу «половина вверх»;</w:t>
+      </w:r>
+    </w:p>
+    <w:p>
+      <w:r>
+        <w:t>– для пересчёта на дату берётся последний курс не позже этой даты; ручной курс компании на ту же дату имеет приоритет над курсом ЦБ.</w:t>
       </w:r>
     </w:p>
     <w:p>
       <w:pPr>
         <w:pStyle w:val="31"/>
       </w:pPr>
-      <w:bookmarkStart w:id="40" w:name="_Toc242105420"/>
-      <w:r>
-        <w:t>4.2.9 Подсистема «Интеграция с партнёрами»</w:t>
-      </w:r>
-      <w:bookmarkEnd w:id="40"/>
-    </w:p>
-    <w:p>
-      <w:r>
-        <w:t>Подсистема должна обеспечивать выдачу партнёрам по API-ключу сведений о проектах, домах и планировках и приём заявок; отказ от создания дубля заявки при повторной отправке формы в течение 24 ч; управление API-ключами (создание, изменение, отключение, перевыпуск, показ ключа один раз при выдаче).</w:t>
+      <w:bookmarkStart w:id="44" w:name="_Toc242136760"/>
+      <w:r>
+        <w:t>4.3.2 Требования к информационному обеспечению</w:t>
+      </w:r>
+      <w:bookmarkEnd w:id="44"/>
+    </w:p>
+    <w:p>
+      <w:r>
+        <w:t>Данные системы должны храниться в одной реляционной БД. Структура БД должна изменяться только миграциями, хранящимися вместе с исходными текстами. Классификаторы (статусы, типы, валюты) должны задаваться в программе кодами латиницей; наименования для пользователя — через файлы локализации. Состав и структура данных приводятся в документе «Описание информационного обеспечения системы».</w:t>
       </w:r>
     </w:p>
     <w:p>
       <w:pPr>
         <w:pStyle w:val="31"/>
       </w:pPr>
-      <w:bookmarkStart w:id="41" w:name="_Toc242105421"/>
-      <w:r>
-        <w:t>4.2.10 Подсистема «Регламентные задания»</w:t>
-      </w:r>
-      <w:bookmarkEnd w:id="41"/>
-    </w:p>
-    <w:p>
-      <w:r>
-        <w:t>Подсистема должна не реже одного раза в час выполнять: перевод неоплаченных платежей с прошедшим сроком в статус «Просрочен»; отмену сделок в статусе «Бронь» с истёкшей датой окончания брони и возврат объектов в продажу; закрытие встреч, просроченных более чем на 7 дней, результатом «Не состоялась»; загрузку курсов валют ЦБ Узбекистана.</w:t>
-      </w:r>
-    </w:p>
-    <w:p>
-      <w:pPr>
-        <w:pStyle w:val="21"/>
-      </w:pPr>
-      <w:bookmarkStart w:id="42" w:name="_Toc242105422"/>
-      <w:r>
-        <w:t>4.3 Требования к видам обеспечения</w:t>
-      </w:r>
-      <w:bookmarkEnd w:id="42"/>
+      <w:bookmarkStart w:id="45" w:name="_Toc242136761"/>
+      <w:r>
+        <w:t>4.3.3 Требования к лингвистическому обеспечению</w:t>
+      </w:r>
+      <w:bookmarkEnd w:id="45"/>
+    </w:p>
+    <w:p>
+      <w:r>
+        <w:t>Языки программирования: Python (серверная часть), TypeScript (клиентская часть), SQL (через средства отображения моделей). Интерфейс пользователя — на русском, английском и узбекском языках; все надписи интерфейса должны браться из файлов локализации.</w:t>
+      </w:r>
     </w:p>
     <w:p>
       <w:pPr>
         <w:pStyle w:val="31"/>
       </w:pPr>
-      <w:bookmarkStart w:id="43" w:name="_Toc242105423"/>
-      <w:r>
-        <w:t>4.3.1 Требования к математическому обеспечению</w:t>
-      </w:r>
-      <w:bookmarkEnd w:id="43"/>
-    </w:p>
-    <w:p>
-      <w:r>
-        <w:t>Специальные математические методы не применяются. Расчёт показателей выполняется по правилам:</w:t>
-      </w:r>
-    </w:p>
-    <w:p>
-      <w:r>
-        <w:t>– процент выполнения плана: факт / план × 100;</w:t>
-      </w:r>
-    </w:p>
-    <w:p>
-      <w:r>
-        <w:t>– прогноз к концу периода: факт / число прошедших дней периода × число дней периода; процент прогноза: прогноз / план × 100;</w:t>
-      </w:r>
-    </w:p>
-    <w:p>
-      <w:r>
-        <w:t>– продажи месяца учитываются по дате закрытия сделки;</w:t>
-      </w:r>
-    </w:p>
-    <w:p>
+      <w:bookmarkStart w:id="46" w:name="_Toc242136762"/>
+      <w:r>
+        <w:t>4.3.4 Требования к программному обеспечению</w:t>
+      </w:r>
+      <w:bookmarkEnd w:id="46"/>
+    </w:p>
+    <w:p>
+      <w:r>
+        <w:t>Система должна функционировать на следующем ПО: ОС семейства Linux на сервере, Docker и Docker Compose, PostgreSQL 16, Redis 7, nginx; в серверной части — Python 3.12, Django 5.2, Django REST framework; клиентская часть — React 19, MUI, TypeScript. На рабочих местах — актуальные версии браузеров Google Chrome, Microsoft Edge, Mozilla Firefox, Safari. Состав ПО приводится в документе «Описание программного обеспечения».</w:t>
+      </w:r>
+    </w:p>
+    <w:p>
+      <w:pPr>
+        <w:pStyle w:val="31"/>
+      </w:pPr>
+      <w:bookmarkStart w:id="47" w:name="_Toc242136763"/>
+      <w:r>
+        <w:t>4.3.5 Требования к техническому обеспечению</w:t>
+      </w:r>
+      <w:bookmarkEnd w:id="47"/>
+    </w:p>
+    <w:p>
+      <w:r>
+        <w:t>Минимальная конфигурация сервера: 2 процессорных ядра, 4 ГБ оперативной памяти, 40 ГБ дискового пространства плюс объём для файлов и резервных копий; постоянный IP-адрес или доменное имя; доступ из сети Интернет по портам 80 и 443. Рабочее ме</w:t>
+      </w:r>
       <w:r>
         <w:lastRenderedPageBreak/>
-        <w:t>– пересчёт суммы из одной валюты в другую выполняется через узбекский сум: сумма × курс исходной валюты / курс валюты назначения, где курс — число сумов за единицу валюты; кросс-курс в вычислении не округляется, результат округляется до 0,01 по правилу «половина вверх»;</w:t>
-      </w:r>
-    </w:p>
-    <w:p>
-      <w:r>
-        <w:t>– для пересчёта на дату берётся последний курс не позже этой даты; ручной курс компании на ту же дату имеет приоритет над курсом ЦБ.</w:t>
+        <w:t>сто пользователя — любое устройство с современным браузером и доступом к сети Интернет.</w:t>
       </w:r>
     </w:p>
     <w:p>
       <w:pPr>
         <w:pStyle w:val="31"/>
       </w:pPr>
-      <w:bookmarkStart w:id="44" w:name="_Toc242105424"/>
-      <w:r>
-        <w:t>4.3.2 Требования к информационному обеспечению</w:t>
-      </w:r>
-      <w:bookmarkEnd w:id="44"/>
-    </w:p>
-    <w:p>
-      <w:r>
-        <w:t>Данные системы должны храниться в одной реляционной БД. Структура БД должна изменяться только миграциями, хранящимися вместе с исходными текстами. Классификаторы (статусы, типы, валюты) должны задаваться в программе кодами латиницей; наименования для пользователя — через файлы локализации. Состав и структура данных приводятся в документе «Описание информационного обеспечения системы».</w:t>
+      <w:bookmarkStart w:id="48" w:name="_Toc242136764"/>
+      <w:r>
+        <w:t>4.3.6 Требования к метрологическому обеспечению</w:t>
+      </w:r>
+      <w:bookmarkEnd w:id="48"/>
+    </w:p>
+    <w:p>
+      <w:r>
+        <w:t>Требования не предъявляются.</w:t>
       </w:r>
     </w:p>
     <w:p>
       <w:pPr>
         <w:pStyle w:val="31"/>
       </w:pPr>
-      <w:bookmarkStart w:id="45" w:name="_Toc242105425"/>
-      <w:r>
-        <w:t>4.3.3 Требования к лингвистическому обеспечению</w:t>
-      </w:r>
-      <w:bookmarkEnd w:id="45"/>
-    </w:p>
-    <w:p>
-      <w:r>
-        <w:t>Языки программирования: Python (серверная часть), TypeScript (клиентская часть), SQL (через средства отображения моделей). Интерфейс пользователя — на русском, английском и узбекском языках; все надписи интерфейса должны браться из файлов локализации.</w:t>
+      <w:bookmarkStart w:id="49" w:name="_Toc242136765"/>
+      <w:r>
+        <w:t>4.3.7 Требования к организационному обеспечению</w:t>
+      </w:r>
+      <w:bookmarkEnd w:id="49"/>
+    </w:p>
+    <w:p>
+      <w:r>
+        <w:t>Заказчик назначает администратора системы в каждой компании и ответственного за сервер. Порядок выдачи прав доступа, увольнения сотрудников и выдачи API-ключей партнёрам устанавливается распорядительным документом заказчика с учётом рекомендаций руководства администратора.</w:t>
       </w:r>
     </w:p>
     <w:p>
       <w:pPr>
         <w:pStyle w:val="31"/>
       </w:pPr>
-      <w:bookmarkStart w:id="46" w:name="_Toc242105426"/>
-      <w:r>
-        <w:t>4.3.4 Требования к программному обеспечению</w:t>
-      </w:r>
-      <w:bookmarkEnd w:id="46"/>
-    </w:p>
-    <w:p>
-      <w:r>
-        <w:t>Система должна функционировать на следующем ПО: ОС семейства Linux на сервере, Docker и Docker Compose, PostgreSQL 16, Redis 7, nginx; в серверной части — Python 3.12, Django 5.2, Django REST framework; клиентская часть — React 19, MUI, TypeScript. На рабочих местах — актуальные версии браузеров Google Chrome, Microsoft Edge, Mozilla Firefox, Safari. Состав ПО приводится в документе «Описание программного обеспечения».</w:t>
-      </w:r>
-    </w:p>
-    <w:p>
-      <w:pPr>
-        <w:pStyle w:val="31"/>
-      </w:pPr>
-      <w:bookmarkStart w:id="47" w:name="_Toc242105427"/>
-      <w:r>
-        <w:t>4.3.5 Требования к техническому обеспечению</w:t>
-      </w:r>
-      <w:bookmarkEnd w:id="47"/>
-    </w:p>
-    <w:p>
-      <w:r>
-        <w:t>Минимальная конфигурация сервера: 2 процессорных ядра, 4 ГБ оперативной памяти, 40 ГБ дискового пространства плюс объём для файлов и резервных копий; постоянный IP-адрес или доменное имя; доступ из сети Интернет по портам 80 и 443. Рабочее место пользователя — любое устройство с современным браузером и доступом к сети Интернет.</w:t>
-      </w:r>
-    </w:p>
-    <w:p>
-      <w:pPr>
-        <w:pStyle w:val="31"/>
-      </w:pPr>
-      <w:bookmarkStart w:id="48" w:name="_Toc242105428"/>
-      <w:r>
-        <w:lastRenderedPageBreak/>
-        <w:t>4.3.6 Требования к метрологическому обеспечению</w:t>
-      </w:r>
-      <w:bookmarkEnd w:id="48"/>
-    </w:p>
-    <w:p>
-      <w:r>
-        <w:t>Требования не предъявляются.</w:t>
-      </w:r>
-    </w:p>
-    <w:p>
-      <w:pPr>
-        <w:pStyle w:val="31"/>
-      </w:pPr>
-      <w:bookmarkStart w:id="49" w:name="_Toc242105429"/>
-      <w:r>
-        <w:t>4.3.7 Требования к организационному обеспечению</w:t>
-      </w:r>
-      <w:bookmarkEnd w:id="49"/>
-    </w:p>
-    <w:p>
-      <w:r>
-        <w:t>Заказчик назначает администратора системы в каждой компании и ответственного за сервер. Порядок выдачи прав доступа, увольнения сотрудников и выдачи API-ключей партнёрам устанавливается распорядительным документом заказчика с учётом рекомендаций руководства администратора.</w:t>
-      </w:r>
-    </w:p>
-    <w:p>
-      <w:pPr>
-        <w:pStyle w:val="31"/>
-      </w:pPr>
-      <w:bookmarkStart w:id="50" w:name="_Toc242105430"/>
+      <w:bookmarkStart w:id="50" w:name="_Toc242136766"/>
       <w:r>
         <w:t>4.3.8 Требования к методическому обеспечению</w:t>
       </w:r>
@@ -8029,7 +8040,7 @@
         <w:pStyle w:val="1"/>
         <w:pageBreakBefore/>
       </w:pPr>
-      <w:bookmarkStart w:id="51" w:name="_Toc242105431"/>
+      <w:bookmarkStart w:id="51" w:name="_Toc242136767"/>
       <w:r>
         <w:lastRenderedPageBreak/>
         <w:t>5 Состав и содержание работ по созданию системы</w:t>
@@ -8351,7 +8362,7 @@
         <w:pStyle w:val="1"/>
         <w:pageBreakBefore/>
       </w:pPr>
-      <w:bookmarkStart w:id="52" w:name="_Toc242105432"/>
+      <w:bookmarkStart w:id="52" w:name="_Toc242136768"/>
       <w:r>
         <w:lastRenderedPageBreak/>
         <w:t>6 Порядок разработки автоматизированной системы</w:t>
@@ -8398,7 +8409,7 @@
         <w:pStyle w:val="1"/>
         <w:pageBreakBefore/>
       </w:pPr>
-      <w:bookmarkStart w:id="53" w:name="_Toc242105433"/>
+      <w:bookmarkStart w:id="53" w:name="_Toc242136769"/>
       <w:r>
         <w:lastRenderedPageBreak/>
         <w:t>7 Порядок контроля и приёмки автоматизированной системы</w:t>
@@ -8415,7 +8426,7 @@
         <w:pStyle w:val="1"/>
         <w:pageBreakBefore/>
       </w:pPr>
-      <w:bookmarkStart w:id="54" w:name="_Toc242105434"/>
+      <w:bookmarkStart w:id="54" w:name="_Toc242136770"/>
       <w:r>
         <w:lastRenderedPageBreak/>
         <w:t>8 Требования к составу и содержанию работ по подготовке объекта автоматизации к вводу системы в действие</w:t>
@@ -8477,7 +8488,7 @@
         <w:pStyle w:val="1"/>
         <w:pageBreakBefore/>
       </w:pPr>
-      <w:bookmarkStart w:id="55" w:name="_Toc242105435"/>
+      <w:bookmarkStart w:id="55" w:name="_Toc242136771"/>
       <w:r>
         <w:lastRenderedPageBreak/>
         <w:t>9 Требования к документированию</w:t>
@@ -9119,7 +9130,7 @@
         <w:pStyle w:val="1"/>
         <w:pageBreakBefore/>
       </w:pPr>
-      <w:bookmarkStart w:id="56" w:name="_Toc242105436"/>
+      <w:bookmarkStart w:id="56" w:name="_Toc242136772"/>
       <w:r>
         <w:lastRenderedPageBreak/>
         <w:t>10 Источники разработки</w:t>
@@ -9158,7 +9169,7 @@
         <w:ind w:firstLine="0"/>
         <w:jc w:val="center"/>
       </w:pPr>
-      <w:bookmarkStart w:id="57" w:name="_Toc242105437"/>
+      <w:bookmarkStart w:id="57" w:name="_Toc242136773"/>
       <w:r>
         <w:lastRenderedPageBreak/>
         <w:t>ЛИСТ РЕГИСТРАЦИИ ИЗМЕНЕНИЙ</w:t>
@@ -11220,31 +11231,31 @@
       </w:rPr>
     </w:lvl>
   </w:abstractNum>
-  <w:num w:numId="1" w16cid:durableId="1885560220">
+  <w:num w:numId="1" w16cid:durableId="1374957913">
     <w:abstractNumId w:val="8"/>
   </w:num>
-  <w:num w:numId="2" w16cid:durableId="1601797142">
+  <w:num w:numId="2" w16cid:durableId="1664701894">
     <w:abstractNumId w:val="6"/>
   </w:num>
-  <w:num w:numId="3" w16cid:durableId="1463228511">
+  <w:num w:numId="3" w16cid:durableId="119300720">
     <w:abstractNumId w:val="5"/>
   </w:num>
-  <w:num w:numId="4" w16cid:durableId="579674720">
+  <w:num w:numId="4" w16cid:durableId="1154878014">
     <w:abstractNumId w:val="4"/>
   </w:num>
-  <w:num w:numId="5" w16cid:durableId="1293515521">
+  <w:num w:numId="5" w16cid:durableId="647516931">
     <w:abstractNumId w:val="7"/>
   </w:num>
-  <w:num w:numId="6" w16cid:durableId="899364191">
+  <w:num w:numId="6" w16cid:durableId="1003095208">
     <w:abstractNumId w:val="3"/>
   </w:num>
-  <w:num w:numId="7" w16cid:durableId="549154082">
+  <w:num w:numId="7" w16cid:durableId="1332215996">
     <w:abstractNumId w:val="2"/>
   </w:num>
-  <w:num w:numId="8" w16cid:durableId="494416087">
+  <w:num w:numId="8" w16cid:durableId="762607781">
     <w:abstractNumId w:val="1"/>
   </w:num>
-  <w:num w:numId="9" w16cid:durableId="799104554">
+  <w:num w:numId="9" w16cid:durableId="1251087452">
     <w:abstractNumId w:val="0"/>
   </w:num>
 </w:numbering>
@@ -22777,7 +22788,7 @@
     <w:autoRedefine/>
     <w:uiPriority w:val="39"/>
     <w:unhideWhenUsed/>
-    <w:rsid w:val="0030005E"/>
+    <w:rsid w:val="009B4066"/>
     <w:pPr>
       <w:spacing w:after="100"/>
     </w:pPr>
@@ -22789,7 +22800,7 @@
     <w:autoRedefine/>
     <w:uiPriority w:val="39"/>
     <w:unhideWhenUsed/>
-    <w:rsid w:val="0030005E"/>
+    <w:rsid w:val="009B4066"/>
     <w:pPr>
       <w:spacing w:after="100"/>
       <w:ind w:left="240"/>
@@ -22802,7 +22813,7 @@
     <w:autoRedefine/>
     <w:uiPriority w:val="39"/>
     <w:unhideWhenUsed/>
-    <w:rsid w:val="0030005E"/>
+    <w:rsid w:val="009B4066"/>
     <w:pPr>
       <w:spacing w:after="100"/>
       <w:ind w:left="480"/>
@@ -22813,7 +22824,7 @@
     <w:basedOn w:val="a2"/>
     <w:uiPriority w:val="99"/>
     <w:unhideWhenUsed/>
-    <w:rsid w:val="0030005E"/>
+    <w:rsid w:val="009B4066"/>
     <w:rPr>
       <w:color w:val="0000FF" w:themeColor="hyperlink"/>
       <w:u w:val="single"/>

</xml_diff>

<commit_message>
Payment plan fix and discount fix
</commit_message>
<xml_diff>
--- a/docs/gost/out/01_ТЗ_Техническое_задание.docx
+++ b/docs/gost/out/01_ТЗ_Техническое_задание.docx
@@ -306,7 +306,7 @@
       <w:r>
         <w:fldChar w:fldCharType="separate"/>
       </w:r>
-      <w:hyperlink w:anchor="_Toc242174886" w:history="1">
+      <w:hyperlink w:anchor="_Toc242192184" w:history="1">
         <w:r>
           <w:rPr>
             <w:rStyle w:val="aff8"/>
@@ -333,7 +333,7 @@
             <w:noProof/>
             <w:webHidden/>
           </w:rPr>
-          <w:instrText xml:space="preserve"> PAGEREF _Toc242174886 \h </w:instrText>
+          <w:instrText xml:space="preserve"> PAGEREF _Toc242192184 \h </w:instrText>
         </w:r>
         <w:r>
           <w:rPr>
@@ -379,7 +379,7 @@
           <w14:ligatures w14:val="standardContextual"/>
         </w:rPr>
       </w:pPr>
-      <w:hyperlink w:anchor="_Toc242174887" w:history="1">
+      <w:hyperlink w:anchor="_Toc242192185" w:history="1">
         <w:r>
           <w:rPr>
             <w:rStyle w:val="aff8"/>
@@ -406,7 +406,7 @@
             <w:noProof/>
             <w:webHidden/>
           </w:rPr>
-          <w:instrText xml:space="preserve"> PAGEREF _Toc242174887 \h </w:instrText>
+          <w:instrText xml:space="preserve"> PAGEREF _Toc242192185 \h </w:instrText>
         </w:r>
         <w:r>
           <w:rPr>
@@ -452,7 +452,7 @@
           <w14:ligatures w14:val="standardContextual"/>
         </w:rPr>
       </w:pPr>
-      <w:hyperlink w:anchor="_Toc242174888" w:history="1">
+      <w:hyperlink w:anchor="_Toc242192186" w:history="1">
         <w:r>
           <w:rPr>
             <w:rStyle w:val="aff8"/>
@@ -479,7 +479,7 @@
             <w:noProof/>
             <w:webHidden/>
           </w:rPr>
-          <w:instrText xml:space="preserve"> PAGEREF _Toc242174888 \h </w:instrText>
+          <w:instrText xml:space="preserve"> PAGEREF _Toc242192186 \h </w:instrText>
         </w:r>
         <w:r>
           <w:rPr>
@@ -525,7 +525,7 @@
           <w14:ligatures w14:val="standardContextual"/>
         </w:rPr>
       </w:pPr>
-      <w:hyperlink w:anchor="_Toc242174889" w:history="1">
+      <w:hyperlink w:anchor="_Toc242192187" w:history="1">
         <w:r>
           <w:rPr>
             <w:rStyle w:val="aff8"/>
@@ -552,7 +552,7 @@
             <w:noProof/>
             <w:webHidden/>
           </w:rPr>
-          <w:instrText xml:space="preserve"> PAGEREF _Toc242174889 \h </w:instrText>
+          <w:instrText xml:space="preserve"> PAGEREF _Toc242192187 \h </w:instrText>
         </w:r>
         <w:r>
           <w:rPr>
@@ -598,7 +598,7 @@
           <w14:ligatures w14:val="standardContextual"/>
         </w:rPr>
       </w:pPr>
-      <w:hyperlink w:anchor="_Toc242174890" w:history="1">
+      <w:hyperlink w:anchor="_Toc242192188" w:history="1">
         <w:r>
           <w:rPr>
             <w:rStyle w:val="aff8"/>
@@ -625,7 +625,7 @@
             <w:noProof/>
             <w:webHidden/>
           </w:rPr>
-          <w:instrText xml:space="preserve"> PAGEREF _Toc242174890 \h </w:instrText>
+          <w:instrText xml:space="preserve"> PAGEREF _Toc242192188 \h </w:instrText>
         </w:r>
         <w:r>
           <w:rPr>
@@ -671,7 +671,7 @@
           <w14:ligatures w14:val="standardContextual"/>
         </w:rPr>
       </w:pPr>
-      <w:hyperlink w:anchor="_Toc242174891" w:history="1">
+      <w:hyperlink w:anchor="_Toc242192189" w:history="1">
         <w:r>
           <w:rPr>
             <w:rStyle w:val="aff8"/>
@@ -698,7 +698,7 @@
             <w:noProof/>
             <w:webHidden/>
           </w:rPr>
-          <w:instrText xml:space="preserve"> PAGEREF _Toc242174891 \h </w:instrText>
+          <w:instrText xml:space="preserve"> PAGEREF _Toc242192189 \h </w:instrText>
         </w:r>
         <w:r>
           <w:rPr>
@@ -744,7 +744,7 @@
           <w14:ligatures w14:val="standardContextual"/>
         </w:rPr>
       </w:pPr>
-      <w:hyperlink w:anchor="_Toc242174892" w:history="1">
+      <w:hyperlink w:anchor="_Toc242192190" w:history="1">
         <w:r>
           <w:rPr>
             <w:rStyle w:val="aff8"/>
@@ -771,7 +771,7 @@
             <w:noProof/>
             <w:webHidden/>
           </w:rPr>
-          <w:instrText xml:space="preserve"> PAGEREF _Toc242174892 \h </w:instrText>
+          <w:instrText xml:space="preserve"> PAGEREF _Toc242192190 \h </w:instrText>
         </w:r>
         <w:r>
           <w:rPr>
@@ -817,7 +817,7 @@
           <w14:ligatures w14:val="standardContextual"/>
         </w:rPr>
       </w:pPr>
-      <w:hyperlink w:anchor="_Toc242174893" w:history="1">
+      <w:hyperlink w:anchor="_Toc242192191" w:history="1">
         <w:r>
           <w:rPr>
             <w:rStyle w:val="aff8"/>
@@ -844,7 +844,7 @@
             <w:noProof/>
             <w:webHidden/>
           </w:rPr>
-          <w:instrText xml:space="preserve"> PAGEREF _Toc242174893 \h </w:instrText>
+          <w:instrText xml:space="preserve"> PAGEREF _Toc242192191 \h </w:instrText>
         </w:r>
         <w:r>
           <w:rPr>
@@ -890,7 +890,7 @@
           <w14:ligatures w14:val="standardContextual"/>
         </w:rPr>
       </w:pPr>
-      <w:hyperlink w:anchor="_Toc242174894" w:history="1">
+      <w:hyperlink w:anchor="_Toc242192192" w:history="1">
         <w:r>
           <w:rPr>
             <w:rStyle w:val="aff8"/>
@@ -917,7 +917,7 @@
             <w:noProof/>
             <w:webHidden/>
           </w:rPr>
-          <w:instrText xml:space="preserve"> PAGEREF _Toc242174894 \h </w:instrText>
+          <w:instrText xml:space="preserve"> PAGEREF _Toc242192192 \h </w:instrText>
         </w:r>
         <w:r>
           <w:rPr>
@@ -963,7 +963,7 @@
           <w14:ligatures w14:val="standardContextual"/>
         </w:rPr>
       </w:pPr>
-      <w:hyperlink w:anchor="_Toc242174895" w:history="1">
+      <w:hyperlink w:anchor="_Toc242192193" w:history="1">
         <w:r>
           <w:rPr>
             <w:rStyle w:val="aff8"/>
@@ -990,7 +990,7 @@
             <w:noProof/>
             <w:webHidden/>
           </w:rPr>
-          <w:instrText xml:space="preserve"> PAGEREF _Toc242174895 \h </w:instrText>
+          <w:instrText xml:space="preserve"> PAGEREF _Toc242192193 \h </w:instrText>
         </w:r>
         <w:r>
           <w:rPr>
@@ -1036,7 +1036,7 @@
           <w14:ligatures w14:val="standardContextual"/>
         </w:rPr>
       </w:pPr>
-      <w:hyperlink w:anchor="_Toc242174896" w:history="1">
+      <w:hyperlink w:anchor="_Toc242192194" w:history="1">
         <w:r>
           <w:rPr>
             <w:rStyle w:val="aff8"/>
@@ -1063,7 +1063,7 @@
             <w:noProof/>
             <w:webHidden/>
           </w:rPr>
-          <w:instrText xml:space="preserve"> PAGEREF _Toc242174896 \h </w:instrText>
+          <w:instrText xml:space="preserve"> PAGEREF _Toc242192194 \h </w:instrText>
         </w:r>
         <w:r>
           <w:rPr>
@@ -1109,7 +1109,7 @@
           <w14:ligatures w14:val="standardContextual"/>
         </w:rPr>
       </w:pPr>
-      <w:hyperlink w:anchor="_Toc242174897" w:history="1">
+      <w:hyperlink w:anchor="_Toc242192195" w:history="1">
         <w:r>
           <w:rPr>
             <w:rStyle w:val="aff8"/>
@@ -1136,7 +1136,7 @@
             <w:noProof/>
             <w:webHidden/>
           </w:rPr>
-          <w:instrText xml:space="preserve"> PAGEREF _Toc242174897 \h </w:instrText>
+          <w:instrText xml:space="preserve"> PAGEREF _Toc242192195 \h </w:instrText>
         </w:r>
         <w:r>
           <w:rPr>
@@ -1182,7 +1182,7 @@
           <w14:ligatures w14:val="standardContextual"/>
         </w:rPr>
       </w:pPr>
-      <w:hyperlink w:anchor="_Toc242174898" w:history="1">
+      <w:hyperlink w:anchor="_Toc242192196" w:history="1">
         <w:r>
           <w:rPr>
             <w:rStyle w:val="aff8"/>
@@ -1209,7 +1209,7 @@
             <w:noProof/>
             <w:webHidden/>
           </w:rPr>
-          <w:instrText xml:space="preserve"> PAGEREF _Toc242174898 \h </w:instrText>
+          <w:instrText xml:space="preserve"> PAGEREF _Toc242192196 \h </w:instrText>
         </w:r>
         <w:r>
           <w:rPr>
@@ -1255,7 +1255,7 @@
           <w14:ligatures w14:val="standardContextual"/>
         </w:rPr>
       </w:pPr>
-      <w:hyperlink w:anchor="_Toc242174899" w:history="1">
+      <w:hyperlink w:anchor="_Toc242192197" w:history="1">
         <w:r>
           <w:rPr>
             <w:rStyle w:val="aff8"/>
@@ -1282,7 +1282,7 @@
             <w:noProof/>
             <w:webHidden/>
           </w:rPr>
-          <w:instrText xml:space="preserve"> PAGEREF _Toc242174899 \h </w:instrText>
+          <w:instrText xml:space="preserve"> PAGEREF _Toc242192197 \h </w:instrText>
         </w:r>
         <w:r>
           <w:rPr>
@@ -1328,7 +1328,7 @@
           <w14:ligatures w14:val="standardContextual"/>
         </w:rPr>
       </w:pPr>
-      <w:hyperlink w:anchor="_Toc242174900" w:history="1">
+      <w:hyperlink w:anchor="_Toc242192198" w:history="1">
         <w:r>
           <w:rPr>
             <w:rStyle w:val="aff8"/>
@@ -1355,7 +1355,7 @@
             <w:noProof/>
             <w:webHidden/>
           </w:rPr>
-          <w:instrText xml:space="preserve"> PAGEREF _Toc242174900 \h </w:instrText>
+          <w:instrText xml:space="preserve"> PAGEREF _Toc242192198 \h </w:instrText>
         </w:r>
         <w:r>
           <w:rPr>
@@ -1401,7 +1401,7 @@
           <w14:ligatures w14:val="standardContextual"/>
         </w:rPr>
       </w:pPr>
-      <w:hyperlink w:anchor="_Toc242174901" w:history="1">
+      <w:hyperlink w:anchor="_Toc242192199" w:history="1">
         <w:r>
           <w:rPr>
             <w:rStyle w:val="aff8"/>
@@ -1428,7 +1428,7 @@
             <w:noProof/>
             <w:webHidden/>
           </w:rPr>
-          <w:instrText xml:space="preserve"> PAGEREF _Toc242174901 \h </w:instrText>
+          <w:instrText xml:space="preserve"> PAGEREF _Toc242192199 \h </w:instrText>
         </w:r>
         <w:r>
           <w:rPr>
@@ -1474,7 +1474,7 @@
           <w14:ligatures w14:val="standardContextual"/>
         </w:rPr>
       </w:pPr>
-      <w:hyperlink w:anchor="_Toc242174902" w:history="1">
+      <w:hyperlink w:anchor="_Toc242192200" w:history="1">
         <w:r>
           <w:rPr>
             <w:rStyle w:val="aff8"/>
@@ -1501,7 +1501,7 @@
             <w:noProof/>
             <w:webHidden/>
           </w:rPr>
-          <w:instrText xml:space="preserve"> PAGEREF _Toc242174902 \h </w:instrText>
+          <w:instrText xml:space="preserve"> PAGEREF _Toc242192200 \h </w:instrText>
         </w:r>
         <w:r>
           <w:rPr>
@@ -1547,7 +1547,7 @@
           <w14:ligatures w14:val="standardContextual"/>
         </w:rPr>
       </w:pPr>
-      <w:hyperlink w:anchor="_Toc242174903" w:history="1">
+      <w:hyperlink w:anchor="_Toc242192201" w:history="1">
         <w:r>
           <w:rPr>
             <w:rStyle w:val="aff8"/>
@@ -1574,7 +1574,7 @@
             <w:noProof/>
             <w:webHidden/>
           </w:rPr>
-          <w:instrText xml:space="preserve"> PAGEREF _Toc242174903 \h </w:instrText>
+          <w:instrText xml:space="preserve"> PAGEREF _Toc242192201 \h </w:instrText>
         </w:r>
         <w:r>
           <w:rPr>
@@ -1620,7 +1620,7 @@
           <w14:ligatures w14:val="standardContextual"/>
         </w:rPr>
       </w:pPr>
-      <w:hyperlink w:anchor="_Toc242174904" w:history="1">
+      <w:hyperlink w:anchor="_Toc242192202" w:history="1">
         <w:r>
           <w:rPr>
             <w:rStyle w:val="aff8"/>
@@ -1647,7 +1647,7 @@
             <w:noProof/>
             <w:webHidden/>
           </w:rPr>
-          <w:instrText xml:space="preserve"> PAGEREF _Toc242174904 \h </w:instrText>
+          <w:instrText xml:space="preserve"> PAGEREF _Toc242192202 \h </w:instrText>
         </w:r>
         <w:r>
           <w:rPr>
@@ -1693,7 +1693,7 @@
           <w14:ligatures w14:val="standardContextual"/>
         </w:rPr>
       </w:pPr>
-      <w:hyperlink w:anchor="_Toc242174905" w:history="1">
+      <w:hyperlink w:anchor="_Toc242192203" w:history="1">
         <w:r>
           <w:rPr>
             <w:rStyle w:val="aff8"/>
@@ -1720,7 +1720,7 @@
             <w:noProof/>
             <w:webHidden/>
           </w:rPr>
-          <w:instrText xml:space="preserve"> PAGEREF _Toc242174905 \h </w:instrText>
+          <w:instrText xml:space="preserve"> PAGEREF _Toc242192203 \h </w:instrText>
         </w:r>
         <w:r>
           <w:rPr>
@@ -1766,7 +1766,7 @@
           <w14:ligatures w14:val="standardContextual"/>
         </w:rPr>
       </w:pPr>
-      <w:hyperlink w:anchor="_Toc242174906" w:history="1">
+      <w:hyperlink w:anchor="_Toc242192204" w:history="1">
         <w:r>
           <w:rPr>
             <w:rStyle w:val="aff8"/>
@@ -1793,7 +1793,7 @@
             <w:noProof/>
             <w:webHidden/>
           </w:rPr>
-          <w:instrText xml:space="preserve"> PAGEREF _Toc242174906 \h </w:instrText>
+          <w:instrText xml:space="preserve"> PAGEREF _Toc242192204 \h </w:instrText>
         </w:r>
         <w:r>
           <w:rPr>
@@ -1839,7 +1839,7 @@
           <w14:ligatures w14:val="standardContextual"/>
         </w:rPr>
       </w:pPr>
-      <w:hyperlink w:anchor="_Toc242174907" w:history="1">
+      <w:hyperlink w:anchor="_Toc242192205" w:history="1">
         <w:r>
           <w:rPr>
             <w:rStyle w:val="aff8"/>
@@ -1866,7 +1866,7 @@
             <w:noProof/>
             <w:webHidden/>
           </w:rPr>
-          <w:instrText xml:space="preserve"> PAGEREF _Toc242174907 \h </w:instrText>
+          <w:instrText xml:space="preserve"> PAGEREF _Toc242192205 \h </w:instrText>
         </w:r>
         <w:r>
           <w:rPr>
@@ -1912,7 +1912,7 @@
           <w14:ligatures w14:val="standardContextual"/>
         </w:rPr>
       </w:pPr>
-      <w:hyperlink w:anchor="_Toc242174908" w:history="1">
+      <w:hyperlink w:anchor="_Toc242192206" w:history="1">
         <w:r>
           <w:rPr>
             <w:rStyle w:val="aff8"/>
@@ -1939,7 +1939,7 @@
             <w:noProof/>
             <w:webHidden/>
           </w:rPr>
-          <w:instrText xml:space="preserve"> PAGEREF _Toc242174908 \h </w:instrText>
+          <w:instrText xml:space="preserve"> PAGEREF _Toc242192206 \h </w:instrText>
         </w:r>
         <w:r>
           <w:rPr>
@@ -1985,7 +1985,7 @@
           <w14:ligatures w14:val="standardContextual"/>
         </w:rPr>
       </w:pPr>
-      <w:hyperlink w:anchor="_Toc242174909" w:history="1">
+      <w:hyperlink w:anchor="_Toc242192207" w:history="1">
         <w:r>
           <w:rPr>
             <w:rStyle w:val="aff8"/>
@@ -2012,7 +2012,7 @@
             <w:noProof/>
             <w:webHidden/>
           </w:rPr>
-          <w:instrText xml:space="preserve"> PAGEREF _Toc242174909 \h </w:instrText>
+          <w:instrText xml:space="preserve"> PAGEREF _Toc242192207 \h </w:instrText>
         </w:r>
         <w:r>
           <w:rPr>
@@ -2058,7 +2058,7 @@
           <w14:ligatures w14:val="standardContextual"/>
         </w:rPr>
       </w:pPr>
-      <w:hyperlink w:anchor="_Toc242174910" w:history="1">
+      <w:hyperlink w:anchor="_Toc242192208" w:history="1">
         <w:r>
           <w:rPr>
             <w:rStyle w:val="aff8"/>
@@ -2085,7 +2085,7 @@
             <w:noProof/>
             <w:webHidden/>
           </w:rPr>
-          <w:instrText xml:space="preserve"> PAGEREF _Toc242174910 \h </w:instrText>
+          <w:instrText xml:space="preserve"> PAGEREF _Toc242192208 \h </w:instrText>
         </w:r>
         <w:r>
           <w:rPr>
@@ -2131,7 +2131,7 @@
           <w14:ligatures w14:val="standardContextual"/>
         </w:rPr>
       </w:pPr>
-      <w:hyperlink w:anchor="_Toc242174911" w:history="1">
+      <w:hyperlink w:anchor="_Toc242192209" w:history="1">
         <w:r>
           <w:rPr>
             <w:rStyle w:val="aff8"/>
@@ -2158,7 +2158,7 @@
             <w:noProof/>
             <w:webHidden/>
           </w:rPr>
-          <w:instrText xml:space="preserve"> PAGEREF _Toc242174911 \h </w:instrText>
+          <w:instrText xml:space="preserve"> PAGEREF _Toc242192209 \h </w:instrText>
         </w:r>
         <w:r>
           <w:rPr>
@@ -2204,7 +2204,7 @@
           <w14:ligatures w14:val="standardContextual"/>
         </w:rPr>
       </w:pPr>
-      <w:hyperlink w:anchor="_Toc242174912" w:history="1">
+      <w:hyperlink w:anchor="_Toc242192210" w:history="1">
         <w:r>
           <w:rPr>
             <w:rStyle w:val="aff8"/>
@@ -2231,7 +2231,7 @@
             <w:noProof/>
             <w:webHidden/>
           </w:rPr>
-          <w:instrText xml:space="preserve"> PAGEREF _Toc242174912 \h </w:instrText>
+          <w:instrText xml:space="preserve"> PAGEREF _Toc242192210 \h </w:instrText>
         </w:r>
         <w:r>
           <w:rPr>
@@ -2277,7 +2277,7 @@
           <w14:ligatures w14:val="standardContextual"/>
         </w:rPr>
       </w:pPr>
-      <w:hyperlink w:anchor="_Toc242174913" w:history="1">
+      <w:hyperlink w:anchor="_Toc242192211" w:history="1">
         <w:r>
           <w:rPr>
             <w:rStyle w:val="aff8"/>
@@ -2304,7 +2304,7 @@
             <w:noProof/>
             <w:webHidden/>
           </w:rPr>
-          <w:instrText xml:space="preserve"> PAGEREF _Toc242174913 \h </w:instrText>
+          <w:instrText xml:space="preserve"> PAGEREF _Toc242192211 \h </w:instrText>
         </w:r>
         <w:r>
           <w:rPr>
@@ -2350,7 +2350,7 @@
           <w14:ligatures w14:val="standardContextual"/>
         </w:rPr>
       </w:pPr>
-      <w:hyperlink w:anchor="_Toc242174914" w:history="1">
+      <w:hyperlink w:anchor="_Toc242192212" w:history="1">
         <w:r>
           <w:rPr>
             <w:rStyle w:val="aff8"/>
@@ -2377,7 +2377,7 @@
             <w:noProof/>
             <w:webHidden/>
           </w:rPr>
-          <w:instrText xml:space="preserve"> PAGEREF _Toc242174914 \h </w:instrText>
+          <w:instrText xml:space="preserve"> PAGEREF _Toc242192212 \h </w:instrText>
         </w:r>
         <w:r>
           <w:rPr>
@@ -2423,7 +2423,7 @@
           <w14:ligatures w14:val="standardContextual"/>
         </w:rPr>
       </w:pPr>
-      <w:hyperlink w:anchor="_Toc242174915" w:history="1">
+      <w:hyperlink w:anchor="_Toc242192213" w:history="1">
         <w:r>
           <w:rPr>
             <w:rStyle w:val="aff8"/>
@@ -2450,7 +2450,7 @@
             <w:noProof/>
             <w:webHidden/>
           </w:rPr>
-          <w:instrText xml:space="preserve"> PAGEREF _Toc242174915 \h </w:instrText>
+          <w:instrText xml:space="preserve"> PAGEREF _Toc242192213 \h </w:instrText>
         </w:r>
         <w:r>
           <w:rPr>
@@ -2496,7 +2496,7 @@
           <w14:ligatures w14:val="standardContextual"/>
         </w:rPr>
       </w:pPr>
-      <w:hyperlink w:anchor="_Toc242174916" w:history="1">
+      <w:hyperlink w:anchor="_Toc242192214" w:history="1">
         <w:r>
           <w:rPr>
             <w:rStyle w:val="aff8"/>
@@ -2523,7 +2523,7 @@
             <w:noProof/>
             <w:webHidden/>
           </w:rPr>
-          <w:instrText xml:space="preserve"> PAGEREF _Toc242174916 \h </w:instrText>
+          <w:instrText xml:space="preserve"> PAGEREF _Toc242192214 \h </w:instrText>
         </w:r>
         <w:r>
           <w:rPr>
@@ -2569,7 +2569,7 @@
           <w14:ligatures w14:val="standardContextual"/>
         </w:rPr>
       </w:pPr>
-      <w:hyperlink w:anchor="_Toc242174917" w:history="1">
+      <w:hyperlink w:anchor="_Toc242192215" w:history="1">
         <w:r>
           <w:rPr>
             <w:rStyle w:val="aff8"/>
@@ -2596,7 +2596,7 @@
             <w:noProof/>
             <w:webHidden/>
           </w:rPr>
-          <w:instrText xml:space="preserve"> PAGEREF _Toc242174917 \h </w:instrText>
+          <w:instrText xml:space="preserve"> PAGEREF _Toc242192215 \h </w:instrText>
         </w:r>
         <w:r>
           <w:rPr>
@@ -2642,7 +2642,7 @@
           <w14:ligatures w14:val="standardContextual"/>
         </w:rPr>
       </w:pPr>
-      <w:hyperlink w:anchor="_Toc242174918" w:history="1">
+      <w:hyperlink w:anchor="_Toc242192216" w:history="1">
         <w:r>
           <w:rPr>
             <w:rStyle w:val="aff8"/>
@@ -2669,7 +2669,7 @@
             <w:noProof/>
             <w:webHidden/>
           </w:rPr>
-          <w:instrText xml:space="preserve"> PAGEREF _Toc242174918 \h </w:instrText>
+          <w:instrText xml:space="preserve"> PAGEREF _Toc242192216 \h </w:instrText>
         </w:r>
         <w:r>
           <w:rPr>
@@ -2715,7 +2715,7 @@
           <w14:ligatures w14:val="standardContextual"/>
         </w:rPr>
       </w:pPr>
-      <w:hyperlink w:anchor="_Toc242174919" w:history="1">
+      <w:hyperlink w:anchor="_Toc242192217" w:history="1">
         <w:r>
           <w:rPr>
             <w:rStyle w:val="aff8"/>
@@ -2742,7 +2742,7 @@
             <w:noProof/>
             <w:webHidden/>
           </w:rPr>
-          <w:instrText xml:space="preserve"> PAGEREF _Toc242174919 \h </w:instrText>
+          <w:instrText xml:space="preserve"> PAGEREF _Toc242192217 \h </w:instrText>
         </w:r>
         <w:r>
           <w:rPr>
@@ -2788,7 +2788,7 @@
           <w14:ligatures w14:val="standardContextual"/>
         </w:rPr>
       </w:pPr>
-      <w:hyperlink w:anchor="_Toc242174920" w:history="1">
+      <w:hyperlink w:anchor="_Toc242192218" w:history="1">
         <w:r>
           <w:rPr>
             <w:rStyle w:val="aff8"/>
@@ -2815,7 +2815,7 @@
             <w:noProof/>
             <w:webHidden/>
           </w:rPr>
-          <w:instrText xml:space="preserve"> PAGEREF _Toc242174920 \h </w:instrText>
+          <w:instrText xml:space="preserve"> PAGEREF _Toc242192218 \h </w:instrText>
         </w:r>
         <w:r>
           <w:rPr>
@@ -2861,7 +2861,7 @@
           <w14:ligatures w14:val="standardContextual"/>
         </w:rPr>
       </w:pPr>
-      <w:hyperlink w:anchor="_Toc242174921" w:history="1">
+      <w:hyperlink w:anchor="_Toc242192219" w:history="1">
         <w:r>
           <w:rPr>
             <w:rStyle w:val="aff8"/>
@@ -2888,7 +2888,7 @@
             <w:noProof/>
             <w:webHidden/>
           </w:rPr>
-          <w:instrText xml:space="preserve"> PAGEREF _Toc242174921 \h </w:instrText>
+          <w:instrText xml:space="preserve"> PAGEREF _Toc242192219 \h </w:instrText>
         </w:r>
         <w:r>
           <w:rPr>
@@ -2934,7 +2934,7 @@
           <w14:ligatures w14:val="standardContextual"/>
         </w:rPr>
       </w:pPr>
-      <w:hyperlink w:anchor="_Toc242174922" w:history="1">
+      <w:hyperlink w:anchor="_Toc242192220" w:history="1">
         <w:r>
           <w:rPr>
             <w:rStyle w:val="aff8"/>
@@ -2961,7 +2961,7 @@
             <w:noProof/>
             <w:webHidden/>
           </w:rPr>
-          <w:instrText xml:space="preserve"> PAGEREF _Toc242174922 \h </w:instrText>
+          <w:instrText xml:space="preserve"> PAGEREF _Toc242192220 \h </w:instrText>
         </w:r>
         <w:r>
           <w:rPr>
@@ -3007,7 +3007,7 @@
           <w14:ligatures w14:val="standardContextual"/>
         </w:rPr>
       </w:pPr>
-      <w:hyperlink w:anchor="_Toc242174923" w:history="1">
+      <w:hyperlink w:anchor="_Toc242192221" w:history="1">
         <w:r>
           <w:rPr>
             <w:rStyle w:val="aff8"/>
@@ -3034,7 +3034,7 @@
             <w:noProof/>
             <w:webHidden/>
           </w:rPr>
-          <w:instrText xml:space="preserve"> PAGEREF _Toc242174923 \h </w:instrText>
+          <w:instrText xml:space="preserve"> PAGEREF _Toc242192221 \h </w:instrText>
         </w:r>
         <w:r>
           <w:rPr>
@@ -3080,7 +3080,7 @@
           <w14:ligatures w14:val="standardContextual"/>
         </w:rPr>
       </w:pPr>
-      <w:hyperlink w:anchor="_Toc242174924" w:history="1">
+      <w:hyperlink w:anchor="_Toc242192222" w:history="1">
         <w:r>
           <w:rPr>
             <w:rStyle w:val="aff8"/>
@@ -3107,7 +3107,7 @@
             <w:noProof/>
             <w:webHidden/>
           </w:rPr>
-          <w:instrText xml:space="preserve"> PAGEREF _Toc242174924 \h </w:instrText>
+          <w:instrText xml:space="preserve"> PAGEREF _Toc242192222 \h </w:instrText>
         </w:r>
         <w:r>
           <w:rPr>
@@ -3153,7 +3153,7 @@
           <w14:ligatures w14:val="standardContextual"/>
         </w:rPr>
       </w:pPr>
-      <w:hyperlink w:anchor="_Toc242174925" w:history="1">
+      <w:hyperlink w:anchor="_Toc242192223" w:history="1">
         <w:r>
           <w:rPr>
             <w:rStyle w:val="aff8"/>
@@ -3180,7 +3180,7 @@
             <w:noProof/>
             <w:webHidden/>
           </w:rPr>
-          <w:instrText xml:space="preserve"> PAGEREF _Toc242174925 \h </w:instrText>
+          <w:instrText xml:space="preserve"> PAGEREF _Toc242192223 \h </w:instrText>
         </w:r>
         <w:r>
           <w:rPr>
@@ -3226,7 +3226,7 @@
           <w14:ligatures w14:val="standardContextual"/>
         </w:rPr>
       </w:pPr>
-      <w:hyperlink w:anchor="_Toc242174926" w:history="1">
+      <w:hyperlink w:anchor="_Toc242192224" w:history="1">
         <w:r>
           <w:rPr>
             <w:rStyle w:val="aff8"/>
@@ -3253,7 +3253,7 @@
             <w:noProof/>
             <w:webHidden/>
           </w:rPr>
-          <w:instrText xml:space="preserve"> PAGEREF _Toc242174926 \h </w:instrText>
+          <w:instrText xml:space="preserve"> PAGEREF _Toc242192224 \h </w:instrText>
         </w:r>
         <w:r>
           <w:rPr>
@@ -3299,7 +3299,7 @@
           <w14:ligatures w14:val="standardContextual"/>
         </w:rPr>
       </w:pPr>
-      <w:hyperlink w:anchor="_Toc242174927" w:history="1">
+      <w:hyperlink w:anchor="_Toc242192225" w:history="1">
         <w:r>
           <w:rPr>
             <w:rStyle w:val="aff8"/>
@@ -3326,7 +3326,7 @@
             <w:noProof/>
             <w:webHidden/>
           </w:rPr>
-          <w:instrText xml:space="preserve"> PAGEREF _Toc242174927 \h </w:instrText>
+          <w:instrText xml:space="preserve"> PAGEREF _Toc242192225 \h </w:instrText>
         </w:r>
         <w:r>
           <w:rPr>
@@ -3372,7 +3372,7 @@
           <w14:ligatures w14:val="standardContextual"/>
         </w:rPr>
       </w:pPr>
-      <w:hyperlink w:anchor="_Toc242174928" w:history="1">
+      <w:hyperlink w:anchor="_Toc242192226" w:history="1">
         <w:r>
           <w:rPr>
             <w:rStyle w:val="aff8"/>
@@ -3399,7 +3399,7 @@
             <w:noProof/>
             <w:webHidden/>
           </w:rPr>
-          <w:instrText xml:space="preserve"> PAGEREF _Toc242174928 \h </w:instrText>
+          <w:instrText xml:space="preserve"> PAGEREF _Toc242192226 \h </w:instrText>
         </w:r>
         <w:r>
           <w:rPr>
@@ -3445,7 +3445,7 @@
           <w14:ligatures w14:val="standardContextual"/>
         </w:rPr>
       </w:pPr>
-      <w:hyperlink w:anchor="_Toc242174929" w:history="1">
+      <w:hyperlink w:anchor="_Toc242192227" w:history="1">
         <w:r>
           <w:rPr>
             <w:rStyle w:val="aff8"/>
@@ -3472,7 +3472,7 @@
             <w:noProof/>
             <w:webHidden/>
           </w:rPr>
-          <w:instrText xml:space="preserve"> PAGEREF _Toc242174929 \h </w:instrText>
+          <w:instrText xml:space="preserve"> PAGEREF _Toc242192227 \h </w:instrText>
         </w:r>
         <w:r>
           <w:rPr>
@@ -3518,7 +3518,7 @@
           <w14:ligatures w14:val="standardContextual"/>
         </w:rPr>
       </w:pPr>
-      <w:hyperlink w:anchor="_Toc242174930" w:history="1">
+      <w:hyperlink w:anchor="_Toc242192228" w:history="1">
         <w:r>
           <w:rPr>
             <w:rStyle w:val="aff8"/>
@@ -3545,7 +3545,7 @@
             <w:noProof/>
             <w:webHidden/>
           </w:rPr>
-          <w:instrText xml:space="preserve"> PAGEREF _Toc242174930 \h </w:instrText>
+          <w:instrText xml:space="preserve"> PAGEREF _Toc242192228 \h </w:instrText>
         </w:r>
         <w:r>
           <w:rPr>
@@ -3591,7 +3591,7 @@
           <w14:ligatures w14:val="standardContextual"/>
         </w:rPr>
       </w:pPr>
-      <w:hyperlink w:anchor="_Toc242174931" w:history="1">
+      <w:hyperlink w:anchor="_Toc242192229" w:history="1">
         <w:r>
           <w:rPr>
             <w:rStyle w:val="aff8"/>
@@ -3618,7 +3618,7 @@
             <w:noProof/>
             <w:webHidden/>
           </w:rPr>
-          <w:instrText xml:space="preserve"> PAGEREF _Toc242174931 \h </w:instrText>
+          <w:instrText xml:space="preserve"> PAGEREF _Toc242192229 \h </w:instrText>
         </w:r>
         <w:r>
           <w:rPr>
@@ -3664,7 +3664,7 @@
           <w14:ligatures w14:val="standardContextual"/>
         </w:rPr>
       </w:pPr>
-      <w:hyperlink w:anchor="_Toc242174932" w:history="1">
+      <w:hyperlink w:anchor="_Toc242192230" w:history="1">
         <w:r>
           <w:rPr>
             <w:rStyle w:val="aff8"/>
@@ -3691,7 +3691,7 @@
             <w:noProof/>
             <w:webHidden/>
           </w:rPr>
-          <w:instrText xml:space="preserve"> PAGEREF _Toc242174932 \h </w:instrText>
+          <w:instrText xml:space="preserve"> PAGEREF _Toc242192230 \h </w:instrText>
         </w:r>
         <w:r>
           <w:rPr>
@@ -3737,7 +3737,7 @@
           <w14:ligatures w14:val="standardContextual"/>
         </w:rPr>
       </w:pPr>
-      <w:hyperlink w:anchor="_Toc242174933" w:history="1">
+      <w:hyperlink w:anchor="_Toc242192231" w:history="1">
         <w:r>
           <w:rPr>
             <w:rStyle w:val="aff8"/>
@@ -3764,7 +3764,7 @@
             <w:noProof/>
             <w:webHidden/>
           </w:rPr>
-          <w:instrText xml:space="preserve"> PAGEREF _Toc242174933 \h </w:instrText>
+          <w:instrText xml:space="preserve"> PAGEREF _Toc242192231 \h </w:instrText>
         </w:r>
         <w:r>
           <w:rPr>
@@ -3810,7 +3810,7 @@
           <w14:ligatures w14:val="standardContextual"/>
         </w:rPr>
       </w:pPr>
-      <w:hyperlink w:anchor="_Toc242174934" w:history="1">
+      <w:hyperlink w:anchor="_Toc242192232" w:history="1">
         <w:r>
           <w:rPr>
             <w:rStyle w:val="aff8"/>
@@ -3837,7 +3837,7 @@
             <w:noProof/>
             <w:webHidden/>
           </w:rPr>
-          <w:instrText xml:space="preserve"> PAGEREF _Toc242174934 \h </w:instrText>
+          <w:instrText xml:space="preserve"> PAGEREF _Toc242192232 \h </w:instrText>
         </w:r>
         <w:r>
           <w:rPr>
@@ -3883,7 +3883,7 @@
           <w14:ligatures w14:val="standardContextual"/>
         </w:rPr>
       </w:pPr>
-      <w:hyperlink w:anchor="_Toc242174935" w:history="1">
+      <w:hyperlink w:anchor="_Toc242192233" w:history="1">
         <w:r>
           <w:rPr>
             <w:rStyle w:val="aff8"/>
@@ -3910,7 +3910,7 @@
             <w:noProof/>
             <w:webHidden/>
           </w:rPr>
-          <w:instrText xml:space="preserve"> PAGEREF _Toc242174935 \h </w:instrText>
+          <w:instrText xml:space="preserve"> PAGEREF _Toc242192233 \h </w:instrText>
         </w:r>
         <w:r>
           <w:rPr>
@@ -3956,7 +3956,7 @@
           <w14:ligatures w14:val="standardContextual"/>
         </w:rPr>
       </w:pPr>
-      <w:hyperlink w:anchor="_Toc242174936" w:history="1">
+      <w:hyperlink w:anchor="_Toc242192234" w:history="1">
         <w:r>
           <w:rPr>
             <w:rStyle w:val="aff8"/>
@@ -3983,7 +3983,7 @@
             <w:noProof/>
             <w:webHidden/>
           </w:rPr>
-          <w:instrText xml:space="preserve"> PAGEREF _Toc242174936 \h </w:instrText>
+          <w:instrText xml:space="preserve"> PAGEREF _Toc242192234 \h </w:instrText>
         </w:r>
         <w:r>
           <w:rPr>
@@ -4029,7 +4029,7 @@
           <w14:ligatures w14:val="standardContextual"/>
         </w:rPr>
       </w:pPr>
-      <w:hyperlink w:anchor="_Toc242174937" w:history="1">
+      <w:hyperlink w:anchor="_Toc242192235" w:history="1">
         <w:r>
           <w:rPr>
             <w:rStyle w:val="aff8"/>
@@ -4056,7 +4056,7 @@
             <w:noProof/>
             <w:webHidden/>
           </w:rPr>
-          <w:instrText xml:space="preserve"> PAGEREF _Toc242174937 \h </w:instrText>
+          <w:instrText xml:space="preserve"> PAGEREF _Toc242192235 \h </w:instrText>
         </w:r>
         <w:r>
           <w:rPr>
@@ -4102,7 +4102,7 @@
           <w14:ligatures w14:val="standardContextual"/>
         </w:rPr>
       </w:pPr>
-      <w:hyperlink w:anchor="_Toc242174938" w:history="1">
+      <w:hyperlink w:anchor="_Toc242192236" w:history="1">
         <w:r>
           <w:rPr>
             <w:rStyle w:val="aff8"/>
@@ -4129,7 +4129,7 @@
             <w:noProof/>
             <w:webHidden/>
           </w:rPr>
-          <w:instrText xml:space="preserve"> PAGEREF _Toc242174938 \h </w:instrText>
+          <w:instrText xml:space="preserve"> PAGEREF _Toc242192236 \h </w:instrText>
         </w:r>
         <w:r>
           <w:rPr>
@@ -4175,7 +4175,7 @@
           <w14:ligatures w14:val="standardContextual"/>
         </w:rPr>
       </w:pPr>
-      <w:hyperlink w:anchor="_Toc242174939" w:history="1">
+      <w:hyperlink w:anchor="_Toc242192237" w:history="1">
         <w:r>
           <w:rPr>
             <w:rStyle w:val="aff8"/>
@@ -4202,7 +4202,7 @@
             <w:noProof/>
             <w:webHidden/>
           </w:rPr>
-          <w:instrText xml:space="preserve"> PAGEREF _Toc242174939 \h </w:instrText>
+          <w:instrText xml:space="preserve"> PAGEREF _Toc242192237 \h </w:instrText>
         </w:r>
         <w:r>
           <w:rPr>
@@ -4248,7 +4248,7 @@
           <w14:ligatures w14:val="standardContextual"/>
         </w:rPr>
       </w:pPr>
-      <w:hyperlink w:anchor="_Toc242174940" w:history="1">
+      <w:hyperlink w:anchor="_Toc242192238" w:history="1">
         <w:r>
           <w:rPr>
             <w:rStyle w:val="aff8"/>
@@ -4275,7 +4275,7 @@
             <w:noProof/>
             <w:webHidden/>
           </w:rPr>
-          <w:instrText xml:space="preserve"> PAGEREF _Toc242174940 \h </w:instrText>
+          <w:instrText xml:space="preserve"> PAGEREF _Toc242192238 \h </w:instrText>
         </w:r>
         <w:r>
           <w:rPr>
@@ -4321,7 +4321,7 @@
           <w14:ligatures w14:val="standardContextual"/>
         </w:rPr>
       </w:pPr>
-      <w:hyperlink w:anchor="_Toc242174941" w:history="1">
+      <w:hyperlink w:anchor="_Toc242192239" w:history="1">
         <w:r>
           <w:rPr>
             <w:rStyle w:val="aff8"/>
@@ -4348,7 +4348,7 @@
             <w:noProof/>
             <w:webHidden/>
           </w:rPr>
-          <w:instrText xml:space="preserve"> PAGEREF _Toc242174941 \h </w:instrText>
+          <w:instrText xml:space="preserve"> PAGEREF _Toc242192239 \h </w:instrText>
         </w:r>
         <w:r>
           <w:rPr>
@@ -4394,7 +4394,7 @@
           <w14:ligatures w14:val="standardContextual"/>
         </w:rPr>
       </w:pPr>
-      <w:hyperlink w:anchor="_Toc242174942" w:history="1">
+      <w:hyperlink w:anchor="_Toc242192240" w:history="1">
         <w:r>
           <w:rPr>
             <w:rStyle w:val="aff8"/>
@@ -4421,7 +4421,7 @@
             <w:noProof/>
             <w:webHidden/>
           </w:rPr>
-          <w:instrText xml:space="preserve"> PAGEREF _Toc242174942 \h </w:instrText>
+          <w:instrText xml:space="preserve"> PAGEREF _Toc242192240 \h </w:instrText>
         </w:r>
         <w:r>
           <w:rPr>
@@ -4467,7 +4467,7 @@
           <w14:ligatures w14:val="standardContextual"/>
         </w:rPr>
       </w:pPr>
-      <w:hyperlink w:anchor="_Toc242174943" w:history="1">
+      <w:hyperlink w:anchor="_Toc242192241" w:history="1">
         <w:r>
           <w:rPr>
             <w:rStyle w:val="aff8"/>
@@ -4494,7 +4494,7 @@
             <w:noProof/>
             <w:webHidden/>
           </w:rPr>
-          <w:instrText xml:space="preserve"> PAGEREF _Toc242174943 \h </w:instrText>
+          <w:instrText xml:space="preserve"> PAGEREF _Toc242192241 \h </w:instrText>
         </w:r>
         <w:r>
           <w:rPr>
@@ -4540,7 +4540,7 @@
         <w:ind w:firstLine="0"/>
         <w:jc w:val="center"/>
       </w:pPr>
-      <w:bookmarkStart w:id="0" w:name="_Toc242174886"/>
+      <w:bookmarkStart w:id="0" w:name="_Toc242192184"/>
       <w:r>
         <w:lastRenderedPageBreak/>
         <w:t>ПЕРЕЧЕНЬ ТЕРМИНОВ И СОКРАЩЕНИЙ</w:t>
@@ -5802,7 +5802,7 @@
         <w:pStyle w:val="1"/>
         <w:pageBreakBefore/>
       </w:pPr>
-      <w:bookmarkStart w:id="1" w:name="_Toc242174887"/>
+      <w:bookmarkStart w:id="1" w:name="_Toc242192185"/>
       <w:r>
         <w:lastRenderedPageBreak/>
         <w:t>1 Общие сведения</w:t>
@@ -5813,7 +5813,7 @@
       <w:pPr>
         <w:pStyle w:val="21"/>
       </w:pPr>
-      <w:bookmarkStart w:id="2" w:name="_Toc242174888"/>
+      <w:bookmarkStart w:id="2" w:name="_Toc242192186"/>
       <w:r>
         <w:t>1.1 Полное наименование системы и её условное обозначение</w:t>
       </w:r>
@@ -5833,7 +5833,7 @@
       <w:pPr>
         <w:pStyle w:val="21"/>
       </w:pPr>
-      <w:bookmarkStart w:id="3" w:name="_Toc242174889"/>
+      <w:bookmarkStart w:id="3" w:name="_Toc242192187"/>
       <w:r>
         <w:t>1.2 Шифр темы и номер договора</w:t>
       </w:r>
@@ -5848,7 +5848,7 @@
       <w:pPr>
         <w:pStyle w:val="21"/>
       </w:pPr>
-      <w:bookmarkStart w:id="4" w:name="_Toc242174890"/>
+      <w:bookmarkStart w:id="4" w:name="_Toc242192188"/>
       <w:r>
         <w:t>1.3 Наименования организаций заказчика и разработчика</w:t>
       </w:r>
@@ -5868,7 +5868,7 @@
       <w:pPr>
         <w:pStyle w:val="21"/>
       </w:pPr>
-      <w:bookmarkStart w:id="5" w:name="_Toc242174891"/>
+      <w:bookmarkStart w:id="5" w:name="_Toc242192189"/>
       <w:r>
         <w:t>1.4 Основания для создания системы</w:t>
       </w:r>
@@ -5893,7 +5893,7 @@
       <w:pPr>
         <w:pStyle w:val="21"/>
       </w:pPr>
-      <w:bookmarkStart w:id="6" w:name="_Toc242174892"/>
+      <w:bookmarkStart w:id="6" w:name="_Toc242192190"/>
       <w:r>
         <w:t>1.5 Плановые сроки начала и окончания работ</w:t>
       </w:r>
@@ -5908,7 +5908,7 @@
       <w:pPr>
         <w:pStyle w:val="21"/>
       </w:pPr>
-      <w:bookmarkStart w:id="7" w:name="_Toc242174893"/>
+      <w:bookmarkStart w:id="7" w:name="_Toc242192191"/>
       <w:r>
         <w:t>1.6 Сведения об источниках и порядке финансирования</w:t>
       </w:r>
@@ -5923,7 +5923,7 @@
       <w:pPr>
         <w:pStyle w:val="21"/>
       </w:pPr>
-      <w:bookmarkStart w:id="8" w:name="_Toc242174894"/>
+      <w:bookmarkStart w:id="8" w:name="_Toc242192192"/>
       <w:r>
         <w:lastRenderedPageBreak/>
         <w:t>1.7 Порядок оформления и предъявления результатов работ</w:t>
@@ -5939,7 +5939,7 @@
       <w:pPr>
         <w:pStyle w:val="21"/>
       </w:pPr>
-      <w:bookmarkStart w:id="9" w:name="_Toc242174895"/>
+      <w:bookmarkStart w:id="9" w:name="_Toc242192193"/>
       <w:r>
         <w:t>1.8 Перечень нормативно-технических документов</w:t>
       </w:r>
@@ -6003,7 +6003,7 @@
         <w:pStyle w:val="1"/>
         <w:pageBreakBefore/>
       </w:pPr>
-      <w:bookmarkStart w:id="10" w:name="_Toc242174896"/>
+      <w:bookmarkStart w:id="10" w:name="_Toc242192194"/>
       <w:r>
         <w:lastRenderedPageBreak/>
         <w:t>2 Цели и назначение создания автоматизированной системы</w:t>
@@ -6014,7 +6014,7 @@
       <w:pPr>
         <w:pStyle w:val="21"/>
       </w:pPr>
-      <w:bookmarkStart w:id="11" w:name="_Toc242174897"/>
+      <w:bookmarkStart w:id="11" w:name="_Toc242192195"/>
       <w:r>
         <w:t>2.1 Назначение системы</w:t>
       </w:r>
@@ -6074,7 +6074,7 @@
       <w:pPr>
         <w:pStyle w:val="21"/>
       </w:pPr>
-      <w:bookmarkStart w:id="12" w:name="_Toc242174898"/>
+      <w:bookmarkStart w:id="12" w:name="_Toc242192196"/>
       <w:r>
         <w:t>2.2 Цели создания системы</w:t>
       </w:r>
@@ -6120,7 +6120,7 @@
         <w:pStyle w:val="1"/>
         <w:pageBreakBefore/>
       </w:pPr>
-      <w:bookmarkStart w:id="13" w:name="_Toc242174899"/>
+      <w:bookmarkStart w:id="13" w:name="_Toc242192197"/>
       <w:r>
         <w:lastRenderedPageBreak/>
         <w:t>3 Характеристика объекта автоматизации</w:t>
@@ -6131,7 +6131,7 @@
       <w:pPr>
         <w:pStyle w:val="21"/>
       </w:pPr>
-      <w:bookmarkStart w:id="14" w:name="_Toc242174900"/>
+      <w:bookmarkStart w:id="14" w:name="_Toc242192198"/>
       <w:r>
         <w:t>3.1 Краткие сведения об объекте автоматизации</w:t>
       </w:r>
@@ -6221,7 +6221,7 @@
       <w:pPr>
         <w:pStyle w:val="21"/>
       </w:pPr>
-      <w:bookmarkStart w:id="15" w:name="_Toc242174901"/>
+      <w:bookmarkStart w:id="15" w:name="_Toc242192199"/>
       <w:r>
         <w:t>3.2 Сведения об условиях эксплуатации</w:t>
       </w:r>
@@ -6237,7 +6237,7 @@
         <w:pStyle w:val="1"/>
         <w:pageBreakBefore/>
       </w:pPr>
-      <w:bookmarkStart w:id="16" w:name="_Toc242174902"/>
+      <w:bookmarkStart w:id="16" w:name="_Toc242192200"/>
       <w:r>
         <w:lastRenderedPageBreak/>
         <w:t>4 Требования к автоматизированной системе</w:t>
@@ -6248,7 +6248,7 @@
       <w:pPr>
         <w:pStyle w:val="21"/>
       </w:pPr>
-      <w:bookmarkStart w:id="17" w:name="_Toc242174903"/>
+      <w:bookmarkStart w:id="17" w:name="_Toc242192201"/>
       <w:r>
         <w:t>4.1 Требования к системе в целом</w:t>
       </w:r>
@@ -6258,7 +6258,7 @@
       <w:pPr>
         <w:pStyle w:val="31"/>
       </w:pPr>
-      <w:bookmarkStart w:id="18" w:name="_Toc242174904"/>
+      <w:bookmarkStart w:id="18" w:name="_Toc242192202"/>
       <w:r>
         <w:t>4.1.1 Требования к структуре и функционированию системы</w:t>
       </w:r>
@@ -6904,7 +6904,7 @@
       <w:pPr>
         <w:pStyle w:val="31"/>
       </w:pPr>
-      <w:bookmarkStart w:id="19" w:name="_Toc242174905"/>
+      <w:bookmarkStart w:id="19" w:name="_Toc242192203"/>
       <w:r>
         <w:t>4.1.2 Требования к численности и квалификации персонала</w:t>
       </w:r>
@@ -7185,7 +7185,7 @@
       <w:pPr>
         <w:pStyle w:val="31"/>
       </w:pPr>
-      <w:bookmarkStart w:id="20" w:name="_Toc242174906"/>
+      <w:bookmarkStart w:id="20" w:name="_Toc242192204"/>
       <w:r>
         <w:t>4.1.3 Показатели назначения</w:t>
       </w:r>
@@ -7233,7 +7233,7 @@
       <w:pPr>
         <w:pStyle w:val="31"/>
       </w:pPr>
-      <w:bookmarkStart w:id="21" w:name="_Toc242174907"/>
+      <w:bookmarkStart w:id="21" w:name="_Toc242192205"/>
       <w:r>
         <w:t>4.1.4 Требования к надёжности</w:t>
       </w:r>
@@ -7267,7 +7267,7 @@
       <w:pPr>
         <w:pStyle w:val="31"/>
       </w:pPr>
-      <w:bookmarkStart w:id="22" w:name="_Toc242174908"/>
+      <w:bookmarkStart w:id="22" w:name="_Toc242192206"/>
       <w:r>
         <w:t>4.1.5 Требования к безопасности</w:t>
       </w:r>
@@ -7282,7 +7282,7 @@
       <w:pPr>
         <w:pStyle w:val="31"/>
       </w:pPr>
-      <w:bookmarkStart w:id="23" w:name="_Toc242174909"/>
+      <w:bookmarkStart w:id="23" w:name="_Toc242192207"/>
       <w:r>
         <w:t>4.1.6 Требования к эргономике и технической эстетике</w:t>
       </w:r>
@@ -7327,7 +7327,7 @@
       <w:pPr>
         <w:pStyle w:val="31"/>
       </w:pPr>
-      <w:bookmarkStart w:id="24" w:name="_Toc242174910"/>
+      <w:bookmarkStart w:id="24" w:name="_Toc242192208"/>
       <w:r>
         <w:t>4.1.7 Требования к эксплуатации и техническому обслуживанию</w:t>
       </w:r>
@@ -7357,7 +7357,7 @@
       <w:pPr>
         <w:pStyle w:val="31"/>
       </w:pPr>
-      <w:bookmarkStart w:id="25" w:name="_Toc242174911"/>
+      <w:bookmarkStart w:id="25" w:name="_Toc242192209"/>
       <w:r>
         <w:t>4.1.8 Требования к защите информации от несанкционированного доступа</w:t>
       </w:r>
@@ -7428,7 +7428,7 @@
       <w:pPr>
         <w:pStyle w:val="31"/>
       </w:pPr>
-      <w:bookmarkStart w:id="26" w:name="_Toc242174912"/>
+      <w:bookmarkStart w:id="26" w:name="_Toc242192210"/>
       <w:r>
         <w:t>4.1.9 Требования по сохранности информации при авариях</w:t>
       </w:r>
@@ -7449,7 +7449,7 @@
       <w:pPr>
         <w:pStyle w:val="31"/>
       </w:pPr>
-      <w:bookmarkStart w:id="27" w:name="_Toc242174913"/>
+      <w:bookmarkStart w:id="27" w:name="_Toc242192211"/>
       <w:r>
         <w:t>4.1.10 Требования к защите от влияния внешних воздействий</w:t>
       </w:r>
@@ -7464,7 +7464,7 @@
       <w:pPr>
         <w:pStyle w:val="31"/>
       </w:pPr>
-      <w:bookmarkStart w:id="28" w:name="_Toc242174914"/>
+      <w:bookmarkStart w:id="28" w:name="_Toc242192212"/>
       <w:r>
         <w:t>4.1.11 Требования к патентной чистоте</w:t>
       </w:r>
@@ -7482,7 +7482,7 @@
       <w:pPr>
         <w:pStyle w:val="31"/>
       </w:pPr>
-      <w:bookmarkStart w:id="29" w:name="_Toc242174915"/>
+      <w:bookmarkStart w:id="29" w:name="_Toc242192213"/>
       <w:r>
         <w:t>4.1.12 Требования по стандартизации и унификации</w:t>
       </w:r>
@@ -7497,7 +7497,7 @@
       <w:pPr>
         <w:pStyle w:val="31"/>
       </w:pPr>
-      <w:bookmarkStart w:id="30" w:name="_Toc242174916"/>
+      <w:bookmarkStart w:id="30" w:name="_Toc242192214"/>
       <w:r>
         <w:t>4.1.13 Дополнительные требования</w:t>
       </w:r>
@@ -7517,7 +7517,7 @@
       <w:pPr>
         <w:pStyle w:val="21"/>
       </w:pPr>
-      <w:bookmarkStart w:id="31" w:name="_Toc242174917"/>
+      <w:bookmarkStart w:id="31" w:name="_Toc242192215"/>
       <w:r>
         <w:lastRenderedPageBreak/>
         <w:t>4.2 Требования к функциям, выполняемым системой</w:t>
@@ -7533,7 +7533,7 @@
       <w:pPr>
         <w:pStyle w:val="31"/>
       </w:pPr>
-      <w:bookmarkStart w:id="32" w:name="_Toc242174918"/>
+      <w:bookmarkStart w:id="32" w:name="_Toc242192216"/>
       <w:r>
         <w:t>4.2.1 Подсистема «Организационная структура и права доступа»</w:t>
       </w:r>
@@ -7578,7 +7578,7 @@
       <w:pPr>
         <w:pStyle w:val="31"/>
       </w:pPr>
-      <w:bookmarkStart w:id="33" w:name="_Toc242174919"/>
+      <w:bookmarkStart w:id="33" w:name="_Toc242192217"/>
       <w:r>
         <w:t>4.2.2 Подсистема «Каталог недвижимости»</w:t>
       </w:r>
@@ -7628,7 +7628,7 @@
       <w:pPr>
         <w:pStyle w:val="31"/>
       </w:pPr>
-      <w:bookmarkStart w:id="34" w:name="_Toc242174920"/>
+      <w:bookmarkStart w:id="34" w:name="_Toc242192218"/>
       <w:r>
         <w:lastRenderedPageBreak/>
         <w:t>4.2.3 Подсистема «Работа с клиентами»</w:t>
@@ -7669,7 +7669,7 @@
       <w:pPr>
         <w:pStyle w:val="31"/>
       </w:pPr>
-      <w:bookmarkStart w:id="35" w:name="_Toc242174921"/>
+      <w:bookmarkStart w:id="35" w:name="_Toc242192219"/>
       <w:r>
         <w:t>4.2.4 Подсистема «Сделки»</w:t>
       </w:r>
@@ -7697,6 +7697,11 @@
     </w:p>
     <w:p>
       <w:r>
+        <w:t>– выбор плана оплаты сделки; скидки, действующие только при определённых планах оплаты (например, «за 100% оплату»); порядок расчёта: скидки → цена сделки → план оплаты;</w:t>
+      </w:r>
+    </w:p>
+    <w:p>
+      <w:r>
         <w:t>– уникальность номера договора в пределах компании;</w:t>
       </w:r>
     </w:p>
@@ -7707,19 +7712,121 @@
     </w:p>
     <w:p>
       <w:r>
-        <w:t>– отмену сделки без платежей и подписи клиента с указанием причины и расторжение сделки с документом-основанием при наличии платежей или подписи; перевод оплаченных платежей в статус «К возврату»; освобождение объекта после завершения возвратов; возврат связанной заявки в работу.</w:t>
+        <w:t xml:space="preserve">– отмену сделки без платежей и подписи клиента с указанием причины и расторжение сделки с документом-основанием при наличии платежей или подписи; перевод </w:t>
+      </w:r>
+      <w:r>
+        <w:lastRenderedPageBreak/>
+        <w:t>оплаченных платежей в статус «К возврату»; освобождение объекта после завершения возвратов; возврат связанной заявки в работу.</w:t>
       </w:r>
     </w:p>
     <w:p>
       <w:pPr>
         <w:pStyle w:val="31"/>
       </w:pPr>
-      <w:bookmarkStart w:id="36" w:name="_Toc242174922"/>
+      <w:bookmarkStart w:id="36" w:name="_Toc242192220"/>
+      <w:r>
+        <w:t>4.2.5 Подсистема «Финансы»</w:t>
+      </w:r>
+      <w:bookmarkEnd w:id="36"/>
+    </w:p>
+    <w:p>
+      <w:r>
+        <w:t>Подсистема должна обеспечивать:</w:t>
+      </w:r>
+    </w:p>
+    <w:p>
+      <w:r>
+        <w:t>– создание и изменение графика платежей только в составе сделки; равенство суммы графика стоимости по договору; хранение всего графика в валюте сделки;</w:t>
+      </w:r>
+    </w:p>
+    <w:p>
+      <w:r>
+        <w:t>– ввод строк графика в любой из поддерживаемых валют компании с пересчётом в валюту сделки по курсу на день сохранения и сохранением введённой суммы, валюты и курса; отнесение расхождения от округления на последнюю пересчитанную строку;</w:t>
+      </w:r>
+    </w:p>
+    <w:p>
+      <w:r>
+        <w:t>– сохранение проведённых платежей при изменении графика и запрет их удаления;</w:t>
+      </w:r>
+    </w:p>
+    <w:p>
+      <w:r>
+        <w:t>– отметку оплаты текущей датой и её отмену; запрет оплаты по отменённой или расторгнутой сделке;</w:t>
+      </w:r>
+    </w:p>
+    <w:p>
+      <w:r>
+        <w:t>– автоматический перевод платежей в статус «Просрочен»;</w:t>
+      </w:r>
+    </w:p>
+    <w:p>
+      <w:r>
+        <w:t>– отметку возврата платежей в статусе «К возврату»;</w:t>
+      </w:r>
+    </w:p>
+    <w:p>
+      <w:r>
+        <w:t>– список платежей с фильтрами по плановой и фактической дате, сводную таблицу с группировкой и выгрузку в Excel; итоги по каждой валюте отдельно и общий итог в валюте сделок компании;</w:t>
+      </w:r>
+    </w:p>
+    <w:p>
+      <w:r>
+        <w:t>– настройку валюты сделок компании (одна на компанию) и перечня поддерживаемых валют; загрузку курсов ЦБ Узбекистана автоматически и по запросу пользователя; ручной ввод курса компании на дату, действующего вместо курса ЦБ только в этой компании;</w:t>
+      </w:r>
+    </w:p>
+    <w:p>
+      <w:r>
+        <w:t>– ведение планов оплаты как типов платежей: вид плана (полная оплата; первый взнос и ежемесячные платежи; первый взнос и остаток одним платежом), срок, минимальный первоначальный взнос (своей скидки у плана нет: скидки ведутся в каталоге и могут ограничиваться планами); расчёт и печать вариантов оплаты объекта для клиента с учётом отмеченных скидок; создание графика платежей сделки по выбранному плану одной операцией с последующей ручной правкой;</w:t>
+      </w:r>
+    </w:p>
+    <w:p>
+      <w:r>
+        <w:t>– добавление и изменение типов платежей, условий планов и счетов получателей в отдельном окне; запрет удаления типа платежа или счёта, по которым есть платежи, с объяснением причины.</w:t>
+      </w:r>
+    </w:p>
+    <w:p>
+      <w:pPr>
+        <w:pStyle w:val="31"/>
+      </w:pPr>
+      <w:bookmarkStart w:id="37" w:name="_Toc242192221"/>
+      <w:r>
+        <w:t>4.2.6 Подсистема «Шаблоны документов»</w:t>
+      </w:r>
+      <w:bookmarkEnd w:id="37"/>
+    </w:p>
+    <w:p>
+      <w:r>
+        <w:t xml:space="preserve">Подсистема должна обеспечивать хранение шаблонов договоров в формате DOCX с областью применения (проекты, дома, типы объектов) и формирование документа по </w:t>
+      </w:r>
       <w:r>
         <w:lastRenderedPageBreak/>
-        <w:t>4.2.5 Подсистема «Финансы»</w:t>
-      </w:r>
-      <w:bookmarkEnd w:id="36"/>
+        <w:t>сделке с подстановкой данных клиента, объекта, дома, проекта, сделки и менеджера. Формирование должно быть доступно после сохранения номера и даты договора и недоступно для отменённых и расторгнутых сделок.</w:t>
+      </w:r>
+    </w:p>
+    <w:p>
+      <w:pPr>
+        <w:pStyle w:val="31"/>
+      </w:pPr>
+      <w:bookmarkStart w:id="38" w:name="_Toc242192222"/>
+      <w:r>
+        <w:t>4.2.7 Подсистема «Задачи»</w:t>
+      </w:r>
+      <w:bookmarkEnd w:id="38"/>
+    </w:p>
+    <w:p>
+      <w:r>
+        <w:t>Подсистема должна обеспечивать постановку задач с исполнителем, сроком, приоритетом, наблюдателями, тегами и оценкой времени; подзадачи; комментарии; статусы «Новая», «В работе», «На проверке», «Завершена», «Отменена», «Заблокирована»; запрет завершения задачи при открытых подзадачах; представления списком, канбан-доской и календарём; журнал изменений.</w:t>
+      </w:r>
+    </w:p>
+    <w:p>
+      <w:pPr>
+        <w:pStyle w:val="31"/>
+      </w:pPr>
+      <w:bookmarkStart w:id="39" w:name="_Toc242192223"/>
+      <w:r>
+        <w:t>4.2.8 Подсистема «Аналитика и отчётность»</w:t>
+      </w:r>
+      <w:bookmarkEnd w:id="39"/>
     </w:p>
     <w:p>
       <w:r>
@@ -7728,145 +7835,49 @@
     </w:p>
     <w:p>
       <w:r>
-        <w:t>– создание и изменение графика платежей только в составе сделки; равенство суммы графика стоимости по договору; хранение всего графика в валюте сделки;</w:t>
-      </w:r>
-    </w:p>
-    <w:p>
-      <w:r>
-        <w:t>– ввод строк графика в любой из поддерживаемых валют компании с пересчётом в валюту сделки по курсу на день сохранения и сохранением введённой суммы, валюты и курса; отнесение расхождения от округления на последнюю пересчитанную строку;</w:t>
-      </w:r>
-    </w:p>
-    <w:p>
-      <w:r>
-        <w:t>– сохранение проведённых платежей при изменении графика и запрет их удаления;</w:t>
-      </w:r>
-    </w:p>
-    <w:p>
-      <w:r>
-        <w:t>– отметку оплаты текущей датой и её отмену; запрет оплаты по отменённой или расторгнутой сделке;</w:t>
-      </w:r>
-    </w:p>
-    <w:p>
-      <w:r>
-        <w:t>– автоматический перевод платежей в статус «Просрочен»;</w:t>
-      </w:r>
-    </w:p>
-    <w:p>
-      <w:r>
-        <w:t>– отметку возврата платежей в статусе «К возврату»;</w:t>
-      </w:r>
-    </w:p>
-    <w:p>
-      <w:r>
-        <w:t>– список платежей с фильтрами по плановой и фактической дате, сводную таблицу с группировкой и выгрузку в Excel; итоги по каждой валюте отдельно и общий итог в валюте сделок компании;</w:t>
-      </w:r>
-    </w:p>
-    <w:p>
-      <w:r>
-        <w:t>– настройку валюты сделок компании (одна на компанию) и перечня поддерживаемых валют; загрузку курсов ЦБ Узбекистана автоматически и по запросу пользователя; ручной ввод курса компании на дату, действующего вместо курса ЦБ только в этой компании;</w:t>
-      </w:r>
-    </w:p>
-    <w:p>
-      <w:r>
-        <w:t>– ведение планов оплаты как типов платежей: вид плана (полная оплата; первый взнос и ежемесячные платежи; первый взнос и остаток одним платежом), срок, скидка по плану, минимальный первоначальный взнос; расчёт и печать вариантов оплаты объекта для клиента; создание графика платежей сделки по выбранному плану одной операцией с последующей ручной правкой;</w:t>
-      </w:r>
-    </w:p>
-    <w:p>
-      <w:r>
-        <w:t>– изменение названий типов платежей и счетов получателей и условий планов; запрет удаления типа платежа или счёта, по которым есть платежи, с объяснением причины.</w:t>
+        <w:t>– дашборд с показателями дня и месяца в пределах области видимости пользователя;</w:t>
+      </w:r>
+    </w:p>
+    <w:p>
+      <w:r>
+        <w:t>– сводные таблицы по заявкам, встречам, сделкам и платежам с группировкой и выгрузкой в Excel; отбор «забытых» заявок и просроченных встреч;</w:t>
+      </w:r>
+    </w:p>
+    <w:p>
+      <w:r>
+        <w:t>– загрузку планов продаж по проектам и по сотрудникам из XLSX-шаблонов;</w:t>
+      </w:r>
+    </w:p>
+    <w:p>
+      <w:r>
+        <w:t>– отчёты «план-факт» по количеству, контрактации и поступлениям с процентом выполнения и прогнозом выполнения к концу периода;</w:t>
+      </w:r>
+    </w:p>
+    <w:p>
+      <w:r>
+        <w:t>– приведение денежных показателей дашборда, общего итога финансов и денежного факта отчётов «план-факт» к валюте сделок компании по курсу на дату события; предупреждение о валютах, для которых нет курса и суммы которых поэтому не учтены.</w:t>
       </w:r>
     </w:p>
     <w:p>
       <w:pPr>
         <w:pStyle w:val="31"/>
       </w:pPr>
-      <w:bookmarkStart w:id="37" w:name="_Toc242174923"/>
-      <w:r>
-        <w:t>4.2.6 Подсистема «Шаблоны документов»</w:t>
-      </w:r>
-      <w:bookmarkEnd w:id="37"/>
-    </w:p>
-    <w:p>
-      <w:r>
-        <w:t>Подсистема должна обеспечивать хранение шаблонов договоров в формате DOCX с областью применения (проекты, дома, типы объектов) и формирование документа по сделке с подстановкой данных клиента, объекта, дома, проекта, сделки и менеджера. Формирование должно быть доступно после сохранения номера и даты договора и недоступно для отменённых и расторгнутых сделок.</w:t>
+      <w:bookmarkStart w:id="40" w:name="_Toc242192224"/>
+      <w:r>
+        <w:t>4.2.9 Подсистема «Интеграция с партнёрами»</w:t>
+      </w:r>
+      <w:bookmarkEnd w:id="40"/>
+    </w:p>
+    <w:p>
+      <w:r>
+        <w:t>Подсистема должна обеспечивать выдачу партнёрам по API-ключу сведений о проектах, домах и планировках и приём заявок; отказ от создания дубля заявки при повторной отправке формы в течение 24 ч; управление API-ключами (создание, изменение, отключение, перевыпуск, показ ключа один раз при выдаче).</w:t>
       </w:r>
     </w:p>
     <w:p>
       <w:pPr>
         <w:pStyle w:val="31"/>
       </w:pPr>
-      <w:bookmarkStart w:id="38" w:name="_Toc242174924"/>
-      <w:r>
-        <w:lastRenderedPageBreak/>
-        <w:t>4.2.7 Подсистема «Задачи»</w:t>
-      </w:r>
-      <w:bookmarkEnd w:id="38"/>
-    </w:p>
-    <w:p>
-      <w:r>
-        <w:t>Подсистема должна обеспечивать постановку задач с исполнителем, сроком, приоритетом, наблюдателями, тегами и оценкой времени; подзадачи; комментарии; статусы «Новая», «В работе», «На проверке», «Завершена», «Отменена», «Заблокирована»; запрет завершения задачи при открытых подзадачах; представления списком, канбан-доской и календарём; журнал изменений.</w:t>
-      </w:r>
-    </w:p>
-    <w:p>
-      <w:pPr>
-        <w:pStyle w:val="31"/>
-      </w:pPr>
-      <w:bookmarkStart w:id="39" w:name="_Toc242174925"/>
-      <w:r>
-        <w:t>4.2.8 Подсистема «Аналитика и отчётность»</w:t>
-      </w:r>
-      <w:bookmarkEnd w:id="39"/>
-    </w:p>
-    <w:p>
-      <w:r>
-        <w:t>Подсистема должна обеспечивать:</w:t>
-      </w:r>
-    </w:p>
-    <w:p>
-      <w:r>
-        <w:t>– дашборд с показателями дня и месяца в пределах области видимости пользователя;</w:t>
-      </w:r>
-    </w:p>
-    <w:p>
-      <w:r>
-        <w:t>– сводные таблицы по заявкам, встречам, сделкам и платежам с группировкой и выгрузкой в Excel; отбор «забытых» заявок и просроченных встреч;</w:t>
-      </w:r>
-    </w:p>
-    <w:p>
-      <w:r>
-        <w:t>– загрузку планов продаж по проектам и по сотрудникам из XLSX-шаблонов;</w:t>
-      </w:r>
-    </w:p>
-    <w:p>
-      <w:r>
-        <w:t>– отчёты «план-факт» по количеству, контрактации и поступлениям с процентом выполнения и прогнозом выполнения к концу периода;</w:t>
-      </w:r>
-    </w:p>
-    <w:p>
-      <w:r>
-        <w:t>– приведение денежных показателей дашборда, общего итога финансов и денежного факта отчётов «план-факт» к валюте сделок компании по курсу на дату события; предупреждение о валютах, для которых нет курса и суммы которых поэтому не учтены.</w:t>
-      </w:r>
-    </w:p>
-    <w:p>
-      <w:pPr>
-        <w:pStyle w:val="31"/>
-      </w:pPr>
-      <w:bookmarkStart w:id="40" w:name="_Toc242174926"/>
-      <w:r>
-        <w:t>4.2.9 Подсистема «Интеграция с партнёрами»</w:t>
-      </w:r>
-      <w:bookmarkEnd w:id="40"/>
-    </w:p>
-    <w:p>
-      <w:r>
-        <w:t>Подсистема должна обеспечивать выдачу партнёрам по API-ключу сведений о проектах, домах и планировках и приём заявок; отказ от создания дубля заявки при повторной отправке формы в течение 24 ч; управление API-ключами (создание, изменение, отключение, перевыпуск, показ ключа один раз при выдаче).</w:t>
-      </w:r>
-    </w:p>
-    <w:p>
-      <w:pPr>
-        <w:pStyle w:val="31"/>
-      </w:pPr>
-      <w:bookmarkStart w:id="41" w:name="_Toc242174927"/>
+      <w:bookmarkStart w:id="41" w:name="_Toc242192225"/>
       <w:r>
         <w:t>4.2.10 Подсистема «Регламентные задания»</w:t>
       </w:r>
@@ -7881,7 +7892,7 @@
       <w:pPr>
         <w:pStyle w:val="21"/>
       </w:pPr>
-      <w:bookmarkStart w:id="42" w:name="_Toc242174928"/>
+      <w:bookmarkStart w:id="42" w:name="_Toc242192226"/>
       <w:r>
         <w:lastRenderedPageBreak/>
         <w:t>4.3 Требования к видам обеспечения</w:t>
@@ -7892,7 +7903,7 @@
       <w:pPr>
         <w:pStyle w:val="31"/>
       </w:pPr>
-      <w:bookmarkStart w:id="43" w:name="_Toc242174929"/>
+      <w:bookmarkStart w:id="43" w:name="_Toc242192227"/>
       <w:r>
         <w:t>4.3.1 Требования к математическому обеспечению</w:t>
       </w:r>
@@ -7932,7 +7943,7 @@
       <w:pPr>
         <w:pStyle w:val="31"/>
       </w:pPr>
-      <w:bookmarkStart w:id="44" w:name="_Toc242174930"/>
+      <w:bookmarkStart w:id="44" w:name="_Toc242192228"/>
       <w:r>
         <w:t>4.3.2 Требования к информационному обеспечению</w:t>
       </w:r>
@@ -7947,7 +7958,7 @@
       <w:pPr>
         <w:pStyle w:val="31"/>
       </w:pPr>
-      <w:bookmarkStart w:id="45" w:name="_Toc242174931"/>
+      <w:bookmarkStart w:id="45" w:name="_Toc242192229"/>
       <w:r>
         <w:t>4.3.3 Требования к лингвистическому обеспечению</w:t>
       </w:r>
@@ -7962,7 +7973,7 @@
       <w:pPr>
         <w:pStyle w:val="31"/>
       </w:pPr>
-      <w:bookmarkStart w:id="46" w:name="_Toc242174932"/>
+      <w:bookmarkStart w:id="46" w:name="_Toc242192230"/>
       <w:r>
         <w:t>4.3.4 Требования к программному обеспечению</w:t>
       </w:r>
@@ -7977,7 +7988,7 @@
       <w:pPr>
         <w:pStyle w:val="31"/>
       </w:pPr>
-      <w:bookmarkStart w:id="47" w:name="_Toc242174933"/>
+      <w:bookmarkStart w:id="47" w:name="_Toc242192231"/>
       <w:r>
         <w:lastRenderedPageBreak/>
         <w:t>4.3.5 Требования к техническому обеспечению</w:t>
@@ -7993,7 +8004,7 @@
       <w:pPr>
         <w:pStyle w:val="31"/>
       </w:pPr>
-      <w:bookmarkStart w:id="48" w:name="_Toc242174934"/>
+      <w:bookmarkStart w:id="48" w:name="_Toc242192232"/>
       <w:r>
         <w:t>4.3.6 Требования к метрологическому обеспечению</w:t>
       </w:r>
@@ -8008,7 +8019,7 @@
       <w:pPr>
         <w:pStyle w:val="31"/>
       </w:pPr>
-      <w:bookmarkStart w:id="49" w:name="_Toc242174935"/>
+      <w:bookmarkStart w:id="49" w:name="_Toc242192233"/>
       <w:r>
         <w:t>4.3.7 Требования к организационному обеспечению</w:t>
       </w:r>
@@ -8023,7 +8034,7 @@
       <w:pPr>
         <w:pStyle w:val="31"/>
       </w:pPr>
-      <w:bookmarkStart w:id="50" w:name="_Toc242174936"/>
+      <w:bookmarkStart w:id="50" w:name="_Toc242192234"/>
       <w:r>
         <w:t>4.3.8 Требования к методическому обеспечению</w:t>
       </w:r>
@@ -8039,7 +8050,7 @@
         <w:pStyle w:val="1"/>
         <w:pageBreakBefore/>
       </w:pPr>
-      <w:bookmarkStart w:id="51" w:name="_Toc242174937"/>
+      <w:bookmarkStart w:id="51" w:name="_Toc242192235"/>
       <w:r>
         <w:lastRenderedPageBreak/>
         <w:t>5 Состав и содержание работ по созданию системы</w:t>
@@ -8361,7 +8372,7 @@
         <w:pStyle w:val="1"/>
         <w:pageBreakBefore/>
       </w:pPr>
-      <w:bookmarkStart w:id="52" w:name="_Toc242174938"/>
+      <w:bookmarkStart w:id="52" w:name="_Toc242192236"/>
       <w:r>
         <w:lastRenderedPageBreak/>
         <w:t>6 Порядок разработки автоматизированной системы</w:t>
@@ -8408,7 +8419,7 @@
         <w:pStyle w:val="1"/>
         <w:pageBreakBefore/>
       </w:pPr>
-      <w:bookmarkStart w:id="53" w:name="_Toc242174939"/>
+      <w:bookmarkStart w:id="53" w:name="_Toc242192237"/>
       <w:r>
         <w:lastRenderedPageBreak/>
         <w:t>7 Порядок контроля и приёмки автоматизированной системы</w:t>
@@ -8425,7 +8436,7 @@
         <w:pStyle w:val="1"/>
         <w:pageBreakBefore/>
       </w:pPr>
-      <w:bookmarkStart w:id="54" w:name="_Toc242174940"/>
+      <w:bookmarkStart w:id="54" w:name="_Toc242192238"/>
       <w:r>
         <w:lastRenderedPageBreak/>
         <w:t>8 Требования к составу и содержанию работ по подготовке объекта автоматизации к вводу системы в действие</w:t>
@@ -8487,7 +8498,7 @@
         <w:pStyle w:val="1"/>
         <w:pageBreakBefore/>
       </w:pPr>
-      <w:bookmarkStart w:id="55" w:name="_Toc242174941"/>
+      <w:bookmarkStart w:id="55" w:name="_Toc242192239"/>
       <w:r>
         <w:lastRenderedPageBreak/>
         <w:t>9 Требования к документированию</w:t>
@@ -9129,7 +9140,7 @@
         <w:pStyle w:val="1"/>
         <w:pageBreakBefore/>
       </w:pPr>
-      <w:bookmarkStart w:id="56" w:name="_Toc242174942"/>
+      <w:bookmarkStart w:id="56" w:name="_Toc242192240"/>
       <w:r>
         <w:lastRenderedPageBreak/>
         <w:t>10 Источники разработки</w:t>
@@ -9168,7 +9179,7 @@
         <w:ind w:firstLine="0"/>
         <w:jc w:val="center"/>
       </w:pPr>
-      <w:bookmarkStart w:id="57" w:name="_Toc242174943"/>
+      <w:bookmarkStart w:id="57" w:name="_Toc242192241"/>
       <w:r>
         <w:lastRenderedPageBreak/>
         <w:t>ЛИСТ РЕГИСТРАЦИИ ИЗМЕНЕНИЙ</w:t>
@@ -11230,31 +11241,31 @@
       </w:rPr>
     </w:lvl>
   </w:abstractNum>
-  <w:num w:numId="1" w16cid:durableId="223955193">
+  <w:num w:numId="1" w16cid:durableId="37553423">
     <w:abstractNumId w:val="8"/>
   </w:num>
-  <w:num w:numId="2" w16cid:durableId="1189563554">
+  <w:num w:numId="2" w16cid:durableId="1043484062">
     <w:abstractNumId w:val="6"/>
   </w:num>
-  <w:num w:numId="3" w16cid:durableId="728184927">
+  <w:num w:numId="3" w16cid:durableId="2040860014">
     <w:abstractNumId w:val="5"/>
   </w:num>
-  <w:num w:numId="4" w16cid:durableId="34622587">
+  <w:num w:numId="4" w16cid:durableId="888034673">
     <w:abstractNumId w:val="4"/>
   </w:num>
-  <w:num w:numId="5" w16cid:durableId="1227498339">
+  <w:num w:numId="5" w16cid:durableId="1390032042">
     <w:abstractNumId w:val="7"/>
   </w:num>
-  <w:num w:numId="6" w16cid:durableId="720985851">
+  <w:num w:numId="6" w16cid:durableId="1912815002">
     <w:abstractNumId w:val="3"/>
   </w:num>
-  <w:num w:numId="7" w16cid:durableId="1702049577">
+  <w:num w:numId="7" w16cid:durableId="633608998">
     <w:abstractNumId w:val="2"/>
   </w:num>
-  <w:num w:numId="8" w16cid:durableId="1574852148">
+  <w:num w:numId="8" w16cid:durableId="1179198553">
     <w:abstractNumId w:val="1"/>
   </w:num>
-  <w:num w:numId="9" w16cid:durableId="1147622200">
+  <w:num w:numId="9" w16cid:durableId="47657462">
     <w:abstractNumId w:val="0"/>
   </w:num>
 </w:numbering>
@@ -22787,7 +22798,7 @@
     <w:autoRedefine/>
     <w:uiPriority w:val="39"/>
     <w:unhideWhenUsed/>
-    <w:rsid w:val="00CC5377"/>
+    <w:rsid w:val="00F42D9B"/>
     <w:pPr>
       <w:spacing w:after="100"/>
     </w:pPr>
@@ -22799,7 +22810,7 @@
     <w:autoRedefine/>
     <w:uiPriority w:val="39"/>
     <w:unhideWhenUsed/>
-    <w:rsid w:val="00CC5377"/>
+    <w:rsid w:val="00F42D9B"/>
     <w:pPr>
       <w:spacing w:after="100"/>
       <w:ind w:left="240"/>
@@ -22812,7 +22823,7 @@
     <w:autoRedefine/>
     <w:uiPriority w:val="39"/>
     <w:unhideWhenUsed/>
-    <w:rsid w:val="00CC5377"/>
+    <w:rsid w:val="00F42D9B"/>
     <w:pPr>
       <w:spacing w:after="100"/>
       <w:ind w:left="480"/>
@@ -22823,7 +22834,7 @@
     <w:basedOn w:val="a2"/>
     <w:uiPriority w:val="99"/>
     <w:unhideWhenUsed/>
-    <w:rsid w:val="00CC5377"/>
+    <w:rsid w:val="00F42D9B"/>
     <w:rPr>
       <w:color w:val="0000FF" w:themeColor="hyperlink"/>
       <w:u w:val="single"/>

</xml_diff>

<commit_message>
Improvement on UIUX on calculators
</commit_message>
<xml_diff>
--- a/docs/gost/out/01_ТЗ_Техническое_задание.docx
+++ b/docs/gost/out/01_ТЗ_Техническое_задание.docx
@@ -306,7 +306,7 @@
       <w:r>
         <w:fldChar w:fldCharType="separate"/>
       </w:r>
-      <w:hyperlink w:anchor="_Toc242192184" w:history="1">
+      <w:hyperlink w:anchor="_Toc242193866" w:history="1">
         <w:r>
           <w:rPr>
             <w:rStyle w:val="aff8"/>
@@ -333,7 +333,7 @@
             <w:noProof/>
             <w:webHidden/>
           </w:rPr>
-          <w:instrText xml:space="preserve"> PAGEREF _Toc242192184 \h </w:instrText>
+          <w:instrText xml:space="preserve"> PAGEREF _Toc242193866 \h </w:instrText>
         </w:r>
         <w:r>
           <w:rPr>
@@ -379,7 +379,7 @@
           <w14:ligatures w14:val="standardContextual"/>
         </w:rPr>
       </w:pPr>
-      <w:hyperlink w:anchor="_Toc242192185" w:history="1">
+      <w:hyperlink w:anchor="_Toc242193867" w:history="1">
         <w:r>
           <w:rPr>
             <w:rStyle w:val="aff8"/>
@@ -406,7 +406,7 @@
             <w:noProof/>
             <w:webHidden/>
           </w:rPr>
-          <w:instrText xml:space="preserve"> PAGEREF _Toc242192185 \h </w:instrText>
+          <w:instrText xml:space="preserve"> PAGEREF _Toc242193867 \h </w:instrText>
         </w:r>
         <w:r>
           <w:rPr>
@@ -452,7 +452,7 @@
           <w14:ligatures w14:val="standardContextual"/>
         </w:rPr>
       </w:pPr>
-      <w:hyperlink w:anchor="_Toc242192186" w:history="1">
+      <w:hyperlink w:anchor="_Toc242193868" w:history="1">
         <w:r>
           <w:rPr>
             <w:rStyle w:val="aff8"/>
@@ -479,7 +479,7 @@
             <w:noProof/>
             <w:webHidden/>
           </w:rPr>
-          <w:instrText xml:space="preserve"> PAGEREF _Toc242192186 \h </w:instrText>
+          <w:instrText xml:space="preserve"> PAGEREF _Toc242193868 \h </w:instrText>
         </w:r>
         <w:r>
           <w:rPr>
@@ -525,7 +525,7 @@
           <w14:ligatures w14:val="standardContextual"/>
         </w:rPr>
       </w:pPr>
-      <w:hyperlink w:anchor="_Toc242192187" w:history="1">
+      <w:hyperlink w:anchor="_Toc242193869" w:history="1">
         <w:r>
           <w:rPr>
             <w:rStyle w:val="aff8"/>
@@ -552,7 +552,7 @@
             <w:noProof/>
             <w:webHidden/>
           </w:rPr>
-          <w:instrText xml:space="preserve"> PAGEREF _Toc242192187 \h </w:instrText>
+          <w:instrText xml:space="preserve"> PAGEREF _Toc242193869 \h </w:instrText>
         </w:r>
         <w:r>
           <w:rPr>
@@ -598,7 +598,7 @@
           <w14:ligatures w14:val="standardContextual"/>
         </w:rPr>
       </w:pPr>
-      <w:hyperlink w:anchor="_Toc242192188" w:history="1">
+      <w:hyperlink w:anchor="_Toc242193870" w:history="1">
         <w:r>
           <w:rPr>
             <w:rStyle w:val="aff8"/>
@@ -625,7 +625,7 @@
             <w:noProof/>
             <w:webHidden/>
           </w:rPr>
-          <w:instrText xml:space="preserve"> PAGEREF _Toc242192188 \h </w:instrText>
+          <w:instrText xml:space="preserve"> PAGEREF _Toc242193870 \h </w:instrText>
         </w:r>
         <w:r>
           <w:rPr>
@@ -671,7 +671,7 @@
           <w14:ligatures w14:val="standardContextual"/>
         </w:rPr>
       </w:pPr>
-      <w:hyperlink w:anchor="_Toc242192189" w:history="1">
+      <w:hyperlink w:anchor="_Toc242193871" w:history="1">
         <w:r>
           <w:rPr>
             <w:rStyle w:val="aff8"/>
@@ -698,7 +698,7 @@
             <w:noProof/>
             <w:webHidden/>
           </w:rPr>
-          <w:instrText xml:space="preserve"> PAGEREF _Toc242192189 \h </w:instrText>
+          <w:instrText xml:space="preserve"> PAGEREF _Toc242193871 \h </w:instrText>
         </w:r>
         <w:r>
           <w:rPr>
@@ -744,7 +744,7 @@
           <w14:ligatures w14:val="standardContextual"/>
         </w:rPr>
       </w:pPr>
-      <w:hyperlink w:anchor="_Toc242192190" w:history="1">
+      <w:hyperlink w:anchor="_Toc242193872" w:history="1">
         <w:r>
           <w:rPr>
             <w:rStyle w:val="aff8"/>
@@ -771,7 +771,7 @@
             <w:noProof/>
             <w:webHidden/>
           </w:rPr>
-          <w:instrText xml:space="preserve"> PAGEREF _Toc242192190 \h </w:instrText>
+          <w:instrText xml:space="preserve"> PAGEREF _Toc242193872 \h </w:instrText>
         </w:r>
         <w:r>
           <w:rPr>
@@ -817,7 +817,7 @@
           <w14:ligatures w14:val="standardContextual"/>
         </w:rPr>
       </w:pPr>
-      <w:hyperlink w:anchor="_Toc242192191" w:history="1">
+      <w:hyperlink w:anchor="_Toc242193873" w:history="1">
         <w:r>
           <w:rPr>
             <w:rStyle w:val="aff8"/>
@@ -844,7 +844,7 @@
             <w:noProof/>
             <w:webHidden/>
           </w:rPr>
-          <w:instrText xml:space="preserve"> PAGEREF _Toc242192191 \h </w:instrText>
+          <w:instrText xml:space="preserve"> PAGEREF _Toc242193873 \h </w:instrText>
         </w:r>
         <w:r>
           <w:rPr>
@@ -890,7 +890,7 @@
           <w14:ligatures w14:val="standardContextual"/>
         </w:rPr>
       </w:pPr>
-      <w:hyperlink w:anchor="_Toc242192192" w:history="1">
+      <w:hyperlink w:anchor="_Toc242193874" w:history="1">
         <w:r>
           <w:rPr>
             <w:rStyle w:val="aff8"/>
@@ -917,7 +917,7 @@
             <w:noProof/>
             <w:webHidden/>
           </w:rPr>
-          <w:instrText xml:space="preserve"> PAGEREF _Toc242192192 \h </w:instrText>
+          <w:instrText xml:space="preserve"> PAGEREF _Toc242193874 \h </w:instrText>
         </w:r>
         <w:r>
           <w:rPr>
@@ -963,7 +963,7 @@
           <w14:ligatures w14:val="standardContextual"/>
         </w:rPr>
       </w:pPr>
-      <w:hyperlink w:anchor="_Toc242192193" w:history="1">
+      <w:hyperlink w:anchor="_Toc242193875" w:history="1">
         <w:r>
           <w:rPr>
             <w:rStyle w:val="aff8"/>
@@ -990,7 +990,7 @@
             <w:noProof/>
             <w:webHidden/>
           </w:rPr>
-          <w:instrText xml:space="preserve"> PAGEREF _Toc242192193 \h </w:instrText>
+          <w:instrText xml:space="preserve"> PAGEREF _Toc242193875 \h </w:instrText>
         </w:r>
         <w:r>
           <w:rPr>
@@ -1036,7 +1036,7 @@
           <w14:ligatures w14:val="standardContextual"/>
         </w:rPr>
       </w:pPr>
-      <w:hyperlink w:anchor="_Toc242192194" w:history="1">
+      <w:hyperlink w:anchor="_Toc242193876" w:history="1">
         <w:r>
           <w:rPr>
             <w:rStyle w:val="aff8"/>
@@ -1063,7 +1063,7 @@
             <w:noProof/>
             <w:webHidden/>
           </w:rPr>
-          <w:instrText xml:space="preserve"> PAGEREF _Toc242192194 \h </w:instrText>
+          <w:instrText xml:space="preserve"> PAGEREF _Toc242193876 \h </w:instrText>
         </w:r>
         <w:r>
           <w:rPr>
@@ -1109,7 +1109,7 @@
           <w14:ligatures w14:val="standardContextual"/>
         </w:rPr>
       </w:pPr>
-      <w:hyperlink w:anchor="_Toc242192195" w:history="1">
+      <w:hyperlink w:anchor="_Toc242193877" w:history="1">
         <w:r>
           <w:rPr>
             <w:rStyle w:val="aff8"/>
@@ -1136,7 +1136,7 @@
             <w:noProof/>
             <w:webHidden/>
           </w:rPr>
-          <w:instrText xml:space="preserve"> PAGEREF _Toc242192195 \h </w:instrText>
+          <w:instrText xml:space="preserve"> PAGEREF _Toc242193877 \h </w:instrText>
         </w:r>
         <w:r>
           <w:rPr>
@@ -1182,7 +1182,7 @@
           <w14:ligatures w14:val="standardContextual"/>
         </w:rPr>
       </w:pPr>
-      <w:hyperlink w:anchor="_Toc242192196" w:history="1">
+      <w:hyperlink w:anchor="_Toc242193878" w:history="1">
         <w:r>
           <w:rPr>
             <w:rStyle w:val="aff8"/>
@@ -1209,7 +1209,7 @@
             <w:noProof/>
             <w:webHidden/>
           </w:rPr>
-          <w:instrText xml:space="preserve"> PAGEREF _Toc242192196 \h </w:instrText>
+          <w:instrText xml:space="preserve"> PAGEREF _Toc242193878 \h </w:instrText>
         </w:r>
         <w:r>
           <w:rPr>
@@ -1255,7 +1255,7 @@
           <w14:ligatures w14:val="standardContextual"/>
         </w:rPr>
       </w:pPr>
-      <w:hyperlink w:anchor="_Toc242192197" w:history="1">
+      <w:hyperlink w:anchor="_Toc242193879" w:history="1">
         <w:r>
           <w:rPr>
             <w:rStyle w:val="aff8"/>
@@ -1282,7 +1282,7 @@
             <w:noProof/>
             <w:webHidden/>
           </w:rPr>
-          <w:instrText xml:space="preserve"> PAGEREF _Toc242192197 \h </w:instrText>
+          <w:instrText xml:space="preserve"> PAGEREF _Toc242193879 \h </w:instrText>
         </w:r>
         <w:r>
           <w:rPr>
@@ -1328,7 +1328,7 @@
           <w14:ligatures w14:val="standardContextual"/>
         </w:rPr>
       </w:pPr>
-      <w:hyperlink w:anchor="_Toc242192198" w:history="1">
+      <w:hyperlink w:anchor="_Toc242193880" w:history="1">
         <w:r>
           <w:rPr>
             <w:rStyle w:val="aff8"/>
@@ -1355,7 +1355,7 @@
             <w:noProof/>
             <w:webHidden/>
           </w:rPr>
-          <w:instrText xml:space="preserve"> PAGEREF _Toc242192198 \h </w:instrText>
+          <w:instrText xml:space="preserve"> PAGEREF _Toc242193880 \h </w:instrText>
         </w:r>
         <w:r>
           <w:rPr>
@@ -1401,7 +1401,7 @@
           <w14:ligatures w14:val="standardContextual"/>
         </w:rPr>
       </w:pPr>
-      <w:hyperlink w:anchor="_Toc242192199" w:history="1">
+      <w:hyperlink w:anchor="_Toc242193881" w:history="1">
         <w:r>
           <w:rPr>
             <w:rStyle w:val="aff8"/>
@@ -1428,7 +1428,7 @@
             <w:noProof/>
             <w:webHidden/>
           </w:rPr>
-          <w:instrText xml:space="preserve"> PAGEREF _Toc242192199 \h </w:instrText>
+          <w:instrText xml:space="preserve"> PAGEREF _Toc242193881 \h </w:instrText>
         </w:r>
         <w:r>
           <w:rPr>
@@ -1474,7 +1474,7 @@
           <w14:ligatures w14:val="standardContextual"/>
         </w:rPr>
       </w:pPr>
-      <w:hyperlink w:anchor="_Toc242192200" w:history="1">
+      <w:hyperlink w:anchor="_Toc242193882" w:history="1">
         <w:r>
           <w:rPr>
             <w:rStyle w:val="aff8"/>
@@ -1501,7 +1501,7 @@
             <w:noProof/>
             <w:webHidden/>
           </w:rPr>
-          <w:instrText xml:space="preserve"> PAGEREF _Toc242192200 \h </w:instrText>
+          <w:instrText xml:space="preserve"> PAGEREF _Toc242193882 \h </w:instrText>
         </w:r>
         <w:r>
           <w:rPr>
@@ -1547,7 +1547,7 @@
           <w14:ligatures w14:val="standardContextual"/>
         </w:rPr>
       </w:pPr>
-      <w:hyperlink w:anchor="_Toc242192201" w:history="1">
+      <w:hyperlink w:anchor="_Toc242193883" w:history="1">
         <w:r>
           <w:rPr>
             <w:rStyle w:val="aff8"/>
@@ -1574,7 +1574,7 @@
             <w:noProof/>
             <w:webHidden/>
           </w:rPr>
-          <w:instrText xml:space="preserve"> PAGEREF _Toc242192201 \h </w:instrText>
+          <w:instrText xml:space="preserve"> PAGEREF _Toc242193883 \h </w:instrText>
         </w:r>
         <w:r>
           <w:rPr>
@@ -1620,7 +1620,7 @@
           <w14:ligatures w14:val="standardContextual"/>
         </w:rPr>
       </w:pPr>
-      <w:hyperlink w:anchor="_Toc242192202" w:history="1">
+      <w:hyperlink w:anchor="_Toc242193884" w:history="1">
         <w:r>
           <w:rPr>
             <w:rStyle w:val="aff8"/>
@@ -1647,7 +1647,7 @@
             <w:noProof/>
             <w:webHidden/>
           </w:rPr>
-          <w:instrText xml:space="preserve"> PAGEREF _Toc242192202 \h </w:instrText>
+          <w:instrText xml:space="preserve"> PAGEREF _Toc242193884 \h </w:instrText>
         </w:r>
         <w:r>
           <w:rPr>
@@ -1693,7 +1693,7 @@
           <w14:ligatures w14:val="standardContextual"/>
         </w:rPr>
       </w:pPr>
-      <w:hyperlink w:anchor="_Toc242192203" w:history="1">
+      <w:hyperlink w:anchor="_Toc242193885" w:history="1">
         <w:r>
           <w:rPr>
             <w:rStyle w:val="aff8"/>
@@ -1720,7 +1720,7 @@
             <w:noProof/>
             <w:webHidden/>
           </w:rPr>
-          <w:instrText xml:space="preserve"> PAGEREF _Toc242192203 \h </w:instrText>
+          <w:instrText xml:space="preserve"> PAGEREF _Toc242193885 \h </w:instrText>
         </w:r>
         <w:r>
           <w:rPr>
@@ -1766,7 +1766,7 @@
           <w14:ligatures w14:val="standardContextual"/>
         </w:rPr>
       </w:pPr>
-      <w:hyperlink w:anchor="_Toc242192204" w:history="1">
+      <w:hyperlink w:anchor="_Toc242193886" w:history="1">
         <w:r>
           <w:rPr>
             <w:rStyle w:val="aff8"/>
@@ -1793,7 +1793,7 @@
             <w:noProof/>
             <w:webHidden/>
           </w:rPr>
-          <w:instrText xml:space="preserve"> PAGEREF _Toc242192204 \h </w:instrText>
+          <w:instrText xml:space="preserve"> PAGEREF _Toc242193886 \h </w:instrText>
         </w:r>
         <w:r>
           <w:rPr>
@@ -1839,7 +1839,7 @@
           <w14:ligatures w14:val="standardContextual"/>
         </w:rPr>
       </w:pPr>
-      <w:hyperlink w:anchor="_Toc242192205" w:history="1">
+      <w:hyperlink w:anchor="_Toc242193887" w:history="1">
         <w:r>
           <w:rPr>
             <w:rStyle w:val="aff8"/>
@@ -1866,7 +1866,7 @@
             <w:noProof/>
             <w:webHidden/>
           </w:rPr>
-          <w:instrText xml:space="preserve"> PAGEREF _Toc242192205 \h </w:instrText>
+          <w:instrText xml:space="preserve"> PAGEREF _Toc242193887 \h </w:instrText>
         </w:r>
         <w:r>
           <w:rPr>
@@ -1912,7 +1912,7 @@
           <w14:ligatures w14:val="standardContextual"/>
         </w:rPr>
       </w:pPr>
-      <w:hyperlink w:anchor="_Toc242192206" w:history="1">
+      <w:hyperlink w:anchor="_Toc242193888" w:history="1">
         <w:r>
           <w:rPr>
             <w:rStyle w:val="aff8"/>
@@ -1939,7 +1939,7 @@
             <w:noProof/>
             <w:webHidden/>
           </w:rPr>
-          <w:instrText xml:space="preserve"> PAGEREF _Toc242192206 \h </w:instrText>
+          <w:instrText xml:space="preserve"> PAGEREF _Toc242193888 \h </w:instrText>
         </w:r>
         <w:r>
           <w:rPr>
@@ -1985,7 +1985,7 @@
           <w14:ligatures w14:val="standardContextual"/>
         </w:rPr>
       </w:pPr>
-      <w:hyperlink w:anchor="_Toc242192207" w:history="1">
+      <w:hyperlink w:anchor="_Toc242193889" w:history="1">
         <w:r>
           <w:rPr>
             <w:rStyle w:val="aff8"/>
@@ -2012,7 +2012,7 @@
             <w:noProof/>
             <w:webHidden/>
           </w:rPr>
-          <w:instrText xml:space="preserve"> PAGEREF _Toc242192207 \h </w:instrText>
+          <w:instrText xml:space="preserve"> PAGEREF _Toc242193889 \h </w:instrText>
         </w:r>
         <w:r>
           <w:rPr>
@@ -2058,7 +2058,7 @@
           <w14:ligatures w14:val="standardContextual"/>
         </w:rPr>
       </w:pPr>
-      <w:hyperlink w:anchor="_Toc242192208" w:history="1">
+      <w:hyperlink w:anchor="_Toc242193890" w:history="1">
         <w:r>
           <w:rPr>
             <w:rStyle w:val="aff8"/>
@@ -2085,7 +2085,7 @@
             <w:noProof/>
             <w:webHidden/>
           </w:rPr>
-          <w:instrText xml:space="preserve"> PAGEREF _Toc242192208 \h </w:instrText>
+          <w:instrText xml:space="preserve"> PAGEREF _Toc242193890 \h </w:instrText>
         </w:r>
         <w:r>
           <w:rPr>
@@ -2131,7 +2131,7 @@
           <w14:ligatures w14:val="standardContextual"/>
         </w:rPr>
       </w:pPr>
-      <w:hyperlink w:anchor="_Toc242192209" w:history="1">
+      <w:hyperlink w:anchor="_Toc242193891" w:history="1">
         <w:r>
           <w:rPr>
             <w:rStyle w:val="aff8"/>
@@ -2158,7 +2158,7 @@
             <w:noProof/>
             <w:webHidden/>
           </w:rPr>
-          <w:instrText xml:space="preserve"> PAGEREF _Toc242192209 \h </w:instrText>
+          <w:instrText xml:space="preserve"> PAGEREF _Toc242193891 \h </w:instrText>
         </w:r>
         <w:r>
           <w:rPr>
@@ -2204,7 +2204,7 @@
           <w14:ligatures w14:val="standardContextual"/>
         </w:rPr>
       </w:pPr>
-      <w:hyperlink w:anchor="_Toc242192210" w:history="1">
+      <w:hyperlink w:anchor="_Toc242193892" w:history="1">
         <w:r>
           <w:rPr>
             <w:rStyle w:val="aff8"/>
@@ -2231,7 +2231,7 @@
             <w:noProof/>
             <w:webHidden/>
           </w:rPr>
-          <w:instrText xml:space="preserve"> PAGEREF _Toc242192210 \h </w:instrText>
+          <w:instrText xml:space="preserve"> PAGEREF _Toc242193892 \h </w:instrText>
         </w:r>
         <w:r>
           <w:rPr>
@@ -2277,7 +2277,7 @@
           <w14:ligatures w14:val="standardContextual"/>
         </w:rPr>
       </w:pPr>
-      <w:hyperlink w:anchor="_Toc242192211" w:history="1">
+      <w:hyperlink w:anchor="_Toc242193893" w:history="1">
         <w:r>
           <w:rPr>
             <w:rStyle w:val="aff8"/>
@@ -2304,7 +2304,7 @@
             <w:noProof/>
             <w:webHidden/>
           </w:rPr>
-          <w:instrText xml:space="preserve"> PAGEREF _Toc242192211 \h </w:instrText>
+          <w:instrText xml:space="preserve"> PAGEREF _Toc242193893 \h </w:instrText>
         </w:r>
         <w:r>
           <w:rPr>
@@ -2350,7 +2350,7 @@
           <w14:ligatures w14:val="standardContextual"/>
         </w:rPr>
       </w:pPr>
-      <w:hyperlink w:anchor="_Toc242192212" w:history="1">
+      <w:hyperlink w:anchor="_Toc242193894" w:history="1">
         <w:r>
           <w:rPr>
             <w:rStyle w:val="aff8"/>
@@ -2377,7 +2377,7 @@
             <w:noProof/>
             <w:webHidden/>
           </w:rPr>
-          <w:instrText xml:space="preserve"> PAGEREF _Toc242192212 \h </w:instrText>
+          <w:instrText xml:space="preserve"> PAGEREF _Toc242193894 \h </w:instrText>
         </w:r>
         <w:r>
           <w:rPr>
@@ -2423,7 +2423,7 @@
           <w14:ligatures w14:val="standardContextual"/>
         </w:rPr>
       </w:pPr>
-      <w:hyperlink w:anchor="_Toc242192213" w:history="1">
+      <w:hyperlink w:anchor="_Toc242193895" w:history="1">
         <w:r>
           <w:rPr>
             <w:rStyle w:val="aff8"/>
@@ -2450,7 +2450,7 @@
             <w:noProof/>
             <w:webHidden/>
           </w:rPr>
-          <w:instrText xml:space="preserve"> PAGEREF _Toc242192213 \h </w:instrText>
+          <w:instrText xml:space="preserve"> PAGEREF _Toc242193895 \h </w:instrText>
         </w:r>
         <w:r>
           <w:rPr>
@@ -2496,7 +2496,7 @@
           <w14:ligatures w14:val="standardContextual"/>
         </w:rPr>
       </w:pPr>
-      <w:hyperlink w:anchor="_Toc242192214" w:history="1">
+      <w:hyperlink w:anchor="_Toc242193896" w:history="1">
         <w:r>
           <w:rPr>
             <w:rStyle w:val="aff8"/>
@@ -2523,7 +2523,7 @@
             <w:noProof/>
             <w:webHidden/>
           </w:rPr>
-          <w:instrText xml:space="preserve"> PAGEREF _Toc242192214 \h </w:instrText>
+          <w:instrText xml:space="preserve"> PAGEREF _Toc242193896 \h </w:instrText>
         </w:r>
         <w:r>
           <w:rPr>
@@ -2569,7 +2569,7 @@
           <w14:ligatures w14:val="standardContextual"/>
         </w:rPr>
       </w:pPr>
-      <w:hyperlink w:anchor="_Toc242192215" w:history="1">
+      <w:hyperlink w:anchor="_Toc242193897" w:history="1">
         <w:r>
           <w:rPr>
             <w:rStyle w:val="aff8"/>
@@ -2596,7 +2596,7 @@
             <w:noProof/>
             <w:webHidden/>
           </w:rPr>
-          <w:instrText xml:space="preserve"> PAGEREF _Toc242192215 \h </w:instrText>
+          <w:instrText xml:space="preserve"> PAGEREF _Toc242193897 \h </w:instrText>
         </w:r>
         <w:r>
           <w:rPr>
@@ -2642,7 +2642,7 @@
           <w14:ligatures w14:val="standardContextual"/>
         </w:rPr>
       </w:pPr>
-      <w:hyperlink w:anchor="_Toc242192216" w:history="1">
+      <w:hyperlink w:anchor="_Toc242193898" w:history="1">
         <w:r>
           <w:rPr>
             <w:rStyle w:val="aff8"/>
@@ -2669,7 +2669,7 @@
             <w:noProof/>
             <w:webHidden/>
           </w:rPr>
-          <w:instrText xml:space="preserve"> PAGEREF _Toc242192216 \h </w:instrText>
+          <w:instrText xml:space="preserve"> PAGEREF _Toc242193898 \h </w:instrText>
         </w:r>
         <w:r>
           <w:rPr>
@@ -2715,7 +2715,7 @@
           <w14:ligatures w14:val="standardContextual"/>
         </w:rPr>
       </w:pPr>
-      <w:hyperlink w:anchor="_Toc242192217" w:history="1">
+      <w:hyperlink w:anchor="_Toc242193899" w:history="1">
         <w:r>
           <w:rPr>
             <w:rStyle w:val="aff8"/>
@@ -2742,7 +2742,7 @@
             <w:noProof/>
             <w:webHidden/>
           </w:rPr>
-          <w:instrText xml:space="preserve"> PAGEREF _Toc242192217 \h </w:instrText>
+          <w:instrText xml:space="preserve"> PAGEREF _Toc242193899 \h </w:instrText>
         </w:r>
         <w:r>
           <w:rPr>
@@ -2788,7 +2788,7 @@
           <w14:ligatures w14:val="standardContextual"/>
         </w:rPr>
       </w:pPr>
-      <w:hyperlink w:anchor="_Toc242192218" w:history="1">
+      <w:hyperlink w:anchor="_Toc242193900" w:history="1">
         <w:r>
           <w:rPr>
             <w:rStyle w:val="aff8"/>
@@ -2815,7 +2815,7 @@
             <w:noProof/>
             <w:webHidden/>
           </w:rPr>
-          <w:instrText xml:space="preserve"> PAGEREF _Toc242192218 \h </w:instrText>
+          <w:instrText xml:space="preserve"> PAGEREF _Toc242193900 \h </w:instrText>
         </w:r>
         <w:r>
           <w:rPr>
@@ -2861,7 +2861,7 @@
           <w14:ligatures w14:val="standardContextual"/>
         </w:rPr>
       </w:pPr>
-      <w:hyperlink w:anchor="_Toc242192219" w:history="1">
+      <w:hyperlink w:anchor="_Toc242193901" w:history="1">
         <w:r>
           <w:rPr>
             <w:rStyle w:val="aff8"/>
@@ -2888,7 +2888,7 @@
             <w:noProof/>
             <w:webHidden/>
           </w:rPr>
-          <w:instrText xml:space="preserve"> PAGEREF _Toc242192219 \h </w:instrText>
+          <w:instrText xml:space="preserve"> PAGEREF _Toc242193901 \h </w:instrText>
         </w:r>
         <w:r>
           <w:rPr>
@@ -2934,7 +2934,7 @@
           <w14:ligatures w14:val="standardContextual"/>
         </w:rPr>
       </w:pPr>
-      <w:hyperlink w:anchor="_Toc242192220" w:history="1">
+      <w:hyperlink w:anchor="_Toc242193902" w:history="1">
         <w:r>
           <w:rPr>
             <w:rStyle w:val="aff8"/>
@@ -2961,7 +2961,7 @@
             <w:noProof/>
             <w:webHidden/>
           </w:rPr>
-          <w:instrText xml:space="preserve"> PAGEREF _Toc242192220 \h </w:instrText>
+          <w:instrText xml:space="preserve"> PAGEREF _Toc242193902 \h </w:instrText>
         </w:r>
         <w:r>
           <w:rPr>
@@ -3007,7 +3007,7 @@
           <w14:ligatures w14:val="standardContextual"/>
         </w:rPr>
       </w:pPr>
-      <w:hyperlink w:anchor="_Toc242192221" w:history="1">
+      <w:hyperlink w:anchor="_Toc242193903" w:history="1">
         <w:r>
           <w:rPr>
             <w:rStyle w:val="aff8"/>
@@ -3034,7 +3034,7 @@
             <w:noProof/>
             <w:webHidden/>
           </w:rPr>
-          <w:instrText xml:space="preserve"> PAGEREF _Toc242192221 \h </w:instrText>
+          <w:instrText xml:space="preserve"> PAGEREF _Toc242193903 \h </w:instrText>
         </w:r>
         <w:r>
           <w:rPr>
@@ -3080,7 +3080,7 @@
           <w14:ligatures w14:val="standardContextual"/>
         </w:rPr>
       </w:pPr>
-      <w:hyperlink w:anchor="_Toc242192222" w:history="1">
+      <w:hyperlink w:anchor="_Toc242193904" w:history="1">
         <w:r>
           <w:rPr>
             <w:rStyle w:val="aff8"/>
@@ -3107,7 +3107,7 @@
             <w:noProof/>
             <w:webHidden/>
           </w:rPr>
-          <w:instrText xml:space="preserve"> PAGEREF _Toc242192222 \h </w:instrText>
+          <w:instrText xml:space="preserve"> PAGEREF _Toc242193904 \h </w:instrText>
         </w:r>
         <w:r>
           <w:rPr>
@@ -3153,7 +3153,7 @@
           <w14:ligatures w14:val="standardContextual"/>
         </w:rPr>
       </w:pPr>
-      <w:hyperlink w:anchor="_Toc242192223" w:history="1">
+      <w:hyperlink w:anchor="_Toc242193905" w:history="1">
         <w:r>
           <w:rPr>
             <w:rStyle w:val="aff8"/>
@@ -3180,7 +3180,7 @@
             <w:noProof/>
             <w:webHidden/>
           </w:rPr>
-          <w:instrText xml:space="preserve"> PAGEREF _Toc242192223 \h </w:instrText>
+          <w:instrText xml:space="preserve"> PAGEREF _Toc242193905 \h </w:instrText>
         </w:r>
         <w:r>
           <w:rPr>
@@ -3226,7 +3226,7 @@
           <w14:ligatures w14:val="standardContextual"/>
         </w:rPr>
       </w:pPr>
-      <w:hyperlink w:anchor="_Toc242192224" w:history="1">
+      <w:hyperlink w:anchor="_Toc242193906" w:history="1">
         <w:r>
           <w:rPr>
             <w:rStyle w:val="aff8"/>
@@ -3253,7 +3253,7 @@
             <w:noProof/>
             <w:webHidden/>
           </w:rPr>
-          <w:instrText xml:space="preserve"> PAGEREF _Toc242192224 \h </w:instrText>
+          <w:instrText xml:space="preserve"> PAGEREF _Toc242193906 \h </w:instrText>
         </w:r>
         <w:r>
           <w:rPr>
@@ -3299,7 +3299,7 @@
           <w14:ligatures w14:val="standardContextual"/>
         </w:rPr>
       </w:pPr>
-      <w:hyperlink w:anchor="_Toc242192225" w:history="1">
+      <w:hyperlink w:anchor="_Toc242193907" w:history="1">
         <w:r>
           <w:rPr>
             <w:rStyle w:val="aff8"/>
@@ -3326,7 +3326,7 @@
             <w:noProof/>
             <w:webHidden/>
           </w:rPr>
-          <w:instrText xml:space="preserve"> PAGEREF _Toc242192225 \h </w:instrText>
+          <w:instrText xml:space="preserve"> PAGEREF _Toc242193907 \h </w:instrText>
         </w:r>
         <w:r>
           <w:rPr>
@@ -3372,7 +3372,7 @@
           <w14:ligatures w14:val="standardContextual"/>
         </w:rPr>
       </w:pPr>
-      <w:hyperlink w:anchor="_Toc242192226" w:history="1">
+      <w:hyperlink w:anchor="_Toc242193908" w:history="1">
         <w:r>
           <w:rPr>
             <w:rStyle w:val="aff8"/>
@@ -3399,7 +3399,7 @@
             <w:noProof/>
             <w:webHidden/>
           </w:rPr>
-          <w:instrText xml:space="preserve"> PAGEREF _Toc242192226 \h </w:instrText>
+          <w:instrText xml:space="preserve"> PAGEREF _Toc242193908 \h </w:instrText>
         </w:r>
         <w:r>
           <w:rPr>
@@ -3445,7 +3445,7 @@
           <w14:ligatures w14:val="standardContextual"/>
         </w:rPr>
       </w:pPr>
-      <w:hyperlink w:anchor="_Toc242192227" w:history="1">
+      <w:hyperlink w:anchor="_Toc242193909" w:history="1">
         <w:r>
           <w:rPr>
             <w:rStyle w:val="aff8"/>
@@ -3472,7 +3472,7 @@
             <w:noProof/>
             <w:webHidden/>
           </w:rPr>
-          <w:instrText xml:space="preserve"> PAGEREF _Toc242192227 \h </w:instrText>
+          <w:instrText xml:space="preserve"> PAGEREF _Toc242193909 \h </w:instrText>
         </w:r>
         <w:r>
           <w:rPr>
@@ -3518,7 +3518,7 @@
           <w14:ligatures w14:val="standardContextual"/>
         </w:rPr>
       </w:pPr>
-      <w:hyperlink w:anchor="_Toc242192228" w:history="1">
+      <w:hyperlink w:anchor="_Toc242193910" w:history="1">
         <w:r>
           <w:rPr>
             <w:rStyle w:val="aff8"/>
@@ -3545,7 +3545,7 @@
             <w:noProof/>
             <w:webHidden/>
           </w:rPr>
-          <w:instrText xml:space="preserve"> PAGEREF _Toc242192228 \h </w:instrText>
+          <w:instrText xml:space="preserve"> PAGEREF _Toc242193910 \h </w:instrText>
         </w:r>
         <w:r>
           <w:rPr>
@@ -3591,7 +3591,7 @@
           <w14:ligatures w14:val="standardContextual"/>
         </w:rPr>
       </w:pPr>
-      <w:hyperlink w:anchor="_Toc242192229" w:history="1">
+      <w:hyperlink w:anchor="_Toc242193911" w:history="1">
         <w:r>
           <w:rPr>
             <w:rStyle w:val="aff8"/>
@@ -3618,7 +3618,7 @@
             <w:noProof/>
             <w:webHidden/>
           </w:rPr>
-          <w:instrText xml:space="preserve"> PAGEREF _Toc242192229 \h </w:instrText>
+          <w:instrText xml:space="preserve"> PAGEREF _Toc242193911 \h </w:instrText>
         </w:r>
         <w:r>
           <w:rPr>
@@ -3664,7 +3664,7 @@
           <w14:ligatures w14:val="standardContextual"/>
         </w:rPr>
       </w:pPr>
-      <w:hyperlink w:anchor="_Toc242192230" w:history="1">
+      <w:hyperlink w:anchor="_Toc242193912" w:history="1">
         <w:r>
           <w:rPr>
             <w:rStyle w:val="aff8"/>
@@ -3691,7 +3691,7 @@
             <w:noProof/>
             <w:webHidden/>
           </w:rPr>
-          <w:instrText xml:space="preserve"> PAGEREF _Toc242192230 \h </w:instrText>
+          <w:instrText xml:space="preserve"> PAGEREF _Toc242193912 \h </w:instrText>
         </w:r>
         <w:r>
           <w:rPr>
@@ -3737,7 +3737,7 @@
           <w14:ligatures w14:val="standardContextual"/>
         </w:rPr>
       </w:pPr>
-      <w:hyperlink w:anchor="_Toc242192231" w:history="1">
+      <w:hyperlink w:anchor="_Toc242193913" w:history="1">
         <w:r>
           <w:rPr>
             <w:rStyle w:val="aff8"/>
@@ -3764,7 +3764,7 @@
             <w:noProof/>
             <w:webHidden/>
           </w:rPr>
-          <w:instrText xml:space="preserve"> PAGEREF _Toc242192231 \h </w:instrText>
+          <w:instrText xml:space="preserve"> PAGEREF _Toc242193913 \h </w:instrText>
         </w:r>
         <w:r>
           <w:rPr>
@@ -3810,7 +3810,7 @@
           <w14:ligatures w14:val="standardContextual"/>
         </w:rPr>
       </w:pPr>
-      <w:hyperlink w:anchor="_Toc242192232" w:history="1">
+      <w:hyperlink w:anchor="_Toc242193914" w:history="1">
         <w:r>
           <w:rPr>
             <w:rStyle w:val="aff8"/>
@@ -3837,7 +3837,7 @@
             <w:noProof/>
             <w:webHidden/>
           </w:rPr>
-          <w:instrText xml:space="preserve"> PAGEREF _Toc242192232 \h </w:instrText>
+          <w:instrText xml:space="preserve"> PAGEREF _Toc242193914 \h </w:instrText>
         </w:r>
         <w:r>
           <w:rPr>
@@ -3883,7 +3883,7 @@
           <w14:ligatures w14:val="standardContextual"/>
         </w:rPr>
       </w:pPr>
-      <w:hyperlink w:anchor="_Toc242192233" w:history="1">
+      <w:hyperlink w:anchor="_Toc242193915" w:history="1">
         <w:r>
           <w:rPr>
             <w:rStyle w:val="aff8"/>
@@ -3910,7 +3910,7 @@
             <w:noProof/>
             <w:webHidden/>
           </w:rPr>
-          <w:instrText xml:space="preserve"> PAGEREF _Toc242192233 \h </w:instrText>
+          <w:instrText xml:space="preserve"> PAGEREF _Toc242193915 \h </w:instrText>
         </w:r>
         <w:r>
           <w:rPr>
@@ -3956,7 +3956,7 @@
           <w14:ligatures w14:val="standardContextual"/>
         </w:rPr>
       </w:pPr>
-      <w:hyperlink w:anchor="_Toc242192234" w:history="1">
+      <w:hyperlink w:anchor="_Toc242193916" w:history="1">
         <w:r>
           <w:rPr>
             <w:rStyle w:val="aff8"/>
@@ -3983,7 +3983,7 @@
             <w:noProof/>
             <w:webHidden/>
           </w:rPr>
-          <w:instrText xml:space="preserve"> PAGEREF _Toc242192234 \h </w:instrText>
+          <w:instrText xml:space="preserve"> PAGEREF _Toc242193916 \h </w:instrText>
         </w:r>
         <w:r>
           <w:rPr>
@@ -4029,7 +4029,7 @@
           <w14:ligatures w14:val="standardContextual"/>
         </w:rPr>
       </w:pPr>
-      <w:hyperlink w:anchor="_Toc242192235" w:history="1">
+      <w:hyperlink w:anchor="_Toc242193917" w:history="1">
         <w:r>
           <w:rPr>
             <w:rStyle w:val="aff8"/>
@@ -4056,7 +4056,7 @@
             <w:noProof/>
             <w:webHidden/>
           </w:rPr>
-          <w:instrText xml:space="preserve"> PAGEREF _Toc242192235 \h </w:instrText>
+          <w:instrText xml:space="preserve"> PAGEREF _Toc242193917 \h </w:instrText>
         </w:r>
         <w:r>
           <w:rPr>
@@ -4102,7 +4102,7 @@
           <w14:ligatures w14:val="standardContextual"/>
         </w:rPr>
       </w:pPr>
-      <w:hyperlink w:anchor="_Toc242192236" w:history="1">
+      <w:hyperlink w:anchor="_Toc242193918" w:history="1">
         <w:r>
           <w:rPr>
             <w:rStyle w:val="aff8"/>
@@ -4129,7 +4129,7 @@
             <w:noProof/>
             <w:webHidden/>
           </w:rPr>
-          <w:instrText xml:space="preserve"> PAGEREF _Toc242192236 \h </w:instrText>
+          <w:instrText xml:space="preserve"> PAGEREF _Toc242193918 \h </w:instrText>
         </w:r>
         <w:r>
           <w:rPr>
@@ -4175,7 +4175,7 @@
           <w14:ligatures w14:val="standardContextual"/>
         </w:rPr>
       </w:pPr>
-      <w:hyperlink w:anchor="_Toc242192237" w:history="1">
+      <w:hyperlink w:anchor="_Toc242193919" w:history="1">
         <w:r>
           <w:rPr>
             <w:rStyle w:val="aff8"/>
@@ -4202,7 +4202,7 @@
             <w:noProof/>
             <w:webHidden/>
           </w:rPr>
-          <w:instrText xml:space="preserve"> PAGEREF _Toc242192237 \h </w:instrText>
+          <w:instrText xml:space="preserve"> PAGEREF _Toc242193919 \h </w:instrText>
         </w:r>
         <w:r>
           <w:rPr>
@@ -4248,7 +4248,7 @@
           <w14:ligatures w14:val="standardContextual"/>
         </w:rPr>
       </w:pPr>
-      <w:hyperlink w:anchor="_Toc242192238" w:history="1">
+      <w:hyperlink w:anchor="_Toc242193920" w:history="1">
         <w:r>
           <w:rPr>
             <w:rStyle w:val="aff8"/>
@@ -4275,7 +4275,7 @@
             <w:noProof/>
             <w:webHidden/>
           </w:rPr>
-          <w:instrText xml:space="preserve"> PAGEREF _Toc242192238 \h </w:instrText>
+          <w:instrText xml:space="preserve"> PAGEREF _Toc242193920 \h </w:instrText>
         </w:r>
         <w:r>
           <w:rPr>
@@ -4321,7 +4321,7 @@
           <w14:ligatures w14:val="standardContextual"/>
         </w:rPr>
       </w:pPr>
-      <w:hyperlink w:anchor="_Toc242192239" w:history="1">
+      <w:hyperlink w:anchor="_Toc242193921" w:history="1">
         <w:r>
           <w:rPr>
             <w:rStyle w:val="aff8"/>
@@ -4348,7 +4348,7 @@
             <w:noProof/>
             <w:webHidden/>
           </w:rPr>
-          <w:instrText xml:space="preserve"> PAGEREF _Toc242192239 \h </w:instrText>
+          <w:instrText xml:space="preserve"> PAGEREF _Toc242193921 \h </w:instrText>
         </w:r>
         <w:r>
           <w:rPr>
@@ -4394,7 +4394,7 @@
           <w14:ligatures w14:val="standardContextual"/>
         </w:rPr>
       </w:pPr>
-      <w:hyperlink w:anchor="_Toc242192240" w:history="1">
+      <w:hyperlink w:anchor="_Toc242193922" w:history="1">
         <w:r>
           <w:rPr>
             <w:rStyle w:val="aff8"/>
@@ -4421,7 +4421,7 @@
             <w:noProof/>
             <w:webHidden/>
           </w:rPr>
-          <w:instrText xml:space="preserve"> PAGEREF _Toc242192240 \h </w:instrText>
+          <w:instrText xml:space="preserve"> PAGEREF _Toc242193922 \h </w:instrText>
         </w:r>
         <w:r>
           <w:rPr>
@@ -4467,7 +4467,7 @@
           <w14:ligatures w14:val="standardContextual"/>
         </w:rPr>
       </w:pPr>
-      <w:hyperlink w:anchor="_Toc242192241" w:history="1">
+      <w:hyperlink w:anchor="_Toc242193923" w:history="1">
         <w:r>
           <w:rPr>
             <w:rStyle w:val="aff8"/>
@@ -4494,7 +4494,7 @@
             <w:noProof/>
             <w:webHidden/>
           </w:rPr>
-          <w:instrText xml:space="preserve"> PAGEREF _Toc242192241 \h </w:instrText>
+          <w:instrText xml:space="preserve"> PAGEREF _Toc242193923 \h </w:instrText>
         </w:r>
         <w:r>
           <w:rPr>
@@ -4540,7 +4540,7 @@
         <w:ind w:firstLine="0"/>
         <w:jc w:val="center"/>
       </w:pPr>
-      <w:bookmarkStart w:id="0" w:name="_Toc242192184"/>
+      <w:bookmarkStart w:id="0" w:name="_Toc242193866"/>
       <w:r>
         <w:lastRenderedPageBreak/>
         <w:t>ПЕРЕЧЕНЬ ТЕРМИНОВ И СОКРАЩЕНИЙ</w:t>
@@ -5802,7 +5802,7 @@
         <w:pStyle w:val="1"/>
         <w:pageBreakBefore/>
       </w:pPr>
-      <w:bookmarkStart w:id="1" w:name="_Toc242192185"/>
+      <w:bookmarkStart w:id="1" w:name="_Toc242193867"/>
       <w:r>
         <w:lastRenderedPageBreak/>
         <w:t>1 Общие сведения</w:t>
@@ -5813,7 +5813,7 @@
       <w:pPr>
         <w:pStyle w:val="21"/>
       </w:pPr>
-      <w:bookmarkStart w:id="2" w:name="_Toc242192186"/>
+      <w:bookmarkStart w:id="2" w:name="_Toc242193868"/>
       <w:r>
         <w:t>1.1 Полное наименование системы и её условное обозначение</w:t>
       </w:r>
@@ -5833,7 +5833,7 @@
       <w:pPr>
         <w:pStyle w:val="21"/>
       </w:pPr>
-      <w:bookmarkStart w:id="3" w:name="_Toc242192187"/>
+      <w:bookmarkStart w:id="3" w:name="_Toc242193869"/>
       <w:r>
         <w:t>1.2 Шифр темы и номер договора</w:t>
       </w:r>
@@ -5848,7 +5848,7 @@
       <w:pPr>
         <w:pStyle w:val="21"/>
       </w:pPr>
-      <w:bookmarkStart w:id="4" w:name="_Toc242192188"/>
+      <w:bookmarkStart w:id="4" w:name="_Toc242193870"/>
       <w:r>
         <w:t>1.3 Наименования организаций заказчика и разработчика</w:t>
       </w:r>
@@ -5868,7 +5868,7 @@
       <w:pPr>
         <w:pStyle w:val="21"/>
       </w:pPr>
-      <w:bookmarkStart w:id="5" w:name="_Toc242192189"/>
+      <w:bookmarkStart w:id="5" w:name="_Toc242193871"/>
       <w:r>
         <w:t>1.4 Основания для создания системы</w:t>
       </w:r>
@@ -5893,7 +5893,7 @@
       <w:pPr>
         <w:pStyle w:val="21"/>
       </w:pPr>
-      <w:bookmarkStart w:id="6" w:name="_Toc242192190"/>
+      <w:bookmarkStart w:id="6" w:name="_Toc242193872"/>
       <w:r>
         <w:t>1.5 Плановые сроки начала и окончания работ</w:t>
       </w:r>
@@ -5908,7 +5908,7 @@
       <w:pPr>
         <w:pStyle w:val="21"/>
       </w:pPr>
-      <w:bookmarkStart w:id="7" w:name="_Toc242192191"/>
+      <w:bookmarkStart w:id="7" w:name="_Toc242193873"/>
       <w:r>
         <w:t>1.6 Сведения об источниках и порядке финансирования</w:t>
       </w:r>
@@ -5923,7 +5923,7 @@
       <w:pPr>
         <w:pStyle w:val="21"/>
       </w:pPr>
-      <w:bookmarkStart w:id="8" w:name="_Toc242192192"/>
+      <w:bookmarkStart w:id="8" w:name="_Toc242193874"/>
       <w:r>
         <w:lastRenderedPageBreak/>
         <w:t>1.7 Порядок оформления и предъявления результатов работ</w:t>
@@ -5939,7 +5939,7 @@
       <w:pPr>
         <w:pStyle w:val="21"/>
       </w:pPr>
-      <w:bookmarkStart w:id="9" w:name="_Toc242192193"/>
+      <w:bookmarkStart w:id="9" w:name="_Toc242193875"/>
       <w:r>
         <w:t>1.8 Перечень нормативно-технических документов</w:t>
       </w:r>
@@ -6003,7 +6003,7 @@
         <w:pStyle w:val="1"/>
         <w:pageBreakBefore/>
       </w:pPr>
-      <w:bookmarkStart w:id="10" w:name="_Toc242192194"/>
+      <w:bookmarkStart w:id="10" w:name="_Toc242193876"/>
       <w:r>
         <w:lastRenderedPageBreak/>
         <w:t>2 Цели и назначение создания автоматизированной системы</w:t>
@@ -6014,7 +6014,7 @@
       <w:pPr>
         <w:pStyle w:val="21"/>
       </w:pPr>
-      <w:bookmarkStart w:id="11" w:name="_Toc242192195"/>
+      <w:bookmarkStart w:id="11" w:name="_Toc242193877"/>
       <w:r>
         <w:t>2.1 Назначение системы</w:t>
       </w:r>
@@ -6074,7 +6074,7 @@
       <w:pPr>
         <w:pStyle w:val="21"/>
       </w:pPr>
-      <w:bookmarkStart w:id="12" w:name="_Toc242192196"/>
+      <w:bookmarkStart w:id="12" w:name="_Toc242193878"/>
       <w:r>
         <w:t>2.2 Цели создания системы</w:t>
       </w:r>
@@ -6120,7 +6120,7 @@
         <w:pStyle w:val="1"/>
         <w:pageBreakBefore/>
       </w:pPr>
-      <w:bookmarkStart w:id="13" w:name="_Toc242192197"/>
+      <w:bookmarkStart w:id="13" w:name="_Toc242193879"/>
       <w:r>
         <w:lastRenderedPageBreak/>
         <w:t>3 Характеристика объекта автоматизации</w:t>
@@ -6131,7 +6131,7 @@
       <w:pPr>
         <w:pStyle w:val="21"/>
       </w:pPr>
-      <w:bookmarkStart w:id="14" w:name="_Toc242192198"/>
+      <w:bookmarkStart w:id="14" w:name="_Toc242193880"/>
       <w:r>
         <w:t>3.1 Краткие сведения об объекте автоматизации</w:t>
       </w:r>
@@ -6221,7 +6221,7 @@
       <w:pPr>
         <w:pStyle w:val="21"/>
       </w:pPr>
-      <w:bookmarkStart w:id="15" w:name="_Toc242192199"/>
+      <w:bookmarkStart w:id="15" w:name="_Toc242193881"/>
       <w:r>
         <w:t>3.2 Сведения об условиях эксплуатации</w:t>
       </w:r>
@@ -6237,7 +6237,7 @@
         <w:pStyle w:val="1"/>
         <w:pageBreakBefore/>
       </w:pPr>
-      <w:bookmarkStart w:id="16" w:name="_Toc242192200"/>
+      <w:bookmarkStart w:id="16" w:name="_Toc242193882"/>
       <w:r>
         <w:lastRenderedPageBreak/>
         <w:t>4 Требования к автоматизированной системе</w:t>
@@ -6248,7 +6248,7 @@
       <w:pPr>
         <w:pStyle w:val="21"/>
       </w:pPr>
-      <w:bookmarkStart w:id="17" w:name="_Toc242192201"/>
+      <w:bookmarkStart w:id="17" w:name="_Toc242193883"/>
       <w:r>
         <w:t>4.1 Требования к системе в целом</w:t>
       </w:r>
@@ -6258,7 +6258,7 @@
       <w:pPr>
         <w:pStyle w:val="31"/>
       </w:pPr>
-      <w:bookmarkStart w:id="18" w:name="_Toc242192202"/>
+      <w:bookmarkStart w:id="18" w:name="_Toc242193884"/>
       <w:r>
         <w:t>4.1.1 Требования к структуре и функционированию системы</w:t>
       </w:r>
@@ -6904,7 +6904,7 @@
       <w:pPr>
         <w:pStyle w:val="31"/>
       </w:pPr>
-      <w:bookmarkStart w:id="19" w:name="_Toc242192203"/>
+      <w:bookmarkStart w:id="19" w:name="_Toc242193885"/>
       <w:r>
         <w:t>4.1.2 Требования к численности и квалификации персонала</w:t>
       </w:r>
@@ -7185,7 +7185,7 @@
       <w:pPr>
         <w:pStyle w:val="31"/>
       </w:pPr>
-      <w:bookmarkStart w:id="20" w:name="_Toc242192204"/>
+      <w:bookmarkStart w:id="20" w:name="_Toc242193886"/>
       <w:r>
         <w:t>4.1.3 Показатели назначения</w:t>
       </w:r>
@@ -7233,7 +7233,7 @@
       <w:pPr>
         <w:pStyle w:val="31"/>
       </w:pPr>
-      <w:bookmarkStart w:id="21" w:name="_Toc242192205"/>
+      <w:bookmarkStart w:id="21" w:name="_Toc242193887"/>
       <w:r>
         <w:t>4.1.4 Требования к надёжности</w:t>
       </w:r>
@@ -7267,7 +7267,7 @@
       <w:pPr>
         <w:pStyle w:val="31"/>
       </w:pPr>
-      <w:bookmarkStart w:id="22" w:name="_Toc242192206"/>
+      <w:bookmarkStart w:id="22" w:name="_Toc242193888"/>
       <w:r>
         <w:t>4.1.5 Требования к безопасности</w:t>
       </w:r>
@@ -7282,7 +7282,7 @@
       <w:pPr>
         <w:pStyle w:val="31"/>
       </w:pPr>
-      <w:bookmarkStart w:id="23" w:name="_Toc242192207"/>
+      <w:bookmarkStart w:id="23" w:name="_Toc242193889"/>
       <w:r>
         <w:t>4.1.6 Требования к эргономике и технической эстетике</w:t>
       </w:r>
@@ -7327,7 +7327,7 @@
       <w:pPr>
         <w:pStyle w:val="31"/>
       </w:pPr>
-      <w:bookmarkStart w:id="24" w:name="_Toc242192208"/>
+      <w:bookmarkStart w:id="24" w:name="_Toc242193890"/>
       <w:r>
         <w:t>4.1.7 Требования к эксплуатации и техническому обслуживанию</w:t>
       </w:r>
@@ -7357,7 +7357,7 @@
       <w:pPr>
         <w:pStyle w:val="31"/>
       </w:pPr>
-      <w:bookmarkStart w:id="25" w:name="_Toc242192209"/>
+      <w:bookmarkStart w:id="25" w:name="_Toc242193891"/>
       <w:r>
         <w:t>4.1.8 Требования к защите информации от несанкционированного доступа</w:t>
       </w:r>
@@ -7428,7 +7428,7 @@
       <w:pPr>
         <w:pStyle w:val="31"/>
       </w:pPr>
-      <w:bookmarkStart w:id="26" w:name="_Toc242192210"/>
+      <w:bookmarkStart w:id="26" w:name="_Toc242193892"/>
       <w:r>
         <w:t>4.1.9 Требования по сохранности информации при авариях</w:t>
       </w:r>
@@ -7449,7 +7449,7 @@
       <w:pPr>
         <w:pStyle w:val="31"/>
       </w:pPr>
-      <w:bookmarkStart w:id="27" w:name="_Toc242192211"/>
+      <w:bookmarkStart w:id="27" w:name="_Toc242193893"/>
       <w:r>
         <w:t>4.1.10 Требования к защите от влияния внешних воздействий</w:t>
       </w:r>
@@ -7464,7 +7464,7 @@
       <w:pPr>
         <w:pStyle w:val="31"/>
       </w:pPr>
-      <w:bookmarkStart w:id="28" w:name="_Toc242192212"/>
+      <w:bookmarkStart w:id="28" w:name="_Toc242193894"/>
       <w:r>
         <w:t>4.1.11 Требования к патентной чистоте</w:t>
       </w:r>
@@ -7482,7 +7482,7 @@
       <w:pPr>
         <w:pStyle w:val="31"/>
       </w:pPr>
-      <w:bookmarkStart w:id="29" w:name="_Toc242192213"/>
+      <w:bookmarkStart w:id="29" w:name="_Toc242193895"/>
       <w:r>
         <w:t>4.1.12 Требования по стандартизации и унификации</w:t>
       </w:r>
@@ -7497,7 +7497,7 @@
       <w:pPr>
         <w:pStyle w:val="31"/>
       </w:pPr>
-      <w:bookmarkStart w:id="30" w:name="_Toc242192214"/>
+      <w:bookmarkStart w:id="30" w:name="_Toc242193896"/>
       <w:r>
         <w:t>4.1.13 Дополнительные требования</w:t>
       </w:r>
@@ -7517,7 +7517,7 @@
       <w:pPr>
         <w:pStyle w:val="21"/>
       </w:pPr>
-      <w:bookmarkStart w:id="31" w:name="_Toc242192215"/>
+      <w:bookmarkStart w:id="31" w:name="_Toc242193897"/>
       <w:r>
         <w:lastRenderedPageBreak/>
         <w:t>4.2 Требования к функциям, выполняемым системой</w:t>
@@ -7533,7 +7533,7 @@
       <w:pPr>
         <w:pStyle w:val="31"/>
       </w:pPr>
-      <w:bookmarkStart w:id="32" w:name="_Toc242192216"/>
+      <w:bookmarkStart w:id="32" w:name="_Toc242193898"/>
       <w:r>
         <w:t>4.2.1 Подсистема «Организационная структура и права доступа»</w:t>
       </w:r>
@@ -7578,7 +7578,7 @@
       <w:pPr>
         <w:pStyle w:val="31"/>
       </w:pPr>
-      <w:bookmarkStart w:id="33" w:name="_Toc242192217"/>
+      <w:bookmarkStart w:id="33" w:name="_Toc242193899"/>
       <w:r>
         <w:t>4.2.2 Подсистема «Каталог недвижимости»</w:t>
       </w:r>
@@ -7628,7 +7628,7 @@
       <w:pPr>
         <w:pStyle w:val="31"/>
       </w:pPr>
-      <w:bookmarkStart w:id="34" w:name="_Toc242192218"/>
+      <w:bookmarkStart w:id="34" w:name="_Toc242193900"/>
       <w:r>
         <w:lastRenderedPageBreak/>
         <w:t>4.2.3 Подсистема «Работа с клиентами»</w:t>
@@ -7669,7 +7669,7 @@
       <w:pPr>
         <w:pStyle w:val="31"/>
       </w:pPr>
-      <w:bookmarkStart w:id="35" w:name="_Toc242192219"/>
+      <w:bookmarkStart w:id="35" w:name="_Toc242193901"/>
       <w:r>
         <w:t>4.2.4 Подсистема «Сделки»</w:t>
       </w:r>
@@ -7723,7 +7723,7 @@
       <w:pPr>
         <w:pStyle w:val="31"/>
       </w:pPr>
-      <w:bookmarkStart w:id="36" w:name="_Toc242192220"/>
+      <w:bookmarkStart w:id="36" w:name="_Toc242193902"/>
       <w:r>
         <w:t>4.2.5 Подсистема «Финансы»</w:t>
       </w:r>
@@ -7788,7 +7788,7 @@
       <w:pPr>
         <w:pStyle w:val="31"/>
       </w:pPr>
-      <w:bookmarkStart w:id="37" w:name="_Toc242192221"/>
+      <w:bookmarkStart w:id="37" w:name="_Toc242193903"/>
       <w:r>
         <w:t>4.2.6 Подсистема «Шаблоны документов»</w:t>
       </w:r>
@@ -7807,7 +7807,7 @@
       <w:pPr>
         <w:pStyle w:val="31"/>
       </w:pPr>
-      <w:bookmarkStart w:id="38" w:name="_Toc242192222"/>
+      <w:bookmarkStart w:id="38" w:name="_Toc242193904"/>
       <w:r>
         <w:t>4.2.7 Подсистема «Задачи»</w:t>
       </w:r>
@@ -7822,7 +7822,7 @@
       <w:pPr>
         <w:pStyle w:val="31"/>
       </w:pPr>
-      <w:bookmarkStart w:id="39" w:name="_Toc242192223"/>
+      <w:bookmarkStart w:id="39" w:name="_Toc242193905"/>
       <w:r>
         <w:t>4.2.8 Подсистема «Аналитика и отчётность»</w:t>
       </w:r>
@@ -7862,7 +7862,7 @@
       <w:pPr>
         <w:pStyle w:val="31"/>
       </w:pPr>
-      <w:bookmarkStart w:id="40" w:name="_Toc242192224"/>
+      <w:bookmarkStart w:id="40" w:name="_Toc242193906"/>
       <w:r>
         <w:t>4.2.9 Подсистема «Интеграция с партнёрами»</w:t>
       </w:r>
@@ -7877,7 +7877,7 @@
       <w:pPr>
         <w:pStyle w:val="31"/>
       </w:pPr>
-      <w:bookmarkStart w:id="41" w:name="_Toc242192225"/>
+      <w:bookmarkStart w:id="41" w:name="_Toc242193907"/>
       <w:r>
         <w:t>4.2.10 Подсистема «Регламентные задания»</w:t>
       </w:r>
@@ -7892,7 +7892,7 @@
       <w:pPr>
         <w:pStyle w:val="21"/>
       </w:pPr>
-      <w:bookmarkStart w:id="42" w:name="_Toc242192226"/>
+      <w:bookmarkStart w:id="42" w:name="_Toc242193908"/>
       <w:r>
         <w:lastRenderedPageBreak/>
         <w:t>4.3 Требования к видам обеспечения</w:t>
@@ -7903,7 +7903,7 @@
       <w:pPr>
         <w:pStyle w:val="31"/>
       </w:pPr>
-      <w:bookmarkStart w:id="43" w:name="_Toc242192227"/>
+      <w:bookmarkStart w:id="43" w:name="_Toc242193909"/>
       <w:r>
         <w:t>4.3.1 Требования к математическому обеспечению</w:t>
       </w:r>
@@ -7943,7 +7943,7 @@
       <w:pPr>
         <w:pStyle w:val="31"/>
       </w:pPr>
-      <w:bookmarkStart w:id="44" w:name="_Toc242192228"/>
+      <w:bookmarkStart w:id="44" w:name="_Toc242193910"/>
       <w:r>
         <w:t>4.3.2 Требования к информационному обеспечению</w:t>
       </w:r>
@@ -7958,7 +7958,7 @@
       <w:pPr>
         <w:pStyle w:val="31"/>
       </w:pPr>
-      <w:bookmarkStart w:id="45" w:name="_Toc242192229"/>
+      <w:bookmarkStart w:id="45" w:name="_Toc242193911"/>
       <w:r>
         <w:t>4.3.3 Требования к лингвистическому обеспечению</w:t>
       </w:r>
@@ -7973,7 +7973,7 @@
       <w:pPr>
         <w:pStyle w:val="31"/>
       </w:pPr>
-      <w:bookmarkStart w:id="46" w:name="_Toc242192230"/>
+      <w:bookmarkStart w:id="46" w:name="_Toc242193912"/>
       <w:r>
         <w:t>4.3.4 Требования к программному обеспечению</w:t>
       </w:r>
@@ -7988,7 +7988,7 @@
       <w:pPr>
         <w:pStyle w:val="31"/>
       </w:pPr>
-      <w:bookmarkStart w:id="47" w:name="_Toc242192231"/>
+      <w:bookmarkStart w:id="47" w:name="_Toc242193913"/>
       <w:r>
         <w:lastRenderedPageBreak/>
         <w:t>4.3.5 Требования к техническому обеспечению</w:t>
@@ -8004,7 +8004,7 @@
       <w:pPr>
         <w:pStyle w:val="31"/>
       </w:pPr>
-      <w:bookmarkStart w:id="48" w:name="_Toc242192232"/>
+      <w:bookmarkStart w:id="48" w:name="_Toc242193914"/>
       <w:r>
         <w:t>4.3.6 Требования к метрологическому обеспечению</w:t>
       </w:r>
@@ -8019,7 +8019,7 @@
       <w:pPr>
         <w:pStyle w:val="31"/>
       </w:pPr>
-      <w:bookmarkStart w:id="49" w:name="_Toc242192233"/>
+      <w:bookmarkStart w:id="49" w:name="_Toc242193915"/>
       <w:r>
         <w:t>4.3.7 Требования к организационному обеспечению</w:t>
       </w:r>
@@ -8034,7 +8034,7 @@
       <w:pPr>
         <w:pStyle w:val="31"/>
       </w:pPr>
-      <w:bookmarkStart w:id="50" w:name="_Toc242192234"/>
+      <w:bookmarkStart w:id="50" w:name="_Toc242193916"/>
       <w:r>
         <w:t>4.3.8 Требования к методическому обеспечению</w:t>
       </w:r>
@@ -8050,7 +8050,7 @@
         <w:pStyle w:val="1"/>
         <w:pageBreakBefore/>
       </w:pPr>
-      <w:bookmarkStart w:id="51" w:name="_Toc242192235"/>
+      <w:bookmarkStart w:id="51" w:name="_Toc242193917"/>
       <w:r>
         <w:lastRenderedPageBreak/>
         <w:t>5 Состав и содержание работ по созданию системы</w:t>
@@ -8372,7 +8372,7 @@
         <w:pStyle w:val="1"/>
         <w:pageBreakBefore/>
       </w:pPr>
-      <w:bookmarkStart w:id="52" w:name="_Toc242192236"/>
+      <w:bookmarkStart w:id="52" w:name="_Toc242193918"/>
       <w:r>
         <w:lastRenderedPageBreak/>
         <w:t>6 Порядок разработки автоматизированной системы</w:t>
@@ -8419,7 +8419,7 @@
         <w:pStyle w:val="1"/>
         <w:pageBreakBefore/>
       </w:pPr>
-      <w:bookmarkStart w:id="53" w:name="_Toc242192237"/>
+      <w:bookmarkStart w:id="53" w:name="_Toc242193919"/>
       <w:r>
         <w:lastRenderedPageBreak/>
         <w:t>7 Порядок контроля и приёмки автоматизированной системы</w:t>
@@ -8436,7 +8436,7 @@
         <w:pStyle w:val="1"/>
         <w:pageBreakBefore/>
       </w:pPr>
-      <w:bookmarkStart w:id="54" w:name="_Toc242192238"/>
+      <w:bookmarkStart w:id="54" w:name="_Toc242193920"/>
       <w:r>
         <w:lastRenderedPageBreak/>
         <w:t>8 Требования к составу и содержанию работ по подготовке объекта автоматизации к вводу системы в действие</w:t>
@@ -8498,7 +8498,7 @@
         <w:pStyle w:val="1"/>
         <w:pageBreakBefore/>
       </w:pPr>
-      <w:bookmarkStart w:id="55" w:name="_Toc242192239"/>
+      <w:bookmarkStart w:id="55" w:name="_Toc242193921"/>
       <w:r>
         <w:lastRenderedPageBreak/>
         <w:t>9 Требования к документированию</w:t>
@@ -9140,7 +9140,7 @@
         <w:pStyle w:val="1"/>
         <w:pageBreakBefore/>
       </w:pPr>
-      <w:bookmarkStart w:id="56" w:name="_Toc242192240"/>
+      <w:bookmarkStart w:id="56" w:name="_Toc242193922"/>
       <w:r>
         <w:lastRenderedPageBreak/>
         <w:t>10 Источники разработки</w:t>
@@ -9179,7 +9179,7 @@
         <w:ind w:firstLine="0"/>
         <w:jc w:val="center"/>
       </w:pPr>
-      <w:bookmarkStart w:id="57" w:name="_Toc242192241"/>
+      <w:bookmarkStart w:id="57" w:name="_Toc242193923"/>
       <w:r>
         <w:lastRenderedPageBreak/>
         <w:t>ЛИСТ РЕГИСТРАЦИИ ИЗМЕНЕНИЙ</w:t>
@@ -11241,31 +11241,31 @@
       </w:rPr>
     </w:lvl>
   </w:abstractNum>
-  <w:num w:numId="1" w16cid:durableId="37553423">
+  <w:num w:numId="1" w16cid:durableId="1997028666">
     <w:abstractNumId w:val="8"/>
   </w:num>
-  <w:num w:numId="2" w16cid:durableId="1043484062">
+  <w:num w:numId="2" w16cid:durableId="157815794">
     <w:abstractNumId w:val="6"/>
   </w:num>
-  <w:num w:numId="3" w16cid:durableId="2040860014">
+  <w:num w:numId="3" w16cid:durableId="2053649138">
     <w:abstractNumId w:val="5"/>
   </w:num>
-  <w:num w:numId="4" w16cid:durableId="888034673">
+  <w:num w:numId="4" w16cid:durableId="1067849503">
     <w:abstractNumId w:val="4"/>
   </w:num>
-  <w:num w:numId="5" w16cid:durableId="1390032042">
+  <w:num w:numId="5" w16cid:durableId="84419787">
     <w:abstractNumId w:val="7"/>
   </w:num>
-  <w:num w:numId="6" w16cid:durableId="1912815002">
+  <w:num w:numId="6" w16cid:durableId="463961787">
     <w:abstractNumId w:val="3"/>
   </w:num>
-  <w:num w:numId="7" w16cid:durableId="633608998">
+  <w:num w:numId="7" w16cid:durableId="1968968129">
     <w:abstractNumId w:val="2"/>
   </w:num>
-  <w:num w:numId="8" w16cid:durableId="1179198553">
+  <w:num w:numId="8" w16cid:durableId="463275930">
     <w:abstractNumId w:val="1"/>
   </w:num>
-  <w:num w:numId="9" w16cid:durableId="47657462">
+  <w:num w:numId="9" w16cid:durableId="1852714997">
     <w:abstractNumId w:val="0"/>
   </w:num>
 </w:numbering>
@@ -22798,7 +22798,7 @@
     <w:autoRedefine/>
     <w:uiPriority w:val="39"/>
     <w:unhideWhenUsed/>
-    <w:rsid w:val="00F42D9B"/>
+    <w:rsid w:val="008E3364"/>
     <w:pPr>
       <w:spacing w:after="100"/>
     </w:pPr>
@@ -22810,7 +22810,7 @@
     <w:autoRedefine/>
     <w:uiPriority w:val="39"/>
     <w:unhideWhenUsed/>
-    <w:rsid w:val="00F42D9B"/>
+    <w:rsid w:val="008E3364"/>
     <w:pPr>
       <w:spacing w:after="100"/>
       <w:ind w:left="240"/>
@@ -22823,7 +22823,7 @@
     <w:autoRedefine/>
     <w:uiPriority w:val="39"/>
     <w:unhideWhenUsed/>
-    <w:rsid w:val="00F42D9B"/>
+    <w:rsid w:val="008E3364"/>
     <w:pPr>
       <w:spacing w:after="100"/>
       <w:ind w:left="480"/>
@@ -22834,7 +22834,7 @@
     <w:basedOn w:val="a2"/>
     <w:uiPriority w:val="99"/>
     <w:unhideWhenUsed/>
-    <w:rsid w:val="00F42D9B"/>
+    <w:rsid w:val="008E3364"/>
     <w:rPr>
       <w:color w:val="0000FF" w:themeColor="hyperlink"/>
       <w:u w:val="single"/>

</xml_diff>

<commit_message>
Clear payment status buttons with confirmation; reserve blocks booking
</commit_message>
<xml_diff>
--- a/docs/gost/out/01_ТЗ_Техническое_задание.docx
+++ b/docs/gost/out/01_ТЗ_Техническое_задание.docx
@@ -306,7 +306,7 @@
       <w:r>
         <w:fldChar w:fldCharType="separate"/>
       </w:r>
-      <w:hyperlink w:anchor="_Toc242436146" w:history="1">
+      <w:hyperlink w:anchor="_Toc242450499" w:history="1">
         <w:r>
           <w:rPr>
             <w:rStyle w:val="aff8"/>
@@ -333,7 +333,7 @@
             <w:noProof/>
             <w:webHidden/>
           </w:rPr>
-          <w:instrText xml:space="preserve"> PAGEREF _Toc242436146 \h </w:instrText>
+          <w:instrText xml:space="preserve"> PAGEREF _Toc242450499 \h </w:instrText>
         </w:r>
         <w:r>
           <w:rPr>
@@ -379,7 +379,7 @@
           <w14:ligatures w14:val="standardContextual"/>
         </w:rPr>
       </w:pPr>
-      <w:hyperlink w:anchor="_Toc242436147" w:history="1">
+      <w:hyperlink w:anchor="_Toc242450500" w:history="1">
         <w:r>
           <w:rPr>
             <w:rStyle w:val="aff8"/>
@@ -406,7 +406,7 @@
             <w:noProof/>
             <w:webHidden/>
           </w:rPr>
-          <w:instrText xml:space="preserve"> PAGEREF _Toc242436147 \h </w:instrText>
+          <w:instrText xml:space="preserve"> PAGEREF _Toc242450500 \h </w:instrText>
         </w:r>
         <w:r>
           <w:rPr>
@@ -452,7 +452,7 @@
           <w14:ligatures w14:val="standardContextual"/>
         </w:rPr>
       </w:pPr>
-      <w:hyperlink w:anchor="_Toc242436148" w:history="1">
+      <w:hyperlink w:anchor="_Toc242450501" w:history="1">
         <w:r>
           <w:rPr>
             <w:rStyle w:val="aff8"/>
@@ -479,7 +479,7 @@
             <w:noProof/>
             <w:webHidden/>
           </w:rPr>
-          <w:instrText xml:space="preserve"> PAGEREF _Toc242436148 \h </w:instrText>
+          <w:instrText xml:space="preserve"> PAGEREF _Toc242450501 \h </w:instrText>
         </w:r>
         <w:r>
           <w:rPr>
@@ -525,7 +525,7 @@
           <w14:ligatures w14:val="standardContextual"/>
         </w:rPr>
       </w:pPr>
-      <w:hyperlink w:anchor="_Toc242436149" w:history="1">
+      <w:hyperlink w:anchor="_Toc242450502" w:history="1">
         <w:r>
           <w:rPr>
             <w:rStyle w:val="aff8"/>
@@ -552,7 +552,7 @@
             <w:noProof/>
             <w:webHidden/>
           </w:rPr>
-          <w:instrText xml:space="preserve"> PAGEREF _Toc242436149 \h </w:instrText>
+          <w:instrText xml:space="preserve"> PAGEREF _Toc242450502 \h </w:instrText>
         </w:r>
         <w:r>
           <w:rPr>
@@ -598,7 +598,7 @@
           <w14:ligatures w14:val="standardContextual"/>
         </w:rPr>
       </w:pPr>
-      <w:hyperlink w:anchor="_Toc242436150" w:history="1">
+      <w:hyperlink w:anchor="_Toc242450503" w:history="1">
         <w:r>
           <w:rPr>
             <w:rStyle w:val="aff8"/>
@@ -625,7 +625,7 @@
             <w:noProof/>
             <w:webHidden/>
           </w:rPr>
-          <w:instrText xml:space="preserve"> PAGEREF _Toc242436150 \h </w:instrText>
+          <w:instrText xml:space="preserve"> PAGEREF _Toc242450503 \h </w:instrText>
         </w:r>
         <w:r>
           <w:rPr>
@@ -671,7 +671,7 @@
           <w14:ligatures w14:val="standardContextual"/>
         </w:rPr>
       </w:pPr>
-      <w:hyperlink w:anchor="_Toc242436151" w:history="1">
+      <w:hyperlink w:anchor="_Toc242450504" w:history="1">
         <w:r>
           <w:rPr>
             <w:rStyle w:val="aff8"/>
@@ -698,7 +698,7 @@
             <w:noProof/>
             <w:webHidden/>
           </w:rPr>
-          <w:instrText xml:space="preserve"> PAGEREF _Toc242436151 \h </w:instrText>
+          <w:instrText xml:space="preserve"> PAGEREF _Toc242450504 \h </w:instrText>
         </w:r>
         <w:r>
           <w:rPr>
@@ -744,7 +744,7 @@
           <w14:ligatures w14:val="standardContextual"/>
         </w:rPr>
       </w:pPr>
-      <w:hyperlink w:anchor="_Toc242436152" w:history="1">
+      <w:hyperlink w:anchor="_Toc242450505" w:history="1">
         <w:r>
           <w:rPr>
             <w:rStyle w:val="aff8"/>
@@ -771,7 +771,7 @@
             <w:noProof/>
             <w:webHidden/>
           </w:rPr>
-          <w:instrText xml:space="preserve"> PAGEREF _Toc242436152 \h </w:instrText>
+          <w:instrText xml:space="preserve"> PAGEREF _Toc242450505 \h </w:instrText>
         </w:r>
         <w:r>
           <w:rPr>
@@ -817,7 +817,7 @@
           <w14:ligatures w14:val="standardContextual"/>
         </w:rPr>
       </w:pPr>
-      <w:hyperlink w:anchor="_Toc242436153" w:history="1">
+      <w:hyperlink w:anchor="_Toc242450506" w:history="1">
         <w:r>
           <w:rPr>
             <w:rStyle w:val="aff8"/>
@@ -844,7 +844,7 @@
             <w:noProof/>
             <w:webHidden/>
           </w:rPr>
-          <w:instrText xml:space="preserve"> PAGEREF _Toc242436153 \h </w:instrText>
+          <w:instrText xml:space="preserve"> PAGEREF _Toc242450506 \h </w:instrText>
         </w:r>
         <w:r>
           <w:rPr>
@@ -890,7 +890,7 @@
           <w14:ligatures w14:val="standardContextual"/>
         </w:rPr>
       </w:pPr>
-      <w:hyperlink w:anchor="_Toc242436154" w:history="1">
+      <w:hyperlink w:anchor="_Toc242450507" w:history="1">
         <w:r>
           <w:rPr>
             <w:rStyle w:val="aff8"/>
@@ -917,7 +917,7 @@
             <w:noProof/>
             <w:webHidden/>
           </w:rPr>
-          <w:instrText xml:space="preserve"> PAGEREF _Toc242436154 \h </w:instrText>
+          <w:instrText xml:space="preserve"> PAGEREF _Toc242450507 \h </w:instrText>
         </w:r>
         <w:r>
           <w:rPr>
@@ -963,7 +963,7 @@
           <w14:ligatures w14:val="standardContextual"/>
         </w:rPr>
       </w:pPr>
-      <w:hyperlink w:anchor="_Toc242436155" w:history="1">
+      <w:hyperlink w:anchor="_Toc242450508" w:history="1">
         <w:r>
           <w:rPr>
             <w:rStyle w:val="aff8"/>
@@ -990,7 +990,7 @@
             <w:noProof/>
             <w:webHidden/>
           </w:rPr>
-          <w:instrText xml:space="preserve"> PAGEREF _Toc242436155 \h </w:instrText>
+          <w:instrText xml:space="preserve"> PAGEREF _Toc242450508 \h </w:instrText>
         </w:r>
         <w:r>
           <w:rPr>
@@ -1036,7 +1036,7 @@
           <w14:ligatures w14:val="standardContextual"/>
         </w:rPr>
       </w:pPr>
-      <w:hyperlink w:anchor="_Toc242436156" w:history="1">
+      <w:hyperlink w:anchor="_Toc242450509" w:history="1">
         <w:r>
           <w:rPr>
             <w:rStyle w:val="aff8"/>
@@ -1063,7 +1063,7 @@
             <w:noProof/>
             <w:webHidden/>
           </w:rPr>
-          <w:instrText xml:space="preserve"> PAGEREF _Toc242436156 \h </w:instrText>
+          <w:instrText xml:space="preserve"> PAGEREF _Toc242450509 \h </w:instrText>
         </w:r>
         <w:r>
           <w:rPr>
@@ -1109,7 +1109,7 @@
           <w14:ligatures w14:val="standardContextual"/>
         </w:rPr>
       </w:pPr>
-      <w:hyperlink w:anchor="_Toc242436157" w:history="1">
+      <w:hyperlink w:anchor="_Toc242450510" w:history="1">
         <w:r>
           <w:rPr>
             <w:rStyle w:val="aff8"/>
@@ -1136,7 +1136,7 @@
             <w:noProof/>
             <w:webHidden/>
           </w:rPr>
-          <w:instrText xml:space="preserve"> PAGEREF _Toc242436157 \h </w:instrText>
+          <w:instrText xml:space="preserve"> PAGEREF _Toc242450510 \h </w:instrText>
         </w:r>
         <w:r>
           <w:rPr>
@@ -1182,7 +1182,7 @@
           <w14:ligatures w14:val="standardContextual"/>
         </w:rPr>
       </w:pPr>
-      <w:hyperlink w:anchor="_Toc242436158" w:history="1">
+      <w:hyperlink w:anchor="_Toc242450511" w:history="1">
         <w:r>
           <w:rPr>
             <w:rStyle w:val="aff8"/>
@@ -1209,7 +1209,7 @@
             <w:noProof/>
             <w:webHidden/>
           </w:rPr>
-          <w:instrText xml:space="preserve"> PAGEREF _Toc242436158 \h </w:instrText>
+          <w:instrText xml:space="preserve"> PAGEREF _Toc242450511 \h </w:instrText>
         </w:r>
         <w:r>
           <w:rPr>
@@ -1255,7 +1255,7 @@
           <w14:ligatures w14:val="standardContextual"/>
         </w:rPr>
       </w:pPr>
-      <w:hyperlink w:anchor="_Toc242436159" w:history="1">
+      <w:hyperlink w:anchor="_Toc242450512" w:history="1">
         <w:r>
           <w:rPr>
             <w:rStyle w:val="aff8"/>
@@ -1282,7 +1282,7 @@
             <w:noProof/>
             <w:webHidden/>
           </w:rPr>
-          <w:instrText xml:space="preserve"> PAGEREF _Toc242436159 \h </w:instrText>
+          <w:instrText xml:space="preserve"> PAGEREF _Toc242450512 \h </w:instrText>
         </w:r>
         <w:r>
           <w:rPr>
@@ -1328,7 +1328,7 @@
           <w14:ligatures w14:val="standardContextual"/>
         </w:rPr>
       </w:pPr>
-      <w:hyperlink w:anchor="_Toc242436160" w:history="1">
+      <w:hyperlink w:anchor="_Toc242450513" w:history="1">
         <w:r>
           <w:rPr>
             <w:rStyle w:val="aff8"/>
@@ -1355,7 +1355,7 @@
             <w:noProof/>
             <w:webHidden/>
           </w:rPr>
-          <w:instrText xml:space="preserve"> PAGEREF _Toc242436160 \h </w:instrText>
+          <w:instrText xml:space="preserve"> PAGEREF _Toc242450513 \h </w:instrText>
         </w:r>
         <w:r>
           <w:rPr>
@@ -1401,7 +1401,7 @@
           <w14:ligatures w14:val="standardContextual"/>
         </w:rPr>
       </w:pPr>
-      <w:hyperlink w:anchor="_Toc242436161" w:history="1">
+      <w:hyperlink w:anchor="_Toc242450514" w:history="1">
         <w:r>
           <w:rPr>
             <w:rStyle w:val="aff8"/>
@@ -1428,7 +1428,7 @@
             <w:noProof/>
             <w:webHidden/>
           </w:rPr>
-          <w:instrText xml:space="preserve"> PAGEREF _Toc242436161 \h </w:instrText>
+          <w:instrText xml:space="preserve"> PAGEREF _Toc242450514 \h </w:instrText>
         </w:r>
         <w:r>
           <w:rPr>
@@ -1474,7 +1474,7 @@
           <w14:ligatures w14:val="standardContextual"/>
         </w:rPr>
       </w:pPr>
-      <w:hyperlink w:anchor="_Toc242436162" w:history="1">
+      <w:hyperlink w:anchor="_Toc242450515" w:history="1">
         <w:r>
           <w:rPr>
             <w:rStyle w:val="aff8"/>
@@ -1501,7 +1501,7 @@
             <w:noProof/>
             <w:webHidden/>
           </w:rPr>
-          <w:instrText xml:space="preserve"> PAGEREF _Toc242436162 \h </w:instrText>
+          <w:instrText xml:space="preserve"> PAGEREF _Toc242450515 \h </w:instrText>
         </w:r>
         <w:r>
           <w:rPr>
@@ -1547,7 +1547,7 @@
           <w14:ligatures w14:val="standardContextual"/>
         </w:rPr>
       </w:pPr>
-      <w:hyperlink w:anchor="_Toc242436163" w:history="1">
+      <w:hyperlink w:anchor="_Toc242450516" w:history="1">
         <w:r>
           <w:rPr>
             <w:rStyle w:val="aff8"/>
@@ -1574,7 +1574,7 @@
             <w:noProof/>
             <w:webHidden/>
           </w:rPr>
-          <w:instrText xml:space="preserve"> PAGEREF _Toc242436163 \h </w:instrText>
+          <w:instrText xml:space="preserve"> PAGEREF _Toc242450516 \h </w:instrText>
         </w:r>
         <w:r>
           <w:rPr>
@@ -1620,7 +1620,7 @@
           <w14:ligatures w14:val="standardContextual"/>
         </w:rPr>
       </w:pPr>
-      <w:hyperlink w:anchor="_Toc242436164" w:history="1">
+      <w:hyperlink w:anchor="_Toc242450517" w:history="1">
         <w:r>
           <w:rPr>
             <w:rStyle w:val="aff8"/>
@@ -1647,7 +1647,7 @@
             <w:noProof/>
             <w:webHidden/>
           </w:rPr>
-          <w:instrText xml:space="preserve"> PAGEREF _Toc242436164 \h </w:instrText>
+          <w:instrText xml:space="preserve"> PAGEREF _Toc242450517 \h </w:instrText>
         </w:r>
         <w:r>
           <w:rPr>
@@ -1693,7 +1693,7 @@
           <w14:ligatures w14:val="standardContextual"/>
         </w:rPr>
       </w:pPr>
-      <w:hyperlink w:anchor="_Toc242436165" w:history="1">
+      <w:hyperlink w:anchor="_Toc242450518" w:history="1">
         <w:r>
           <w:rPr>
             <w:rStyle w:val="aff8"/>
@@ -1720,7 +1720,7 @@
             <w:noProof/>
             <w:webHidden/>
           </w:rPr>
-          <w:instrText xml:space="preserve"> PAGEREF _Toc242436165 \h </w:instrText>
+          <w:instrText xml:space="preserve"> PAGEREF _Toc242450518 \h </w:instrText>
         </w:r>
         <w:r>
           <w:rPr>
@@ -1766,7 +1766,7 @@
           <w14:ligatures w14:val="standardContextual"/>
         </w:rPr>
       </w:pPr>
-      <w:hyperlink w:anchor="_Toc242436166" w:history="1">
+      <w:hyperlink w:anchor="_Toc242450519" w:history="1">
         <w:r>
           <w:rPr>
             <w:rStyle w:val="aff8"/>
@@ -1793,7 +1793,7 @@
             <w:noProof/>
             <w:webHidden/>
           </w:rPr>
-          <w:instrText xml:space="preserve"> PAGEREF _Toc242436166 \h </w:instrText>
+          <w:instrText xml:space="preserve"> PAGEREF _Toc242450519 \h </w:instrText>
         </w:r>
         <w:r>
           <w:rPr>
@@ -1839,7 +1839,7 @@
           <w14:ligatures w14:val="standardContextual"/>
         </w:rPr>
       </w:pPr>
-      <w:hyperlink w:anchor="_Toc242436167" w:history="1">
+      <w:hyperlink w:anchor="_Toc242450520" w:history="1">
         <w:r>
           <w:rPr>
             <w:rStyle w:val="aff8"/>
@@ -1866,7 +1866,7 @@
             <w:noProof/>
             <w:webHidden/>
           </w:rPr>
-          <w:instrText xml:space="preserve"> PAGEREF _Toc242436167 \h </w:instrText>
+          <w:instrText xml:space="preserve"> PAGEREF _Toc242450520 \h </w:instrText>
         </w:r>
         <w:r>
           <w:rPr>
@@ -1912,7 +1912,7 @@
           <w14:ligatures w14:val="standardContextual"/>
         </w:rPr>
       </w:pPr>
-      <w:hyperlink w:anchor="_Toc242436168" w:history="1">
+      <w:hyperlink w:anchor="_Toc242450521" w:history="1">
         <w:r>
           <w:rPr>
             <w:rStyle w:val="aff8"/>
@@ -1939,7 +1939,7 @@
             <w:noProof/>
             <w:webHidden/>
           </w:rPr>
-          <w:instrText xml:space="preserve"> PAGEREF _Toc242436168 \h </w:instrText>
+          <w:instrText xml:space="preserve"> PAGEREF _Toc242450521 \h </w:instrText>
         </w:r>
         <w:r>
           <w:rPr>
@@ -1985,7 +1985,7 @@
           <w14:ligatures w14:val="standardContextual"/>
         </w:rPr>
       </w:pPr>
-      <w:hyperlink w:anchor="_Toc242436169" w:history="1">
+      <w:hyperlink w:anchor="_Toc242450522" w:history="1">
         <w:r>
           <w:rPr>
             <w:rStyle w:val="aff8"/>
@@ -2012,7 +2012,7 @@
             <w:noProof/>
             <w:webHidden/>
           </w:rPr>
-          <w:instrText xml:space="preserve"> PAGEREF _Toc242436169 \h </w:instrText>
+          <w:instrText xml:space="preserve"> PAGEREF _Toc242450522 \h </w:instrText>
         </w:r>
         <w:r>
           <w:rPr>
@@ -2058,7 +2058,7 @@
           <w14:ligatures w14:val="standardContextual"/>
         </w:rPr>
       </w:pPr>
-      <w:hyperlink w:anchor="_Toc242436170" w:history="1">
+      <w:hyperlink w:anchor="_Toc242450523" w:history="1">
         <w:r>
           <w:rPr>
             <w:rStyle w:val="aff8"/>
@@ -2085,7 +2085,7 @@
             <w:noProof/>
             <w:webHidden/>
           </w:rPr>
-          <w:instrText xml:space="preserve"> PAGEREF _Toc242436170 \h </w:instrText>
+          <w:instrText xml:space="preserve"> PAGEREF _Toc242450523 \h </w:instrText>
         </w:r>
         <w:r>
           <w:rPr>
@@ -2131,7 +2131,7 @@
           <w14:ligatures w14:val="standardContextual"/>
         </w:rPr>
       </w:pPr>
-      <w:hyperlink w:anchor="_Toc242436171" w:history="1">
+      <w:hyperlink w:anchor="_Toc242450524" w:history="1">
         <w:r>
           <w:rPr>
             <w:rStyle w:val="aff8"/>
@@ -2158,7 +2158,7 @@
             <w:noProof/>
             <w:webHidden/>
           </w:rPr>
-          <w:instrText xml:space="preserve"> PAGEREF _Toc242436171 \h </w:instrText>
+          <w:instrText xml:space="preserve"> PAGEREF _Toc242450524 \h </w:instrText>
         </w:r>
         <w:r>
           <w:rPr>
@@ -2204,7 +2204,7 @@
           <w14:ligatures w14:val="standardContextual"/>
         </w:rPr>
       </w:pPr>
-      <w:hyperlink w:anchor="_Toc242436172" w:history="1">
+      <w:hyperlink w:anchor="_Toc242450525" w:history="1">
         <w:r>
           <w:rPr>
             <w:rStyle w:val="aff8"/>
@@ -2231,7 +2231,7 @@
             <w:noProof/>
             <w:webHidden/>
           </w:rPr>
-          <w:instrText xml:space="preserve"> PAGEREF _Toc242436172 \h </w:instrText>
+          <w:instrText xml:space="preserve"> PAGEREF _Toc242450525 \h </w:instrText>
         </w:r>
         <w:r>
           <w:rPr>
@@ -2277,7 +2277,7 @@
           <w14:ligatures w14:val="standardContextual"/>
         </w:rPr>
       </w:pPr>
-      <w:hyperlink w:anchor="_Toc242436173" w:history="1">
+      <w:hyperlink w:anchor="_Toc242450526" w:history="1">
         <w:r>
           <w:rPr>
             <w:rStyle w:val="aff8"/>
@@ -2304,7 +2304,7 @@
             <w:noProof/>
             <w:webHidden/>
           </w:rPr>
-          <w:instrText xml:space="preserve"> PAGEREF _Toc242436173 \h </w:instrText>
+          <w:instrText xml:space="preserve"> PAGEREF _Toc242450526 \h </w:instrText>
         </w:r>
         <w:r>
           <w:rPr>
@@ -2350,7 +2350,7 @@
           <w14:ligatures w14:val="standardContextual"/>
         </w:rPr>
       </w:pPr>
-      <w:hyperlink w:anchor="_Toc242436174" w:history="1">
+      <w:hyperlink w:anchor="_Toc242450527" w:history="1">
         <w:r>
           <w:rPr>
             <w:rStyle w:val="aff8"/>
@@ -2377,7 +2377,7 @@
             <w:noProof/>
             <w:webHidden/>
           </w:rPr>
-          <w:instrText xml:space="preserve"> PAGEREF _Toc242436174 \h </w:instrText>
+          <w:instrText xml:space="preserve"> PAGEREF _Toc242450527 \h </w:instrText>
         </w:r>
         <w:r>
           <w:rPr>
@@ -2423,7 +2423,7 @@
           <w14:ligatures w14:val="standardContextual"/>
         </w:rPr>
       </w:pPr>
-      <w:hyperlink w:anchor="_Toc242436175" w:history="1">
+      <w:hyperlink w:anchor="_Toc242450528" w:history="1">
         <w:r>
           <w:rPr>
             <w:rStyle w:val="aff8"/>
@@ -2450,7 +2450,7 @@
             <w:noProof/>
             <w:webHidden/>
           </w:rPr>
-          <w:instrText xml:space="preserve"> PAGEREF _Toc242436175 \h </w:instrText>
+          <w:instrText xml:space="preserve"> PAGEREF _Toc242450528 \h </w:instrText>
         </w:r>
         <w:r>
           <w:rPr>
@@ -2496,7 +2496,7 @@
           <w14:ligatures w14:val="standardContextual"/>
         </w:rPr>
       </w:pPr>
-      <w:hyperlink w:anchor="_Toc242436176" w:history="1">
+      <w:hyperlink w:anchor="_Toc242450529" w:history="1">
         <w:r>
           <w:rPr>
             <w:rStyle w:val="aff8"/>
@@ -2523,7 +2523,7 @@
             <w:noProof/>
             <w:webHidden/>
           </w:rPr>
-          <w:instrText xml:space="preserve"> PAGEREF _Toc242436176 \h </w:instrText>
+          <w:instrText xml:space="preserve"> PAGEREF _Toc242450529 \h </w:instrText>
         </w:r>
         <w:r>
           <w:rPr>
@@ -2569,7 +2569,7 @@
           <w14:ligatures w14:val="standardContextual"/>
         </w:rPr>
       </w:pPr>
-      <w:hyperlink w:anchor="_Toc242436177" w:history="1">
+      <w:hyperlink w:anchor="_Toc242450530" w:history="1">
         <w:r>
           <w:rPr>
             <w:rStyle w:val="aff8"/>
@@ -2596,7 +2596,7 @@
             <w:noProof/>
             <w:webHidden/>
           </w:rPr>
-          <w:instrText xml:space="preserve"> PAGEREF _Toc242436177 \h </w:instrText>
+          <w:instrText xml:space="preserve"> PAGEREF _Toc242450530 \h </w:instrText>
         </w:r>
         <w:r>
           <w:rPr>
@@ -2642,7 +2642,7 @@
           <w14:ligatures w14:val="standardContextual"/>
         </w:rPr>
       </w:pPr>
-      <w:hyperlink w:anchor="_Toc242436178" w:history="1">
+      <w:hyperlink w:anchor="_Toc242450531" w:history="1">
         <w:r>
           <w:rPr>
             <w:rStyle w:val="aff8"/>
@@ -2669,7 +2669,7 @@
             <w:noProof/>
             <w:webHidden/>
           </w:rPr>
-          <w:instrText xml:space="preserve"> PAGEREF _Toc242436178 \h </w:instrText>
+          <w:instrText xml:space="preserve"> PAGEREF _Toc242450531 \h </w:instrText>
         </w:r>
         <w:r>
           <w:rPr>
@@ -2715,7 +2715,7 @@
           <w14:ligatures w14:val="standardContextual"/>
         </w:rPr>
       </w:pPr>
-      <w:hyperlink w:anchor="_Toc242436179" w:history="1">
+      <w:hyperlink w:anchor="_Toc242450532" w:history="1">
         <w:r>
           <w:rPr>
             <w:rStyle w:val="aff8"/>
@@ -2742,7 +2742,7 @@
             <w:noProof/>
             <w:webHidden/>
           </w:rPr>
-          <w:instrText xml:space="preserve"> PAGEREF _Toc242436179 \h </w:instrText>
+          <w:instrText xml:space="preserve"> PAGEREF _Toc242450532 \h </w:instrText>
         </w:r>
         <w:r>
           <w:rPr>
@@ -2788,7 +2788,7 @@
           <w14:ligatures w14:val="standardContextual"/>
         </w:rPr>
       </w:pPr>
-      <w:hyperlink w:anchor="_Toc242436180" w:history="1">
+      <w:hyperlink w:anchor="_Toc242450533" w:history="1">
         <w:r>
           <w:rPr>
             <w:rStyle w:val="aff8"/>
@@ -2815,7 +2815,7 @@
             <w:noProof/>
             <w:webHidden/>
           </w:rPr>
-          <w:instrText xml:space="preserve"> PAGEREF _Toc242436180 \h </w:instrText>
+          <w:instrText xml:space="preserve"> PAGEREF _Toc242450533 \h </w:instrText>
         </w:r>
         <w:r>
           <w:rPr>
@@ -2861,7 +2861,7 @@
           <w14:ligatures w14:val="standardContextual"/>
         </w:rPr>
       </w:pPr>
-      <w:hyperlink w:anchor="_Toc242436181" w:history="1">
+      <w:hyperlink w:anchor="_Toc242450534" w:history="1">
         <w:r>
           <w:rPr>
             <w:rStyle w:val="aff8"/>
@@ -2888,7 +2888,7 @@
             <w:noProof/>
             <w:webHidden/>
           </w:rPr>
-          <w:instrText xml:space="preserve"> PAGEREF _Toc242436181 \h </w:instrText>
+          <w:instrText xml:space="preserve"> PAGEREF _Toc242450534 \h </w:instrText>
         </w:r>
         <w:r>
           <w:rPr>
@@ -2934,7 +2934,7 @@
           <w14:ligatures w14:val="standardContextual"/>
         </w:rPr>
       </w:pPr>
-      <w:hyperlink w:anchor="_Toc242436182" w:history="1">
+      <w:hyperlink w:anchor="_Toc242450535" w:history="1">
         <w:r>
           <w:rPr>
             <w:rStyle w:val="aff8"/>
@@ -2961,7 +2961,7 @@
             <w:noProof/>
             <w:webHidden/>
           </w:rPr>
-          <w:instrText xml:space="preserve"> PAGEREF _Toc242436182 \h </w:instrText>
+          <w:instrText xml:space="preserve"> PAGEREF _Toc242450535 \h </w:instrText>
         </w:r>
         <w:r>
           <w:rPr>
@@ -3007,7 +3007,7 @@
           <w14:ligatures w14:val="standardContextual"/>
         </w:rPr>
       </w:pPr>
-      <w:hyperlink w:anchor="_Toc242436183" w:history="1">
+      <w:hyperlink w:anchor="_Toc242450536" w:history="1">
         <w:r>
           <w:rPr>
             <w:rStyle w:val="aff8"/>
@@ -3034,7 +3034,7 @@
             <w:noProof/>
             <w:webHidden/>
           </w:rPr>
-          <w:instrText xml:space="preserve"> PAGEREF _Toc242436183 \h </w:instrText>
+          <w:instrText xml:space="preserve"> PAGEREF _Toc242450536 \h </w:instrText>
         </w:r>
         <w:r>
           <w:rPr>
@@ -3080,7 +3080,7 @@
           <w14:ligatures w14:val="standardContextual"/>
         </w:rPr>
       </w:pPr>
-      <w:hyperlink w:anchor="_Toc242436184" w:history="1">
+      <w:hyperlink w:anchor="_Toc242450537" w:history="1">
         <w:r>
           <w:rPr>
             <w:rStyle w:val="aff8"/>
@@ -3107,7 +3107,7 @@
             <w:noProof/>
             <w:webHidden/>
           </w:rPr>
-          <w:instrText xml:space="preserve"> PAGEREF _Toc242436184 \h </w:instrText>
+          <w:instrText xml:space="preserve"> PAGEREF _Toc242450537 \h </w:instrText>
         </w:r>
         <w:r>
           <w:rPr>
@@ -3153,7 +3153,7 @@
           <w14:ligatures w14:val="standardContextual"/>
         </w:rPr>
       </w:pPr>
-      <w:hyperlink w:anchor="_Toc242436185" w:history="1">
+      <w:hyperlink w:anchor="_Toc242450538" w:history="1">
         <w:r>
           <w:rPr>
             <w:rStyle w:val="aff8"/>
@@ -3180,7 +3180,7 @@
             <w:noProof/>
             <w:webHidden/>
           </w:rPr>
-          <w:instrText xml:space="preserve"> PAGEREF _Toc242436185 \h </w:instrText>
+          <w:instrText xml:space="preserve"> PAGEREF _Toc242450538 \h </w:instrText>
         </w:r>
         <w:r>
           <w:rPr>
@@ -3226,7 +3226,7 @@
           <w14:ligatures w14:val="standardContextual"/>
         </w:rPr>
       </w:pPr>
-      <w:hyperlink w:anchor="_Toc242436186" w:history="1">
+      <w:hyperlink w:anchor="_Toc242450539" w:history="1">
         <w:r>
           <w:rPr>
             <w:rStyle w:val="aff8"/>
@@ -3253,7 +3253,7 @@
             <w:noProof/>
             <w:webHidden/>
           </w:rPr>
-          <w:instrText xml:space="preserve"> PAGEREF _Toc242436186 \h </w:instrText>
+          <w:instrText xml:space="preserve"> PAGEREF _Toc242450539 \h </w:instrText>
         </w:r>
         <w:r>
           <w:rPr>
@@ -3299,7 +3299,7 @@
           <w14:ligatures w14:val="standardContextual"/>
         </w:rPr>
       </w:pPr>
-      <w:hyperlink w:anchor="_Toc242436187" w:history="1">
+      <w:hyperlink w:anchor="_Toc242450540" w:history="1">
         <w:r>
           <w:rPr>
             <w:rStyle w:val="aff8"/>
@@ -3326,7 +3326,7 @@
             <w:noProof/>
             <w:webHidden/>
           </w:rPr>
-          <w:instrText xml:space="preserve"> PAGEREF _Toc242436187 \h </w:instrText>
+          <w:instrText xml:space="preserve"> PAGEREF _Toc242450540 \h </w:instrText>
         </w:r>
         <w:r>
           <w:rPr>
@@ -3372,7 +3372,7 @@
           <w14:ligatures w14:val="standardContextual"/>
         </w:rPr>
       </w:pPr>
-      <w:hyperlink w:anchor="_Toc242436188" w:history="1">
+      <w:hyperlink w:anchor="_Toc242450541" w:history="1">
         <w:r>
           <w:rPr>
             <w:rStyle w:val="aff8"/>
@@ -3399,7 +3399,7 @@
             <w:noProof/>
             <w:webHidden/>
           </w:rPr>
-          <w:instrText xml:space="preserve"> PAGEREF _Toc242436188 \h </w:instrText>
+          <w:instrText xml:space="preserve"> PAGEREF _Toc242450541 \h </w:instrText>
         </w:r>
         <w:r>
           <w:rPr>
@@ -3445,7 +3445,7 @@
           <w14:ligatures w14:val="standardContextual"/>
         </w:rPr>
       </w:pPr>
-      <w:hyperlink w:anchor="_Toc242436189" w:history="1">
+      <w:hyperlink w:anchor="_Toc242450542" w:history="1">
         <w:r>
           <w:rPr>
             <w:rStyle w:val="aff8"/>
@@ -3472,7 +3472,7 @@
             <w:noProof/>
             <w:webHidden/>
           </w:rPr>
-          <w:instrText xml:space="preserve"> PAGEREF _Toc242436189 \h </w:instrText>
+          <w:instrText xml:space="preserve"> PAGEREF _Toc242450542 \h </w:instrText>
         </w:r>
         <w:r>
           <w:rPr>
@@ -3518,7 +3518,7 @@
           <w14:ligatures w14:val="standardContextual"/>
         </w:rPr>
       </w:pPr>
-      <w:hyperlink w:anchor="_Toc242436190" w:history="1">
+      <w:hyperlink w:anchor="_Toc242450543" w:history="1">
         <w:r>
           <w:rPr>
             <w:rStyle w:val="aff8"/>
@@ -3545,7 +3545,7 @@
             <w:noProof/>
             <w:webHidden/>
           </w:rPr>
-          <w:instrText xml:space="preserve"> PAGEREF _Toc242436190 \h </w:instrText>
+          <w:instrText xml:space="preserve"> PAGEREF _Toc242450543 \h </w:instrText>
         </w:r>
         <w:r>
           <w:rPr>
@@ -3591,7 +3591,7 @@
           <w14:ligatures w14:val="standardContextual"/>
         </w:rPr>
       </w:pPr>
-      <w:hyperlink w:anchor="_Toc242436191" w:history="1">
+      <w:hyperlink w:anchor="_Toc242450544" w:history="1">
         <w:r>
           <w:rPr>
             <w:rStyle w:val="aff8"/>
@@ -3618,7 +3618,7 @@
             <w:noProof/>
             <w:webHidden/>
           </w:rPr>
-          <w:instrText xml:space="preserve"> PAGEREF _Toc242436191 \h </w:instrText>
+          <w:instrText xml:space="preserve"> PAGEREF _Toc242450544 \h </w:instrText>
         </w:r>
         <w:r>
           <w:rPr>
@@ -3664,7 +3664,7 @@
           <w14:ligatures w14:val="standardContextual"/>
         </w:rPr>
       </w:pPr>
-      <w:hyperlink w:anchor="_Toc242436192" w:history="1">
+      <w:hyperlink w:anchor="_Toc242450545" w:history="1">
         <w:r>
           <w:rPr>
             <w:rStyle w:val="aff8"/>
@@ -3691,7 +3691,7 @@
             <w:noProof/>
             <w:webHidden/>
           </w:rPr>
-          <w:instrText xml:space="preserve"> PAGEREF _Toc242436192 \h </w:instrText>
+          <w:instrText xml:space="preserve"> PAGEREF _Toc242450545 \h </w:instrText>
         </w:r>
         <w:r>
           <w:rPr>
@@ -3737,7 +3737,7 @@
           <w14:ligatures w14:val="standardContextual"/>
         </w:rPr>
       </w:pPr>
-      <w:hyperlink w:anchor="_Toc242436193" w:history="1">
+      <w:hyperlink w:anchor="_Toc242450546" w:history="1">
         <w:r>
           <w:rPr>
             <w:rStyle w:val="aff8"/>
@@ -3764,7 +3764,7 @@
             <w:noProof/>
             <w:webHidden/>
           </w:rPr>
-          <w:instrText xml:space="preserve"> PAGEREF _Toc242436193 \h </w:instrText>
+          <w:instrText xml:space="preserve"> PAGEREF _Toc242450546 \h </w:instrText>
         </w:r>
         <w:r>
           <w:rPr>
@@ -3810,7 +3810,7 @@
           <w14:ligatures w14:val="standardContextual"/>
         </w:rPr>
       </w:pPr>
-      <w:hyperlink w:anchor="_Toc242436194" w:history="1">
+      <w:hyperlink w:anchor="_Toc242450547" w:history="1">
         <w:r>
           <w:rPr>
             <w:rStyle w:val="aff8"/>
@@ -3837,7 +3837,7 @@
             <w:noProof/>
             <w:webHidden/>
           </w:rPr>
-          <w:instrText xml:space="preserve"> PAGEREF _Toc242436194 \h </w:instrText>
+          <w:instrText xml:space="preserve"> PAGEREF _Toc242450547 \h </w:instrText>
         </w:r>
         <w:r>
           <w:rPr>
@@ -3883,7 +3883,7 @@
           <w14:ligatures w14:val="standardContextual"/>
         </w:rPr>
       </w:pPr>
-      <w:hyperlink w:anchor="_Toc242436195" w:history="1">
+      <w:hyperlink w:anchor="_Toc242450548" w:history="1">
         <w:r>
           <w:rPr>
             <w:rStyle w:val="aff8"/>
@@ -3910,7 +3910,7 @@
             <w:noProof/>
             <w:webHidden/>
           </w:rPr>
-          <w:instrText xml:space="preserve"> PAGEREF _Toc242436195 \h </w:instrText>
+          <w:instrText xml:space="preserve"> PAGEREF _Toc242450548 \h </w:instrText>
         </w:r>
         <w:r>
           <w:rPr>
@@ -3956,7 +3956,7 @@
           <w14:ligatures w14:val="standardContextual"/>
         </w:rPr>
       </w:pPr>
-      <w:hyperlink w:anchor="_Toc242436196" w:history="1">
+      <w:hyperlink w:anchor="_Toc242450549" w:history="1">
         <w:r>
           <w:rPr>
             <w:rStyle w:val="aff8"/>
@@ -3983,7 +3983,7 @@
             <w:noProof/>
             <w:webHidden/>
           </w:rPr>
-          <w:instrText xml:space="preserve"> PAGEREF _Toc242436196 \h </w:instrText>
+          <w:instrText xml:space="preserve"> PAGEREF _Toc242450549 \h </w:instrText>
         </w:r>
         <w:r>
           <w:rPr>
@@ -4029,7 +4029,7 @@
           <w14:ligatures w14:val="standardContextual"/>
         </w:rPr>
       </w:pPr>
-      <w:hyperlink w:anchor="_Toc242436197" w:history="1">
+      <w:hyperlink w:anchor="_Toc242450550" w:history="1">
         <w:r>
           <w:rPr>
             <w:rStyle w:val="aff8"/>
@@ -4056,7 +4056,7 @@
             <w:noProof/>
             <w:webHidden/>
           </w:rPr>
-          <w:instrText xml:space="preserve"> PAGEREF _Toc242436197 \h </w:instrText>
+          <w:instrText xml:space="preserve"> PAGEREF _Toc242450550 \h </w:instrText>
         </w:r>
         <w:r>
           <w:rPr>
@@ -4102,7 +4102,7 @@
           <w14:ligatures w14:val="standardContextual"/>
         </w:rPr>
       </w:pPr>
-      <w:hyperlink w:anchor="_Toc242436198" w:history="1">
+      <w:hyperlink w:anchor="_Toc242450551" w:history="1">
         <w:r>
           <w:rPr>
             <w:rStyle w:val="aff8"/>
@@ -4129,7 +4129,7 @@
             <w:noProof/>
             <w:webHidden/>
           </w:rPr>
-          <w:instrText xml:space="preserve"> PAGEREF _Toc242436198 \h </w:instrText>
+          <w:instrText xml:space="preserve"> PAGEREF _Toc242450551 \h </w:instrText>
         </w:r>
         <w:r>
           <w:rPr>
@@ -4175,7 +4175,7 @@
           <w14:ligatures w14:val="standardContextual"/>
         </w:rPr>
       </w:pPr>
-      <w:hyperlink w:anchor="_Toc242436199" w:history="1">
+      <w:hyperlink w:anchor="_Toc242450552" w:history="1">
         <w:r>
           <w:rPr>
             <w:rStyle w:val="aff8"/>
@@ -4202,7 +4202,7 @@
             <w:noProof/>
             <w:webHidden/>
           </w:rPr>
-          <w:instrText xml:space="preserve"> PAGEREF _Toc242436199 \h </w:instrText>
+          <w:instrText xml:space="preserve"> PAGEREF _Toc242450552 \h </w:instrText>
         </w:r>
         <w:r>
           <w:rPr>
@@ -4248,7 +4248,7 @@
           <w14:ligatures w14:val="standardContextual"/>
         </w:rPr>
       </w:pPr>
-      <w:hyperlink w:anchor="_Toc242436200" w:history="1">
+      <w:hyperlink w:anchor="_Toc242450553" w:history="1">
         <w:r>
           <w:rPr>
             <w:rStyle w:val="aff8"/>
@@ -4275,7 +4275,7 @@
             <w:noProof/>
             <w:webHidden/>
           </w:rPr>
-          <w:instrText xml:space="preserve"> PAGEREF _Toc242436200 \h </w:instrText>
+          <w:instrText xml:space="preserve"> PAGEREF _Toc242450553 \h </w:instrText>
         </w:r>
         <w:r>
           <w:rPr>
@@ -4321,7 +4321,7 @@
           <w14:ligatures w14:val="standardContextual"/>
         </w:rPr>
       </w:pPr>
-      <w:hyperlink w:anchor="_Toc242436201" w:history="1">
+      <w:hyperlink w:anchor="_Toc242450554" w:history="1">
         <w:r>
           <w:rPr>
             <w:rStyle w:val="aff8"/>
@@ -4348,7 +4348,7 @@
             <w:noProof/>
             <w:webHidden/>
           </w:rPr>
-          <w:instrText xml:space="preserve"> PAGEREF _Toc242436201 \h </w:instrText>
+          <w:instrText xml:space="preserve"> PAGEREF _Toc242450554 \h </w:instrText>
         </w:r>
         <w:r>
           <w:rPr>
@@ -4394,7 +4394,7 @@
           <w14:ligatures w14:val="standardContextual"/>
         </w:rPr>
       </w:pPr>
-      <w:hyperlink w:anchor="_Toc242436202" w:history="1">
+      <w:hyperlink w:anchor="_Toc242450555" w:history="1">
         <w:r>
           <w:rPr>
             <w:rStyle w:val="aff8"/>
@@ -4421,7 +4421,7 @@
             <w:noProof/>
             <w:webHidden/>
           </w:rPr>
-          <w:instrText xml:space="preserve"> PAGEREF _Toc242436202 \h </w:instrText>
+          <w:instrText xml:space="preserve"> PAGEREF _Toc242450555 \h </w:instrText>
         </w:r>
         <w:r>
           <w:rPr>
@@ -4467,7 +4467,7 @@
           <w14:ligatures w14:val="standardContextual"/>
         </w:rPr>
       </w:pPr>
-      <w:hyperlink w:anchor="_Toc242436203" w:history="1">
+      <w:hyperlink w:anchor="_Toc242450556" w:history="1">
         <w:r>
           <w:rPr>
             <w:rStyle w:val="aff8"/>
@@ -4494,7 +4494,7 @@
             <w:noProof/>
             <w:webHidden/>
           </w:rPr>
-          <w:instrText xml:space="preserve"> PAGEREF _Toc242436203 \h </w:instrText>
+          <w:instrText xml:space="preserve"> PAGEREF _Toc242450556 \h </w:instrText>
         </w:r>
         <w:r>
           <w:rPr>
@@ -4540,7 +4540,7 @@
         <w:ind w:firstLine="0"/>
         <w:jc w:val="center"/>
       </w:pPr>
-      <w:bookmarkStart w:id="0" w:name="_Toc242436146"/>
+      <w:bookmarkStart w:id="0" w:name="_Toc242450499"/>
       <w:r>
         <w:lastRenderedPageBreak/>
         <w:t>ПЕРЕЧЕНЬ ТЕРМИНОВ И СОКРАЩЕНИЙ</w:t>
@@ -5802,7 +5802,7 @@
         <w:pStyle w:val="1"/>
         <w:pageBreakBefore/>
       </w:pPr>
-      <w:bookmarkStart w:id="1" w:name="_Toc242436147"/>
+      <w:bookmarkStart w:id="1" w:name="_Toc242450500"/>
       <w:r>
         <w:lastRenderedPageBreak/>
         <w:t>1 Общие сведения</w:t>
@@ -5813,7 +5813,7 @@
       <w:pPr>
         <w:pStyle w:val="21"/>
       </w:pPr>
-      <w:bookmarkStart w:id="2" w:name="_Toc242436148"/>
+      <w:bookmarkStart w:id="2" w:name="_Toc242450501"/>
       <w:r>
         <w:t>1.1 Полное наименование системы и её условное обозначение</w:t>
       </w:r>
@@ -5833,7 +5833,7 @@
       <w:pPr>
         <w:pStyle w:val="21"/>
       </w:pPr>
-      <w:bookmarkStart w:id="3" w:name="_Toc242436149"/>
+      <w:bookmarkStart w:id="3" w:name="_Toc242450502"/>
       <w:r>
         <w:t>1.2 Шифр темы и номер договора</w:t>
       </w:r>
@@ -5848,7 +5848,7 @@
       <w:pPr>
         <w:pStyle w:val="21"/>
       </w:pPr>
-      <w:bookmarkStart w:id="4" w:name="_Toc242436150"/>
+      <w:bookmarkStart w:id="4" w:name="_Toc242450503"/>
       <w:r>
         <w:t>1.3 Наименования организаций заказчика и разработчика</w:t>
       </w:r>
@@ -5868,7 +5868,7 @@
       <w:pPr>
         <w:pStyle w:val="21"/>
       </w:pPr>
-      <w:bookmarkStart w:id="5" w:name="_Toc242436151"/>
+      <w:bookmarkStart w:id="5" w:name="_Toc242450504"/>
       <w:r>
         <w:t>1.4 Основания для создания системы</w:t>
       </w:r>
@@ -5893,7 +5893,7 @@
       <w:pPr>
         <w:pStyle w:val="21"/>
       </w:pPr>
-      <w:bookmarkStart w:id="6" w:name="_Toc242436152"/>
+      <w:bookmarkStart w:id="6" w:name="_Toc242450505"/>
       <w:r>
         <w:t>1.5 Плановые сроки начала и окончания работ</w:t>
       </w:r>
@@ -5908,7 +5908,7 @@
       <w:pPr>
         <w:pStyle w:val="21"/>
       </w:pPr>
-      <w:bookmarkStart w:id="7" w:name="_Toc242436153"/>
+      <w:bookmarkStart w:id="7" w:name="_Toc242450506"/>
       <w:r>
         <w:t>1.6 Сведения об источниках и порядке финансирования</w:t>
       </w:r>
@@ -5923,7 +5923,7 @@
       <w:pPr>
         <w:pStyle w:val="21"/>
       </w:pPr>
-      <w:bookmarkStart w:id="8" w:name="_Toc242436154"/>
+      <w:bookmarkStart w:id="8" w:name="_Toc242450507"/>
       <w:r>
         <w:lastRenderedPageBreak/>
         <w:t>1.7 Порядок оформления и предъявления результатов работ</w:t>
@@ -5939,7 +5939,7 @@
       <w:pPr>
         <w:pStyle w:val="21"/>
       </w:pPr>
-      <w:bookmarkStart w:id="9" w:name="_Toc242436155"/>
+      <w:bookmarkStart w:id="9" w:name="_Toc242450508"/>
       <w:r>
         <w:t>1.8 Перечень нормативно-технических документов</w:t>
       </w:r>
@@ -6003,7 +6003,7 @@
         <w:pStyle w:val="1"/>
         <w:pageBreakBefore/>
       </w:pPr>
-      <w:bookmarkStart w:id="10" w:name="_Toc242436156"/>
+      <w:bookmarkStart w:id="10" w:name="_Toc242450509"/>
       <w:r>
         <w:lastRenderedPageBreak/>
         <w:t>2 Цели и назначение создания автоматизированной системы</w:t>
@@ -6014,7 +6014,7 @@
       <w:pPr>
         <w:pStyle w:val="21"/>
       </w:pPr>
-      <w:bookmarkStart w:id="11" w:name="_Toc242436157"/>
+      <w:bookmarkStart w:id="11" w:name="_Toc242450510"/>
       <w:r>
         <w:t>2.1 Назначение системы</w:t>
       </w:r>
@@ -6074,7 +6074,7 @@
       <w:pPr>
         <w:pStyle w:val="21"/>
       </w:pPr>
-      <w:bookmarkStart w:id="12" w:name="_Toc242436158"/>
+      <w:bookmarkStart w:id="12" w:name="_Toc242450511"/>
       <w:r>
         <w:t>2.2 Цели создания системы</w:t>
       </w:r>
@@ -6120,7 +6120,7 @@
         <w:pStyle w:val="1"/>
         <w:pageBreakBefore/>
       </w:pPr>
-      <w:bookmarkStart w:id="13" w:name="_Toc242436159"/>
+      <w:bookmarkStart w:id="13" w:name="_Toc242450512"/>
       <w:r>
         <w:lastRenderedPageBreak/>
         <w:t>3 Характеристика объекта автоматизации</w:t>
@@ -6131,7 +6131,7 @@
       <w:pPr>
         <w:pStyle w:val="21"/>
       </w:pPr>
-      <w:bookmarkStart w:id="14" w:name="_Toc242436160"/>
+      <w:bookmarkStart w:id="14" w:name="_Toc242450513"/>
       <w:r>
         <w:t>3.1 Краткие сведения об объекте автоматизации</w:t>
       </w:r>
@@ -6221,7 +6221,7 @@
       <w:pPr>
         <w:pStyle w:val="21"/>
       </w:pPr>
-      <w:bookmarkStart w:id="15" w:name="_Toc242436161"/>
+      <w:bookmarkStart w:id="15" w:name="_Toc242450514"/>
       <w:r>
         <w:t>3.2 Сведения об условиях эксплуатации</w:t>
       </w:r>
@@ -6237,7 +6237,7 @@
         <w:pStyle w:val="1"/>
         <w:pageBreakBefore/>
       </w:pPr>
-      <w:bookmarkStart w:id="16" w:name="_Toc242436162"/>
+      <w:bookmarkStart w:id="16" w:name="_Toc242450515"/>
       <w:r>
         <w:lastRenderedPageBreak/>
         <w:t>4 Требования к автоматизированной системе</w:t>
@@ -6248,7 +6248,7 @@
       <w:pPr>
         <w:pStyle w:val="21"/>
       </w:pPr>
-      <w:bookmarkStart w:id="17" w:name="_Toc242436163"/>
+      <w:bookmarkStart w:id="17" w:name="_Toc242450516"/>
       <w:r>
         <w:t>4.1 Требования к системе в целом</w:t>
       </w:r>
@@ -6258,7 +6258,7 @@
       <w:pPr>
         <w:pStyle w:val="31"/>
       </w:pPr>
-      <w:bookmarkStart w:id="18" w:name="_Toc242436164"/>
+      <w:bookmarkStart w:id="18" w:name="_Toc242450517"/>
       <w:r>
         <w:t>4.1.1 Требования к структуре и функционированию системы</w:t>
       </w:r>
@@ -6904,7 +6904,7 @@
       <w:pPr>
         <w:pStyle w:val="31"/>
       </w:pPr>
-      <w:bookmarkStart w:id="19" w:name="_Toc242436165"/>
+      <w:bookmarkStart w:id="19" w:name="_Toc242450518"/>
       <w:r>
         <w:t>4.1.2 Требования к численности и квалификации персонала</w:t>
       </w:r>
@@ -7185,7 +7185,7 @@
       <w:pPr>
         <w:pStyle w:val="31"/>
       </w:pPr>
-      <w:bookmarkStart w:id="20" w:name="_Toc242436166"/>
+      <w:bookmarkStart w:id="20" w:name="_Toc242450519"/>
       <w:r>
         <w:t>4.1.3 Показатели назначения</w:t>
       </w:r>
@@ -7233,7 +7233,7 @@
       <w:pPr>
         <w:pStyle w:val="31"/>
       </w:pPr>
-      <w:bookmarkStart w:id="21" w:name="_Toc242436167"/>
+      <w:bookmarkStart w:id="21" w:name="_Toc242450520"/>
       <w:r>
         <w:t>4.1.4 Требования к надёжности</w:t>
       </w:r>
@@ -7267,7 +7267,7 @@
       <w:pPr>
         <w:pStyle w:val="31"/>
       </w:pPr>
-      <w:bookmarkStart w:id="22" w:name="_Toc242436168"/>
+      <w:bookmarkStart w:id="22" w:name="_Toc242450521"/>
       <w:r>
         <w:t>4.1.5 Требования к безопасности</w:t>
       </w:r>
@@ -7282,7 +7282,7 @@
       <w:pPr>
         <w:pStyle w:val="31"/>
       </w:pPr>
-      <w:bookmarkStart w:id="23" w:name="_Toc242436169"/>
+      <w:bookmarkStart w:id="23" w:name="_Toc242450522"/>
       <w:r>
         <w:t>4.1.6 Требования к эргономике и технической эстетике</w:t>
       </w:r>
@@ -7327,7 +7327,7 @@
       <w:pPr>
         <w:pStyle w:val="31"/>
       </w:pPr>
-      <w:bookmarkStart w:id="24" w:name="_Toc242436170"/>
+      <w:bookmarkStart w:id="24" w:name="_Toc242450523"/>
       <w:r>
         <w:t>4.1.7 Требования к эксплуатации и техническому обслуживанию</w:t>
       </w:r>
@@ -7357,7 +7357,7 @@
       <w:pPr>
         <w:pStyle w:val="31"/>
       </w:pPr>
-      <w:bookmarkStart w:id="25" w:name="_Toc242436171"/>
+      <w:bookmarkStart w:id="25" w:name="_Toc242450524"/>
       <w:r>
         <w:t>4.1.8 Требования к защите информации от несанкционированного доступа</w:t>
       </w:r>
@@ -7428,7 +7428,7 @@
       <w:pPr>
         <w:pStyle w:val="31"/>
       </w:pPr>
-      <w:bookmarkStart w:id="26" w:name="_Toc242436172"/>
+      <w:bookmarkStart w:id="26" w:name="_Toc242450525"/>
       <w:r>
         <w:t>4.1.9 Требования по сохранности информации при авариях</w:t>
       </w:r>
@@ -7449,7 +7449,7 @@
       <w:pPr>
         <w:pStyle w:val="31"/>
       </w:pPr>
-      <w:bookmarkStart w:id="27" w:name="_Toc242436173"/>
+      <w:bookmarkStart w:id="27" w:name="_Toc242450526"/>
       <w:r>
         <w:t>4.1.10 Требования к защите от влияния внешних воздействий</w:t>
       </w:r>
@@ -7464,7 +7464,7 @@
       <w:pPr>
         <w:pStyle w:val="31"/>
       </w:pPr>
-      <w:bookmarkStart w:id="28" w:name="_Toc242436174"/>
+      <w:bookmarkStart w:id="28" w:name="_Toc242450527"/>
       <w:r>
         <w:t>4.1.11 Требования к патентной чистоте</w:t>
       </w:r>
@@ -7482,7 +7482,7 @@
       <w:pPr>
         <w:pStyle w:val="31"/>
       </w:pPr>
-      <w:bookmarkStart w:id="29" w:name="_Toc242436175"/>
+      <w:bookmarkStart w:id="29" w:name="_Toc242450528"/>
       <w:r>
         <w:t>4.1.12 Требования по стандартизации и унификации</w:t>
       </w:r>
@@ -7497,7 +7497,7 @@
       <w:pPr>
         <w:pStyle w:val="31"/>
       </w:pPr>
-      <w:bookmarkStart w:id="30" w:name="_Toc242436176"/>
+      <w:bookmarkStart w:id="30" w:name="_Toc242450529"/>
       <w:r>
         <w:t>4.1.13 Дополнительные требования</w:t>
       </w:r>
@@ -7517,7 +7517,7 @@
       <w:pPr>
         <w:pStyle w:val="21"/>
       </w:pPr>
-      <w:bookmarkStart w:id="31" w:name="_Toc242436177"/>
+      <w:bookmarkStart w:id="31" w:name="_Toc242450530"/>
       <w:r>
         <w:lastRenderedPageBreak/>
         <w:t>4.2 Требования к функциям, выполняемым системой</w:t>
@@ -7533,7 +7533,7 @@
       <w:pPr>
         <w:pStyle w:val="31"/>
       </w:pPr>
-      <w:bookmarkStart w:id="32" w:name="_Toc242436178"/>
+      <w:bookmarkStart w:id="32" w:name="_Toc242450531"/>
       <w:r>
         <w:t>4.2.1 Подсистема «Организационная структура и права доступа»</w:t>
       </w:r>
@@ -7578,7 +7578,7 @@
       <w:pPr>
         <w:pStyle w:val="31"/>
       </w:pPr>
-      <w:bookmarkStart w:id="33" w:name="_Toc242436179"/>
+      <w:bookmarkStart w:id="33" w:name="_Toc242450532"/>
       <w:r>
         <w:t>4.2.2 Подсистема «Каталог недвижимости»</w:t>
       </w:r>
@@ -7629,7 +7629,7 @@
       <w:pPr>
         <w:pStyle w:val="31"/>
       </w:pPr>
-      <w:bookmarkStart w:id="34" w:name="_Toc242436180"/>
+      <w:bookmarkStart w:id="34" w:name="_Toc242450533"/>
       <w:r>
         <w:t>4.2.3 Подсистема «Работа с клиентами»</w:t>
       </w:r>
@@ -7669,7 +7669,7 @@
       <w:pPr>
         <w:pStyle w:val="31"/>
       </w:pPr>
-      <w:bookmarkStart w:id="35" w:name="_Toc242436181"/>
+      <w:bookmarkStart w:id="35" w:name="_Toc242450534"/>
       <w:r>
         <w:t>4.2.4 Подсистема «Сделки»</w:t>
       </w:r>
@@ -7720,7 +7720,7 @@
       <w:pPr>
         <w:pStyle w:val="31"/>
       </w:pPr>
-      <w:bookmarkStart w:id="36" w:name="_Toc242436182"/>
+      <w:bookmarkStart w:id="36" w:name="_Toc242450535"/>
       <w:r>
         <w:t>4.2.5 Подсистема «Финансы»</w:t>
       </w:r>
@@ -7785,7 +7785,7 @@
       <w:pPr>
         <w:pStyle w:val="31"/>
       </w:pPr>
-      <w:bookmarkStart w:id="37" w:name="_Toc242436183"/>
+      <w:bookmarkStart w:id="37" w:name="_Toc242450536"/>
       <w:r>
         <w:lastRenderedPageBreak/>
         <w:t>4.2.6 Подсистема «Шаблоны документов»</w:t>
@@ -7801,7 +7801,7 @@
       <w:pPr>
         <w:pStyle w:val="31"/>
       </w:pPr>
-      <w:bookmarkStart w:id="38" w:name="_Toc242436184"/>
+      <w:bookmarkStart w:id="38" w:name="_Toc242450537"/>
       <w:r>
         <w:t>4.2.7 Подсистема «Задачи»</w:t>
       </w:r>
@@ -7816,7 +7816,7 @@
       <w:pPr>
         <w:pStyle w:val="31"/>
       </w:pPr>
-      <w:bookmarkStart w:id="39" w:name="_Toc242436185"/>
+      <w:bookmarkStart w:id="39" w:name="_Toc242450538"/>
       <w:r>
         <w:t>4.2.8 Подсистема «Аналитика и отчётность»</w:t>
       </w:r>
@@ -7856,7 +7856,7 @@
       <w:pPr>
         <w:pStyle w:val="31"/>
       </w:pPr>
-      <w:bookmarkStart w:id="40" w:name="_Toc242436186"/>
+      <w:bookmarkStart w:id="40" w:name="_Toc242450539"/>
       <w:r>
         <w:t>4.2.9 Подсистема «Интеграция с партнёрами»</w:t>
       </w:r>
@@ -7871,7 +7871,7 @@
       <w:pPr>
         <w:pStyle w:val="31"/>
       </w:pPr>
-      <w:bookmarkStart w:id="41" w:name="_Toc242436187"/>
+      <w:bookmarkStart w:id="41" w:name="_Toc242450540"/>
       <w:r>
         <w:lastRenderedPageBreak/>
         <w:t>4.2.10 Подсистема «Регламентные задания»</w:t>
@@ -7887,7 +7887,7 @@
       <w:pPr>
         <w:pStyle w:val="21"/>
       </w:pPr>
-      <w:bookmarkStart w:id="42" w:name="_Toc242436188"/>
+      <w:bookmarkStart w:id="42" w:name="_Toc242450541"/>
       <w:r>
         <w:t>4.3 Требования к видам обеспечения</w:t>
       </w:r>
@@ -7897,7 +7897,7 @@
       <w:pPr>
         <w:pStyle w:val="31"/>
       </w:pPr>
-      <w:bookmarkStart w:id="43" w:name="_Toc242436189"/>
+      <w:bookmarkStart w:id="43" w:name="_Toc242450542"/>
       <w:r>
         <w:t>4.3.1 Требования к математическому обеспечению</w:t>
       </w:r>
@@ -7937,7 +7937,7 @@
       <w:pPr>
         <w:pStyle w:val="31"/>
       </w:pPr>
-      <w:bookmarkStart w:id="44" w:name="_Toc242436190"/>
+      <w:bookmarkStart w:id="44" w:name="_Toc242450543"/>
       <w:r>
         <w:t>4.3.2 Требования к информационному обеспечению</w:t>
       </w:r>
@@ -7952,7 +7952,7 @@
       <w:pPr>
         <w:pStyle w:val="31"/>
       </w:pPr>
-      <w:bookmarkStart w:id="45" w:name="_Toc242436191"/>
+      <w:bookmarkStart w:id="45" w:name="_Toc242450544"/>
       <w:r>
         <w:t>4.3.3 Требования к лингвистическому обеспечению</w:t>
       </w:r>
@@ -7967,7 +7967,7 @@
       <w:pPr>
         <w:pStyle w:val="31"/>
       </w:pPr>
-      <w:bookmarkStart w:id="46" w:name="_Toc242436192"/>
+      <w:bookmarkStart w:id="46" w:name="_Toc242450545"/>
       <w:r>
         <w:lastRenderedPageBreak/>
         <w:t>4.3.4 Требования к программному обеспечению</w:t>
@@ -7983,7 +7983,7 @@
       <w:pPr>
         <w:pStyle w:val="31"/>
       </w:pPr>
-      <w:bookmarkStart w:id="47" w:name="_Toc242436193"/>
+      <w:bookmarkStart w:id="47" w:name="_Toc242450546"/>
       <w:r>
         <w:t>4.3.5 Требования к техническому обеспечению</w:t>
       </w:r>
@@ -7998,7 +7998,7 @@
       <w:pPr>
         <w:pStyle w:val="31"/>
       </w:pPr>
-      <w:bookmarkStart w:id="48" w:name="_Toc242436194"/>
+      <w:bookmarkStart w:id="48" w:name="_Toc242450547"/>
       <w:r>
         <w:t>4.3.6 Требования к метрологическому обеспечению</w:t>
       </w:r>
@@ -8013,7 +8013,7 @@
       <w:pPr>
         <w:pStyle w:val="31"/>
       </w:pPr>
-      <w:bookmarkStart w:id="49" w:name="_Toc242436195"/>
+      <w:bookmarkStart w:id="49" w:name="_Toc242450548"/>
       <w:r>
         <w:t>4.3.7 Требования к организационному обеспечению</w:t>
       </w:r>
@@ -8028,7 +8028,7 @@
       <w:pPr>
         <w:pStyle w:val="31"/>
       </w:pPr>
-      <w:bookmarkStart w:id="50" w:name="_Toc242436196"/>
+      <w:bookmarkStart w:id="50" w:name="_Toc242450549"/>
       <w:r>
         <w:t>4.3.8 Требования к методическому обеспечению</w:t>
       </w:r>
@@ -8044,7 +8044,7 @@
         <w:pStyle w:val="1"/>
         <w:pageBreakBefore/>
       </w:pPr>
-      <w:bookmarkStart w:id="51" w:name="_Toc242436197"/>
+      <w:bookmarkStart w:id="51" w:name="_Toc242450550"/>
       <w:r>
         <w:lastRenderedPageBreak/>
         <w:t>5 Состав и содержание работ по созданию системы</w:t>
@@ -8366,7 +8366,7 @@
         <w:pStyle w:val="1"/>
         <w:pageBreakBefore/>
       </w:pPr>
-      <w:bookmarkStart w:id="52" w:name="_Toc242436198"/>
+      <w:bookmarkStart w:id="52" w:name="_Toc242450551"/>
       <w:r>
         <w:lastRenderedPageBreak/>
         <w:t>6 Порядок разработки автоматизированной системы</w:t>
@@ -8413,7 +8413,7 @@
         <w:pStyle w:val="1"/>
         <w:pageBreakBefore/>
       </w:pPr>
-      <w:bookmarkStart w:id="53" w:name="_Toc242436199"/>
+      <w:bookmarkStart w:id="53" w:name="_Toc242450552"/>
       <w:r>
         <w:lastRenderedPageBreak/>
         <w:t>7 Порядок контроля и приёмки автоматизированной системы</w:t>
@@ -8430,7 +8430,7 @@
         <w:pStyle w:val="1"/>
         <w:pageBreakBefore/>
       </w:pPr>
-      <w:bookmarkStart w:id="54" w:name="_Toc242436200"/>
+      <w:bookmarkStart w:id="54" w:name="_Toc242450553"/>
       <w:r>
         <w:lastRenderedPageBreak/>
         <w:t>8 Требования к составу и содержанию работ по подготовке объекта автоматизации к вводу системы в действие</w:t>
@@ -8492,7 +8492,7 @@
         <w:pStyle w:val="1"/>
         <w:pageBreakBefore/>
       </w:pPr>
-      <w:bookmarkStart w:id="55" w:name="_Toc242436201"/>
+      <w:bookmarkStart w:id="55" w:name="_Toc242450554"/>
       <w:r>
         <w:lastRenderedPageBreak/>
         <w:t>9 Требования к документированию</w:t>
@@ -9134,7 +9134,7 @@
         <w:pStyle w:val="1"/>
         <w:pageBreakBefore/>
       </w:pPr>
-      <w:bookmarkStart w:id="56" w:name="_Toc242436202"/>
+      <w:bookmarkStart w:id="56" w:name="_Toc242450555"/>
       <w:r>
         <w:lastRenderedPageBreak/>
         <w:t>10 Источники разработки</w:t>
@@ -9173,7 +9173,7 @@
         <w:ind w:firstLine="0"/>
         <w:jc w:val="center"/>
       </w:pPr>
-      <w:bookmarkStart w:id="57" w:name="_Toc242436203"/>
+      <w:bookmarkStart w:id="57" w:name="_Toc242450556"/>
       <w:r>
         <w:lastRenderedPageBreak/>
         <w:t>ЛИСТ РЕГИСТРАЦИИ ИЗМЕНЕНИЙ</w:t>
@@ -11235,31 +11235,31 @@
       </w:rPr>
     </w:lvl>
   </w:abstractNum>
-  <w:num w:numId="1" w16cid:durableId="321348158">
+  <w:num w:numId="1" w16cid:durableId="1158770557">
     <w:abstractNumId w:val="8"/>
   </w:num>
-  <w:num w:numId="2" w16cid:durableId="420224207">
+  <w:num w:numId="2" w16cid:durableId="204022004">
     <w:abstractNumId w:val="6"/>
   </w:num>
-  <w:num w:numId="3" w16cid:durableId="1411346708">
+  <w:num w:numId="3" w16cid:durableId="1016537157">
     <w:abstractNumId w:val="5"/>
   </w:num>
-  <w:num w:numId="4" w16cid:durableId="1972400174">
+  <w:num w:numId="4" w16cid:durableId="1597597093">
     <w:abstractNumId w:val="4"/>
   </w:num>
-  <w:num w:numId="5" w16cid:durableId="2053654485">
+  <w:num w:numId="5" w16cid:durableId="484473195">
     <w:abstractNumId w:val="7"/>
   </w:num>
-  <w:num w:numId="6" w16cid:durableId="382215258">
+  <w:num w:numId="6" w16cid:durableId="2113816960">
     <w:abstractNumId w:val="3"/>
   </w:num>
-  <w:num w:numId="7" w16cid:durableId="2066104577">
+  <w:num w:numId="7" w16cid:durableId="814445871">
     <w:abstractNumId w:val="2"/>
   </w:num>
-  <w:num w:numId="8" w16cid:durableId="516575263">
+  <w:num w:numId="8" w16cid:durableId="1441413466">
     <w:abstractNumId w:val="1"/>
   </w:num>
-  <w:num w:numId="9" w16cid:durableId="1791971064">
+  <w:num w:numId="9" w16cid:durableId="291253500">
     <w:abstractNumId w:val="0"/>
   </w:num>
 </w:numbering>
@@ -22792,7 +22792,7 @@
     <w:autoRedefine/>
     <w:uiPriority w:val="39"/>
     <w:unhideWhenUsed/>
-    <w:rsid w:val="00285B47"/>
+    <w:rsid w:val="00764942"/>
     <w:pPr>
       <w:spacing w:after="100"/>
     </w:pPr>
@@ -22804,7 +22804,7 @@
     <w:autoRedefine/>
     <w:uiPriority w:val="39"/>
     <w:unhideWhenUsed/>
-    <w:rsid w:val="00285B47"/>
+    <w:rsid w:val="00764942"/>
     <w:pPr>
       <w:spacing w:after="100"/>
       <w:ind w:left="240"/>
@@ -22817,7 +22817,7 @@
     <w:autoRedefine/>
     <w:uiPriority w:val="39"/>
     <w:unhideWhenUsed/>
-    <w:rsid w:val="00285B47"/>
+    <w:rsid w:val="00764942"/>
     <w:pPr>
       <w:spacing w:after="100"/>
       <w:ind w:left="480"/>
@@ -22828,7 +22828,7 @@
     <w:basedOn w:val="a2"/>
     <w:uiPriority w:val="99"/>
     <w:unhideWhenUsed/>
-    <w:rsid w:val="00285B47"/>
+    <w:rsid w:val="00764942"/>
     <w:rPr>
       <w:color w:val="0000FF" w:themeColor="hyperlink"/>
       <w:u w:val="single"/>

</xml_diff>

<commit_message>
More fixes for temmplates
</commit_message>
<xml_diff>
--- a/docs/gost/out/01_ТЗ_Техническое_задание.docx
+++ b/docs/gost/out/01_ТЗ_Техническое_задание.docx
@@ -306,7 +306,7 @@
       <w:r>
         <w:fldChar w:fldCharType="separate"/>
       </w:r>
-      <w:hyperlink w:anchor="_Toc242450499" w:history="1">
+      <w:hyperlink w:anchor="_Toc242457157" w:history="1">
         <w:r>
           <w:rPr>
             <w:rStyle w:val="aff8"/>
@@ -333,7 +333,7 @@
             <w:noProof/>
             <w:webHidden/>
           </w:rPr>
-          <w:instrText xml:space="preserve"> PAGEREF _Toc242450499 \h </w:instrText>
+          <w:instrText xml:space="preserve"> PAGEREF _Toc242457157 \h </w:instrText>
         </w:r>
         <w:r>
           <w:rPr>
@@ -379,7 +379,7 @@
           <w14:ligatures w14:val="standardContextual"/>
         </w:rPr>
       </w:pPr>
-      <w:hyperlink w:anchor="_Toc242450500" w:history="1">
+      <w:hyperlink w:anchor="_Toc242457158" w:history="1">
         <w:r>
           <w:rPr>
             <w:rStyle w:val="aff8"/>
@@ -406,7 +406,7 @@
             <w:noProof/>
             <w:webHidden/>
           </w:rPr>
-          <w:instrText xml:space="preserve"> PAGEREF _Toc242450500 \h </w:instrText>
+          <w:instrText xml:space="preserve"> PAGEREF _Toc242457158 \h </w:instrText>
         </w:r>
         <w:r>
           <w:rPr>
@@ -452,7 +452,7 @@
           <w14:ligatures w14:val="standardContextual"/>
         </w:rPr>
       </w:pPr>
-      <w:hyperlink w:anchor="_Toc242450501" w:history="1">
+      <w:hyperlink w:anchor="_Toc242457159" w:history="1">
         <w:r>
           <w:rPr>
             <w:rStyle w:val="aff8"/>
@@ -479,7 +479,7 @@
             <w:noProof/>
             <w:webHidden/>
           </w:rPr>
-          <w:instrText xml:space="preserve"> PAGEREF _Toc242450501 \h </w:instrText>
+          <w:instrText xml:space="preserve"> PAGEREF _Toc242457159 \h </w:instrText>
         </w:r>
         <w:r>
           <w:rPr>
@@ -525,7 +525,7 @@
           <w14:ligatures w14:val="standardContextual"/>
         </w:rPr>
       </w:pPr>
-      <w:hyperlink w:anchor="_Toc242450502" w:history="1">
+      <w:hyperlink w:anchor="_Toc242457160" w:history="1">
         <w:r>
           <w:rPr>
             <w:rStyle w:val="aff8"/>
@@ -552,7 +552,7 @@
             <w:noProof/>
             <w:webHidden/>
           </w:rPr>
-          <w:instrText xml:space="preserve"> PAGEREF _Toc242450502 \h </w:instrText>
+          <w:instrText xml:space="preserve"> PAGEREF _Toc242457160 \h </w:instrText>
         </w:r>
         <w:r>
           <w:rPr>
@@ -598,7 +598,7 @@
           <w14:ligatures w14:val="standardContextual"/>
         </w:rPr>
       </w:pPr>
-      <w:hyperlink w:anchor="_Toc242450503" w:history="1">
+      <w:hyperlink w:anchor="_Toc242457161" w:history="1">
         <w:r>
           <w:rPr>
             <w:rStyle w:val="aff8"/>
@@ -625,7 +625,7 @@
             <w:noProof/>
             <w:webHidden/>
           </w:rPr>
-          <w:instrText xml:space="preserve"> PAGEREF _Toc242450503 \h </w:instrText>
+          <w:instrText xml:space="preserve"> PAGEREF _Toc242457161 \h </w:instrText>
         </w:r>
         <w:r>
           <w:rPr>
@@ -671,7 +671,7 @@
           <w14:ligatures w14:val="standardContextual"/>
         </w:rPr>
       </w:pPr>
-      <w:hyperlink w:anchor="_Toc242450504" w:history="1">
+      <w:hyperlink w:anchor="_Toc242457162" w:history="1">
         <w:r>
           <w:rPr>
             <w:rStyle w:val="aff8"/>
@@ -698,7 +698,7 @@
             <w:noProof/>
             <w:webHidden/>
           </w:rPr>
-          <w:instrText xml:space="preserve"> PAGEREF _Toc242450504 \h </w:instrText>
+          <w:instrText xml:space="preserve"> PAGEREF _Toc242457162 \h </w:instrText>
         </w:r>
         <w:r>
           <w:rPr>
@@ -744,7 +744,7 @@
           <w14:ligatures w14:val="standardContextual"/>
         </w:rPr>
       </w:pPr>
-      <w:hyperlink w:anchor="_Toc242450505" w:history="1">
+      <w:hyperlink w:anchor="_Toc242457163" w:history="1">
         <w:r>
           <w:rPr>
             <w:rStyle w:val="aff8"/>
@@ -771,7 +771,7 @@
             <w:noProof/>
             <w:webHidden/>
           </w:rPr>
-          <w:instrText xml:space="preserve"> PAGEREF _Toc242450505 \h </w:instrText>
+          <w:instrText xml:space="preserve"> PAGEREF _Toc242457163 \h </w:instrText>
         </w:r>
         <w:r>
           <w:rPr>
@@ -817,7 +817,7 @@
           <w14:ligatures w14:val="standardContextual"/>
         </w:rPr>
       </w:pPr>
-      <w:hyperlink w:anchor="_Toc242450506" w:history="1">
+      <w:hyperlink w:anchor="_Toc242457164" w:history="1">
         <w:r>
           <w:rPr>
             <w:rStyle w:val="aff8"/>
@@ -844,7 +844,7 @@
             <w:noProof/>
             <w:webHidden/>
           </w:rPr>
-          <w:instrText xml:space="preserve"> PAGEREF _Toc242450506 \h </w:instrText>
+          <w:instrText xml:space="preserve"> PAGEREF _Toc242457164 \h </w:instrText>
         </w:r>
         <w:r>
           <w:rPr>
@@ -890,7 +890,7 @@
           <w14:ligatures w14:val="standardContextual"/>
         </w:rPr>
       </w:pPr>
-      <w:hyperlink w:anchor="_Toc242450507" w:history="1">
+      <w:hyperlink w:anchor="_Toc242457165" w:history="1">
         <w:r>
           <w:rPr>
             <w:rStyle w:val="aff8"/>
@@ -917,7 +917,7 @@
             <w:noProof/>
             <w:webHidden/>
           </w:rPr>
-          <w:instrText xml:space="preserve"> PAGEREF _Toc242450507 \h </w:instrText>
+          <w:instrText xml:space="preserve"> PAGEREF _Toc242457165 \h </w:instrText>
         </w:r>
         <w:r>
           <w:rPr>
@@ -963,7 +963,7 @@
           <w14:ligatures w14:val="standardContextual"/>
         </w:rPr>
       </w:pPr>
-      <w:hyperlink w:anchor="_Toc242450508" w:history="1">
+      <w:hyperlink w:anchor="_Toc242457166" w:history="1">
         <w:r>
           <w:rPr>
             <w:rStyle w:val="aff8"/>
@@ -990,7 +990,7 @@
             <w:noProof/>
             <w:webHidden/>
           </w:rPr>
-          <w:instrText xml:space="preserve"> PAGEREF _Toc242450508 \h </w:instrText>
+          <w:instrText xml:space="preserve"> PAGEREF _Toc242457166 \h </w:instrText>
         </w:r>
         <w:r>
           <w:rPr>
@@ -1036,7 +1036,7 @@
           <w14:ligatures w14:val="standardContextual"/>
         </w:rPr>
       </w:pPr>
-      <w:hyperlink w:anchor="_Toc242450509" w:history="1">
+      <w:hyperlink w:anchor="_Toc242457167" w:history="1">
         <w:r>
           <w:rPr>
             <w:rStyle w:val="aff8"/>
@@ -1063,7 +1063,7 @@
             <w:noProof/>
             <w:webHidden/>
           </w:rPr>
-          <w:instrText xml:space="preserve"> PAGEREF _Toc242450509 \h </w:instrText>
+          <w:instrText xml:space="preserve"> PAGEREF _Toc242457167 \h </w:instrText>
         </w:r>
         <w:r>
           <w:rPr>
@@ -1109,7 +1109,7 @@
           <w14:ligatures w14:val="standardContextual"/>
         </w:rPr>
       </w:pPr>
-      <w:hyperlink w:anchor="_Toc242450510" w:history="1">
+      <w:hyperlink w:anchor="_Toc242457168" w:history="1">
         <w:r>
           <w:rPr>
             <w:rStyle w:val="aff8"/>
@@ -1136,7 +1136,7 @@
             <w:noProof/>
             <w:webHidden/>
           </w:rPr>
-          <w:instrText xml:space="preserve"> PAGEREF _Toc242450510 \h </w:instrText>
+          <w:instrText xml:space="preserve"> PAGEREF _Toc242457168 \h </w:instrText>
         </w:r>
         <w:r>
           <w:rPr>
@@ -1182,7 +1182,7 @@
           <w14:ligatures w14:val="standardContextual"/>
         </w:rPr>
       </w:pPr>
-      <w:hyperlink w:anchor="_Toc242450511" w:history="1">
+      <w:hyperlink w:anchor="_Toc242457169" w:history="1">
         <w:r>
           <w:rPr>
             <w:rStyle w:val="aff8"/>
@@ -1209,7 +1209,7 @@
             <w:noProof/>
             <w:webHidden/>
           </w:rPr>
-          <w:instrText xml:space="preserve"> PAGEREF _Toc242450511 \h </w:instrText>
+          <w:instrText xml:space="preserve"> PAGEREF _Toc242457169 \h </w:instrText>
         </w:r>
         <w:r>
           <w:rPr>
@@ -1255,7 +1255,7 @@
           <w14:ligatures w14:val="standardContextual"/>
         </w:rPr>
       </w:pPr>
-      <w:hyperlink w:anchor="_Toc242450512" w:history="1">
+      <w:hyperlink w:anchor="_Toc242457170" w:history="1">
         <w:r>
           <w:rPr>
             <w:rStyle w:val="aff8"/>
@@ -1282,7 +1282,7 @@
             <w:noProof/>
             <w:webHidden/>
           </w:rPr>
-          <w:instrText xml:space="preserve"> PAGEREF _Toc242450512 \h </w:instrText>
+          <w:instrText xml:space="preserve"> PAGEREF _Toc242457170 \h </w:instrText>
         </w:r>
         <w:r>
           <w:rPr>
@@ -1328,7 +1328,7 @@
           <w14:ligatures w14:val="standardContextual"/>
         </w:rPr>
       </w:pPr>
-      <w:hyperlink w:anchor="_Toc242450513" w:history="1">
+      <w:hyperlink w:anchor="_Toc242457171" w:history="1">
         <w:r>
           <w:rPr>
             <w:rStyle w:val="aff8"/>
@@ -1355,7 +1355,7 @@
             <w:noProof/>
             <w:webHidden/>
           </w:rPr>
-          <w:instrText xml:space="preserve"> PAGEREF _Toc242450513 \h </w:instrText>
+          <w:instrText xml:space="preserve"> PAGEREF _Toc242457171 \h </w:instrText>
         </w:r>
         <w:r>
           <w:rPr>
@@ -1401,7 +1401,7 @@
           <w14:ligatures w14:val="standardContextual"/>
         </w:rPr>
       </w:pPr>
-      <w:hyperlink w:anchor="_Toc242450514" w:history="1">
+      <w:hyperlink w:anchor="_Toc242457172" w:history="1">
         <w:r>
           <w:rPr>
             <w:rStyle w:val="aff8"/>
@@ -1428,7 +1428,7 @@
             <w:noProof/>
             <w:webHidden/>
           </w:rPr>
-          <w:instrText xml:space="preserve"> PAGEREF _Toc242450514 \h </w:instrText>
+          <w:instrText xml:space="preserve"> PAGEREF _Toc242457172 \h </w:instrText>
         </w:r>
         <w:r>
           <w:rPr>
@@ -1474,7 +1474,7 @@
           <w14:ligatures w14:val="standardContextual"/>
         </w:rPr>
       </w:pPr>
-      <w:hyperlink w:anchor="_Toc242450515" w:history="1">
+      <w:hyperlink w:anchor="_Toc242457173" w:history="1">
         <w:r>
           <w:rPr>
             <w:rStyle w:val="aff8"/>
@@ -1501,7 +1501,7 @@
             <w:noProof/>
             <w:webHidden/>
           </w:rPr>
-          <w:instrText xml:space="preserve"> PAGEREF _Toc242450515 \h </w:instrText>
+          <w:instrText xml:space="preserve"> PAGEREF _Toc242457173 \h </w:instrText>
         </w:r>
         <w:r>
           <w:rPr>
@@ -1547,7 +1547,7 @@
           <w14:ligatures w14:val="standardContextual"/>
         </w:rPr>
       </w:pPr>
-      <w:hyperlink w:anchor="_Toc242450516" w:history="1">
+      <w:hyperlink w:anchor="_Toc242457174" w:history="1">
         <w:r>
           <w:rPr>
             <w:rStyle w:val="aff8"/>
@@ -1574,7 +1574,7 @@
             <w:noProof/>
             <w:webHidden/>
           </w:rPr>
-          <w:instrText xml:space="preserve"> PAGEREF _Toc242450516 \h </w:instrText>
+          <w:instrText xml:space="preserve"> PAGEREF _Toc242457174 \h </w:instrText>
         </w:r>
         <w:r>
           <w:rPr>
@@ -1620,7 +1620,7 @@
           <w14:ligatures w14:val="standardContextual"/>
         </w:rPr>
       </w:pPr>
-      <w:hyperlink w:anchor="_Toc242450517" w:history="1">
+      <w:hyperlink w:anchor="_Toc242457175" w:history="1">
         <w:r>
           <w:rPr>
             <w:rStyle w:val="aff8"/>
@@ -1647,7 +1647,7 @@
             <w:noProof/>
             <w:webHidden/>
           </w:rPr>
-          <w:instrText xml:space="preserve"> PAGEREF _Toc242450517 \h </w:instrText>
+          <w:instrText xml:space="preserve"> PAGEREF _Toc242457175 \h </w:instrText>
         </w:r>
         <w:r>
           <w:rPr>
@@ -1693,7 +1693,7 @@
           <w14:ligatures w14:val="standardContextual"/>
         </w:rPr>
       </w:pPr>
-      <w:hyperlink w:anchor="_Toc242450518" w:history="1">
+      <w:hyperlink w:anchor="_Toc242457176" w:history="1">
         <w:r>
           <w:rPr>
             <w:rStyle w:val="aff8"/>
@@ -1720,7 +1720,7 @@
             <w:noProof/>
             <w:webHidden/>
           </w:rPr>
-          <w:instrText xml:space="preserve"> PAGEREF _Toc242450518 \h </w:instrText>
+          <w:instrText xml:space="preserve"> PAGEREF _Toc242457176 \h </w:instrText>
         </w:r>
         <w:r>
           <w:rPr>
@@ -1766,7 +1766,7 @@
           <w14:ligatures w14:val="standardContextual"/>
         </w:rPr>
       </w:pPr>
-      <w:hyperlink w:anchor="_Toc242450519" w:history="1">
+      <w:hyperlink w:anchor="_Toc242457177" w:history="1">
         <w:r>
           <w:rPr>
             <w:rStyle w:val="aff8"/>
@@ -1793,7 +1793,7 @@
             <w:noProof/>
             <w:webHidden/>
           </w:rPr>
-          <w:instrText xml:space="preserve"> PAGEREF _Toc242450519 \h </w:instrText>
+          <w:instrText xml:space="preserve"> PAGEREF _Toc242457177 \h </w:instrText>
         </w:r>
         <w:r>
           <w:rPr>
@@ -1839,7 +1839,7 @@
           <w14:ligatures w14:val="standardContextual"/>
         </w:rPr>
       </w:pPr>
-      <w:hyperlink w:anchor="_Toc242450520" w:history="1">
+      <w:hyperlink w:anchor="_Toc242457178" w:history="1">
         <w:r>
           <w:rPr>
             <w:rStyle w:val="aff8"/>
@@ -1866,7 +1866,7 @@
             <w:noProof/>
             <w:webHidden/>
           </w:rPr>
-          <w:instrText xml:space="preserve"> PAGEREF _Toc242450520 \h </w:instrText>
+          <w:instrText xml:space="preserve"> PAGEREF _Toc242457178 \h </w:instrText>
         </w:r>
         <w:r>
           <w:rPr>
@@ -1912,7 +1912,7 @@
           <w14:ligatures w14:val="standardContextual"/>
         </w:rPr>
       </w:pPr>
-      <w:hyperlink w:anchor="_Toc242450521" w:history="1">
+      <w:hyperlink w:anchor="_Toc242457179" w:history="1">
         <w:r>
           <w:rPr>
             <w:rStyle w:val="aff8"/>
@@ -1939,7 +1939,7 @@
             <w:noProof/>
             <w:webHidden/>
           </w:rPr>
-          <w:instrText xml:space="preserve"> PAGEREF _Toc242450521 \h </w:instrText>
+          <w:instrText xml:space="preserve"> PAGEREF _Toc242457179 \h </w:instrText>
         </w:r>
         <w:r>
           <w:rPr>
@@ -1985,7 +1985,7 @@
           <w14:ligatures w14:val="standardContextual"/>
         </w:rPr>
       </w:pPr>
-      <w:hyperlink w:anchor="_Toc242450522" w:history="1">
+      <w:hyperlink w:anchor="_Toc242457180" w:history="1">
         <w:r>
           <w:rPr>
             <w:rStyle w:val="aff8"/>
@@ -2012,7 +2012,7 @@
             <w:noProof/>
             <w:webHidden/>
           </w:rPr>
-          <w:instrText xml:space="preserve"> PAGEREF _Toc242450522 \h </w:instrText>
+          <w:instrText xml:space="preserve"> PAGEREF _Toc242457180 \h </w:instrText>
         </w:r>
         <w:r>
           <w:rPr>
@@ -2058,7 +2058,7 @@
           <w14:ligatures w14:val="standardContextual"/>
         </w:rPr>
       </w:pPr>
-      <w:hyperlink w:anchor="_Toc242450523" w:history="1">
+      <w:hyperlink w:anchor="_Toc242457181" w:history="1">
         <w:r>
           <w:rPr>
             <w:rStyle w:val="aff8"/>
@@ -2085,7 +2085,7 @@
             <w:noProof/>
             <w:webHidden/>
           </w:rPr>
-          <w:instrText xml:space="preserve"> PAGEREF _Toc242450523 \h </w:instrText>
+          <w:instrText xml:space="preserve"> PAGEREF _Toc242457181 \h </w:instrText>
         </w:r>
         <w:r>
           <w:rPr>
@@ -2131,7 +2131,7 @@
           <w14:ligatures w14:val="standardContextual"/>
         </w:rPr>
       </w:pPr>
-      <w:hyperlink w:anchor="_Toc242450524" w:history="1">
+      <w:hyperlink w:anchor="_Toc242457182" w:history="1">
         <w:r>
           <w:rPr>
             <w:rStyle w:val="aff8"/>
@@ -2158,7 +2158,7 @@
             <w:noProof/>
             <w:webHidden/>
           </w:rPr>
-          <w:instrText xml:space="preserve"> PAGEREF _Toc242450524 \h </w:instrText>
+          <w:instrText xml:space="preserve"> PAGEREF _Toc242457182 \h </w:instrText>
         </w:r>
         <w:r>
           <w:rPr>
@@ -2204,7 +2204,7 @@
           <w14:ligatures w14:val="standardContextual"/>
         </w:rPr>
       </w:pPr>
-      <w:hyperlink w:anchor="_Toc242450525" w:history="1">
+      <w:hyperlink w:anchor="_Toc242457183" w:history="1">
         <w:r>
           <w:rPr>
             <w:rStyle w:val="aff8"/>
@@ -2231,7 +2231,7 @@
             <w:noProof/>
             <w:webHidden/>
           </w:rPr>
-          <w:instrText xml:space="preserve"> PAGEREF _Toc242450525 \h </w:instrText>
+          <w:instrText xml:space="preserve"> PAGEREF _Toc242457183 \h </w:instrText>
         </w:r>
         <w:r>
           <w:rPr>
@@ -2277,7 +2277,7 @@
           <w14:ligatures w14:val="standardContextual"/>
         </w:rPr>
       </w:pPr>
-      <w:hyperlink w:anchor="_Toc242450526" w:history="1">
+      <w:hyperlink w:anchor="_Toc242457184" w:history="1">
         <w:r>
           <w:rPr>
             <w:rStyle w:val="aff8"/>
@@ -2304,7 +2304,7 @@
             <w:noProof/>
             <w:webHidden/>
           </w:rPr>
-          <w:instrText xml:space="preserve"> PAGEREF _Toc242450526 \h </w:instrText>
+          <w:instrText xml:space="preserve"> PAGEREF _Toc242457184 \h </w:instrText>
         </w:r>
         <w:r>
           <w:rPr>
@@ -2350,7 +2350,7 @@
           <w14:ligatures w14:val="standardContextual"/>
         </w:rPr>
       </w:pPr>
-      <w:hyperlink w:anchor="_Toc242450527" w:history="1">
+      <w:hyperlink w:anchor="_Toc242457185" w:history="1">
         <w:r>
           <w:rPr>
             <w:rStyle w:val="aff8"/>
@@ -2377,7 +2377,7 @@
             <w:noProof/>
             <w:webHidden/>
           </w:rPr>
-          <w:instrText xml:space="preserve"> PAGEREF _Toc242450527 \h </w:instrText>
+          <w:instrText xml:space="preserve"> PAGEREF _Toc242457185 \h </w:instrText>
         </w:r>
         <w:r>
           <w:rPr>
@@ -2423,7 +2423,7 @@
           <w14:ligatures w14:val="standardContextual"/>
         </w:rPr>
       </w:pPr>
-      <w:hyperlink w:anchor="_Toc242450528" w:history="1">
+      <w:hyperlink w:anchor="_Toc242457186" w:history="1">
         <w:r>
           <w:rPr>
             <w:rStyle w:val="aff8"/>
@@ -2450,7 +2450,7 @@
             <w:noProof/>
             <w:webHidden/>
           </w:rPr>
-          <w:instrText xml:space="preserve"> PAGEREF _Toc242450528 \h </w:instrText>
+          <w:instrText xml:space="preserve"> PAGEREF _Toc242457186 \h </w:instrText>
         </w:r>
         <w:r>
           <w:rPr>
@@ -2496,7 +2496,7 @@
           <w14:ligatures w14:val="standardContextual"/>
         </w:rPr>
       </w:pPr>
-      <w:hyperlink w:anchor="_Toc242450529" w:history="1">
+      <w:hyperlink w:anchor="_Toc242457187" w:history="1">
         <w:r>
           <w:rPr>
             <w:rStyle w:val="aff8"/>
@@ -2523,7 +2523,7 @@
             <w:noProof/>
             <w:webHidden/>
           </w:rPr>
-          <w:instrText xml:space="preserve"> PAGEREF _Toc242450529 \h </w:instrText>
+          <w:instrText xml:space="preserve"> PAGEREF _Toc242457187 \h </w:instrText>
         </w:r>
         <w:r>
           <w:rPr>
@@ -2569,7 +2569,7 @@
           <w14:ligatures w14:val="standardContextual"/>
         </w:rPr>
       </w:pPr>
-      <w:hyperlink w:anchor="_Toc242450530" w:history="1">
+      <w:hyperlink w:anchor="_Toc242457188" w:history="1">
         <w:r>
           <w:rPr>
             <w:rStyle w:val="aff8"/>
@@ -2596,7 +2596,7 @@
             <w:noProof/>
             <w:webHidden/>
           </w:rPr>
-          <w:instrText xml:space="preserve"> PAGEREF _Toc242450530 \h </w:instrText>
+          <w:instrText xml:space="preserve"> PAGEREF _Toc242457188 \h </w:instrText>
         </w:r>
         <w:r>
           <w:rPr>
@@ -2642,7 +2642,7 @@
           <w14:ligatures w14:val="standardContextual"/>
         </w:rPr>
       </w:pPr>
-      <w:hyperlink w:anchor="_Toc242450531" w:history="1">
+      <w:hyperlink w:anchor="_Toc242457189" w:history="1">
         <w:r>
           <w:rPr>
             <w:rStyle w:val="aff8"/>
@@ -2669,7 +2669,7 @@
             <w:noProof/>
             <w:webHidden/>
           </w:rPr>
-          <w:instrText xml:space="preserve"> PAGEREF _Toc242450531 \h </w:instrText>
+          <w:instrText xml:space="preserve"> PAGEREF _Toc242457189 \h </w:instrText>
         </w:r>
         <w:r>
           <w:rPr>
@@ -2715,7 +2715,7 @@
           <w14:ligatures w14:val="standardContextual"/>
         </w:rPr>
       </w:pPr>
-      <w:hyperlink w:anchor="_Toc242450532" w:history="1">
+      <w:hyperlink w:anchor="_Toc242457190" w:history="1">
         <w:r>
           <w:rPr>
             <w:rStyle w:val="aff8"/>
@@ -2742,7 +2742,7 @@
             <w:noProof/>
             <w:webHidden/>
           </w:rPr>
-          <w:instrText xml:space="preserve"> PAGEREF _Toc242450532 \h </w:instrText>
+          <w:instrText xml:space="preserve"> PAGEREF _Toc242457190 \h </w:instrText>
         </w:r>
         <w:r>
           <w:rPr>
@@ -2788,7 +2788,7 @@
           <w14:ligatures w14:val="standardContextual"/>
         </w:rPr>
       </w:pPr>
-      <w:hyperlink w:anchor="_Toc242450533" w:history="1">
+      <w:hyperlink w:anchor="_Toc242457191" w:history="1">
         <w:r>
           <w:rPr>
             <w:rStyle w:val="aff8"/>
@@ -2815,7 +2815,7 @@
             <w:noProof/>
             <w:webHidden/>
           </w:rPr>
-          <w:instrText xml:space="preserve"> PAGEREF _Toc242450533 \h </w:instrText>
+          <w:instrText xml:space="preserve"> PAGEREF _Toc242457191 \h </w:instrText>
         </w:r>
         <w:r>
           <w:rPr>
@@ -2861,7 +2861,7 @@
           <w14:ligatures w14:val="standardContextual"/>
         </w:rPr>
       </w:pPr>
-      <w:hyperlink w:anchor="_Toc242450534" w:history="1">
+      <w:hyperlink w:anchor="_Toc242457192" w:history="1">
         <w:r>
           <w:rPr>
             <w:rStyle w:val="aff8"/>
@@ -2888,7 +2888,7 @@
             <w:noProof/>
             <w:webHidden/>
           </w:rPr>
-          <w:instrText xml:space="preserve"> PAGEREF _Toc242450534 \h </w:instrText>
+          <w:instrText xml:space="preserve"> PAGEREF _Toc242457192 \h </w:instrText>
         </w:r>
         <w:r>
           <w:rPr>
@@ -2934,7 +2934,7 @@
           <w14:ligatures w14:val="standardContextual"/>
         </w:rPr>
       </w:pPr>
-      <w:hyperlink w:anchor="_Toc242450535" w:history="1">
+      <w:hyperlink w:anchor="_Toc242457193" w:history="1">
         <w:r>
           <w:rPr>
             <w:rStyle w:val="aff8"/>
@@ -2961,7 +2961,7 @@
             <w:noProof/>
             <w:webHidden/>
           </w:rPr>
-          <w:instrText xml:space="preserve"> PAGEREF _Toc242450535 \h </w:instrText>
+          <w:instrText xml:space="preserve"> PAGEREF _Toc242457193 \h </w:instrText>
         </w:r>
         <w:r>
           <w:rPr>
@@ -3007,7 +3007,7 @@
           <w14:ligatures w14:val="standardContextual"/>
         </w:rPr>
       </w:pPr>
-      <w:hyperlink w:anchor="_Toc242450536" w:history="1">
+      <w:hyperlink w:anchor="_Toc242457194" w:history="1">
         <w:r>
           <w:rPr>
             <w:rStyle w:val="aff8"/>
@@ -3034,7 +3034,7 @@
             <w:noProof/>
             <w:webHidden/>
           </w:rPr>
-          <w:instrText xml:space="preserve"> PAGEREF _Toc242450536 \h </w:instrText>
+          <w:instrText xml:space="preserve"> PAGEREF _Toc242457194 \h </w:instrText>
         </w:r>
         <w:r>
           <w:rPr>
@@ -3080,7 +3080,7 @@
           <w14:ligatures w14:val="standardContextual"/>
         </w:rPr>
       </w:pPr>
-      <w:hyperlink w:anchor="_Toc242450537" w:history="1">
+      <w:hyperlink w:anchor="_Toc242457195" w:history="1">
         <w:r>
           <w:rPr>
             <w:rStyle w:val="aff8"/>
@@ -3107,7 +3107,7 @@
             <w:noProof/>
             <w:webHidden/>
           </w:rPr>
-          <w:instrText xml:space="preserve"> PAGEREF _Toc242450537 \h </w:instrText>
+          <w:instrText xml:space="preserve"> PAGEREF _Toc242457195 \h </w:instrText>
         </w:r>
         <w:r>
           <w:rPr>
@@ -3153,7 +3153,7 @@
           <w14:ligatures w14:val="standardContextual"/>
         </w:rPr>
       </w:pPr>
-      <w:hyperlink w:anchor="_Toc242450538" w:history="1">
+      <w:hyperlink w:anchor="_Toc242457196" w:history="1">
         <w:r>
           <w:rPr>
             <w:rStyle w:val="aff8"/>
@@ -3180,7 +3180,7 @@
             <w:noProof/>
             <w:webHidden/>
           </w:rPr>
-          <w:instrText xml:space="preserve"> PAGEREF _Toc242450538 \h </w:instrText>
+          <w:instrText xml:space="preserve"> PAGEREF _Toc242457196 \h </w:instrText>
         </w:r>
         <w:r>
           <w:rPr>
@@ -3226,7 +3226,7 @@
           <w14:ligatures w14:val="standardContextual"/>
         </w:rPr>
       </w:pPr>
-      <w:hyperlink w:anchor="_Toc242450539" w:history="1">
+      <w:hyperlink w:anchor="_Toc242457197" w:history="1">
         <w:r>
           <w:rPr>
             <w:rStyle w:val="aff8"/>
@@ -3253,7 +3253,7 @@
             <w:noProof/>
             <w:webHidden/>
           </w:rPr>
-          <w:instrText xml:space="preserve"> PAGEREF _Toc242450539 \h </w:instrText>
+          <w:instrText xml:space="preserve"> PAGEREF _Toc242457197 \h </w:instrText>
         </w:r>
         <w:r>
           <w:rPr>
@@ -3299,7 +3299,7 @@
           <w14:ligatures w14:val="standardContextual"/>
         </w:rPr>
       </w:pPr>
-      <w:hyperlink w:anchor="_Toc242450540" w:history="1">
+      <w:hyperlink w:anchor="_Toc242457198" w:history="1">
         <w:r>
           <w:rPr>
             <w:rStyle w:val="aff8"/>
@@ -3326,7 +3326,7 @@
             <w:noProof/>
             <w:webHidden/>
           </w:rPr>
-          <w:instrText xml:space="preserve"> PAGEREF _Toc242450540 \h </w:instrText>
+          <w:instrText xml:space="preserve"> PAGEREF _Toc242457198 \h </w:instrText>
         </w:r>
         <w:r>
           <w:rPr>
@@ -3372,7 +3372,7 @@
           <w14:ligatures w14:val="standardContextual"/>
         </w:rPr>
       </w:pPr>
-      <w:hyperlink w:anchor="_Toc242450541" w:history="1">
+      <w:hyperlink w:anchor="_Toc242457199" w:history="1">
         <w:r>
           <w:rPr>
             <w:rStyle w:val="aff8"/>
@@ -3399,7 +3399,7 @@
             <w:noProof/>
             <w:webHidden/>
           </w:rPr>
-          <w:instrText xml:space="preserve"> PAGEREF _Toc242450541 \h </w:instrText>
+          <w:instrText xml:space="preserve"> PAGEREF _Toc242457199 \h </w:instrText>
         </w:r>
         <w:r>
           <w:rPr>
@@ -3445,7 +3445,7 @@
           <w14:ligatures w14:val="standardContextual"/>
         </w:rPr>
       </w:pPr>
-      <w:hyperlink w:anchor="_Toc242450542" w:history="1">
+      <w:hyperlink w:anchor="_Toc242457200" w:history="1">
         <w:r>
           <w:rPr>
             <w:rStyle w:val="aff8"/>
@@ -3472,7 +3472,7 @@
             <w:noProof/>
             <w:webHidden/>
           </w:rPr>
-          <w:instrText xml:space="preserve"> PAGEREF _Toc242450542 \h </w:instrText>
+          <w:instrText xml:space="preserve"> PAGEREF _Toc242457200 \h </w:instrText>
         </w:r>
         <w:r>
           <w:rPr>
@@ -3518,7 +3518,7 @@
           <w14:ligatures w14:val="standardContextual"/>
         </w:rPr>
       </w:pPr>
-      <w:hyperlink w:anchor="_Toc242450543" w:history="1">
+      <w:hyperlink w:anchor="_Toc242457201" w:history="1">
         <w:r>
           <w:rPr>
             <w:rStyle w:val="aff8"/>
@@ -3545,7 +3545,7 @@
             <w:noProof/>
             <w:webHidden/>
           </w:rPr>
-          <w:instrText xml:space="preserve"> PAGEREF _Toc242450543 \h </w:instrText>
+          <w:instrText xml:space="preserve"> PAGEREF _Toc242457201 \h </w:instrText>
         </w:r>
         <w:r>
           <w:rPr>
@@ -3591,7 +3591,7 @@
           <w14:ligatures w14:val="standardContextual"/>
         </w:rPr>
       </w:pPr>
-      <w:hyperlink w:anchor="_Toc242450544" w:history="1">
+      <w:hyperlink w:anchor="_Toc242457202" w:history="1">
         <w:r>
           <w:rPr>
             <w:rStyle w:val="aff8"/>
@@ -3618,7 +3618,7 @@
             <w:noProof/>
             <w:webHidden/>
           </w:rPr>
-          <w:instrText xml:space="preserve"> PAGEREF _Toc242450544 \h </w:instrText>
+          <w:instrText xml:space="preserve"> PAGEREF _Toc242457202 \h </w:instrText>
         </w:r>
         <w:r>
           <w:rPr>
@@ -3664,7 +3664,7 @@
           <w14:ligatures w14:val="standardContextual"/>
         </w:rPr>
       </w:pPr>
-      <w:hyperlink w:anchor="_Toc242450545" w:history="1">
+      <w:hyperlink w:anchor="_Toc242457203" w:history="1">
         <w:r>
           <w:rPr>
             <w:rStyle w:val="aff8"/>
@@ -3691,7 +3691,7 @@
             <w:noProof/>
             <w:webHidden/>
           </w:rPr>
-          <w:instrText xml:space="preserve"> PAGEREF _Toc242450545 \h </w:instrText>
+          <w:instrText xml:space="preserve"> PAGEREF _Toc242457203 \h </w:instrText>
         </w:r>
         <w:r>
           <w:rPr>
@@ -3737,7 +3737,7 @@
           <w14:ligatures w14:val="standardContextual"/>
         </w:rPr>
       </w:pPr>
-      <w:hyperlink w:anchor="_Toc242450546" w:history="1">
+      <w:hyperlink w:anchor="_Toc242457204" w:history="1">
         <w:r>
           <w:rPr>
             <w:rStyle w:val="aff8"/>
@@ -3764,7 +3764,7 @@
             <w:noProof/>
             <w:webHidden/>
           </w:rPr>
-          <w:instrText xml:space="preserve"> PAGEREF _Toc242450546 \h </w:instrText>
+          <w:instrText xml:space="preserve"> PAGEREF _Toc242457204 \h </w:instrText>
         </w:r>
         <w:r>
           <w:rPr>
@@ -3810,7 +3810,7 @@
           <w14:ligatures w14:val="standardContextual"/>
         </w:rPr>
       </w:pPr>
-      <w:hyperlink w:anchor="_Toc242450547" w:history="1">
+      <w:hyperlink w:anchor="_Toc242457205" w:history="1">
         <w:r>
           <w:rPr>
             <w:rStyle w:val="aff8"/>
@@ -3837,7 +3837,7 @@
             <w:noProof/>
             <w:webHidden/>
           </w:rPr>
-          <w:instrText xml:space="preserve"> PAGEREF _Toc242450547 \h </w:instrText>
+          <w:instrText xml:space="preserve"> PAGEREF _Toc242457205 \h </w:instrText>
         </w:r>
         <w:r>
           <w:rPr>
@@ -3883,7 +3883,7 @@
           <w14:ligatures w14:val="standardContextual"/>
         </w:rPr>
       </w:pPr>
-      <w:hyperlink w:anchor="_Toc242450548" w:history="1">
+      <w:hyperlink w:anchor="_Toc242457206" w:history="1">
         <w:r>
           <w:rPr>
             <w:rStyle w:val="aff8"/>
@@ -3910,7 +3910,7 @@
             <w:noProof/>
             <w:webHidden/>
           </w:rPr>
-          <w:instrText xml:space="preserve"> PAGEREF _Toc242450548 \h </w:instrText>
+          <w:instrText xml:space="preserve"> PAGEREF _Toc242457206 \h </w:instrText>
         </w:r>
         <w:r>
           <w:rPr>
@@ -3956,7 +3956,7 @@
           <w14:ligatures w14:val="standardContextual"/>
         </w:rPr>
       </w:pPr>
-      <w:hyperlink w:anchor="_Toc242450549" w:history="1">
+      <w:hyperlink w:anchor="_Toc242457207" w:history="1">
         <w:r>
           <w:rPr>
             <w:rStyle w:val="aff8"/>
@@ -3983,7 +3983,7 @@
             <w:noProof/>
             <w:webHidden/>
           </w:rPr>
-          <w:instrText xml:space="preserve"> PAGEREF _Toc242450549 \h </w:instrText>
+          <w:instrText xml:space="preserve"> PAGEREF _Toc242457207 \h </w:instrText>
         </w:r>
         <w:r>
           <w:rPr>
@@ -4029,7 +4029,7 @@
           <w14:ligatures w14:val="standardContextual"/>
         </w:rPr>
       </w:pPr>
-      <w:hyperlink w:anchor="_Toc242450550" w:history="1">
+      <w:hyperlink w:anchor="_Toc242457208" w:history="1">
         <w:r>
           <w:rPr>
             <w:rStyle w:val="aff8"/>
@@ -4056,7 +4056,7 @@
             <w:noProof/>
             <w:webHidden/>
           </w:rPr>
-          <w:instrText xml:space="preserve"> PAGEREF _Toc242450550 \h </w:instrText>
+          <w:instrText xml:space="preserve"> PAGEREF _Toc242457208 \h </w:instrText>
         </w:r>
         <w:r>
           <w:rPr>
@@ -4102,7 +4102,7 @@
           <w14:ligatures w14:val="standardContextual"/>
         </w:rPr>
       </w:pPr>
-      <w:hyperlink w:anchor="_Toc242450551" w:history="1">
+      <w:hyperlink w:anchor="_Toc242457209" w:history="1">
         <w:r>
           <w:rPr>
             <w:rStyle w:val="aff8"/>
@@ -4129,7 +4129,7 @@
             <w:noProof/>
             <w:webHidden/>
           </w:rPr>
-          <w:instrText xml:space="preserve"> PAGEREF _Toc242450551 \h </w:instrText>
+          <w:instrText xml:space="preserve"> PAGEREF _Toc242457209 \h </w:instrText>
         </w:r>
         <w:r>
           <w:rPr>
@@ -4175,7 +4175,7 @@
           <w14:ligatures w14:val="standardContextual"/>
         </w:rPr>
       </w:pPr>
-      <w:hyperlink w:anchor="_Toc242450552" w:history="1">
+      <w:hyperlink w:anchor="_Toc242457210" w:history="1">
         <w:r>
           <w:rPr>
             <w:rStyle w:val="aff8"/>
@@ -4202,7 +4202,7 @@
             <w:noProof/>
             <w:webHidden/>
           </w:rPr>
-          <w:instrText xml:space="preserve"> PAGEREF _Toc242450552 \h </w:instrText>
+          <w:instrText xml:space="preserve"> PAGEREF _Toc242457210 \h </w:instrText>
         </w:r>
         <w:r>
           <w:rPr>
@@ -4248,7 +4248,7 @@
           <w14:ligatures w14:val="standardContextual"/>
         </w:rPr>
       </w:pPr>
-      <w:hyperlink w:anchor="_Toc242450553" w:history="1">
+      <w:hyperlink w:anchor="_Toc242457211" w:history="1">
         <w:r>
           <w:rPr>
             <w:rStyle w:val="aff8"/>
@@ -4275,7 +4275,7 @@
             <w:noProof/>
             <w:webHidden/>
           </w:rPr>
-          <w:instrText xml:space="preserve"> PAGEREF _Toc242450553 \h </w:instrText>
+          <w:instrText xml:space="preserve"> PAGEREF _Toc242457211 \h </w:instrText>
         </w:r>
         <w:r>
           <w:rPr>
@@ -4321,7 +4321,7 @@
           <w14:ligatures w14:val="standardContextual"/>
         </w:rPr>
       </w:pPr>
-      <w:hyperlink w:anchor="_Toc242450554" w:history="1">
+      <w:hyperlink w:anchor="_Toc242457212" w:history="1">
         <w:r>
           <w:rPr>
             <w:rStyle w:val="aff8"/>
@@ -4348,7 +4348,7 @@
             <w:noProof/>
             <w:webHidden/>
           </w:rPr>
-          <w:instrText xml:space="preserve"> PAGEREF _Toc242450554 \h </w:instrText>
+          <w:instrText xml:space="preserve"> PAGEREF _Toc242457212 \h </w:instrText>
         </w:r>
         <w:r>
           <w:rPr>
@@ -4394,7 +4394,7 @@
           <w14:ligatures w14:val="standardContextual"/>
         </w:rPr>
       </w:pPr>
-      <w:hyperlink w:anchor="_Toc242450555" w:history="1">
+      <w:hyperlink w:anchor="_Toc242457213" w:history="1">
         <w:r>
           <w:rPr>
             <w:rStyle w:val="aff8"/>
@@ -4421,7 +4421,7 @@
             <w:noProof/>
             <w:webHidden/>
           </w:rPr>
-          <w:instrText xml:space="preserve"> PAGEREF _Toc242450555 \h </w:instrText>
+          <w:instrText xml:space="preserve"> PAGEREF _Toc242457213 \h </w:instrText>
         </w:r>
         <w:r>
           <w:rPr>
@@ -4467,7 +4467,7 @@
           <w14:ligatures w14:val="standardContextual"/>
         </w:rPr>
       </w:pPr>
-      <w:hyperlink w:anchor="_Toc242450556" w:history="1">
+      <w:hyperlink w:anchor="_Toc242457214" w:history="1">
         <w:r>
           <w:rPr>
             <w:rStyle w:val="aff8"/>
@@ -4494,7 +4494,7 @@
             <w:noProof/>
             <w:webHidden/>
           </w:rPr>
-          <w:instrText xml:space="preserve"> PAGEREF _Toc242450556 \h </w:instrText>
+          <w:instrText xml:space="preserve"> PAGEREF _Toc242457214 \h </w:instrText>
         </w:r>
         <w:r>
           <w:rPr>
@@ -4540,7 +4540,7 @@
         <w:ind w:firstLine="0"/>
         <w:jc w:val="center"/>
       </w:pPr>
-      <w:bookmarkStart w:id="0" w:name="_Toc242450499"/>
+      <w:bookmarkStart w:id="0" w:name="_Toc242457157"/>
       <w:r>
         <w:lastRenderedPageBreak/>
         <w:t>ПЕРЕЧЕНЬ ТЕРМИНОВ И СОКРАЩЕНИЙ</w:t>
@@ -5802,7 +5802,7 @@
         <w:pStyle w:val="1"/>
         <w:pageBreakBefore/>
       </w:pPr>
-      <w:bookmarkStart w:id="1" w:name="_Toc242450500"/>
+      <w:bookmarkStart w:id="1" w:name="_Toc242457158"/>
       <w:r>
         <w:lastRenderedPageBreak/>
         <w:t>1 Общие сведения</w:t>
@@ -5813,7 +5813,7 @@
       <w:pPr>
         <w:pStyle w:val="21"/>
       </w:pPr>
-      <w:bookmarkStart w:id="2" w:name="_Toc242450501"/>
+      <w:bookmarkStart w:id="2" w:name="_Toc242457159"/>
       <w:r>
         <w:t>1.1 Полное наименование системы и её условное обозначение</w:t>
       </w:r>
@@ -5833,7 +5833,7 @@
       <w:pPr>
         <w:pStyle w:val="21"/>
       </w:pPr>
-      <w:bookmarkStart w:id="3" w:name="_Toc242450502"/>
+      <w:bookmarkStart w:id="3" w:name="_Toc242457160"/>
       <w:r>
         <w:t>1.2 Шифр темы и номер договора</w:t>
       </w:r>
@@ -5848,7 +5848,7 @@
       <w:pPr>
         <w:pStyle w:val="21"/>
       </w:pPr>
-      <w:bookmarkStart w:id="4" w:name="_Toc242450503"/>
+      <w:bookmarkStart w:id="4" w:name="_Toc242457161"/>
       <w:r>
         <w:t>1.3 Наименования организаций заказчика и разработчика</w:t>
       </w:r>
@@ -5868,7 +5868,7 @@
       <w:pPr>
         <w:pStyle w:val="21"/>
       </w:pPr>
-      <w:bookmarkStart w:id="5" w:name="_Toc242450504"/>
+      <w:bookmarkStart w:id="5" w:name="_Toc242457162"/>
       <w:r>
         <w:t>1.4 Основания для создания системы</w:t>
       </w:r>
@@ -5893,7 +5893,7 @@
       <w:pPr>
         <w:pStyle w:val="21"/>
       </w:pPr>
-      <w:bookmarkStart w:id="6" w:name="_Toc242450505"/>
+      <w:bookmarkStart w:id="6" w:name="_Toc242457163"/>
       <w:r>
         <w:t>1.5 Плановые сроки начала и окончания работ</w:t>
       </w:r>
@@ -5908,7 +5908,7 @@
       <w:pPr>
         <w:pStyle w:val="21"/>
       </w:pPr>
-      <w:bookmarkStart w:id="7" w:name="_Toc242450506"/>
+      <w:bookmarkStart w:id="7" w:name="_Toc242457164"/>
       <w:r>
         <w:t>1.6 Сведения об источниках и порядке финансирования</w:t>
       </w:r>
@@ -5923,7 +5923,7 @@
       <w:pPr>
         <w:pStyle w:val="21"/>
       </w:pPr>
-      <w:bookmarkStart w:id="8" w:name="_Toc242450507"/>
+      <w:bookmarkStart w:id="8" w:name="_Toc242457165"/>
       <w:r>
         <w:lastRenderedPageBreak/>
         <w:t>1.7 Порядок оформления и предъявления результатов работ</w:t>
@@ -5939,7 +5939,7 @@
       <w:pPr>
         <w:pStyle w:val="21"/>
       </w:pPr>
-      <w:bookmarkStart w:id="9" w:name="_Toc242450508"/>
+      <w:bookmarkStart w:id="9" w:name="_Toc242457166"/>
       <w:r>
         <w:t>1.8 Перечень нормативно-технических документов</w:t>
       </w:r>
@@ -6003,7 +6003,7 @@
         <w:pStyle w:val="1"/>
         <w:pageBreakBefore/>
       </w:pPr>
-      <w:bookmarkStart w:id="10" w:name="_Toc242450509"/>
+      <w:bookmarkStart w:id="10" w:name="_Toc242457167"/>
       <w:r>
         <w:lastRenderedPageBreak/>
         <w:t>2 Цели и назначение создания автоматизированной системы</w:t>
@@ -6014,7 +6014,7 @@
       <w:pPr>
         <w:pStyle w:val="21"/>
       </w:pPr>
-      <w:bookmarkStart w:id="11" w:name="_Toc242450510"/>
+      <w:bookmarkStart w:id="11" w:name="_Toc242457168"/>
       <w:r>
         <w:t>2.1 Назначение системы</w:t>
       </w:r>
@@ -6074,7 +6074,7 @@
       <w:pPr>
         <w:pStyle w:val="21"/>
       </w:pPr>
-      <w:bookmarkStart w:id="12" w:name="_Toc242450511"/>
+      <w:bookmarkStart w:id="12" w:name="_Toc242457169"/>
       <w:r>
         <w:t>2.2 Цели создания системы</w:t>
       </w:r>
@@ -6120,7 +6120,7 @@
         <w:pStyle w:val="1"/>
         <w:pageBreakBefore/>
       </w:pPr>
-      <w:bookmarkStart w:id="13" w:name="_Toc242450512"/>
+      <w:bookmarkStart w:id="13" w:name="_Toc242457170"/>
       <w:r>
         <w:lastRenderedPageBreak/>
         <w:t>3 Характеристика объекта автоматизации</w:t>
@@ -6131,7 +6131,7 @@
       <w:pPr>
         <w:pStyle w:val="21"/>
       </w:pPr>
-      <w:bookmarkStart w:id="14" w:name="_Toc242450513"/>
+      <w:bookmarkStart w:id="14" w:name="_Toc242457171"/>
       <w:r>
         <w:t>3.1 Краткие сведения об объекте автоматизации</w:t>
       </w:r>
@@ -6221,7 +6221,7 @@
       <w:pPr>
         <w:pStyle w:val="21"/>
       </w:pPr>
-      <w:bookmarkStart w:id="15" w:name="_Toc242450514"/>
+      <w:bookmarkStart w:id="15" w:name="_Toc242457172"/>
       <w:r>
         <w:t>3.2 Сведения об условиях эксплуатации</w:t>
       </w:r>
@@ -6237,7 +6237,7 @@
         <w:pStyle w:val="1"/>
         <w:pageBreakBefore/>
       </w:pPr>
-      <w:bookmarkStart w:id="16" w:name="_Toc242450515"/>
+      <w:bookmarkStart w:id="16" w:name="_Toc242457173"/>
       <w:r>
         <w:lastRenderedPageBreak/>
         <w:t>4 Требования к автоматизированной системе</w:t>
@@ -6248,7 +6248,7 @@
       <w:pPr>
         <w:pStyle w:val="21"/>
       </w:pPr>
-      <w:bookmarkStart w:id="17" w:name="_Toc242450516"/>
+      <w:bookmarkStart w:id="17" w:name="_Toc242457174"/>
       <w:r>
         <w:t>4.1 Требования к системе в целом</w:t>
       </w:r>
@@ -6258,7 +6258,7 @@
       <w:pPr>
         <w:pStyle w:val="31"/>
       </w:pPr>
-      <w:bookmarkStart w:id="18" w:name="_Toc242450517"/>
+      <w:bookmarkStart w:id="18" w:name="_Toc242457175"/>
       <w:r>
         <w:t>4.1.1 Требования к структуре и функционированию системы</w:t>
       </w:r>
@@ -6904,7 +6904,7 @@
       <w:pPr>
         <w:pStyle w:val="31"/>
       </w:pPr>
-      <w:bookmarkStart w:id="19" w:name="_Toc242450518"/>
+      <w:bookmarkStart w:id="19" w:name="_Toc242457176"/>
       <w:r>
         <w:t>4.1.2 Требования к численности и квалификации персонала</w:t>
       </w:r>
@@ -7185,7 +7185,7 @@
       <w:pPr>
         <w:pStyle w:val="31"/>
       </w:pPr>
-      <w:bookmarkStart w:id="20" w:name="_Toc242450519"/>
+      <w:bookmarkStart w:id="20" w:name="_Toc242457177"/>
       <w:r>
         <w:t>4.1.3 Показатели назначения</w:t>
       </w:r>
@@ -7233,7 +7233,7 @@
       <w:pPr>
         <w:pStyle w:val="31"/>
       </w:pPr>
-      <w:bookmarkStart w:id="21" w:name="_Toc242450520"/>
+      <w:bookmarkStart w:id="21" w:name="_Toc242457178"/>
       <w:r>
         <w:t>4.1.4 Требования к надёжности</w:t>
       </w:r>
@@ -7267,7 +7267,7 @@
       <w:pPr>
         <w:pStyle w:val="31"/>
       </w:pPr>
-      <w:bookmarkStart w:id="22" w:name="_Toc242450521"/>
+      <w:bookmarkStart w:id="22" w:name="_Toc242457179"/>
       <w:r>
         <w:t>4.1.5 Требования к безопасности</w:t>
       </w:r>
@@ -7282,7 +7282,7 @@
       <w:pPr>
         <w:pStyle w:val="31"/>
       </w:pPr>
-      <w:bookmarkStart w:id="23" w:name="_Toc242450522"/>
+      <w:bookmarkStart w:id="23" w:name="_Toc242457180"/>
       <w:r>
         <w:t>4.1.6 Требования к эргономике и технической эстетике</w:t>
       </w:r>
@@ -7327,7 +7327,7 @@
       <w:pPr>
         <w:pStyle w:val="31"/>
       </w:pPr>
-      <w:bookmarkStart w:id="24" w:name="_Toc242450523"/>
+      <w:bookmarkStart w:id="24" w:name="_Toc242457181"/>
       <w:r>
         <w:t>4.1.7 Требования к эксплуатации и техническому обслуживанию</w:t>
       </w:r>
@@ -7357,7 +7357,7 @@
       <w:pPr>
         <w:pStyle w:val="31"/>
       </w:pPr>
-      <w:bookmarkStart w:id="25" w:name="_Toc242450524"/>
+      <w:bookmarkStart w:id="25" w:name="_Toc242457182"/>
       <w:r>
         <w:t>4.1.8 Требования к защите информации от несанкционированного доступа</w:t>
       </w:r>
@@ -7428,7 +7428,7 @@
       <w:pPr>
         <w:pStyle w:val="31"/>
       </w:pPr>
-      <w:bookmarkStart w:id="26" w:name="_Toc242450525"/>
+      <w:bookmarkStart w:id="26" w:name="_Toc242457183"/>
       <w:r>
         <w:t>4.1.9 Требования по сохранности информации при авариях</w:t>
       </w:r>
@@ -7449,7 +7449,7 @@
       <w:pPr>
         <w:pStyle w:val="31"/>
       </w:pPr>
-      <w:bookmarkStart w:id="27" w:name="_Toc242450526"/>
+      <w:bookmarkStart w:id="27" w:name="_Toc242457184"/>
       <w:r>
         <w:t>4.1.10 Требования к защите от влияния внешних воздействий</w:t>
       </w:r>
@@ -7464,7 +7464,7 @@
       <w:pPr>
         <w:pStyle w:val="31"/>
       </w:pPr>
-      <w:bookmarkStart w:id="28" w:name="_Toc242450527"/>
+      <w:bookmarkStart w:id="28" w:name="_Toc242457185"/>
       <w:r>
         <w:t>4.1.11 Требования к патентной чистоте</w:t>
       </w:r>
@@ -7482,7 +7482,7 @@
       <w:pPr>
         <w:pStyle w:val="31"/>
       </w:pPr>
-      <w:bookmarkStart w:id="29" w:name="_Toc242450528"/>
+      <w:bookmarkStart w:id="29" w:name="_Toc242457186"/>
       <w:r>
         <w:t>4.1.12 Требования по стандартизации и унификации</w:t>
       </w:r>
@@ -7497,7 +7497,7 @@
       <w:pPr>
         <w:pStyle w:val="31"/>
       </w:pPr>
-      <w:bookmarkStart w:id="30" w:name="_Toc242450529"/>
+      <w:bookmarkStart w:id="30" w:name="_Toc242457187"/>
       <w:r>
         <w:t>4.1.13 Дополнительные требования</w:t>
       </w:r>
@@ -7517,7 +7517,7 @@
       <w:pPr>
         <w:pStyle w:val="21"/>
       </w:pPr>
-      <w:bookmarkStart w:id="31" w:name="_Toc242450530"/>
+      <w:bookmarkStart w:id="31" w:name="_Toc242457188"/>
       <w:r>
         <w:lastRenderedPageBreak/>
         <w:t>4.2 Требования к функциям, выполняемым системой</w:t>
@@ -7533,7 +7533,7 @@
       <w:pPr>
         <w:pStyle w:val="31"/>
       </w:pPr>
-      <w:bookmarkStart w:id="32" w:name="_Toc242450531"/>
+      <w:bookmarkStart w:id="32" w:name="_Toc242457189"/>
       <w:r>
         <w:t>4.2.1 Подсистема «Организационная структура и права доступа»</w:t>
       </w:r>
@@ -7578,7 +7578,7 @@
       <w:pPr>
         <w:pStyle w:val="31"/>
       </w:pPr>
-      <w:bookmarkStart w:id="33" w:name="_Toc242450532"/>
+      <w:bookmarkStart w:id="33" w:name="_Toc242457190"/>
       <w:r>
         <w:t>4.2.2 Подсистема «Каталог недвижимости»</w:t>
       </w:r>
@@ -7629,7 +7629,7 @@
       <w:pPr>
         <w:pStyle w:val="31"/>
       </w:pPr>
-      <w:bookmarkStart w:id="34" w:name="_Toc242450533"/>
+      <w:bookmarkStart w:id="34" w:name="_Toc242457191"/>
       <w:r>
         <w:t>4.2.3 Подсистема «Работа с клиентами»</w:t>
       </w:r>
@@ -7669,7 +7669,7 @@
       <w:pPr>
         <w:pStyle w:val="31"/>
       </w:pPr>
-      <w:bookmarkStart w:id="35" w:name="_Toc242450534"/>
+      <w:bookmarkStart w:id="35" w:name="_Toc242457192"/>
       <w:r>
         <w:t>4.2.4 Подсистема «Сделки»</w:t>
       </w:r>
@@ -7720,7 +7720,7 @@
       <w:pPr>
         <w:pStyle w:val="31"/>
       </w:pPr>
-      <w:bookmarkStart w:id="36" w:name="_Toc242450535"/>
+      <w:bookmarkStart w:id="36" w:name="_Toc242457193"/>
       <w:r>
         <w:t>4.2.5 Подсистема «Финансы»</w:t>
       </w:r>
@@ -7785,7 +7785,7 @@
       <w:pPr>
         <w:pStyle w:val="31"/>
       </w:pPr>
-      <w:bookmarkStart w:id="37" w:name="_Toc242450536"/>
+      <w:bookmarkStart w:id="37" w:name="_Toc242457194"/>
       <w:r>
         <w:lastRenderedPageBreak/>
         <w:t>4.2.6 Подсистема «Шаблоны документов»</w:t>
@@ -7801,7 +7801,7 @@
       <w:pPr>
         <w:pStyle w:val="31"/>
       </w:pPr>
-      <w:bookmarkStart w:id="38" w:name="_Toc242450537"/>
+      <w:bookmarkStart w:id="38" w:name="_Toc242457195"/>
       <w:r>
         <w:t>4.2.7 Подсистема «Задачи»</w:t>
       </w:r>
@@ -7816,7 +7816,7 @@
       <w:pPr>
         <w:pStyle w:val="31"/>
       </w:pPr>
-      <w:bookmarkStart w:id="39" w:name="_Toc242450538"/>
+      <w:bookmarkStart w:id="39" w:name="_Toc242457196"/>
       <w:r>
         <w:t>4.2.8 Подсистема «Аналитика и отчётность»</w:t>
       </w:r>
@@ -7856,7 +7856,7 @@
       <w:pPr>
         <w:pStyle w:val="31"/>
       </w:pPr>
-      <w:bookmarkStart w:id="40" w:name="_Toc242450539"/>
+      <w:bookmarkStart w:id="40" w:name="_Toc242457197"/>
       <w:r>
         <w:t>4.2.9 Подсистема «Интеграция с партнёрами»</w:t>
       </w:r>
@@ -7871,7 +7871,7 @@
       <w:pPr>
         <w:pStyle w:val="31"/>
       </w:pPr>
-      <w:bookmarkStart w:id="41" w:name="_Toc242450540"/>
+      <w:bookmarkStart w:id="41" w:name="_Toc242457198"/>
       <w:r>
         <w:lastRenderedPageBreak/>
         <w:t>4.2.10 Подсистема «Регламентные задания»</w:t>
@@ -7887,7 +7887,7 @@
       <w:pPr>
         <w:pStyle w:val="21"/>
       </w:pPr>
-      <w:bookmarkStart w:id="42" w:name="_Toc242450541"/>
+      <w:bookmarkStart w:id="42" w:name="_Toc242457199"/>
       <w:r>
         <w:t>4.3 Требования к видам обеспечения</w:t>
       </w:r>
@@ -7897,7 +7897,7 @@
       <w:pPr>
         <w:pStyle w:val="31"/>
       </w:pPr>
-      <w:bookmarkStart w:id="43" w:name="_Toc242450542"/>
+      <w:bookmarkStart w:id="43" w:name="_Toc242457200"/>
       <w:r>
         <w:t>4.3.1 Требования к математическому обеспечению</w:t>
       </w:r>
@@ -7937,7 +7937,7 @@
       <w:pPr>
         <w:pStyle w:val="31"/>
       </w:pPr>
-      <w:bookmarkStart w:id="44" w:name="_Toc242450543"/>
+      <w:bookmarkStart w:id="44" w:name="_Toc242457201"/>
       <w:r>
         <w:t>4.3.2 Требования к информационному обеспечению</w:t>
       </w:r>
@@ -7952,7 +7952,7 @@
       <w:pPr>
         <w:pStyle w:val="31"/>
       </w:pPr>
-      <w:bookmarkStart w:id="45" w:name="_Toc242450544"/>
+      <w:bookmarkStart w:id="45" w:name="_Toc242457202"/>
       <w:r>
         <w:t>4.3.3 Требования к лингвистическому обеспечению</w:t>
       </w:r>
@@ -7967,7 +7967,7 @@
       <w:pPr>
         <w:pStyle w:val="31"/>
       </w:pPr>
-      <w:bookmarkStart w:id="46" w:name="_Toc242450545"/>
+      <w:bookmarkStart w:id="46" w:name="_Toc242457203"/>
       <w:r>
         <w:lastRenderedPageBreak/>
         <w:t>4.3.4 Требования к программному обеспечению</w:t>
@@ -7983,7 +7983,7 @@
       <w:pPr>
         <w:pStyle w:val="31"/>
       </w:pPr>
-      <w:bookmarkStart w:id="47" w:name="_Toc242450546"/>
+      <w:bookmarkStart w:id="47" w:name="_Toc242457204"/>
       <w:r>
         <w:t>4.3.5 Требования к техническому обеспечению</w:t>
       </w:r>
@@ -7998,7 +7998,7 @@
       <w:pPr>
         <w:pStyle w:val="31"/>
       </w:pPr>
-      <w:bookmarkStart w:id="48" w:name="_Toc242450547"/>
+      <w:bookmarkStart w:id="48" w:name="_Toc242457205"/>
       <w:r>
         <w:t>4.3.6 Требования к метрологическому обеспечению</w:t>
       </w:r>
@@ -8013,7 +8013,7 @@
       <w:pPr>
         <w:pStyle w:val="31"/>
       </w:pPr>
-      <w:bookmarkStart w:id="49" w:name="_Toc242450548"/>
+      <w:bookmarkStart w:id="49" w:name="_Toc242457206"/>
       <w:r>
         <w:t>4.3.7 Требования к организационному обеспечению</w:t>
       </w:r>
@@ -8028,7 +8028,7 @@
       <w:pPr>
         <w:pStyle w:val="31"/>
       </w:pPr>
-      <w:bookmarkStart w:id="50" w:name="_Toc242450549"/>
+      <w:bookmarkStart w:id="50" w:name="_Toc242457207"/>
       <w:r>
         <w:t>4.3.8 Требования к методическому обеспечению</w:t>
       </w:r>
@@ -8044,7 +8044,7 @@
         <w:pStyle w:val="1"/>
         <w:pageBreakBefore/>
       </w:pPr>
-      <w:bookmarkStart w:id="51" w:name="_Toc242450550"/>
+      <w:bookmarkStart w:id="51" w:name="_Toc242457208"/>
       <w:r>
         <w:lastRenderedPageBreak/>
         <w:t>5 Состав и содержание работ по созданию системы</w:t>
@@ -8366,7 +8366,7 @@
         <w:pStyle w:val="1"/>
         <w:pageBreakBefore/>
       </w:pPr>
-      <w:bookmarkStart w:id="52" w:name="_Toc242450551"/>
+      <w:bookmarkStart w:id="52" w:name="_Toc242457209"/>
       <w:r>
         <w:lastRenderedPageBreak/>
         <w:t>6 Порядок разработки автоматизированной системы</w:t>
@@ -8413,7 +8413,7 @@
         <w:pStyle w:val="1"/>
         <w:pageBreakBefore/>
       </w:pPr>
-      <w:bookmarkStart w:id="53" w:name="_Toc242450552"/>
+      <w:bookmarkStart w:id="53" w:name="_Toc242457210"/>
       <w:r>
         <w:lastRenderedPageBreak/>
         <w:t>7 Порядок контроля и приёмки автоматизированной системы</w:t>
@@ -8430,7 +8430,7 @@
         <w:pStyle w:val="1"/>
         <w:pageBreakBefore/>
       </w:pPr>
-      <w:bookmarkStart w:id="54" w:name="_Toc242450553"/>
+      <w:bookmarkStart w:id="54" w:name="_Toc242457211"/>
       <w:r>
         <w:lastRenderedPageBreak/>
         <w:t>8 Требования к составу и содержанию работ по подготовке объекта автоматизации к вводу системы в действие</w:t>
@@ -8492,7 +8492,7 @@
         <w:pStyle w:val="1"/>
         <w:pageBreakBefore/>
       </w:pPr>
-      <w:bookmarkStart w:id="55" w:name="_Toc242450554"/>
+      <w:bookmarkStart w:id="55" w:name="_Toc242457212"/>
       <w:r>
         <w:lastRenderedPageBreak/>
         <w:t>9 Требования к документированию</w:t>
@@ -9134,7 +9134,7 @@
         <w:pStyle w:val="1"/>
         <w:pageBreakBefore/>
       </w:pPr>
-      <w:bookmarkStart w:id="56" w:name="_Toc242450555"/>
+      <w:bookmarkStart w:id="56" w:name="_Toc242457213"/>
       <w:r>
         <w:lastRenderedPageBreak/>
         <w:t>10 Источники разработки</w:t>
@@ -9173,7 +9173,7 @@
         <w:ind w:firstLine="0"/>
         <w:jc w:val="center"/>
       </w:pPr>
-      <w:bookmarkStart w:id="57" w:name="_Toc242450556"/>
+      <w:bookmarkStart w:id="57" w:name="_Toc242457214"/>
       <w:r>
         <w:lastRenderedPageBreak/>
         <w:t>ЛИСТ РЕГИСТРАЦИИ ИЗМЕНЕНИЙ</w:t>
@@ -11235,31 +11235,31 @@
       </w:rPr>
     </w:lvl>
   </w:abstractNum>
-  <w:num w:numId="1" w16cid:durableId="1158770557">
+  <w:num w:numId="1" w16cid:durableId="1079405710">
     <w:abstractNumId w:val="8"/>
   </w:num>
-  <w:num w:numId="2" w16cid:durableId="204022004">
+  <w:num w:numId="2" w16cid:durableId="1606692080">
     <w:abstractNumId w:val="6"/>
   </w:num>
-  <w:num w:numId="3" w16cid:durableId="1016537157">
+  <w:num w:numId="3" w16cid:durableId="249971511">
     <w:abstractNumId w:val="5"/>
   </w:num>
-  <w:num w:numId="4" w16cid:durableId="1597597093">
+  <w:num w:numId="4" w16cid:durableId="668097452">
     <w:abstractNumId w:val="4"/>
   </w:num>
-  <w:num w:numId="5" w16cid:durableId="484473195">
+  <w:num w:numId="5" w16cid:durableId="1842575894">
     <w:abstractNumId w:val="7"/>
   </w:num>
-  <w:num w:numId="6" w16cid:durableId="2113816960">
+  <w:num w:numId="6" w16cid:durableId="991525265">
     <w:abstractNumId w:val="3"/>
   </w:num>
-  <w:num w:numId="7" w16cid:durableId="814445871">
+  <w:num w:numId="7" w16cid:durableId="1001079797">
     <w:abstractNumId w:val="2"/>
   </w:num>
-  <w:num w:numId="8" w16cid:durableId="1441413466">
+  <w:num w:numId="8" w16cid:durableId="733938567">
     <w:abstractNumId w:val="1"/>
   </w:num>
-  <w:num w:numId="9" w16cid:durableId="291253500">
+  <w:num w:numId="9" w16cid:durableId="92677773">
     <w:abstractNumId w:val="0"/>
   </w:num>
 </w:numbering>
@@ -22792,7 +22792,7 @@
     <w:autoRedefine/>
     <w:uiPriority w:val="39"/>
     <w:unhideWhenUsed/>
-    <w:rsid w:val="00764942"/>
+    <w:rsid w:val="001055A8"/>
     <w:pPr>
       <w:spacing w:after="100"/>
     </w:pPr>
@@ -22804,7 +22804,7 @@
     <w:autoRedefine/>
     <w:uiPriority w:val="39"/>
     <w:unhideWhenUsed/>
-    <w:rsid w:val="00764942"/>
+    <w:rsid w:val="001055A8"/>
     <w:pPr>
       <w:spacing w:after="100"/>
       <w:ind w:left="240"/>
@@ -22817,7 +22817,7 @@
     <w:autoRedefine/>
     <w:uiPriority w:val="39"/>
     <w:unhideWhenUsed/>
-    <w:rsid w:val="00764942"/>
+    <w:rsid w:val="001055A8"/>
     <w:pPr>
       <w:spacing w:after="100"/>
       <w:ind w:left="480"/>
@@ -22828,7 +22828,7 @@
     <w:basedOn w:val="a2"/>
     <w:uiPriority w:val="99"/>
     <w:unhideWhenUsed/>
-    <w:rsid w:val="00764942"/>
+    <w:rsid w:val="001055A8"/>
     <w:rPr>
       <w:color w:val="0000FF" w:themeColor="hyperlink"/>
       <w:u w:val="single"/>

</xml_diff>

<commit_message>
Add curency switch and editi user data
</commit_message>
<xml_diff>
--- a/docs/gost/out/01_ТЗ_Техническое_задание.docx
+++ b/docs/gost/out/01_ТЗ_Техническое_задание.docx
@@ -306,7 +306,7 @@
       <w:r>
         <w:fldChar w:fldCharType="separate"/>
       </w:r>
-      <w:hyperlink w:anchor="_Toc242459026" w:history="1">
+      <w:hyperlink w:anchor="_Toc242649620" w:history="1">
         <w:r>
           <w:rPr>
             <w:rStyle w:val="aff8"/>
@@ -333,7 +333,7 @@
             <w:noProof/>
             <w:webHidden/>
           </w:rPr>
-          <w:instrText xml:space="preserve"> PAGEREF _Toc242459026 \h </w:instrText>
+          <w:instrText xml:space="preserve"> PAGEREF _Toc242649620 \h </w:instrText>
         </w:r>
         <w:r>
           <w:rPr>
@@ -379,7 +379,7 @@
           <w14:ligatures w14:val="standardContextual"/>
         </w:rPr>
       </w:pPr>
-      <w:hyperlink w:anchor="_Toc242459027" w:history="1">
+      <w:hyperlink w:anchor="_Toc242649621" w:history="1">
         <w:r>
           <w:rPr>
             <w:rStyle w:val="aff8"/>
@@ -406,7 +406,7 @@
             <w:noProof/>
             <w:webHidden/>
           </w:rPr>
-          <w:instrText xml:space="preserve"> PAGEREF _Toc242459027 \h </w:instrText>
+          <w:instrText xml:space="preserve"> PAGEREF _Toc242649621 \h </w:instrText>
         </w:r>
         <w:r>
           <w:rPr>
@@ -452,7 +452,7 @@
           <w14:ligatures w14:val="standardContextual"/>
         </w:rPr>
       </w:pPr>
-      <w:hyperlink w:anchor="_Toc242459028" w:history="1">
+      <w:hyperlink w:anchor="_Toc242649622" w:history="1">
         <w:r>
           <w:rPr>
             <w:rStyle w:val="aff8"/>
@@ -479,7 +479,7 @@
             <w:noProof/>
             <w:webHidden/>
           </w:rPr>
-          <w:instrText xml:space="preserve"> PAGEREF _Toc242459028 \h </w:instrText>
+          <w:instrText xml:space="preserve"> PAGEREF _Toc242649622 \h </w:instrText>
         </w:r>
         <w:r>
           <w:rPr>
@@ -525,7 +525,7 @@
           <w14:ligatures w14:val="standardContextual"/>
         </w:rPr>
       </w:pPr>
-      <w:hyperlink w:anchor="_Toc242459029" w:history="1">
+      <w:hyperlink w:anchor="_Toc242649623" w:history="1">
         <w:r>
           <w:rPr>
             <w:rStyle w:val="aff8"/>
@@ -552,7 +552,7 @@
             <w:noProof/>
             <w:webHidden/>
           </w:rPr>
-          <w:instrText xml:space="preserve"> PAGEREF _Toc242459029 \h </w:instrText>
+          <w:instrText xml:space="preserve"> PAGEREF _Toc242649623 \h </w:instrText>
         </w:r>
         <w:r>
           <w:rPr>
@@ -598,7 +598,7 @@
           <w14:ligatures w14:val="standardContextual"/>
         </w:rPr>
       </w:pPr>
-      <w:hyperlink w:anchor="_Toc242459030" w:history="1">
+      <w:hyperlink w:anchor="_Toc242649624" w:history="1">
         <w:r>
           <w:rPr>
             <w:rStyle w:val="aff8"/>
@@ -625,7 +625,7 @@
             <w:noProof/>
             <w:webHidden/>
           </w:rPr>
-          <w:instrText xml:space="preserve"> PAGEREF _Toc242459030 \h </w:instrText>
+          <w:instrText xml:space="preserve"> PAGEREF _Toc242649624 \h </w:instrText>
         </w:r>
         <w:r>
           <w:rPr>
@@ -671,7 +671,7 @@
           <w14:ligatures w14:val="standardContextual"/>
         </w:rPr>
       </w:pPr>
-      <w:hyperlink w:anchor="_Toc242459031" w:history="1">
+      <w:hyperlink w:anchor="_Toc242649625" w:history="1">
         <w:r>
           <w:rPr>
             <w:rStyle w:val="aff8"/>
@@ -698,7 +698,7 @@
             <w:noProof/>
             <w:webHidden/>
           </w:rPr>
-          <w:instrText xml:space="preserve"> PAGEREF _Toc242459031 \h </w:instrText>
+          <w:instrText xml:space="preserve"> PAGEREF _Toc242649625 \h </w:instrText>
         </w:r>
         <w:r>
           <w:rPr>
@@ -744,7 +744,7 @@
           <w14:ligatures w14:val="standardContextual"/>
         </w:rPr>
       </w:pPr>
-      <w:hyperlink w:anchor="_Toc242459032" w:history="1">
+      <w:hyperlink w:anchor="_Toc242649626" w:history="1">
         <w:r>
           <w:rPr>
             <w:rStyle w:val="aff8"/>
@@ -771,7 +771,7 @@
             <w:noProof/>
             <w:webHidden/>
           </w:rPr>
-          <w:instrText xml:space="preserve"> PAGEREF _Toc242459032 \h </w:instrText>
+          <w:instrText xml:space="preserve"> PAGEREF _Toc242649626 \h </w:instrText>
         </w:r>
         <w:r>
           <w:rPr>
@@ -817,7 +817,7 @@
           <w14:ligatures w14:val="standardContextual"/>
         </w:rPr>
       </w:pPr>
-      <w:hyperlink w:anchor="_Toc242459033" w:history="1">
+      <w:hyperlink w:anchor="_Toc242649627" w:history="1">
         <w:r>
           <w:rPr>
             <w:rStyle w:val="aff8"/>
@@ -844,7 +844,7 @@
             <w:noProof/>
             <w:webHidden/>
           </w:rPr>
-          <w:instrText xml:space="preserve"> PAGEREF _Toc242459033 \h </w:instrText>
+          <w:instrText xml:space="preserve"> PAGEREF _Toc242649627 \h </w:instrText>
         </w:r>
         <w:r>
           <w:rPr>
@@ -890,7 +890,7 @@
           <w14:ligatures w14:val="standardContextual"/>
         </w:rPr>
       </w:pPr>
-      <w:hyperlink w:anchor="_Toc242459034" w:history="1">
+      <w:hyperlink w:anchor="_Toc242649628" w:history="1">
         <w:r>
           <w:rPr>
             <w:rStyle w:val="aff8"/>
@@ -917,7 +917,7 @@
             <w:noProof/>
             <w:webHidden/>
           </w:rPr>
-          <w:instrText xml:space="preserve"> PAGEREF _Toc242459034 \h </w:instrText>
+          <w:instrText xml:space="preserve"> PAGEREF _Toc242649628 \h </w:instrText>
         </w:r>
         <w:r>
           <w:rPr>
@@ -963,7 +963,7 @@
           <w14:ligatures w14:val="standardContextual"/>
         </w:rPr>
       </w:pPr>
-      <w:hyperlink w:anchor="_Toc242459035" w:history="1">
+      <w:hyperlink w:anchor="_Toc242649629" w:history="1">
         <w:r>
           <w:rPr>
             <w:rStyle w:val="aff8"/>
@@ -990,7 +990,7 @@
             <w:noProof/>
             <w:webHidden/>
           </w:rPr>
-          <w:instrText xml:space="preserve"> PAGEREF _Toc242459035 \h </w:instrText>
+          <w:instrText xml:space="preserve"> PAGEREF _Toc242649629 \h </w:instrText>
         </w:r>
         <w:r>
           <w:rPr>
@@ -1036,7 +1036,7 @@
           <w14:ligatures w14:val="standardContextual"/>
         </w:rPr>
       </w:pPr>
-      <w:hyperlink w:anchor="_Toc242459036" w:history="1">
+      <w:hyperlink w:anchor="_Toc242649630" w:history="1">
         <w:r>
           <w:rPr>
             <w:rStyle w:val="aff8"/>
@@ -1063,7 +1063,7 @@
             <w:noProof/>
             <w:webHidden/>
           </w:rPr>
-          <w:instrText xml:space="preserve"> PAGEREF _Toc242459036 \h </w:instrText>
+          <w:instrText xml:space="preserve"> PAGEREF _Toc242649630 \h </w:instrText>
         </w:r>
         <w:r>
           <w:rPr>
@@ -1109,7 +1109,7 @@
           <w14:ligatures w14:val="standardContextual"/>
         </w:rPr>
       </w:pPr>
-      <w:hyperlink w:anchor="_Toc242459037" w:history="1">
+      <w:hyperlink w:anchor="_Toc242649631" w:history="1">
         <w:r>
           <w:rPr>
             <w:rStyle w:val="aff8"/>
@@ -1136,7 +1136,7 @@
             <w:noProof/>
             <w:webHidden/>
           </w:rPr>
-          <w:instrText xml:space="preserve"> PAGEREF _Toc242459037 \h </w:instrText>
+          <w:instrText xml:space="preserve"> PAGEREF _Toc242649631 \h </w:instrText>
         </w:r>
         <w:r>
           <w:rPr>
@@ -1182,7 +1182,7 @@
           <w14:ligatures w14:val="standardContextual"/>
         </w:rPr>
       </w:pPr>
-      <w:hyperlink w:anchor="_Toc242459038" w:history="1">
+      <w:hyperlink w:anchor="_Toc242649632" w:history="1">
         <w:r>
           <w:rPr>
             <w:rStyle w:val="aff8"/>
@@ -1209,7 +1209,7 @@
             <w:noProof/>
             <w:webHidden/>
           </w:rPr>
-          <w:instrText xml:space="preserve"> PAGEREF _Toc242459038 \h </w:instrText>
+          <w:instrText xml:space="preserve"> PAGEREF _Toc242649632 \h </w:instrText>
         </w:r>
         <w:r>
           <w:rPr>
@@ -1255,7 +1255,7 @@
           <w14:ligatures w14:val="standardContextual"/>
         </w:rPr>
       </w:pPr>
-      <w:hyperlink w:anchor="_Toc242459039" w:history="1">
+      <w:hyperlink w:anchor="_Toc242649633" w:history="1">
         <w:r>
           <w:rPr>
             <w:rStyle w:val="aff8"/>
@@ -1282,7 +1282,7 @@
             <w:noProof/>
             <w:webHidden/>
           </w:rPr>
-          <w:instrText xml:space="preserve"> PAGEREF _Toc242459039 \h </w:instrText>
+          <w:instrText xml:space="preserve"> PAGEREF _Toc242649633 \h </w:instrText>
         </w:r>
         <w:r>
           <w:rPr>
@@ -1328,7 +1328,7 @@
           <w14:ligatures w14:val="standardContextual"/>
         </w:rPr>
       </w:pPr>
-      <w:hyperlink w:anchor="_Toc242459040" w:history="1">
+      <w:hyperlink w:anchor="_Toc242649634" w:history="1">
         <w:r>
           <w:rPr>
             <w:rStyle w:val="aff8"/>
@@ -1355,7 +1355,7 @@
             <w:noProof/>
             <w:webHidden/>
           </w:rPr>
-          <w:instrText xml:space="preserve"> PAGEREF _Toc242459040 \h </w:instrText>
+          <w:instrText xml:space="preserve"> PAGEREF _Toc242649634 \h </w:instrText>
         </w:r>
         <w:r>
           <w:rPr>
@@ -1401,7 +1401,7 @@
           <w14:ligatures w14:val="standardContextual"/>
         </w:rPr>
       </w:pPr>
-      <w:hyperlink w:anchor="_Toc242459041" w:history="1">
+      <w:hyperlink w:anchor="_Toc242649635" w:history="1">
         <w:r>
           <w:rPr>
             <w:rStyle w:val="aff8"/>
@@ -1428,7 +1428,7 @@
             <w:noProof/>
             <w:webHidden/>
           </w:rPr>
-          <w:instrText xml:space="preserve"> PAGEREF _Toc242459041 \h </w:instrText>
+          <w:instrText xml:space="preserve"> PAGEREF _Toc242649635 \h </w:instrText>
         </w:r>
         <w:r>
           <w:rPr>
@@ -1474,7 +1474,7 @@
           <w14:ligatures w14:val="standardContextual"/>
         </w:rPr>
       </w:pPr>
-      <w:hyperlink w:anchor="_Toc242459042" w:history="1">
+      <w:hyperlink w:anchor="_Toc242649636" w:history="1">
         <w:r>
           <w:rPr>
             <w:rStyle w:val="aff8"/>
@@ -1501,7 +1501,7 @@
             <w:noProof/>
             <w:webHidden/>
           </w:rPr>
-          <w:instrText xml:space="preserve"> PAGEREF _Toc242459042 \h </w:instrText>
+          <w:instrText xml:space="preserve"> PAGEREF _Toc242649636 \h </w:instrText>
         </w:r>
         <w:r>
           <w:rPr>
@@ -1547,7 +1547,7 @@
           <w14:ligatures w14:val="standardContextual"/>
         </w:rPr>
       </w:pPr>
-      <w:hyperlink w:anchor="_Toc242459043" w:history="1">
+      <w:hyperlink w:anchor="_Toc242649637" w:history="1">
         <w:r>
           <w:rPr>
             <w:rStyle w:val="aff8"/>
@@ -1574,7 +1574,7 @@
             <w:noProof/>
             <w:webHidden/>
           </w:rPr>
-          <w:instrText xml:space="preserve"> PAGEREF _Toc242459043 \h </w:instrText>
+          <w:instrText xml:space="preserve"> PAGEREF _Toc242649637 \h </w:instrText>
         </w:r>
         <w:r>
           <w:rPr>
@@ -1620,7 +1620,7 @@
           <w14:ligatures w14:val="standardContextual"/>
         </w:rPr>
       </w:pPr>
-      <w:hyperlink w:anchor="_Toc242459044" w:history="1">
+      <w:hyperlink w:anchor="_Toc242649638" w:history="1">
         <w:r>
           <w:rPr>
             <w:rStyle w:val="aff8"/>
@@ -1647,7 +1647,7 @@
             <w:noProof/>
             <w:webHidden/>
           </w:rPr>
-          <w:instrText xml:space="preserve"> PAGEREF _Toc242459044 \h </w:instrText>
+          <w:instrText xml:space="preserve"> PAGEREF _Toc242649638 \h </w:instrText>
         </w:r>
         <w:r>
           <w:rPr>
@@ -1693,7 +1693,7 @@
           <w14:ligatures w14:val="standardContextual"/>
         </w:rPr>
       </w:pPr>
-      <w:hyperlink w:anchor="_Toc242459045" w:history="1">
+      <w:hyperlink w:anchor="_Toc242649639" w:history="1">
         <w:r>
           <w:rPr>
             <w:rStyle w:val="aff8"/>
@@ -1720,7 +1720,7 @@
             <w:noProof/>
             <w:webHidden/>
           </w:rPr>
-          <w:instrText xml:space="preserve"> PAGEREF _Toc242459045 \h </w:instrText>
+          <w:instrText xml:space="preserve"> PAGEREF _Toc242649639 \h </w:instrText>
         </w:r>
         <w:r>
           <w:rPr>
@@ -1766,7 +1766,7 @@
           <w14:ligatures w14:val="standardContextual"/>
         </w:rPr>
       </w:pPr>
-      <w:hyperlink w:anchor="_Toc242459046" w:history="1">
+      <w:hyperlink w:anchor="_Toc242649640" w:history="1">
         <w:r>
           <w:rPr>
             <w:rStyle w:val="aff8"/>
@@ -1793,7 +1793,7 @@
             <w:noProof/>
             <w:webHidden/>
           </w:rPr>
-          <w:instrText xml:space="preserve"> PAGEREF _Toc242459046 \h </w:instrText>
+          <w:instrText xml:space="preserve"> PAGEREF _Toc242649640 \h </w:instrText>
         </w:r>
         <w:r>
           <w:rPr>
@@ -1839,7 +1839,7 @@
           <w14:ligatures w14:val="standardContextual"/>
         </w:rPr>
       </w:pPr>
-      <w:hyperlink w:anchor="_Toc242459047" w:history="1">
+      <w:hyperlink w:anchor="_Toc242649641" w:history="1">
         <w:r>
           <w:rPr>
             <w:rStyle w:val="aff8"/>
@@ -1866,7 +1866,7 @@
             <w:noProof/>
             <w:webHidden/>
           </w:rPr>
-          <w:instrText xml:space="preserve"> PAGEREF _Toc242459047 \h </w:instrText>
+          <w:instrText xml:space="preserve"> PAGEREF _Toc242649641 \h </w:instrText>
         </w:r>
         <w:r>
           <w:rPr>
@@ -1912,7 +1912,7 @@
           <w14:ligatures w14:val="standardContextual"/>
         </w:rPr>
       </w:pPr>
-      <w:hyperlink w:anchor="_Toc242459048" w:history="1">
+      <w:hyperlink w:anchor="_Toc242649642" w:history="1">
         <w:r>
           <w:rPr>
             <w:rStyle w:val="aff8"/>
@@ -1939,7 +1939,7 @@
             <w:noProof/>
             <w:webHidden/>
           </w:rPr>
-          <w:instrText xml:space="preserve"> PAGEREF _Toc242459048 \h </w:instrText>
+          <w:instrText xml:space="preserve"> PAGEREF _Toc242649642 \h </w:instrText>
         </w:r>
         <w:r>
           <w:rPr>
@@ -1985,7 +1985,7 @@
           <w14:ligatures w14:val="standardContextual"/>
         </w:rPr>
       </w:pPr>
-      <w:hyperlink w:anchor="_Toc242459049" w:history="1">
+      <w:hyperlink w:anchor="_Toc242649643" w:history="1">
         <w:r>
           <w:rPr>
             <w:rStyle w:val="aff8"/>
@@ -2012,7 +2012,7 @@
             <w:noProof/>
             <w:webHidden/>
           </w:rPr>
-          <w:instrText xml:space="preserve"> PAGEREF _Toc242459049 \h </w:instrText>
+          <w:instrText xml:space="preserve"> PAGEREF _Toc242649643 \h </w:instrText>
         </w:r>
         <w:r>
           <w:rPr>
@@ -2058,7 +2058,7 @@
           <w14:ligatures w14:val="standardContextual"/>
         </w:rPr>
       </w:pPr>
-      <w:hyperlink w:anchor="_Toc242459050" w:history="1">
+      <w:hyperlink w:anchor="_Toc242649644" w:history="1">
         <w:r>
           <w:rPr>
             <w:rStyle w:val="aff8"/>
@@ -2085,7 +2085,7 @@
             <w:noProof/>
             <w:webHidden/>
           </w:rPr>
-          <w:instrText xml:space="preserve"> PAGEREF _Toc242459050 \h </w:instrText>
+          <w:instrText xml:space="preserve"> PAGEREF _Toc242649644 \h </w:instrText>
         </w:r>
         <w:r>
           <w:rPr>
@@ -2131,7 +2131,7 @@
           <w14:ligatures w14:val="standardContextual"/>
         </w:rPr>
       </w:pPr>
-      <w:hyperlink w:anchor="_Toc242459051" w:history="1">
+      <w:hyperlink w:anchor="_Toc242649645" w:history="1">
         <w:r>
           <w:rPr>
             <w:rStyle w:val="aff8"/>
@@ -2158,7 +2158,7 @@
             <w:noProof/>
             <w:webHidden/>
           </w:rPr>
-          <w:instrText xml:space="preserve"> PAGEREF _Toc242459051 \h </w:instrText>
+          <w:instrText xml:space="preserve"> PAGEREF _Toc242649645 \h </w:instrText>
         </w:r>
         <w:r>
           <w:rPr>
@@ -2204,7 +2204,7 @@
           <w14:ligatures w14:val="standardContextual"/>
         </w:rPr>
       </w:pPr>
-      <w:hyperlink w:anchor="_Toc242459052" w:history="1">
+      <w:hyperlink w:anchor="_Toc242649646" w:history="1">
         <w:r>
           <w:rPr>
             <w:rStyle w:val="aff8"/>
@@ -2231,7 +2231,7 @@
             <w:noProof/>
             <w:webHidden/>
           </w:rPr>
-          <w:instrText xml:space="preserve"> PAGEREF _Toc242459052 \h </w:instrText>
+          <w:instrText xml:space="preserve"> PAGEREF _Toc242649646 \h </w:instrText>
         </w:r>
         <w:r>
           <w:rPr>
@@ -2277,7 +2277,7 @@
           <w14:ligatures w14:val="standardContextual"/>
         </w:rPr>
       </w:pPr>
-      <w:hyperlink w:anchor="_Toc242459053" w:history="1">
+      <w:hyperlink w:anchor="_Toc242649647" w:history="1">
         <w:r>
           <w:rPr>
             <w:rStyle w:val="aff8"/>
@@ -2304,7 +2304,7 @@
             <w:noProof/>
             <w:webHidden/>
           </w:rPr>
-          <w:instrText xml:space="preserve"> PAGEREF _Toc242459053 \h </w:instrText>
+          <w:instrText xml:space="preserve"> PAGEREF _Toc242649647 \h </w:instrText>
         </w:r>
         <w:r>
           <w:rPr>
@@ -2350,7 +2350,7 @@
           <w14:ligatures w14:val="standardContextual"/>
         </w:rPr>
       </w:pPr>
-      <w:hyperlink w:anchor="_Toc242459054" w:history="1">
+      <w:hyperlink w:anchor="_Toc242649648" w:history="1">
         <w:r>
           <w:rPr>
             <w:rStyle w:val="aff8"/>
@@ -2377,7 +2377,7 @@
             <w:noProof/>
             <w:webHidden/>
           </w:rPr>
-          <w:instrText xml:space="preserve"> PAGEREF _Toc242459054 \h </w:instrText>
+          <w:instrText xml:space="preserve"> PAGEREF _Toc242649648 \h </w:instrText>
         </w:r>
         <w:r>
           <w:rPr>
@@ -2423,7 +2423,7 @@
           <w14:ligatures w14:val="standardContextual"/>
         </w:rPr>
       </w:pPr>
-      <w:hyperlink w:anchor="_Toc242459055" w:history="1">
+      <w:hyperlink w:anchor="_Toc242649649" w:history="1">
         <w:r>
           <w:rPr>
             <w:rStyle w:val="aff8"/>
@@ -2450,7 +2450,7 @@
             <w:noProof/>
             <w:webHidden/>
           </w:rPr>
-          <w:instrText xml:space="preserve"> PAGEREF _Toc242459055 \h </w:instrText>
+          <w:instrText xml:space="preserve"> PAGEREF _Toc242649649 \h </w:instrText>
         </w:r>
         <w:r>
           <w:rPr>
@@ -2496,7 +2496,7 @@
           <w14:ligatures w14:val="standardContextual"/>
         </w:rPr>
       </w:pPr>
-      <w:hyperlink w:anchor="_Toc242459056" w:history="1">
+      <w:hyperlink w:anchor="_Toc242649650" w:history="1">
         <w:r>
           <w:rPr>
             <w:rStyle w:val="aff8"/>
@@ -2523,7 +2523,7 @@
             <w:noProof/>
             <w:webHidden/>
           </w:rPr>
-          <w:instrText xml:space="preserve"> PAGEREF _Toc242459056 \h </w:instrText>
+          <w:instrText xml:space="preserve"> PAGEREF _Toc242649650 \h </w:instrText>
         </w:r>
         <w:r>
           <w:rPr>
@@ -2569,7 +2569,7 @@
           <w14:ligatures w14:val="standardContextual"/>
         </w:rPr>
       </w:pPr>
-      <w:hyperlink w:anchor="_Toc242459057" w:history="1">
+      <w:hyperlink w:anchor="_Toc242649651" w:history="1">
         <w:r>
           <w:rPr>
             <w:rStyle w:val="aff8"/>
@@ -2596,7 +2596,7 @@
             <w:noProof/>
             <w:webHidden/>
           </w:rPr>
-          <w:instrText xml:space="preserve"> PAGEREF _Toc242459057 \h </w:instrText>
+          <w:instrText xml:space="preserve"> PAGEREF _Toc242649651 \h </w:instrText>
         </w:r>
         <w:r>
           <w:rPr>
@@ -2642,7 +2642,7 @@
           <w14:ligatures w14:val="standardContextual"/>
         </w:rPr>
       </w:pPr>
-      <w:hyperlink w:anchor="_Toc242459058" w:history="1">
+      <w:hyperlink w:anchor="_Toc242649652" w:history="1">
         <w:r>
           <w:rPr>
             <w:rStyle w:val="aff8"/>
@@ -2669,7 +2669,7 @@
             <w:noProof/>
             <w:webHidden/>
           </w:rPr>
-          <w:instrText xml:space="preserve"> PAGEREF _Toc242459058 \h </w:instrText>
+          <w:instrText xml:space="preserve"> PAGEREF _Toc242649652 \h </w:instrText>
         </w:r>
         <w:r>
           <w:rPr>
@@ -2715,7 +2715,7 @@
           <w14:ligatures w14:val="standardContextual"/>
         </w:rPr>
       </w:pPr>
-      <w:hyperlink w:anchor="_Toc242459059" w:history="1">
+      <w:hyperlink w:anchor="_Toc242649653" w:history="1">
         <w:r>
           <w:rPr>
             <w:rStyle w:val="aff8"/>
@@ -2742,7 +2742,7 @@
             <w:noProof/>
             <w:webHidden/>
           </w:rPr>
-          <w:instrText xml:space="preserve"> PAGEREF _Toc242459059 \h </w:instrText>
+          <w:instrText xml:space="preserve"> PAGEREF _Toc242649653 \h </w:instrText>
         </w:r>
         <w:r>
           <w:rPr>
@@ -2788,7 +2788,7 @@
           <w14:ligatures w14:val="standardContextual"/>
         </w:rPr>
       </w:pPr>
-      <w:hyperlink w:anchor="_Toc242459060" w:history="1">
+      <w:hyperlink w:anchor="_Toc242649654" w:history="1">
         <w:r>
           <w:rPr>
             <w:rStyle w:val="aff8"/>
@@ -2815,7 +2815,7 @@
             <w:noProof/>
             <w:webHidden/>
           </w:rPr>
-          <w:instrText xml:space="preserve"> PAGEREF _Toc242459060 \h </w:instrText>
+          <w:instrText xml:space="preserve"> PAGEREF _Toc242649654 \h </w:instrText>
         </w:r>
         <w:r>
           <w:rPr>
@@ -2861,7 +2861,7 @@
           <w14:ligatures w14:val="standardContextual"/>
         </w:rPr>
       </w:pPr>
-      <w:hyperlink w:anchor="_Toc242459061" w:history="1">
+      <w:hyperlink w:anchor="_Toc242649655" w:history="1">
         <w:r>
           <w:rPr>
             <w:rStyle w:val="aff8"/>
@@ -2888,7 +2888,7 @@
             <w:noProof/>
             <w:webHidden/>
           </w:rPr>
-          <w:instrText xml:space="preserve"> PAGEREF _Toc242459061 \h </w:instrText>
+          <w:instrText xml:space="preserve"> PAGEREF _Toc242649655 \h </w:instrText>
         </w:r>
         <w:r>
           <w:rPr>
@@ -2934,7 +2934,7 @@
           <w14:ligatures w14:val="standardContextual"/>
         </w:rPr>
       </w:pPr>
-      <w:hyperlink w:anchor="_Toc242459062" w:history="1">
+      <w:hyperlink w:anchor="_Toc242649656" w:history="1">
         <w:r>
           <w:rPr>
             <w:rStyle w:val="aff8"/>
@@ -2961,7 +2961,7 @@
             <w:noProof/>
             <w:webHidden/>
           </w:rPr>
-          <w:instrText xml:space="preserve"> PAGEREF _Toc242459062 \h </w:instrText>
+          <w:instrText xml:space="preserve"> PAGEREF _Toc242649656 \h </w:instrText>
         </w:r>
         <w:r>
           <w:rPr>
@@ -3007,7 +3007,7 @@
           <w14:ligatures w14:val="standardContextual"/>
         </w:rPr>
       </w:pPr>
-      <w:hyperlink w:anchor="_Toc242459063" w:history="1">
+      <w:hyperlink w:anchor="_Toc242649657" w:history="1">
         <w:r>
           <w:rPr>
             <w:rStyle w:val="aff8"/>
@@ -3034,7 +3034,7 @@
             <w:noProof/>
             <w:webHidden/>
           </w:rPr>
-          <w:instrText xml:space="preserve"> PAGEREF _Toc242459063 \h </w:instrText>
+          <w:instrText xml:space="preserve"> PAGEREF _Toc242649657 \h </w:instrText>
         </w:r>
         <w:r>
           <w:rPr>
@@ -3080,7 +3080,7 @@
           <w14:ligatures w14:val="standardContextual"/>
         </w:rPr>
       </w:pPr>
-      <w:hyperlink w:anchor="_Toc242459064" w:history="1">
+      <w:hyperlink w:anchor="_Toc242649658" w:history="1">
         <w:r>
           <w:rPr>
             <w:rStyle w:val="aff8"/>
@@ -3107,7 +3107,7 @@
             <w:noProof/>
             <w:webHidden/>
           </w:rPr>
-          <w:instrText xml:space="preserve"> PAGEREF _Toc242459064 \h </w:instrText>
+          <w:instrText xml:space="preserve"> PAGEREF _Toc242649658 \h </w:instrText>
         </w:r>
         <w:r>
           <w:rPr>
@@ -3153,7 +3153,7 @@
           <w14:ligatures w14:val="standardContextual"/>
         </w:rPr>
       </w:pPr>
-      <w:hyperlink w:anchor="_Toc242459065" w:history="1">
+      <w:hyperlink w:anchor="_Toc242649659" w:history="1">
         <w:r>
           <w:rPr>
             <w:rStyle w:val="aff8"/>
@@ -3180,7 +3180,7 @@
             <w:noProof/>
             <w:webHidden/>
           </w:rPr>
-          <w:instrText xml:space="preserve"> PAGEREF _Toc242459065 \h </w:instrText>
+          <w:instrText xml:space="preserve"> PAGEREF _Toc242649659 \h </w:instrText>
         </w:r>
         <w:r>
           <w:rPr>
@@ -3226,7 +3226,7 @@
           <w14:ligatures w14:val="standardContextual"/>
         </w:rPr>
       </w:pPr>
-      <w:hyperlink w:anchor="_Toc242459066" w:history="1">
+      <w:hyperlink w:anchor="_Toc242649660" w:history="1">
         <w:r>
           <w:rPr>
             <w:rStyle w:val="aff8"/>
@@ -3253,7 +3253,7 @@
             <w:noProof/>
             <w:webHidden/>
           </w:rPr>
-          <w:instrText xml:space="preserve"> PAGEREF _Toc242459066 \h </w:instrText>
+          <w:instrText xml:space="preserve"> PAGEREF _Toc242649660 \h </w:instrText>
         </w:r>
         <w:r>
           <w:rPr>
@@ -3299,7 +3299,7 @@
           <w14:ligatures w14:val="standardContextual"/>
         </w:rPr>
       </w:pPr>
-      <w:hyperlink w:anchor="_Toc242459067" w:history="1">
+      <w:hyperlink w:anchor="_Toc242649661" w:history="1">
         <w:r>
           <w:rPr>
             <w:rStyle w:val="aff8"/>
@@ -3326,7 +3326,7 @@
             <w:noProof/>
             <w:webHidden/>
           </w:rPr>
-          <w:instrText xml:space="preserve"> PAGEREF _Toc242459067 \h </w:instrText>
+          <w:instrText xml:space="preserve"> PAGEREF _Toc242649661 \h </w:instrText>
         </w:r>
         <w:r>
           <w:rPr>
@@ -3372,7 +3372,7 @@
           <w14:ligatures w14:val="standardContextual"/>
         </w:rPr>
       </w:pPr>
-      <w:hyperlink w:anchor="_Toc242459068" w:history="1">
+      <w:hyperlink w:anchor="_Toc242649662" w:history="1">
         <w:r>
           <w:rPr>
             <w:rStyle w:val="aff8"/>
@@ -3399,7 +3399,7 @@
             <w:noProof/>
             <w:webHidden/>
           </w:rPr>
-          <w:instrText xml:space="preserve"> PAGEREF _Toc242459068 \h </w:instrText>
+          <w:instrText xml:space="preserve"> PAGEREF _Toc242649662 \h </w:instrText>
         </w:r>
         <w:r>
           <w:rPr>
@@ -3445,7 +3445,7 @@
           <w14:ligatures w14:val="standardContextual"/>
         </w:rPr>
       </w:pPr>
-      <w:hyperlink w:anchor="_Toc242459069" w:history="1">
+      <w:hyperlink w:anchor="_Toc242649663" w:history="1">
         <w:r>
           <w:rPr>
             <w:rStyle w:val="aff8"/>
@@ -3472,7 +3472,7 @@
             <w:noProof/>
             <w:webHidden/>
           </w:rPr>
-          <w:instrText xml:space="preserve"> PAGEREF _Toc242459069 \h </w:instrText>
+          <w:instrText xml:space="preserve"> PAGEREF _Toc242649663 \h </w:instrText>
         </w:r>
         <w:r>
           <w:rPr>
@@ -3518,7 +3518,7 @@
           <w14:ligatures w14:val="standardContextual"/>
         </w:rPr>
       </w:pPr>
-      <w:hyperlink w:anchor="_Toc242459070" w:history="1">
+      <w:hyperlink w:anchor="_Toc242649664" w:history="1">
         <w:r>
           <w:rPr>
             <w:rStyle w:val="aff8"/>
@@ -3545,7 +3545,7 @@
             <w:noProof/>
             <w:webHidden/>
           </w:rPr>
-          <w:instrText xml:space="preserve"> PAGEREF _Toc242459070 \h </w:instrText>
+          <w:instrText xml:space="preserve"> PAGEREF _Toc242649664 \h </w:instrText>
         </w:r>
         <w:r>
           <w:rPr>
@@ -3591,7 +3591,7 @@
           <w14:ligatures w14:val="standardContextual"/>
         </w:rPr>
       </w:pPr>
-      <w:hyperlink w:anchor="_Toc242459071" w:history="1">
+      <w:hyperlink w:anchor="_Toc242649665" w:history="1">
         <w:r>
           <w:rPr>
             <w:rStyle w:val="aff8"/>
@@ -3618,7 +3618,7 @@
             <w:noProof/>
             <w:webHidden/>
           </w:rPr>
-          <w:instrText xml:space="preserve"> PAGEREF _Toc242459071 \h </w:instrText>
+          <w:instrText xml:space="preserve"> PAGEREF _Toc242649665 \h </w:instrText>
         </w:r>
         <w:r>
           <w:rPr>
@@ -3664,7 +3664,7 @@
           <w14:ligatures w14:val="standardContextual"/>
         </w:rPr>
       </w:pPr>
-      <w:hyperlink w:anchor="_Toc242459072" w:history="1">
+      <w:hyperlink w:anchor="_Toc242649666" w:history="1">
         <w:r>
           <w:rPr>
             <w:rStyle w:val="aff8"/>
@@ -3691,7 +3691,7 @@
             <w:noProof/>
             <w:webHidden/>
           </w:rPr>
-          <w:instrText xml:space="preserve"> PAGEREF _Toc242459072 \h </w:instrText>
+          <w:instrText xml:space="preserve"> PAGEREF _Toc242649666 \h </w:instrText>
         </w:r>
         <w:r>
           <w:rPr>
@@ -3737,7 +3737,7 @@
           <w14:ligatures w14:val="standardContextual"/>
         </w:rPr>
       </w:pPr>
-      <w:hyperlink w:anchor="_Toc242459073" w:history="1">
+      <w:hyperlink w:anchor="_Toc242649667" w:history="1">
         <w:r>
           <w:rPr>
             <w:rStyle w:val="aff8"/>
@@ -3764,7 +3764,7 @@
             <w:noProof/>
             <w:webHidden/>
           </w:rPr>
-          <w:instrText xml:space="preserve"> PAGEREF _Toc242459073 \h </w:instrText>
+          <w:instrText xml:space="preserve"> PAGEREF _Toc242649667 \h </w:instrText>
         </w:r>
         <w:r>
           <w:rPr>
@@ -3810,7 +3810,7 @@
           <w14:ligatures w14:val="standardContextual"/>
         </w:rPr>
       </w:pPr>
-      <w:hyperlink w:anchor="_Toc242459074" w:history="1">
+      <w:hyperlink w:anchor="_Toc242649668" w:history="1">
         <w:r>
           <w:rPr>
             <w:rStyle w:val="aff8"/>
@@ -3837,7 +3837,7 @@
             <w:noProof/>
             <w:webHidden/>
           </w:rPr>
-          <w:instrText xml:space="preserve"> PAGEREF _Toc242459074 \h </w:instrText>
+          <w:instrText xml:space="preserve"> PAGEREF _Toc242649668 \h </w:instrText>
         </w:r>
         <w:r>
           <w:rPr>
@@ -3883,7 +3883,7 @@
           <w14:ligatures w14:val="standardContextual"/>
         </w:rPr>
       </w:pPr>
-      <w:hyperlink w:anchor="_Toc242459075" w:history="1">
+      <w:hyperlink w:anchor="_Toc242649669" w:history="1">
         <w:r>
           <w:rPr>
             <w:rStyle w:val="aff8"/>
@@ -3910,7 +3910,7 @@
             <w:noProof/>
             <w:webHidden/>
           </w:rPr>
-          <w:instrText xml:space="preserve"> PAGEREF _Toc242459075 \h </w:instrText>
+          <w:instrText xml:space="preserve"> PAGEREF _Toc242649669 \h </w:instrText>
         </w:r>
         <w:r>
           <w:rPr>
@@ -3956,7 +3956,7 @@
           <w14:ligatures w14:val="standardContextual"/>
         </w:rPr>
       </w:pPr>
-      <w:hyperlink w:anchor="_Toc242459076" w:history="1">
+      <w:hyperlink w:anchor="_Toc242649670" w:history="1">
         <w:r>
           <w:rPr>
             <w:rStyle w:val="aff8"/>
@@ -3983,7 +3983,7 @@
             <w:noProof/>
             <w:webHidden/>
           </w:rPr>
-          <w:instrText xml:space="preserve"> PAGEREF _Toc242459076 \h </w:instrText>
+          <w:instrText xml:space="preserve"> PAGEREF _Toc242649670 \h </w:instrText>
         </w:r>
         <w:r>
           <w:rPr>
@@ -4029,7 +4029,7 @@
           <w14:ligatures w14:val="standardContextual"/>
         </w:rPr>
       </w:pPr>
-      <w:hyperlink w:anchor="_Toc242459077" w:history="1">
+      <w:hyperlink w:anchor="_Toc242649671" w:history="1">
         <w:r>
           <w:rPr>
             <w:rStyle w:val="aff8"/>
@@ -4056,7 +4056,7 @@
             <w:noProof/>
             <w:webHidden/>
           </w:rPr>
-          <w:instrText xml:space="preserve"> PAGEREF _Toc242459077 \h </w:instrText>
+          <w:instrText xml:space="preserve"> PAGEREF _Toc242649671 \h </w:instrText>
         </w:r>
         <w:r>
           <w:rPr>
@@ -4102,7 +4102,7 @@
           <w14:ligatures w14:val="standardContextual"/>
         </w:rPr>
       </w:pPr>
-      <w:hyperlink w:anchor="_Toc242459078" w:history="1">
+      <w:hyperlink w:anchor="_Toc242649672" w:history="1">
         <w:r>
           <w:rPr>
             <w:rStyle w:val="aff8"/>
@@ -4129,7 +4129,7 @@
             <w:noProof/>
             <w:webHidden/>
           </w:rPr>
-          <w:instrText xml:space="preserve"> PAGEREF _Toc242459078 \h </w:instrText>
+          <w:instrText xml:space="preserve"> PAGEREF _Toc242649672 \h </w:instrText>
         </w:r>
         <w:r>
           <w:rPr>
@@ -4175,7 +4175,7 @@
           <w14:ligatures w14:val="standardContextual"/>
         </w:rPr>
       </w:pPr>
-      <w:hyperlink w:anchor="_Toc242459079" w:history="1">
+      <w:hyperlink w:anchor="_Toc242649673" w:history="1">
         <w:r>
           <w:rPr>
             <w:rStyle w:val="aff8"/>
@@ -4202,7 +4202,7 @@
             <w:noProof/>
             <w:webHidden/>
           </w:rPr>
-          <w:instrText xml:space="preserve"> PAGEREF _Toc242459079 \h </w:instrText>
+          <w:instrText xml:space="preserve"> PAGEREF _Toc242649673 \h </w:instrText>
         </w:r>
         <w:r>
           <w:rPr>
@@ -4248,7 +4248,7 @@
           <w14:ligatures w14:val="standardContextual"/>
         </w:rPr>
       </w:pPr>
-      <w:hyperlink w:anchor="_Toc242459080" w:history="1">
+      <w:hyperlink w:anchor="_Toc242649674" w:history="1">
         <w:r>
           <w:rPr>
             <w:rStyle w:val="aff8"/>
@@ -4275,7 +4275,7 @@
             <w:noProof/>
             <w:webHidden/>
           </w:rPr>
-          <w:instrText xml:space="preserve"> PAGEREF _Toc242459080 \h </w:instrText>
+          <w:instrText xml:space="preserve"> PAGEREF _Toc242649674 \h </w:instrText>
         </w:r>
         <w:r>
           <w:rPr>
@@ -4321,7 +4321,7 @@
           <w14:ligatures w14:val="standardContextual"/>
         </w:rPr>
       </w:pPr>
-      <w:hyperlink w:anchor="_Toc242459081" w:history="1">
+      <w:hyperlink w:anchor="_Toc242649675" w:history="1">
         <w:r>
           <w:rPr>
             <w:rStyle w:val="aff8"/>
@@ -4348,7 +4348,7 @@
             <w:noProof/>
             <w:webHidden/>
           </w:rPr>
-          <w:instrText xml:space="preserve"> PAGEREF _Toc242459081 \h </w:instrText>
+          <w:instrText xml:space="preserve"> PAGEREF _Toc242649675 \h </w:instrText>
         </w:r>
         <w:r>
           <w:rPr>
@@ -4394,7 +4394,7 @@
           <w14:ligatures w14:val="standardContextual"/>
         </w:rPr>
       </w:pPr>
-      <w:hyperlink w:anchor="_Toc242459082" w:history="1">
+      <w:hyperlink w:anchor="_Toc242649676" w:history="1">
         <w:r>
           <w:rPr>
             <w:rStyle w:val="aff8"/>
@@ -4421,7 +4421,7 @@
             <w:noProof/>
             <w:webHidden/>
           </w:rPr>
-          <w:instrText xml:space="preserve"> PAGEREF _Toc242459082 \h </w:instrText>
+          <w:instrText xml:space="preserve"> PAGEREF _Toc242649676 \h </w:instrText>
         </w:r>
         <w:r>
           <w:rPr>
@@ -4467,7 +4467,7 @@
           <w14:ligatures w14:val="standardContextual"/>
         </w:rPr>
       </w:pPr>
-      <w:hyperlink w:anchor="_Toc242459083" w:history="1">
+      <w:hyperlink w:anchor="_Toc242649677" w:history="1">
         <w:r>
           <w:rPr>
             <w:rStyle w:val="aff8"/>
@@ -4494,7 +4494,7 @@
             <w:noProof/>
             <w:webHidden/>
           </w:rPr>
-          <w:instrText xml:space="preserve"> PAGEREF _Toc242459083 \h </w:instrText>
+          <w:instrText xml:space="preserve"> PAGEREF _Toc242649677 \h </w:instrText>
         </w:r>
         <w:r>
           <w:rPr>
@@ -4540,7 +4540,7 @@
         <w:ind w:firstLine="0"/>
         <w:jc w:val="center"/>
       </w:pPr>
-      <w:bookmarkStart w:id="0" w:name="_Toc242459026"/>
+      <w:bookmarkStart w:id="0" w:name="_Toc242649620"/>
       <w:r>
         <w:lastRenderedPageBreak/>
         <w:t>ПЕРЕЧЕНЬ ТЕРМИНОВ И СОКРАЩЕНИЙ</w:t>
@@ -5802,7 +5802,7 @@
         <w:pStyle w:val="1"/>
         <w:pageBreakBefore/>
       </w:pPr>
-      <w:bookmarkStart w:id="1" w:name="_Toc242459027"/>
+      <w:bookmarkStart w:id="1" w:name="_Toc242649621"/>
       <w:r>
         <w:lastRenderedPageBreak/>
         <w:t>1 Общие сведения</w:t>
@@ -5813,7 +5813,7 @@
       <w:pPr>
         <w:pStyle w:val="21"/>
       </w:pPr>
-      <w:bookmarkStart w:id="2" w:name="_Toc242459028"/>
+      <w:bookmarkStart w:id="2" w:name="_Toc242649622"/>
       <w:r>
         <w:t>1.1 Полное наименование системы и её условное обозначение</w:t>
       </w:r>
@@ -5833,7 +5833,7 @@
       <w:pPr>
         <w:pStyle w:val="21"/>
       </w:pPr>
-      <w:bookmarkStart w:id="3" w:name="_Toc242459029"/>
+      <w:bookmarkStart w:id="3" w:name="_Toc242649623"/>
       <w:r>
         <w:t>1.2 Шифр темы и номер договора</w:t>
       </w:r>
@@ -5848,7 +5848,7 @@
       <w:pPr>
         <w:pStyle w:val="21"/>
       </w:pPr>
-      <w:bookmarkStart w:id="4" w:name="_Toc242459030"/>
+      <w:bookmarkStart w:id="4" w:name="_Toc242649624"/>
       <w:r>
         <w:t>1.3 Наименования организаций заказчика и разработчика</w:t>
       </w:r>
@@ -5868,7 +5868,7 @@
       <w:pPr>
         <w:pStyle w:val="21"/>
       </w:pPr>
-      <w:bookmarkStart w:id="5" w:name="_Toc242459031"/>
+      <w:bookmarkStart w:id="5" w:name="_Toc242649625"/>
       <w:r>
         <w:t>1.4 Основания для создания системы</w:t>
       </w:r>
@@ -5893,7 +5893,7 @@
       <w:pPr>
         <w:pStyle w:val="21"/>
       </w:pPr>
-      <w:bookmarkStart w:id="6" w:name="_Toc242459032"/>
+      <w:bookmarkStart w:id="6" w:name="_Toc242649626"/>
       <w:r>
         <w:t>1.5 Плановые сроки начала и окончания работ</w:t>
       </w:r>
@@ -5908,7 +5908,7 @@
       <w:pPr>
         <w:pStyle w:val="21"/>
       </w:pPr>
-      <w:bookmarkStart w:id="7" w:name="_Toc242459033"/>
+      <w:bookmarkStart w:id="7" w:name="_Toc242649627"/>
       <w:r>
         <w:t>1.6 Сведения об источниках и порядке финансирования</w:t>
       </w:r>
@@ -5923,7 +5923,7 @@
       <w:pPr>
         <w:pStyle w:val="21"/>
       </w:pPr>
-      <w:bookmarkStart w:id="8" w:name="_Toc242459034"/>
+      <w:bookmarkStart w:id="8" w:name="_Toc242649628"/>
       <w:r>
         <w:lastRenderedPageBreak/>
         <w:t>1.7 Порядок оформления и предъявления результатов работ</w:t>
@@ -5939,7 +5939,7 @@
       <w:pPr>
         <w:pStyle w:val="21"/>
       </w:pPr>
-      <w:bookmarkStart w:id="9" w:name="_Toc242459035"/>
+      <w:bookmarkStart w:id="9" w:name="_Toc242649629"/>
       <w:r>
         <w:t>1.8 Перечень нормативно-технических документов</w:t>
       </w:r>
@@ -6003,7 +6003,7 @@
         <w:pStyle w:val="1"/>
         <w:pageBreakBefore/>
       </w:pPr>
-      <w:bookmarkStart w:id="10" w:name="_Toc242459036"/>
+      <w:bookmarkStart w:id="10" w:name="_Toc242649630"/>
       <w:r>
         <w:lastRenderedPageBreak/>
         <w:t>2 Цели и назначение создания автоматизированной системы</w:t>
@@ -6014,7 +6014,7 @@
       <w:pPr>
         <w:pStyle w:val="21"/>
       </w:pPr>
-      <w:bookmarkStart w:id="11" w:name="_Toc242459037"/>
+      <w:bookmarkStart w:id="11" w:name="_Toc242649631"/>
       <w:r>
         <w:t>2.1 Назначение системы</w:t>
       </w:r>
@@ -6074,7 +6074,7 @@
       <w:pPr>
         <w:pStyle w:val="21"/>
       </w:pPr>
-      <w:bookmarkStart w:id="12" w:name="_Toc242459038"/>
+      <w:bookmarkStart w:id="12" w:name="_Toc242649632"/>
       <w:r>
         <w:t>2.2 Цели создания системы</w:t>
       </w:r>
@@ -6120,7 +6120,7 @@
         <w:pStyle w:val="1"/>
         <w:pageBreakBefore/>
       </w:pPr>
-      <w:bookmarkStart w:id="13" w:name="_Toc242459039"/>
+      <w:bookmarkStart w:id="13" w:name="_Toc242649633"/>
       <w:r>
         <w:lastRenderedPageBreak/>
         <w:t>3 Характеристика объекта автоматизации</w:t>
@@ -6131,7 +6131,7 @@
       <w:pPr>
         <w:pStyle w:val="21"/>
       </w:pPr>
-      <w:bookmarkStart w:id="14" w:name="_Toc242459040"/>
+      <w:bookmarkStart w:id="14" w:name="_Toc242649634"/>
       <w:r>
         <w:t>3.1 Краткие сведения об объекте автоматизации</w:t>
       </w:r>
@@ -6221,7 +6221,7 @@
       <w:pPr>
         <w:pStyle w:val="21"/>
       </w:pPr>
-      <w:bookmarkStart w:id="15" w:name="_Toc242459041"/>
+      <w:bookmarkStart w:id="15" w:name="_Toc242649635"/>
       <w:r>
         <w:t>3.2 Сведения об условиях эксплуатации</w:t>
       </w:r>
@@ -6237,7 +6237,7 @@
         <w:pStyle w:val="1"/>
         <w:pageBreakBefore/>
       </w:pPr>
-      <w:bookmarkStart w:id="16" w:name="_Toc242459042"/>
+      <w:bookmarkStart w:id="16" w:name="_Toc242649636"/>
       <w:r>
         <w:lastRenderedPageBreak/>
         <w:t>4 Требования к автоматизированной системе</w:t>
@@ -6248,7 +6248,7 @@
       <w:pPr>
         <w:pStyle w:val="21"/>
       </w:pPr>
-      <w:bookmarkStart w:id="17" w:name="_Toc242459043"/>
+      <w:bookmarkStart w:id="17" w:name="_Toc242649637"/>
       <w:r>
         <w:t>4.1 Требования к системе в целом</w:t>
       </w:r>
@@ -6258,7 +6258,7 @@
       <w:pPr>
         <w:pStyle w:val="31"/>
       </w:pPr>
-      <w:bookmarkStart w:id="18" w:name="_Toc242459044"/>
+      <w:bookmarkStart w:id="18" w:name="_Toc242649638"/>
       <w:r>
         <w:t>4.1.1 Требования к структуре и функционированию системы</w:t>
       </w:r>
@@ -6904,7 +6904,7 @@
       <w:pPr>
         <w:pStyle w:val="31"/>
       </w:pPr>
-      <w:bookmarkStart w:id="19" w:name="_Toc242459045"/>
+      <w:bookmarkStart w:id="19" w:name="_Toc242649639"/>
       <w:r>
         <w:t>4.1.2 Требования к численности и квалификации персонала</w:t>
       </w:r>
@@ -7185,7 +7185,7 @@
       <w:pPr>
         <w:pStyle w:val="31"/>
       </w:pPr>
-      <w:bookmarkStart w:id="20" w:name="_Toc242459046"/>
+      <w:bookmarkStart w:id="20" w:name="_Toc242649640"/>
       <w:r>
         <w:t>4.1.3 Показатели назначения</w:t>
       </w:r>
@@ -7233,7 +7233,7 @@
       <w:pPr>
         <w:pStyle w:val="31"/>
       </w:pPr>
-      <w:bookmarkStart w:id="21" w:name="_Toc242459047"/>
+      <w:bookmarkStart w:id="21" w:name="_Toc242649641"/>
       <w:r>
         <w:t>4.1.4 Требования к надёжности</w:t>
       </w:r>
@@ -7267,7 +7267,7 @@
       <w:pPr>
         <w:pStyle w:val="31"/>
       </w:pPr>
-      <w:bookmarkStart w:id="22" w:name="_Toc242459048"/>
+      <w:bookmarkStart w:id="22" w:name="_Toc242649642"/>
       <w:r>
         <w:t>4.1.5 Требования к безопасности</w:t>
       </w:r>
@@ -7282,7 +7282,7 @@
       <w:pPr>
         <w:pStyle w:val="31"/>
       </w:pPr>
-      <w:bookmarkStart w:id="23" w:name="_Toc242459049"/>
+      <w:bookmarkStart w:id="23" w:name="_Toc242649643"/>
       <w:r>
         <w:t>4.1.6 Требования к эргономике и технической эстетике</w:t>
       </w:r>
@@ -7327,7 +7327,7 @@
       <w:pPr>
         <w:pStyle w:val="31"/>
       </w:pPr>
-      <w:bookmarkStart w:id="24" w:name="_Toc242459050"/>
+      <w:bookmarkStart w:id="24" w:name="_Toc242649644"/>
       <w:r>
         <w:t>4.1.7 Требования к эксплуатации и техническому обслуживанию</w:t>
       </w:r>
@@ -7357,7 +7357,7 @@
       <w:pPr>
         <w:pStyle w:val="31"/>
       </w:pPr>
-      <w:bookmarkStart w:id="25" w:name="_Toc242459051"/>
+      <w:bookmarkStart w:id="25" w:name="_Toc242649645"/>
       <w:r>
         <w:t>4.1.8 Требования к защите информации от несанкционированного доступа</w:t>
       </w:r>
@@ -7428,7 +7428,7 @@
       <w:pPr>
         <w:pStyle w:val="31"/>
       </w:pPr>
-      <w:bookmarkStart w:id="26" w:name="_Toc242459052"/>
+      <w:bookmarkStart w:id="26" w:name="_Toc242649646"/>
       <w:r>
         <w:t>4.1.9 Требования по сохранности информации при авариях</w:t>
       </w:r>
@@ -7449,7 +7449,7 @@
       <w:pPr>
         <w:pStyle w:val="31"/>
       </w:pPr>
-      <w:bookmarkStart w:id="27" w:name="_Toc242459053"/>
+      <w:bookmarkStart w:id="27" w:name="_Toc242649647"/>
       <w:r>
         <w:t>4.1.10 Требования к защите от влияния внешних воздействий</w:t>
       </w:r>
@@ -7464,7 +7464,7 @@
       <w:pPr>
         <w:pStyle w:val="31"/>
       </w:pPr>
-      <w:bookmarkStart w:id="28" w:name="_Toc242459054"/>
+      <w:bookmarkStart w:id="28" w:name="_Toc242649648"/>
       <w:r>
         <w:t>4.1.11 Требования к патентной чистоте</w:t>
       </w:r>
@@ -7482,7 +7482,7 @@
       <w:pPr>
         <w:pStyle w:val="31"/>
       </w:pPr>
-      <w:bookmarkStart w:id="29" w:name="_Toc242459055"/>
+      <w:bookmarkStart w:id="29" w:name="_Toc242649649"/>
       <w:r>
         <w:t>4.1.12 Требования по стандартизации и унификации</w:t>
       </w:r>
@@ -7497,7 +7497,7 @@
       <w:pPr>
         <w:pStyle w:val="31"/>
       </w:pPr>
-      <w:bookmarkStart w:id="30" w:name="_Toc242459056"/>
+      <w:bookmarkStart w:id="30" w:name="_Toc242649650"/>
       <w:r>
         <w:t>4.1.13 Дополнительные требования</w:t>
       </w:r>
@@ -7517,7 +7517,7 @@
       <w:pPr>
         <w:pStyle w:val="21"/>
       </w:pPr>
-      <w:bookmarkStart w:id="31" w:name="_Toc242459057"/>
+      <w:bookmarkStart w:id="31" w:name="_Toc242649651"/>
       <w:r>
         <w:lastRenderedPageBreak/>
         <w:t>4.2 Требования к функциям, выполняемым системой</w:t>
@@ -7533,7 +7533,7 @@
       <w:pPr>
         <w:pStyle w:val="31"/>
       </w:pPr>
-      <w:bookmarkStart w:id="32" w:name="_Toc242459058"/>
+      <w:bookmarkStart w:id="32" w:name="_Toc242649652"/>
       <w:r>
         <w:t>4.2.1 Подсистема «Организационная структура и права доступа»</w:t>
       </w:r>
@@ -7578,7 +7578,7 @@
       <w:pPr>
         <w:pStyle w:val="31"/>
       </w:pPr>
-      <w:bookmarkStart w:id="33" w:name="_Toc242459059"/>
+      <w:bookmarkStart w:id="33" w:name="_Toc242649653"/>
       <w:r>
         <w:t>4.2.2 Подсистема «Каталог недвижимости»</w:t>
       </w:r>
@@ -7629,7 +7629,7 @@
       <w:pPr>
         <w:pStyle w:val="31"/>
       </w:pPr>
-      <w:bookmarkStart w:id="34" w:name="_Toc242459060"/>
+      <w:bookmarkStart w:id="34" w:name="_Toc242649654"/>
       <w:r>
         <w:t>4.2.3 Подсистема «Работа с клиентами»</w:t>
       </w:r>
@@ -7669,7 +7669,7 @@
       <w:pPr>
         <w:pStyle w:val="31"/>
       </w:pPr>
-      <w:bookmarkStart w:id="35" w:name="_Toc242459061"/>
+      <w:bookmarkStart w:id="35" w:name="_Toc242649655"/>
       <w:r>
         <w:t>4.2.4 Подсистема «Сделки»</w:t>
       </w:r>
@@ -7720,7 +7720,7 @@
       <w:pPr>
         <w:pStyle w:val="31"/>
       </w:pPr>
-      <w:bookmarkStart w:id="36" w:name="_Toc242459062"/>
+      <w:bookmarkStart w:id="36" w:name="_Toc242649656"/>
       <w:r>
         <w:t>4.2.5 Подсистема «Финансы»</w:t>
       </w:r>
@@ -7785,7 +7785,7 @@
       <w:pPr>
         <w:pStyle w:val="31"/>
       </w:pPr>
-      <w:bookmarkStart w:id="37" w:name="_Toc242459063"/>
+      <w:bookmarkStart w:id="37" w:name="_Toc242649657"/>
       <w:r>
         <w:lastRenderedPageBreak/>
         <w:t>4.2.6 Подсистема «Шаблоны документов»</w:t>
@@ -7801,7 +7801,7 @@
       <w:pPr>
         <w:pStyle w:val="31"/>
       </w:pPr>
-      <w:bookmarkStart w:id="38" w:name="_Toc242459064"/>
+      <w:bookmarkStart w:id="38" w:name="_Toc242649658"/>
       <w:r>
         <w:t>4.2.7 Подсистема «Задачи»</w:t>
       </w:r>
@@ -7816,7 +7816,7 @@
       <w:pPr>
         <w:pStyle w:val="31"/>
       </w:pPr>
-      <w:bookmarkStart w:id="39" w:name="_Toc242459065"/>
+      <w:bookmarkStart w:id="39" w:name="_Toc242649659"/>
       <w:r>
         <w:t>4.2.8 Подсистема «Аналитика и отчётность»</w:t>
       </w:r>
@@ -7856,7 +7856,7 @@
       <w:pPr>
         <w:pStyle w:val="31"/>
       </w:pPr>
-      <w:bookmarkStart w:id="40" w:name="_Toc242459066"/>
+      <w:bookmarkStart w:id="40" w:name="_Toc242649660"/>
       <w:r>
         <w:t>4.2.9 Подсистема «Интеграция с партнёрами»</w:t>
       </w:r>
@@ -7871,7 +7871,7 @@
       <w:pPr>
         <w:pStyle w:val="31"/>
       </w:pPr>
-      <w:bookmarkStart w:id="41" w:name="_Toc242459067"/>
+      <w:bookmarkStart w:id="41" w:name="_Toc242649661"/>
       <w:r>
         <w:lastRenderedPageBreak/>
         <w:t>4.2.10 Подсистема «Регламентные задания»</w:t>
@@ -7887,7 +7887,7 @@
       <w:pPr>
         <w:pStyle w:val="21"/>
       </w:pPr>
-      <w:bookmarkStart w:id="42" w:name="_Toc242459068"/>
+      <w:bookmarkStart w:id="42" w:name="_Toc242649662"/>
       <w:r>
         <w:t>4.3 Требования к видам обеспечения</w:t>
       </w:r>
@@ -7897,7 +7897,7 @@
       <w:pPr>
         <w:pStyle w:val="31"/>
       </w:pPr>
-      <w:bookmarkStart w:id="43" w:name="_Toc242459069"/>
+      <w:bookmarkStart w:id="43" w:name="_Toc242649663"/>
       <w:r>
         <w:t>4.3.1 Требования к математическому обеспечению</w:t>
       </w:r>
@@ -7930,14 +7930,14 @@
     </w:p>
     <w:p>
       <w:r>
-        <w:t>– для пересчёта на дату берётся последний курс не позже этой даты; ручной курс компании на ту же дату имеет приоритет над курсом ЦБ.</w:t>
+        <w:t>– источник курсов выбирает компания: курсы ЦБ Узбекистана или только её ручные курсы; источники не смешиваются; для пересчёта на дату берётся последний курс выбранного источника не позже этой даты.</w:t>
       </w:r>
     </w:p>
     <w:p>
       <w:pPr>
         <w:pStyle w:val="31"/>
       </w:pPr>
-      <w:bookmarkStart w:id="44" w:name="_Toc242459070"/>
+      <w:bookmarkStart w:id="44" w:name="_Toc242649664"/>
       <w:r>
         <w:t>4.3.2 Требования к информационному обеспечению</w:t>
       </w:r>
@@ -7952,7 +7952,7 @@
       <w:pPr>
         <w:pStyle w:val="31"/>
       </w:pPr>
-      <w:bookmarkStart w:id="45" w:name="_Toc242459071"/>
+      <w:bookmarkStart w:id="45" w:name="_Toc242649665"/>
       <w:r>
         <w:t>4.3.3 Требования к лингвистическому обеспечению</w:t>
       </w:r>
@@ -7967,7 +7967,7 @@
       <w:pPr>
         <w:pStyle w:val="31"/>
       </w:pPr>
-      <w:bookmarkStart w:id="46" w:name="_Toc242459072"/>
+      <w:bookmarkStart w:id="46" w:name="_Toc242649666"/>
       <w:r>
         <w:lastRenderedPageBreak/>
         <w:t>4.3.4 Требования к программному обеспечению</w:t>
@@ -7983,7 +7983,7 @@
       <w:pPr>
         <w:pStyle w:val="31"/>
       </w:pPr>
-      <w:bookmarkStart w:id="47" w:name="_Toc242459073"/>
+      <w:bookmarkStart w:id="47" w:name="_Toc242649667"/>
       <w:r>
         <w:t>4.3.5 Требования к техническому обеспечению</w:t>
       </w:r>
@@ -7998,7 +7998,7 @@
       <w:pPr>
         <w:pStyle w:val="31"/>
       </w:pPr>
-      <w:bookmarkStart w:id="48" w:name="_Toc242459074"/>
+      <w:bookmarkStart w:id="48" w:name="_Toc242649668"/>
       <w:r>
         <w:t>4.3.6 Требования к метрологическому обеспечению</w:t>
       </w:r>
@@ -8013,7 +8013,7 @@
       <w:pPr>
         <w:pStyle w:val="31"/>
       </w:pPr>
-      <w:bookmarkStart w:id="49" w:name="_Toc242459075"/>
+      <w:bookmarkStart w:id="49" w:name="_Toc242649669"/>
       <w:r>
         <w:t>4.3.7 Требования к организационному обеспечению</w:t>
       </w:r>
@@ -8028,7 +8028,7 @@
       <w:pPr>
         <w:pStyle w:val="31"/>
       </w:pPr>
-      <w:bookmarkStart w:id="50" w:name="_Toc242459076"/>
+      <w:bookmarkStart w:id="50" w:name="_Toc242649670"/>
       <w:r>
         <w:t>4.3.8 Требования к методическому обеспечению</w:t>
       </w:r>
@@ -8044,7 +8044,7 @@
         <w:pStyle w:val="1"/>
         <w:pageBreakBefore/>
       </w:pPr>
-      <w:bookmarkStart w:id="51" w:name="_Toc242459077"/>
+      <w:bookmarkStart w:id="51" w:name="_Toc242649671"/>
       <w:r>
         <w:lastRenderedPageBreak/>
         <w:t>5 Состав и содержание работ по созданию системы</w:t>
@@ -8366,7 +8366,7 @@
         <w:pStyle w:val="1"/>
         <w:pageBreakBefore/>
       </w:pPr>
-      <w:bookmarkStart w:id="52" w:name="_Toc242459078"/>
+      <w:bookmarkStart w:id="52" w:name="_Toc242649672"/>
       <w:r>
         <w:lastRenderedPageBreak/>
         <w:t>6 Порядок разработки автоматизированной системы</w:t>
@@ -8413,7 +8413,7 @@
         <w:pStyle w:val="1"/>
         <w:pageBreakBefore/>
       </w:pPr>
-      <w:bookmarkStart w:id="53" w:name="_Toc242459079"/>
+      <w:bookmarkStart w:id="53" w:name="_Toc242649673"/>
       <w:r>
         <w:lastRenderedPageBreak/>
         <w:t>7 Порядок контроля и приёмки автоматизированной системы</w:t>
@@ -8430,7 +8430,7 @@
         <w:pStyle w:val="1"/>
         <w:pageBreakBefore/>
       </w:pPr>
-      <w:bookmarkStart w:id="54" w:name="_Toc242459080"/>
+      <w:bookmarkStart w:id="54" w:name="_Toc242649674"/>
       <w:r>
         <w:lastRenderedPageBreak/>
         <w:t>8 Требования к составу и содержанию работ по подготовке объекта автоматизации к вводу системы в действие</w:t>
@@ -8492,7 +8492,7 @@
         <w:pStyle w:val="1"/>
         <w:pageBreakBefore/>
       </w:pPr>
-      <w:bookmarkStart w:id="55" w:name="_Toc242459081"/>
+      <w:bookmarkStart w:id="55" w:name="_Toc242649675"/>
       <w:r>
         <w:lastRenderedPageBreak/>
         <w:t>9 Требования к документированию</w:t>
@@ -9134,7 +9134,7 @@
         <w:pStyle w:val="1"/>
         <w:pageBreakBefore/>
       </w:pPr>
-      <w:bookmarkStart w:id="56" w:name="_Toc242459082"/>
+      <w:bookmarkStart w:id="56" w:name="_Toc242649676"/>
       <w:r>
         <w:lastRenderedPageBreak/>
         <w:t>10 Источники разработки</w:t>
@@ -9173,7 +9173,7 @@
         <w:ind w:firstLine="0"/>
         <w:jc w:val="center"/>
       </w:pPr>
-      <w:bookmarkStart w:id="57" w:name="_Toc242459083"/>
+      <w:bookmarkStart w:id="57" w:name="_Toc242649677"/>
       <w:r>
         <w:lastRenderedPageBreak/>
         <w:t>ЛИСТ РЕГИСТРАЦИИ ИЗМЕНЕНИЙ</w:t>
@@ -11235,31 +11235,31 @@
       </w:rPr>
     </w:lvl>
   </w:abstractNum>
-  <w:num w:numId="1" w16cid:durableId="1579896683">
+  <w:num w:numId="1" w16cid:durableId="2067801970">
     <w:abstractNumId w:val="8"/>
   </w:num>
-  <w:num w:numId="2" w16cid:durableId="291449846">
+  <w:num w:numId="2" w16cid:durableId="1763338401">
     <w:abstractNumId w:val="6"/>
   </w:num>
-  <w:num w:numId="3" w16cid:durableId="1078094532">
+  <w:num w:numId="3" w16cid:durableId="1692100803">
     <w:abstractNumId w:val="5"/>
   </w:num>
-  <w:num w:numId="4" w16cid:durableId="497693537">
+  <w:num w:numId="4" w16cid:durableId="351614861">
     <w:abstractNumId w:val="4"/>
   </w:num>
-  <w:num w:numId="5" w16cid:durableId="1775199714">
+  <w:num w:numId="5" w16cid:durableId="929854840">
     <w:abstractNumId w:val="7"/>
   </w:num>
-  <w:num w:numId="6" w16cid:durableId="1474717336">
+  <w:num w:numId="6" w16cid:durableId="982079180">
     <w:abstractNumId w:val="3"/>
   </w:num>
-  <w:num w:numId="7" w16cid:durableId="1934314698">
+  <w:num w:numId="7" w16cid:durableId="522523642">
     <w:abstractNumId w:val="2"/>
   </w:num>
-  <w:num w:numId="8" w16cid:durableId="715353129">
+  <w:num w:numId="8" w16cid:durableId="282731770">
     <w:abstractNumId w:val="1"/>
   </w:num>
-  <w:num w:numId="9" w16cid:durableId="164713733">
+  <w:num w:numId="9" w16cid:durableId="1658726704">
     <w:abstractNumId w:val="0"/>
   </w:num>
 </w:numbering>
@@ -22792,7 +22792,7 @@
     <w:autoRedefine/>
     <w:uiPriority w:val="39"/>
     <w:unhideWhenUsed/>
-    <w:rsid w:val="00EC25F2"/>
+    <w:rsid w:val="00FB137D"/>
     <w:pPr>
       <w:spacing w:after="100"/>
     </w:pPr>
@@ -22804,7 +22804,7 @@
     <w:autoRedefine/>
     <w:uiPriority w:val="39"/>
     <w:unhideWhenUsed/>
-    <w:rsid w:val="00EC25F2"/>
+    <w:rsid w:val="00FB137D"/>
     <w:pPr>
       <w:spacing w:after="100"/>
       <w:ind w:left="240"/>
@@ -22817,7 +22817,7 @@
     <w:autoRedefine/>
     <w:uiPriority w:val="39"/>
     <w:unhideWhenUsed/>
-    <w:rsid w:val="00EC25F2"/>
+    <w:rsid w:val="00FB137D"/>
     <w:pPr>
       <w:spacing w:after="100"/>
       <w:ind w:left="480"/>
@@ -22828,7 +22828,7 @@
     <w:basedOn w:val="a2"/>
     <w:uiPriority w:val="99"/>
     <w:unhideWhenUsed/>
-    <w:rsid w:val="00EC25F2"/>
+    <w:rsid w:val="00FB137D"/>
     <w:rPr>
       <w:color w:val="0000FF" w:themeColor="hyperlink"/>
       <w:u w:val="single"/>

</xml_diff>

<commit_message>
Add reupload signed docs
</commit_message>
<xml_diff>
--- a/docs/gost/out/01_ТЗ_Техническое_задание.docx
+++ b/docs/gost/out/01_ТЗ_Техническое_задание.docx
@@ -224,7 +224,7 @@
         <w:rPr>
           <w:noProof/>
         </w:rPr>
-        <w:t>29</w:t>
+        <w:t>30</w:t>
       </w:r>
       <w:r>
         <w:fldChar w:fldCharType="end"/>
@@ -306,7 +306,7 @@
       <w:r>
         <w:fldChar w:fldCharType="separate"/>
       </w:r>
-      <w:hyperlink w:anchor="_Toc243319664" w:history="1">
+      <w:hyperlink w:anchor="_Toc243476272" w:history="1">
         <w:r>
           <w:rPr>
             <w:rStyle w:val="aff8"/>
@@ -333,7 +333,7 @@
             <w:noProof/>
             <w:webHidden/>
           </w:rPr>
-          <w:instrText xml:space="preserve"> PAGEREF _Toc243319664 \h </w:instrText>
+          <w:instrText xml:space="preserve"> PAGEREF _Toc243476272 \h </w:instrText>
         </w:r>
         <w:r>
           <w:rPr>
@@ -379,7 +379,7 @@
           <w14:ligatures w14:val="standardContextual"/>
         </w:rPr>
       </w:pPr>
-      <w:hyperlink w:anchor="_Toc243319665" w:history="1">
+      <w:hyperlink w:anchor="_Toc243476273" w:history="1">
         <w:r>
           <w:rPr>
             <w:rStyle w:val="aff8"/>
@@ -406,7 +406,7 @@
             <w:noProof/>
             <w:webHidden/>
           </w:rPr>
-          <w:instrText xml:space="preserve"> PAGEREF _Toc243319665 \h </w:instrText>
+          <w:instrText xml:space="preserve"> PAGEREF _Toc243476273 \h </w:instrText>
         </w:r>
         <w:r>
           <w:rPr>
@@ -452,7 +452,7 @@
           <w14:ligatures w14:val="standardContextual"/>
         </w:rPr>
       </w:pPr>
-      <w:hyperlink w:anchor="_Toc243319666" w:history="1">
+      <w:hyperlink w:anchor="_Toc243476274" w:history="1">
         <w:r>
           <w:rPr>
             <w:rStyle w:val="aff8"/>
@@ -479,7 +479,7 @@
             <w:noProof/>
             <w:webHidden/>
           </w:rPr>
-          <w:instrText xml:space="preserve"> PAGEREF _Toc243319666 \h </w:instrText>
+          <w:instrText xml:space="preserve"> PAGEREF _Toc243476274 \h </w:instrText>
         </w:r>
         <w:r>
           <w:rPr>
@@ -525,7 +525,7 @@
           <w14:ligatures w14:val="standardContextual"/>
         </w:rPr>
       </w:pPr>
-      <w:hyperlink w:anchor="_Toc243319667" w:history="1">
+      <w:hyperlink w:anchor="_Toc243476275" w:history="1">
         <w:r>
           <w:rPr>
             <w:rStyle w:val="aff8"/>
@@ -552,7 +552,7 @@
             <w:noProof/>
             <w:webHidden/>
           </w:rPr>
-          <w:instrText xml:space="preserve"> PAGEREF _Toc243319667 \h </w:instrText>
+          <w:instrText xml:space="preserve"> PAGEREF _Toc243476275 \h </w:instrText>
         </w:r>
         <w:r>
           <w:rPr>
@@ -598,7 +598,7 @@
           <w14:ligatures w14:val="standardContextual"/>
         </w:rPr>
       </w:pPr>
-      <w:hyperlink w:anchor="_Toc243319668" w:history="1">
+      <w:hyperlink w:anchor="_Toc243476276" w:history="1">
         <w:r>
           <w:rPr>
             <w:rStyle w:val="aff8"/>
@@ -625,7 +625,7 @@
             <w:noProof/>
             <w:webHidden/>
           </w:rPr>
-          <w:instrText xml:space="preserve"> PAGEREF _Toc243319668 \h </w:instrText>
+          <w:instrText xml:space="preserve"> PAGEREF _Toc243476276 \h </w:instrText>
         </w:r>
         <w:r>
           <w:rPr>
@@ -671,7 +671,7 @@
           <w14:ligatures w14:val="standardContextual"/>
         </w:rPr>
       </w:pPr>
-      <w:hyperlink w:anchor="_Toc243319669" w:history="1">
+      <w:hyperlink w:anchor="_Toc243476277" w:history="1">
         <w:r>
           <w:rPr>
             <w:rStyle w:val="aff8"/>
@@ -698,7 +698,7 @@
             <w:noProof/>
             <w:webHidden/>
           </w:rPr>
-          <w:instrText xml:space="preserve"> PAGEREF _Toc243319669 \h </w:instrText>
+          <w:instrText xml:space="preserve"> PAGEREF _Toc243476277 \h </w:instrText>
         </w:r>
         <w:r>
           <w:rPr>
@@ -744,7 +744,7 @@
           <w14:ligatures w14:val="standardContextual"/>
         </w:rPr>
       </w:pPr>
-      <w:hyperlink w:anchor="_Toc243319670" w:history="1">
+      <w:hyperlink w:anchor="_Toc243476278" w:history="1">
         <w:r>
           <w:rPr>
             <w:rStyle w:val="aff8"/>
@@ -771,7 +771,7 @@
             <w:noProof/>
             <w:webHidden/>
           </w:rPr>
-          <w:instrText xml:space="preserve"> PAGEREF _Toc243319670 \h </w:instrText>
+          <w:instrText xml:space="preserve"> PAGEREF _Toc243476278 \h </w:instrText>
         </w:r>
         <w:r>
           <w:rPr>
@@ -817,7 +817,7 @@
           <w14:ligatures w14:val="standardContextual"/>
         </w:rPr>
       </w:pPr>
-      <w:hyperlink w:anchor="_Toc243319671" w:history="1">
+      <w:hyperlink w:anchor="_Toc243476279" w:history="1">
         <w:r>
           <w:rPr>
             <w:rStyle w:val="aff8"/>
@@ -844,7 +844,7 @@
             <w:noProof/>
             <w:webHidden/>
           </w:rPr>
-          <w:instrText xml:space="preserve"> PAGEREF _Toc243319671 \h </w:instrText>
+          <w:instrText xml:space="preserve"> PAGEREF _Toc243476279 \h </w:instrText>
         </w:r>
         <w:r>
           <w:rPr>
@@ -890,7 +890,7 @@
           <w14:ligatures w14:val="standardContextual"/>
         </w:rPr>
       </w:pPr>
-      <w:hyperlink w:anchor="_Toc243319672" w:history="1">
+      <w:hyperlink w:anchor="_Toc243476280" w:history="1">
         <w:r>
           <w:rPr>
             <w:rStyle w:val="aff8"/>
@@ -917,7 +917,7 @@
             <w:noProof/>
             <w:webHidden/>
           </w:rPr>
-          <w:instrText xml:space="preserve"> PAGEREF _Toc243319672 \h </w:instrText>
+          <w:instrText xml:space="preserve"> PAGEREF _Toc243476280 \h </w:instrText>
         </w:r>
         <w:r>
           <w:rPr>
@@ -963,7 +963,7 @@
           <w14:ligatures w14:val="standardContextual"/>
         </w:rPr>
       </w:pPr>
-      <w:hyperlink w:anchor="_Toc243319673" w:history="1">
+      <w:hyperlink w:anchor="_Toc243476281" w:history="1">
         <w:r>
           <w:rPr>
             <w:rStyle w:val="aff8"/>
@@ -990,7 +990,7 @@
             <w:noProof/>
             <w:webHidden/>
           </w:rPr>
-          <w:instrText xml:space="preserve"> PAGEREF _Toc243319673 \h </w:instrText>
+          <w:instrText xml:space="preserve"> PAGEREF _Toc243476281 \h </w:instrText>
         </w:r>
         <w:r>
           <w:rPr>
@@ -1036,7 +1036,7 @@
           <w14:ligatures w14:val="standardContextual"/>
         </w:rPr>
       </w:pPr>
-      <w:hyperlink w:anchor="_Toc243319674" w:history="1">
+      <w:hyperlink w:anchor="_Toc243476282" w:history="1">
         <w:r>
           <w:rPr>
             <w:rStyle w:val="aff8"/>
@@ -1063,7 +1063,7 @@
             <w:noProof/>
             <w:webHidden/>
           </w:rPr>
-          <w:instrText xml:space="preserve"> PAGEREF _Toc243319674 \h </w:instrText>
+          <w:instrText xml:space="preserve"> PAGEREF _Toc243476282 \h </w:instrText>
         </w:r>
         <w:r>
           <w:rPr>
@@ -1109,7 +1109,7 @@
           <w14:ligatures w14:val="standardContextual"/>
         </w:rPr>
       </w:pPr>
-      <w:hyperlink w:anchor="_Toc243319675" w:history="1">
+      <w:hyperlink w:anchor="_Toc243476283" w:history="1">
         <w:r>
           <w:rPr>
             <w:rStyle w:val="aff8"/>
@@ -1136,7 +1136,7 @@
             <w:noProof/>
             <w:webHidden/>
           </w:rPr>
-          <w:instrText xml:space="preserve"> PAGEREF _Toc243319675 \h </w:instrText>
+          <w:instrText xml:space="preserve"> PAGEREF _Toc243476283 \h </w:instrText>
         </w:r>
         <w:r>
           <w:rPr>
@@ -1182,7 +1182,7 @@
           <w14:ligatures w14:val="standardContextual"/>
         </w:rPr>
       </w:pPr>
-      <w:hyperlink w:anchor="_Toc243319676" w:history="1">
+      <w:hyperlink w:anchor="_Toc243476284" w:history="1">
         <w:r>
           <w:rPr>
             <w:rStyle w:val="aff8"/>
@@ -1209,7 +1209,7 @@
             <w:noProof/>
             <w:webHidden/>
           </w:rPr>
-          <w:instrText xml:space="preserve"> PAGEREF _Toc243319676 \h </w:instrText>
+          <w:instrText xml:space="preserve"> PAGEREF _Toc243476284 \h </w:instrText>
         </w:r>
         <w:r>
           <w:rPr>
@@ -1255,7 +1255,7 @@
           <w14:ligatures w14:val="standardContextual"/>
         </w:rPr>
       </w:pPr>
-      <w:hyperlink w:anchor="_Toc243319677" w:history="1">
+      <w:hyperlink w:anchor="_Toc243476285" w:history="1">
         <w:r>
           <w:rPr>
             <w:rStyle w:val="aff8"/>
@@ -1282,7 +1282,7 @@
             <w:noProof/>
             <w:webHidden/>
           </w:rPr>
-          <w:instrText xml:space="preserve"> PAGEREF _Toc243319677 \h </w:instrText>
+          <w:instrText xml:space="preserve"> PAGEREF _Toc243476285 \h </w:instrText>
         </w:r>
         <w:r>
           <w:rPr>
@@ -1328,7 +1328,7 @@
           <w14:ligatures w14:val="standardContextual"/>
         </w:rPr>
       </w:pPr>
-      <w:hyperlink w:anchor="_Toc243319678" w:history="1">
+      <w:hyperlink w:anchor="_Toc243476286" w:history="1">
         <w:r>
           <w:rPr>
             <w:rStyle w:val="aff8"/>
@@ -1355,7 +1355,7 @@
             <w:noProof/>
             <w:webHidden/>
           </w:rPr>
-          <w:instrText xml:space="preserve"> PAGEREF _Toc243319678 \h </w:instrText>
+          <w:instrText xml:space="preserve"> PAGEREF _Toc243476286 \h </w:instrText>
         </w:r>
         <w:r>
           <w:rPr>
@@ -1401,7 +1401,7 @@
           <w14:ligatures w14:val="standardContextual"/>
         </w:rPr>
       </w:pPr>
-      <w:hyperlink w:anchor="_Toc243319679" w:history="1">
+      <w:hyperlink w:anchor="_Toc243476287" w:history="1">
         <w:r>
           <w:rPr>
             <w:rStyle w:val="aff8"/>
@@ -1428,7 +1428,7 @@
             <w:noProof/>
             <w:webHidden/>
           </w:rPr>
-          <w:instrText xml:space="preserve"> PAGEREF _Toc243319679 \h </w:instrText>
+          <w:instrText xml:space="preserve"> PAGEREF _Toc243476287 \h </w:instrText>
         </w:r>
         <w:r>
           <w:rPr>
@@ -1474,7 +1474,7 @@
           <w14:ligatures w14:val="standardContextual"/>
         </w:rPr>
       </w:pPr>
-      <w:hyperlink w:anchor="_Toc243319680" w:history="1">
+      <w:hyperlink w:anchor="_Toc243476288" w:history="1">
         <w:r>
           <w:rPr>
             <w:rStyle w:val="aff8"/>
@@ -1501,7 +1501,7 @@
             <w:noProof/>
             <w:webHidden/>
           </w:rPr>
-          <w:instrText xml:space="preserve"> PAGEREF _Toc243319680 \h </w:instrText>
+          <w:instrText xml:space="preserve"> PAGEREF _Toc243476288 \h </w:instrText>
         </w:r>
         <w:r>
           <w:rPr>
@@ -1547,7 +1547,7 @@
           <w14:ligatures w14:val="standardContextual"/>
         </w:rPr>
       </w:pPr>
-      <w:hyperlink w:anchor="_Toc243319681" w:history="1">
+      <w:hyperlink w:anchor="_Toc243476289" w:history="1">
         <w:r>
           <w:rPr>
             <w:rStyle w:val="aff8"/>
@@ -1574,7 +1574,7 @@
             <w:noProof/>
             <w:webHidden/>
           </w:rPr>
-          <w:instrText xml:space="preserve"> PAGEREF _Toc243319681 \h </w:instrText>
+          <w:instrText xml:space="preserve"> PAGEREF _Toc243476289 \h </w:instrText>
         </w:r>
         <w:r>
           <w:rPr>
@@ -1620,7 +1620,7 @@
           <w14:ligatures w14:val="standardContextual"/>
         </w:rPr>
       </w:pPr>
-      <w:hyperlink w:anchor="_Toc243319682" w:history="1">
+      <w:hyperlink w:anchor="_Toc243476290" w:history="1">
         <w:r>
           <w:rPr>
             <w:rStyle w:val="aff8"/>
@@ -1647,7 +1647,7 @@
             <w:noProof/>
             <w:webHidden/>
           </w:rPr>
-          <w:instrText xml:space="preserve"> PAGEREF _Toc243319682 \h </w:instrText>
+          <w:instrText xml:space="preserve"> PAGEREF _Toc243476290 \h </w:instrText>
         </w:r>
         <w:r>
           <w:rPr>
@@ -1693,7 +1693,7 @@
           <w14:ligatures w14:val="standardContextual"/>
         </w:rPr>
       </w:pPr>
-      <w:hyperlink w:anchor="_Toc243319683" w:history="1">
+      <w:hyperlink w:anchor="_Toc243476291" w:history="1">
         <w:r>
           <w:rPr>
             <w:rStyle w:val="aff8"/>
@@ -1720,7 +1720,7 @@
             <w:noProof/>
             <w:webHidden/>
           </w:rPr>
-          <w:instrText xml:space="preserve"> PAGEREF _Toc243319683 \h </w:instrText>
+          <w:instrText xml:space="preserve"> PAGEREF _Toc243476291 \h </w:instrText>
         </w:r>
         <w:r>
           <w:rPr>
@@ -1766,7 +1766,7 @@
           <w14:ligatures w14:val="standardContextual"/>
         </w:rPr>
       </w:pPr>
-      <w:hyperlink w:anchor="_Toc243319684" w:history="1">
+      <w:hyperlink w:anchor="_Toc243476292" w:history="1">
         <w:r>
           <w:rPr>
             <w:rStyle w:val="aff8"/>
@@ -1793,7 +1793,7 @@
             <w:noProof/>
             <w:webHidden/>
           </w:rPr>
-          <w:instrText xml:space="preserve"> PAGEREF _Toc243319684 \h </w:instrText>
+          <w:instrText xml:space="preserve"> PAGEREF _Toc243476292 \h </w:instrText>
         </w:r>
         <w:r>
           <w:rPr>
@@ -1839,7 +1839,7 @@
           <w14:ligatures w14:val="standardContextual"/>
         </w:rPr>
       </w:pPr>
-      <w:hyperlink w:anchor="_Toc243319685" w:history="1">
+      <w:hyperlink w:anchor="_Toc243476293" w:history="1">
         <w:r>
           <w:rPr>
             <w:rStyle w:val="aff8"/>
@@ -1866,7 +1866,7 @@
             <w:noProof/>
             <w:webHidden/>
           </w:rPr>
-          <w:instrText xml:space="preserve"> PAGEREF _Toc243319685 \h </w:instrText>
+          <w:instrText xml:space="preserve"> PAGEREF _Toc243476293 \h </w:instrText>
         </w:r>
         <w:r>
           <w:rPr>
@@ -1912,7 +1912,7 @@
           <w14:ligatures w14:val="standardContextual"/>
         </w:rPr>
       </w:pPr>
-      <w:hyperlink w:anchor="_Toc243319686" w:history="1">
+      <w:hyperlink w:anchor="_Toc243476294" w:history="1">
         <w:r>
           <w:rPr>
             <w:rStyle w:val="aff8"/>
@@ -1939,7 +1939,7 @@
             <w:noProof/>
             <w:webHidden/>
           </w:rPr>
-          <w:instrText xml:space="preserve"> PAGEREF _Toc243319686 \h </w:instrText>
+          <w:instrText xml:space="preserve"> PAGEREF _Toc243476294 \h </w:instrText>
         </w:r>
         <w:r>
           <w:rPr>
@@ -1985,7 +1985,7 @@
           <w14:ligatures w14:val="standardContextual"/>
         </w:rPr>
       </w:pPr>
-      <w:hyperlink w:anchor="_Toc243319687" w:history="1">
+      <w:hyperlink w:anchor="_Toc243476295" w:history="1">
         <w:r>
           <w:rPr>
             <w:rStyle w:val="aff8"/>
@@ -2012,7 +2012,7 @@
             <w:noProof/>
             <w:webHidden/>
           </w:rPr>
-          <w:instrText xml:space="preserve"> PAGEREF _Toc243319687 \h </w:instrText>
+          <w:instrText xml:space="preserve"> PAGEREF _Toc243476295 \h </w:instrText>
         </w:r>
         <w:r>
           <w:rPr>
@@ -2058,7 +2058,7 @@
           <w14:ligatures w14:val="standardContextual"/>
         </w:rPr>
       </w:pPr>
-      <w:hyperlink w:anchor="_Toc243319688" w:history="1">
+      <w:hyperlink w:anchor="_Toc243476296" w:history="1">
         <w:r>
           <w:rPr>
             <w:rStyle w:val="aff8"/>
@@ -2085,7 +2085,7 @@
             <w:noProof/>
             <w:webHidden/>
           </w:rPr>
-          <w:instrText xml:space="preserve"> PAGEREF _Toc243319688 \h </w:instrText>
+          <w:instrText xml:space="preserve"> PAGEREF _Toc243476296 \h </w:instrText>
         </w:r>
         <w:r>
           <w:rPr>
@@ -2131,7 +2131,7 @@
           <w14:ligatures w14:val="standardContextual"/>
         </w:rPr>
       </w:pPr>
-      <w:hyperlink w:anchor="_Toc243319689" w:history="1">
+      <w:hyperlink w:anchor="_Toc243476297" w:history="1">
         <w:r>
           <w:rPr>
             <w:rStyle w:val="aff8"/>
@@ -2158,7 +2158,7 @@
             <w:noProof/>
             <w:webHidden/>
           </w:rPr>
-          <w:instrText xml:space="preserve"> PAGEREF _Toc243319689 \h </w:instrText>
+          <w:instrText xml:space="preserve"> PAGEREF _Toc243476297 \h </w:instrText>
         </w:r>
         <w:r>
           <w:rPr>
@@ -2204,7 +2204,7 @@
           <w14:ligatures w14:val="standardContextual"/>
         </w:rPr>
       </w:pPr>
-      <w:hyperlink w:anchor="_Toc243319690" w:history="1">
+      <w:hyperlink w:anchor="_Toc243476298" w:history="1">
         <w:r>
           <w:rPr>
             <w:rStyle w:val="aff8"/>
@@ -2231,7 +2231,7 @@
             <w:noProof/>
             <w:webHidden/>
           </w:rPr>
-          <w:instrText xml:space="preserve"> PAGEREF _Toc243319690 \h </w:instrText>
+          <w:instrText xml:space="preserve"> PAGEREF _Toc243476298 \h </w:instrText>
         </w:r>
         <w:r>
           <w:rPr>
@@ -2277,7 +2277,7 @@
           <w14:ligatures w14:val="standardContextual"/>
         </w:rPr>
       </w:pPr>
-      <w:hyperlink w:anchor="_Toc243319691" w:history="1">
+      <w:hyperlink w:anchor="_Toc243476299" w:history="1">
         <w:r>
           <w:rPr>
             <w:rStyle w:val="aff8"/>
@@ -2304,7 +2304,7 @@
             <w:noProof/>
             <w:webHidden/>
           </w:rPr>
-          <w:instrText xml:space="preserve"> PAGEREF _Toc243319691 \h </w:instrText>
+          <w:instrText xml:space="preserve"> PAGEREF _Toc243476299 \h </w:instrText>
         </w:r>
         <w:r>
           <w:rPr>
@@ -2350,7 +2350,7 @@
           <w14:ligatures w14:val="standardContextual"/>
         </w:rPr>
       </w:pPr>
-      <w:hyperlink w:anchor="_Toc243319692" w:history="1">
+      <w:hyperlink w:anchor="_Toc243476300" w:history="1">
         <w:r>
           <w:rPr>
             <w:rStyle w:val="aff8"/>
@@ -2377,7 +2377,7 @@
             <w:noProof/>
             <w:webHidden/>
           </w:rPr>
-          <w:instrText xml:space="preserve"> PAGEREF _Toc243319692 \h </w:instrText>
+          <w:instrText xml:space="preserve"> PAGEREF _Toc243476300 \h </w:instrText>
         </w:r>
         <w:r>
           <w:rPr>
@@ -2423,7 +2423,7 @@
           <w14:ligatures w14:val="standardContextual"/>
         </w:rPr>
       </w:pPr>
-      <w:hyperlink w:anchor="_Toc243319693" w:history="1">
+      <w:hyperlink w:anchor="_Toc243476301" w:history="1">
         <w:r>
           <w:rPr>
             <w:rStyle w:val="aff8"/>
@@ -2450,7 +2450,7 @@
             <w:noProof/>
             <w:webHidden/>
           </w:rPr>
-          <w:instrText xml:space="preserve"> PAGEREF _Toc243319693 \h </w:instrText>
+          <w:instrText xml:space="preserve"> PAGEREF _Toc243476301 \h </w:instrText>
         </w:r>
         <w:r>
           <w:rPr>
@@ -2496,7 +2496,7 @@
           <w14:ligatures w14:val="standardContextual"/>
         </w:rPr>
       </w:pPr>
-      <w:hyperlink w:anchor="_Toc243319694" w:history="1">
+      <w:hyperlink w:anchor="_Toc243476302" w:history="1">
         <w:r>
           <w:rPr>
             <w:rStyle w:val="aff8"/>
@@ -2523,7 +2523,7 @@
             <w:noProof/>
             <w:webHidden/>
           </w:rPr>
-          <w:instrText xml:space="preserve"> PAGEREF _Toc243319694 \h </w:instrText>
+          <w:instrText xml:space="preserve"> PAGEREF _Toc243476302 \h </w:instrText>
         </w:r>
         <w:r>
           <w:rPr>
@@ -2569,7 +2569,7 @@
           <w14:ligatures w14:val="standardContextual"/>
         </w:rPr>
       </w:pPr>
-      <w:hyperlink w:anchor="_Toc243319695" w:history="1">
+      <w:hyperlink w:anchor="_Toc243476303" w:history="1">
         <w:r>
           <w:rPr>
             <w:rStyle w:val="aff8"/>
@@ -2596,7 +2596,7 @@
             <w:noProof/>
             <w:webHidden/>
           </w:rPr>
-          <w:instrText xml:space="preserve"> PAGEREF _Toc243319695 \h </w:instrText>
+          <w:instrText xml:space="preserve"> PAGEREF _Toc243476303 \h </w:instrText>
         </w:r>
         <w:r>
           <w:rPr>
@@ -2642,7 +2642,7 @@
           <w14:ligatures w14:val="standardContextual"/>
         </w:rPr>
       </w:pPr>
-      <w:hyperlink w:anchor="_Toc243319696" w:history="1">
+      <w:hyperlink w:anchor="_Toc243476304" w:history="1">
         <w:r>
           <w:rPr>
             <w:rStyle w:val="aff8"/>
@@ -2669,7 +2669,7 @@
             <w:noProof/>
             <w:webHidden/>
           </w:rPr>
-          <w:instrText xml:space="preserve"> PAGEREF _Toc243319696 \h </w:instrText>
+          <w:instrText xml:space="preserve"> PAGEREF _Toc243476304 \h </w:instrText>
         </w:r>
         <w:r>
           <w:rPr>
@@ -2715,7 +2715,7 @@
           <w14:ligatures w14:val="standardContextual"/>
         </w:rPr>
       </w:pPr>
-      <w:hyperlink w:anchor="_Toc243319697" w:history="1">
+      <w:hyperlink w:anchor="_Toc243476305" w:history="1">
         <w:r>
           <w:rPr>
             <w:rStyle w:val="aff8"/>
@@ -2742,7 +2742,7 @@
             <w:noProof/>
             <w:webHidden/>
           </w:rPr>
-          <w:instrText xml:space="preserve"> PAGEREF _Toc243319697 \h </w:instrText>
+          <w:instrText xml:space="preserve"> PAGEREF _Toc243476305 \h </w:instrText>
         </w:r>
         <w:r>
           <w:rPr>
@@ -2788,7 +2788,7 @@
           <w14:ligatures w14:val="standardContextual"/>
         </w:rPr>
       </w:pPr>
-      <w:hyperlink w:anchor="_Toc243319698" w:history="1">
+      <w:hyperlink w:anchor="_Toc243476306" w:history="1">
         <w:r>
           <w:rPr>
             <w:rStyle w:val="aff8"/>
@@ -2815,7 +2815,7 @@
             <w:noProof/>
             <w:webHidden/>
           </w:rPr>
-          <w:instrText xml:space="preserve"> PAGEREF _Toc243319698 \h </w:instrText>
+          <w:instrText xml:space="preserve"> PAGEREF _Toc243476306 \h </w:instrText>
         </w:r>
         <w:r>
           <w:rPr>
@@ -2861,7 +2861,7 @@
           <w14:ligatures w14:val="standardContextual"/>
         </w:rPr>
       </w:pPr>
-      <w:hyperlink w:anchor="_Toc243319699" w:history="1">
+      <w:hyperlink w:anchor="_Toc243476307" w:history="1">
         <w:r>
           <w:rPr>
             <w:rStyle w:val="aff8"/>
@@ -2888,7 +2888,7 @@
             <w:noProof/>
             <w:webHidden/>
           </w:rPr>
-          <w:instrText xml:space="preserve"> PAGEREF _Toc243319699 \h </w:instrText>
+          <w:instrText xml:space="preserve"> PAGEREF _Toc243476307 \h </w:instrText>
         </w:r>
         <w:r>
           <w:rPr>
@@ -2934,7 +2934,7 @@
           <w14:ligatures w14:val="standardContextual"/>
         </w:rPr>
       </w:pPr>
-      <w:hyperlink w:anchor="_Toc243319700" w:history="1">
+      <w:hyperlink w:anchor="_Toc243476308" w:history="1">
         <w:r>
           <w:rPr>
             <w:rStyle w:val="aff8"/>
@@ -2961,7 +2961,7 @@
             <w:noProof/>
             <w:webHidden/>
           </w:rPr>
-          <w:instrText xml:space="preserve"> PAGEREF _Toc243319700 \h </w:instrText>
+          <w:instrText xml:space="preserve"> PAGEREF _Toc243476308 \h </w:instrText>
         </w:r>
         <w:r>
           <w:rPr>
@@ -3007,7 +3007,7 @@
           <w14:ligatures w14:val="standardContextual"/>
         </w:rPr>
       </w:pPr>
-      <w:hyperlink w:anchor="_Toc243319701" w:history="1">
+      <w:hyperlink w:anchor="_Toc243476309" w:history="1">
         <w:r>
           <w:rPr>
             <w:rStyle w:val="aff8"/>
@@ -3034,7 +3034,7 @@
             <w:noProof/>
             <w:webHidden/>
           </w:rPr>
-          <w:instrText xml:space="preserve"> PAGEREF _Toc243319701 \h </w:instrText>
+          <w:instrText xml:space="preserve"> PAGEREF _Toc243476309 \h </w:instrText>
         </w:r>
         <w:r>
           <w:rPr>
@@ -3080,7 +3080,7 @@
           <w14:ligatures w14:val="standardContextual"/>
         </w:rPr>
       </w:pPr>
-      <w:hyperlink w:anchor="_Toc243319702" w:history="1">
+      <w:hyperlink w:anchor="_Toc243476310" w:history="1">
         <w:r>
           <w:rPr>
             <w:rStyle w:val="aff8"/>
@@ -3107,7 +3107,7 @@
             <w:noProof/>
             <w:webHidden/>
           </w:rPr>
-          <w:instrText xml:space="preserve"> PAGEREF _Toc243319702 \h </w:instrText>
+          <w:instrText xml:space="preserve"> PAGEREF _Toc243476310 \h </w:instrText>
         </w:r>
         <w:r>
           <w:rPr>
@@ -3153,7 +3153,7 @@
           <w14:ligatures w14:val="standardContextual"/>
         </w:rPr>
       </w:pPr>
-      <w:hyperlink w:anchor="_Toc243319703" w:history="1">
+      <w:hyperlink w:anchor="_Toc243476311" w:history="1">
         <w:r>
           <w:rPr>
             <w:rStyle w:val="aff8"/>
@@ -3180,7 +3180,7 @@
             <w:noProof/>
             <w:webHidden/>
           </w:rPr>
-          <w:instrText xml:space="preserve"> PAGEREF _Toc243319703 \h </w:instrText>
+          <w:instrText xml:space="preserve"> PAGEREF _Toc243476311 \h </w:instrText>
         </w:r>
         <w:r>
           <w:rPr>
@@ -3226,7 +3226,7 @@
           <w14:ligatures w14:val="standardContextual"/>
         </w:rPr>
       </w:pPr>
-      <w:hyperlink w:anchor="_Toc243319704" w:history="1">
+      <w:hyperlink w:anchor="_Toc243476312" w:history="1">
         <w:r>
           <w:rPr>
             <w:rStyle w:val="aff8"/>
@@ -3253,7 +3253,7 @@
             <w:noProof/>
             <w:webHidden/>
           </w:rPr>
-          <w:instrText xml:space="preserve"> PAGEREF _Toc243319704 \h </w:instrText>
+          <w:instrText xml:space="preserve"> PAGEREF _Toc243476312 \h </w:instrText>
         </w:r>
         <w:r>
           <w:rPr>
@@ -3273,7 +3273,7 @@
             <w:noProof/>
             <w:webHidden/>
           </w:rPr>
-          <w:t>20</w:t>
+          <w:t>21</w:t>
         </w:r>
         <w:r>
           <w:rPr>
@@ -3299,7 +3299,7 @@
           <w14:ligatures w14:val="standardContextual"/>
         </w:rPr>
       </w:pPr>
-      <w:hyperlink w:anchor="_Toc243319705" w:history="1">
+      <w:hyperlink w:anchor="_Toc243476313" w:history="1">
         <w:r>
           <w:rPr>
             <w:rStyle w:val="aff8"/>
@@ -3326,7 +3326,7 @@
             <w:noProof/>
             <w:webHidden/>
           </w:rPr>
-          <w:instrText xml:space="preserve"> PAGEREF _Toc243319705 \h </w:instrText>
+          <w:instrText xml:space="preserve"> PAGEREF _Toc243476313 \h </w:instrText>
         </w:r>
         <w:r>
           <w:rPr>
@@ -3372,7 +3372,7 @@
           <w14:ligatures w14:val="standardContextual"/>
         </w:rPr>
       </w:pPr>
-      <w:hyperlink w:anchor="_Toc243319706" w:history="1">
+      <w:hyperlink w:anchor="_Toc243476314" w:history="1">
         <w:r>
           <w:rPr>
             <w:rStyle w:val="aff8"/>
@@ -3399,7 +3399,7 @@
             <w:noProof/>
             <w:webHidden/>
           </w:rPr>
-          <w:instrText xml:space="preserve"> PAGEREF _Toc243319706 \h </w:instrText>
+          <w:instrText xml:space="preserve"> PAGEREF _Toc243476314 \h </w:instrText>
         </w:r>
         <w:r>
           <w:rPr>
@@ -3445,7 +3445,7 @@
           <w14:ligatures w14:val="standardContextual"/>
         </w:rPr>
       </w:pPr>
-      <w:hyperlink w:anchor="_Toc243319707" w:history="1">
+      <w:hyperlink w:anchor="_Toc243476315" w:history="1">
         <w:r>
           <w:rPr>
             <w:rStyle w:val="aff8"/>
@@ -3472,7 +3472,7 @@
             <w:noProof/>
             <w:webHidden/>
           </w:rPr>
-          <w:instrText xml:space="preserve"> PAGEREF _Toc243319707 \h </w:instrText>
+          <w:instrText xml:space="preserve"> PAGEREF _Toc243476315 \h </w:instrText>
         </w:r>
         <w:r>
           <w:rPr>
@@ -3518,7 +3518,7 @@
           <w14:ligatures w14:val="standardContextual"/>
         </w:rPr>
       </w:pPr>
-      <w:hyperlink w:anchor="_Toc243319708" w:history="1">
+      <w:hyperlink w:anchor="_Toc243476316" w:history="1">
         <w:r>
           <w:rPr>
             <w:rStyle w:val="aff8"/>
@@ -3545,7 +3545,7 @@
             <w:noProof/>
             <w:webHidden/>
           </w:rPr>
-          <w:instrText xml:space="preserve"> PAGEREF _Toc243319708 \h </w:instrText>
+          <w:instrText xml:space="preserve"> PAGEREF _Toc243476316 \h </w:instrText>
         </w:r>
         <w:r>
           <w:rPr>
@@ -3565,7 +3565,7 @@
             <w:noProof/>
             <w:webHidden/>
           </w:rPr>
-          <w:t>21</w:t>
+          <w:t>22</w:t>
         </w:r>
         <w:r>
           <w:rPr>
@@ -3591,7 +3591,7 @@
           <w14:ligatures w14:val="standardContextual"/>
         </w:rPr>
       </w:pPr>
-      <w:hyperlink w:anchor="_Toc243319709" w:history="1">
+      <w:hyperlink w:anchor="_Toc243476317" w:history="1">
         <w:r>
           <w:rPr>
             <w:rStyle w:val="aff8"/>
@@ -3618,7 +3618,7 @@
             <w:noProof/>
             <w:webHidden/>
           </w:rPr>
-          <w:instrText xml:space="preserve"> PAGEREF _Toc243319709 \h </w:instrText>
+          <w:instrText xml:space="preserve"> PAGEREF _Toc243476317 \h </w:instrText>
         </w:r>
         <w:r>
           <w:rPr>
@@ -3664,7 +3664,7 @@
           <w14:ligatures w14:val="standardContextual"/>
         </w:rPr>
       </w:pPr>
-      <w:hyperlink w:anchor="_Toc243319710" w:history="1">
+      <w:hyperlink w:anchor="_Toc243476318" w:history="1">
         <w:r>
           <w:rPr>
             <w:rStyle w:val="aff8"/>
@@ -3691,7 +3691,7 @@
             <w:noProof/>
             <w:webHidden/>
           </w:rPr>
-          <w:instrText xml:space="preserve"> PAGEREF _Toc243319710 \h </w:instrText>
+          <w:instrText xml:space="preserve"> PAGEREF _Toc243476318 \h </w:instrText>
         </w:r>
         <w:r>
           <w:rPr>
@@ -3737,7 +3737,7 @@
           <w14:ligatures w14:val="standardContextual"/>
         </w:rPr>
       </w:pPr>
-      <w:hyperlink w:anchor="_Toc243319711" w:history="1">
+      <w:hyperlink w:anchor="_Toc243476319" w:history="1">
         <w:r>
           <w:rPr>
             <w:rStyle w:val="aff8"/>
@@ -3764,7 +3764,7 @@
             <w:noProof/>
             <w:webHidden/>
           </w:rPr>
-          <w:instrText xml:space="preserve"> PAGEREF _Toc243319711 \h </w:instrText>
+          <w:instrText xml:space="preserve"> PAGEREF _Toc243476319 \h </w:instrText>
         </w:r>
         <w:r>
           <w:rPr>
@@ -3810,7 +3810,7 @@
           <w14:ligatures w14:val="standardContextual"/>
         </w:rPr>
       </w:pPr>
-      <w:hyperlink w:anchor="_Toc243319712" w:history="1">
+      <w:hyperlink w:anchor="_Toc243476320" w:history="1">
         <w:r>
           <w:rPr>
             <w:rStyle w:val="aff8"/>
@@ -3837,7 +3837,7 @@
             <w:noProof/>
             <w:webHidden/>
           </w:rPr>
-          <w:instrText xml:space="preserve"> PAGEREF _Toc243319712 \h </w:instrText>
+          <w:instrText xml:space="preserve"> PAGEREF _Toc243476320 \h </w:instrText>
         </w:r>
         <w:r>
           <w:rPr>
@@ -3883,7 +3883,7 @@
           <w14:ligatures w14:val="standardContextual"/>
         </w:rPr>
       </w:pPr>
-      <w:hyperlink w:anchor="_Toc243319713" w:history="1">
+      <w:hyperlink w:anchor="_Toc243476321" w:history="1">
         <w:r>
           <w:rPr>
             <w:rStyle w:val="aff8"/>
@@ -3910,7 +3910,7 @@
             <w:noProof/>
             <w:webHidden/>
           </w:rPr>
-          <w:instrText xml:space="preserve"> PAGEREF _Toc243319713 \h </w:instrText>
+          <w:instrText xml:space="preserve"> PAGEREF _Toc243476321 \h </w:instrText>
         </w:r>
         <w:r>
           <w:rPr>
@@ -3956,7 +3956,7 @@
           <w14:ligatures w14:val="standardContextual"/>
         </w:rPr>
       </w:pPr>
-      <w:hyperlink w:anchor="_Toc243319714" w:history="1">
+      <w:hyperlink w:anchor="_Toc243476322" w:history="1">
         <w:r>
           <w:rPr>
             <w:rStyle w:val="aff8"/>
@@ -3983,7 +3983,7 @@
             <w:noProof/>
             <w:webHidden/>
           </w:rPr>
-          <w:instrText xml:space="preserve"> PAGEREF _Toc243319714 \h </w:instrText>
+          <w:instrText xml:space="preserve"> PAGEREF _Toc243476322 \h </w:instrText>
         </w:r>
         <w:r>
           <w:rPr>
@@ -4003,7 +4003,7 @@
             <w:noProof/>
             <w:webHidden/>
           </w:rPr>
-          <w:t>22</w:t>
+          <w:t>23</w:t>
         </w:r>
         <w:r>
           <w:rPr>
@@ -4029,7 +4029,7 @@
           <w14:ligatures w14:val="standardContextual"/>
         </w:rPr>
       </w:pPr>
-      <w:hyperlink w:anchor="_Toc243319715" w:history="1">
+      <w:hyperlink w:anchor="_Toc243476323" w:history="1">
         <w:r>
           <w:rPr>
             <w:rStyle w:val="aff8"/>
@@ -4056,7 +4056,7 @@
             <w:noProof/>
             <w:webHidden/>
           </w:rPr>
-          <w:instrText xml:space="preserve"> PAGEREF _Toc243319715 \h </w:instrText>
+          <w:instrText xml:space="preserve"> PAGEREF _Toc243476323 \h </w:instrText>
         </w:r>
         <w:r>
           <w:rPr>
@@ -4076,7 +4076,7 @@
             <w:noProof/>
             <w:webHidden/>
           </w:rPr>
-          <w:t>23</w:t>
+          <w:t>24</w:t>
         </w:r>
         <w:r>
           <w:rPr>
@@ -4102,7 +4102,7 @@
           <w14:ligatures w14:val="standardContextual"/>
         </w:rPr>
       </w:pPr>
-      <w:hyperlink w:anchor="_Toc243319716" w:history="1">
+      <w:hyperlink w:anchor="_Toc243476324" w:history="1">
         <w:r>
           <w:rPr>
             <w:rStyle w:val="aff8"/>
@@ -4129,7 +4129,7 @@
             <w:noProof/>
             <w:webHidden/>
           </w:rPr>
-          <w:instrText xml:space="preserve"> PAGEREF _Toc243319716 \h </w:instrText>
+          <w:instrText xml:space="preserve"> PAGEREF _Toc243476324 \h </w:instrText>
         </w:r>
         <w:r>
           <w:rPr>
@@ -4149,7 +4149,7 @@
             <w:noProof/>
             <w:webHidden/>
           </w:rPr>
-          <w:t>24</w:t>
+          <w:t>25</w:t>
         </w:r>
         <w:r>
           <w:rPr>
@@ -4175,7 +4175,7 @@
           <w14:ligatures w14:val="standardContextual"/>
         </w:rPr>
       </w:pPr>
-      <w:hyperlink w:anchor="_Toc243319717" w:history="1">
+      <w:hyperlink w:anchor="_Toc243476325" w:history="1">
         <w:r>
           <w:rPr>
             <w:rStyle w:val="aff8"/>
@@ -4202,7 +4202,7 @@
             <w:noProof/>
             <w:webHidden/>
           </w:rPr>
-          <w:instrText xml:space="preserve"> PAGEREF _Toc243319717 \h </w:instrText>
+          <w:instrText xml:space="preserve"> PAGEREF _Toc243476325 \h </w:instrText>
         </w:r>
         <w:r>
           <w:rPr>
@@ -4222,7 +4222,7 @@
             <w:noProof/>
             <w:webHidden/>
           </w:rPr>
-          <w:t>25</w:t>
+          <w:t>26</w:t>
         </w:r>
         <w:r>
           <w:rPr>
@@ -4248,7 +4248,7 @@
           <w14:ligatures w14:val="standardContextual"/>
         </w:rPr>
       </w:pPr>
-      <w:hyperlink w:anchor="_Toc243319718" w:history="1">
+      <w:hyperlink w:anchor="_Toc243476326" w:history="1">
         <w:r>
           <w:rPr>
             <w:rStyle w:val="aff8"/>
@@ -4275,7 +4275,7 @@
             <w:noProof/>
             <w:webHidden/>
           </w:rPr>
-          <w:instrText xml:space="preserve"> PAGEREF _Toc243319718 \h </w:instrText>
+          <w:instrText xml:space="preserve"> PAGEREF _Toc243476326 \h </w:instrText>
         </w:r>
         <w:r>
           <w:rPr>
@@ -4295,7 +4295,7 @@
             <w:noProof/>
             <w:webHidden/>
           </w:rPr>
-          <w:t>26</w:t>
+          <w:t>27</w:t>
         </w:r>
         <w:r>
           <w:rPr>
@@ -4321,7 +4321,7 @@
           <w14:ligatures w14:val="standardContextual"/>
         </w:rPr>
       </w:pPr>
-      <w:hyperlink w:anchor="_Toc243319719" w:history="1">
+      <w:hyperlink w:anchor="_Toc243476327" w:history="1">
         <w:r>
           <w:rPr>
             <w:rStyle w:val="aff8"/>
@@ -4348,7 +4348,7 @@
             <w:noProof/>
             <w:webHidden/>
           </w:rPr>
-          <w:instrText xml:space="preserve"> PAGEREF _Toc243319719 \h </w:instrText>
+          <w:instrText xml:space="preserve"> PAGEREF _Toc243476327 \h </w:instrText>
         </w:r>
         <w:r>
           <w:rPr>
@@ -4368,7 +4368,7 @@
             <w:noProof/>
             <w:webHidden/>
           </w:rPr>
-          <w:t>27</w:t>
+          <w:t>28</w:t>
         </w:r>
         <w:r>
           <w:rPr>
@@ -4394,7 +4394,7 @@
           <w14:ligatures w14:val="standardContextual"/>
         </w:rPr>
       </w:pPr>
-      <w:hyperlink w:anchor="_Toc243319720" w:history="1">
+      <w:hyperlink w:anchor="_Toc243476328" w:history="1">
         <w:r>
           <w:rPr>
             <w:rStyle w:val="aff8"/>
@@ -4421,7 +4421,7 @@
             <w:noProof/>
             <w:webHidden/>
           </w:rPr>
-          <w:instrText xml:space="preserve"> PAGEREF _Toc243319720 \h </w:instrText>
+          <w:instrText xml:space="preserve"> PAGEREF _Toc243476328 \h </w:instrText>
         </w:r>
         <w:r>
           <w:rPr>
@@ -4441,7 +4441,7 @@
             <w:noProof/>
             <w:webHidden/>
           </w:rPr>
-          <w:t>28</w:t>
+          <w:t>29</w:t>
         </w:r>
         <w:r>
           <w:rPr>
@@ -4467,7 +4467,7 @@
           <w14:ligatures w14:val="standardContextual"/>
         </w:rPr>
       </w:pPr>
-      <w:hyperlink w:anchor="_Toc243319721" w:history="1">
+      <w:hyperlink w:anchor="_Toc243476329" w:history="1">
         <w:r>
           <w:rPr>
             <w:rStyle w:val="aff8"/>
@@ -4494,7 +4494,7 @@
             <w:noProof/>
             <w:webHidden/>
           </w:rPr>
-          <w:instrText xml:space="preserve"> PAGEREF _Toc243319721 \h </w:instrText>
+          <w:instrText xml:space="preserve"> PAGEREF _Toc243476329 \h </w:instrText>
         </w:r>
         <w:r>
           <w:rPr>
@@ -4514,7 +4514,7 @@
             <w:noProof/>
             <w:webHidden/>
           </w:rPr>
-          <w:t>29</w:t>
+          <w:t>30</w:t>
         </w:r>
         <w:r>
           <w:rPr>
@@ -4540,7 +4540,7 @@
         <w:ind w:firstLine="0"/>
         <w:jc w:val="center"/>
       </w:pPr>
-      <w:bookmarkStart w:id="0" w:name="_Toc243319664"/>
+      <w:bookmarkStart w:id="0" w:name="_Toc243476272"/>
       <w:r>
         <w:lastRenderedPageBreak/>
         <w:t>ПЕРЕЧЕНЬ ТЕРМИНОВ И СОКРАЩЕНИЙ</w:t>
@@ -5802,7 +5802,7 @@
         <w:pStyle w:val="1"/>
         <w:pageBreakBefore/>
       </w:pPr>
-      <w:bookmarkStart w:id="1" w:name="_Toc243319665"/>
+      <w:bookmarkStart w:id="1" w:name="_Toc243476273"/>
       <w:r>
         <w:lastRenderedPageBreak/>
         <w:t>1 Общие сведения</w:t>
@@ -5813,7 +5813,7 @@
       <w:pPr>
         <w:pStyle w:val="21"/>
       </w:pPr>
-      <w:bookmarkStart w:id="2" w:name="_Toc243319666"/>
+      <w:bookmarkStart w:id="2" w:name="_Toc243476274"/>
       <w:r>
         <w:t>1.1 Полное наименование системы и её условное обозначение</w:t>
       </w:r>
@@ -5833,7 +5833,7 @@
       <w:pPr>
         <w:pStyle w:val="21"/>
       </w:pPr>
-      <w:bookmarkStart w:id="3" w:name="_Toc243319667"/>
+      <w:bookmarkStart w:id="3" w:name="_Toc243476275"/>
       <w:r>
         <w:t>1.2 Шифр темы и номер договора</w:t>
       </w:r>
@@ -5848,7 +5848,7 @@
       <w:pPr>
         <w:pStyle w:val="21"/>
       </w:pPr>
-      <w:bookmarkStart w:id="4" w:name="_Toc243319668"/>
+      <w:bookmarkStart w:id="4" w:name="_Toc243476276"/>
       <w:r>
         <w:t>1.3 Наименования организаций заказчика и разработчика</w:t>
       </w:r>
@@ -5868,7 +5868,7 @@
       <w:pPr>
         <w:pStyle w:val="21"/>
       </w:pPr>
-      <w:bookmarkStart w:id="5" w:name="_Toc243319669"/>
+      <w:bookmarkStart w:id="5" w:name="_Toc243476277"/>
       <w:r>
         <w:t>1.4 Основания для создания системы</w:t>
       </w:r>
@@ -5893,7 +5893,7 @@
       <w:pPr>
         <w:pStyle w:val="21"/>
       </w:pPr>
-      <w:bookmarkStart w:id="6" w:name="_Toc243319670"/>
+      <w:bookmarkStart w:id="6" w:name="_Toc243476278"/>
       <w:r>
         <w:t>1.5 Плановые сроки начала и окончания работ</w:t>
       </w:r>
@@ -5908,7 +5908,7 @@
       <w:pPr>
         <w:pStyle w:val="21"/>
       </w:pPr>
-      <w:bookmarkStart w:id="7" w:name="_Toc243319671"/>
+      <w:bookmarkStart w:id="7" w:name="_Toc243476279"/>
       <w:r>
         <w:t>1.6 Сведения об источниках и порядке финансирования</w:t>
       </w:r>
@@ -5923,7 +5923,7 @@
       <w:pPr>
         <w:pStyle w:val="21"/>
       </w:pPr>
-      <w:bookmarkStart w:id="8" w:name="_Toc243319672"/>
+      <w:bookmarkStart w:id="8" w:name="_Toc243476280"/>
       <w:r>
         <w:lastRenderedPageBreak/>
         <w:t>1.7 Порядок оформления и предъявления результатов работ</w:t>
@@ -5939,7 +5939,7 @@
       <w:pPr>
         <w:pStyle w:val="21"/>
       </w:pPr>
-      <w:bookmarkStart w:id="9" w:name="_Toc243319673"/>
+      <w:bookmarkStart w:id="9" w:name="_Toc243476281"/>
       <w:r>
         <w:t>1.8 Перечень нормативно-технических документов</w:t>
       </w:r>
@@ -6003,7 +6003,7 @@
         <w:pStyle w:val="1"/>
         <w:pageBreakBefore/>
       </w:pPr>
-      <w:bookmarkStart w:id="10" w:name="_Toc243319674"/>
+      <w:bookmarkStart w:id="10" w:name="_Toc243476282"/>
       <w:r>
         <w:lastRenderedPageBreak/>
         <w:t>2 Цели и назначение создания автоматизированной системы</w:t>
@@ -6014,7 +6014,7 @@
       <w:pPr>
         <w:pStyle w:val="21"/>
       </w:pPr>
-      <w:bookmarkStart w:id="11" w:name="_Toc243319675"/>
+      <w:bookmarkStart w:id="11" w:name="_Toc243476283"/>
       <w:r>
         <w:t>2.1 Назначение системы</w:t>
       </w:r>
@@ -6074,7 +6074,7 @@
       <w:pPr>
         <w:pStyle w:val="21"/>
       </w:pPr>
-      <w:bookmarkStart w:id="12" w:name="_Toc243319676"/>
+      <w:bookmarkStart w:id="12" w:name="_Toc243476284"/>
       <w:r>
         <w:t>2.2 Цели создания системы</w:t>
       </w:r>
@@ -6120,7 +6120,7 @@
         <w:pStyle w:val="1"/>
         <w:pageBreakBefore/>
       </w:pPr>
-      <w:bookmarkStart w:id="13" w:name="_Toc243319677"/>
+      <w:bookmarkStart w:id="13" w:name="_Toc243476285"/>
       <w:r>
         <w:lastRenderedPageBreak/>
         <w:t>3 Характеристика объекта автоматизации</w:t>
@@ -6131,7 +6131,7 @@
       <w:pPr>
         <w:pStyle w:val="21"/>
       </w:pPr>
-      <w:bookmarkStart w:id="14" w:name="_Toc243319678"/>
+      <w:bookmarkStart w:id="14" w:name="_Toc243476286"/>
       <w:r>
         <w:t>3.1 Краткие сведения об объекте автоматизации</w:t>
       </w:r>
@@ -6221,7 +6221,7 @@
       <w:pPr>
         <w:pStyle w:val="21"/>
       </w:pPr>
-      <w:bookmarkStart w:id="15" w:name="_Toc243319679"/>
+      <w:bookmarkStart w:id="15" w:name="_Toc243476287"/>
       <w:r>
         <w:t>3.2 Сведения об условиях эксплуатации</w:t>
       </w:r>
@@ -6237,7 +6237,7 @@
         <w:pStyle w:val="1"/>
         <w:pageBreakBefore/>
       </w:pPr>
-      <w:bookmarkStart w:id="16" w:name="_Toc243319680"/>
+      <w:bookmarkStart w:id="16" w:name="_Toc243476288"/>
       <w:r>
         <w:lastRenderedPageBreak/>
         <w:t>4 Требования к автоматизированной системе</w:t>
@@ -6248,7 +6248,7 @@
       <w:pPr>
         <w:pStyle w:val="21"/>
       </w:pPr>
-      <w:bookmarkStart w:id="17" w:name="_Toc243319681"/>
+      <w:bookmarkStart w:id="17" w:name="_Toc243476289"/>
       <w:r>
         <w:t>4.1 Требования к системе в целом</w:t>
       </w:r>
@@ -6258,7 +6258,7 @@
       <w:pPr>
         <w:pStyle w:val="31"/>
       </w:pPr>
-      <w:bookmarkStart w:id="18" w:name="_Toc243319682"/>
+      <w:bookmarkStart w:id="18" w:name="_Toc243476290"/>
       <w:r>
         <w:t>4.1.1 Требования к структуре и функционированию системы</w:t>
       </w:r>
@@ -6904,7 +6904,7 @@
       <w:pPr>
         <w:pStyle w:val="31"/>
       </w:pPr>
-      <w:bookmarkStart w:id="19" w:name="_Toc243319683"/>
+      <w:bookmarkStart w:id="19" w:name="_Toc243476291"/>
       <w:r>
         <w:t>4.1.2 Требования к численности и квалификации персонала</w:t>
       </w:r>
@@ -7185,7 +7185,7 @@
       <w:pPr>
         <w:pStyle w:val="31"/>
       </w:pPr>
-      <w:bookmarkStart w:id="20" w:name="_Toc243319684"/>
+      <w:bookmarkStart w:id="20" w:name="_Toc243476292"/>
       <w:r>
         <w:t>4.1.3 Показатели назначения</w:t>
       </w:r>
@@ -7233,7 +7233,7 @@
       <w:pPr>
         <w:pStyle w:val="31"/>
       </w:pPr>
-      <w:bookmarkStart w:id="21" w:name="_Toc243319685"/>
+      <w:bookmarkStart w:id="21" w:name="_Toc243476293"/>
       <w:r>
         <w:t>4.1.4 Требования к надёжности</w:t>
       </w:r>
@@ -7267,7 +7267,7 @@
       <w:pPr>
         <w:pStyle w:val="31"/>
       </w:pPr>
-      <w:bookmarkStart w:id="22" w:name="_Toc243319686"/>
+      <w:bookmarkStart w:id="22" w:name="_Toc243476294"/>
       <w:r>
         <w:t>4.1.5 Требования к безопасности</w:t>
       </w:r>
@@ -7282,7 +7282,7 @@
       <w:pPr>
         <w:pStyle w:val="31"/>
       </w:pPr>
-      <w:bookmarkStart w:id="23" w:name="_Toc243319687"/>
+      <w:bookmarkStart w:id="23" w:name="_Toc243476295"/>
       <w:r>
         <w:t>4.1.6 Требования к эргономике и технической эстетике</w:t>
       </w:r>
@@ -7327,7 +7327,7 @@
       <w:pPr>
         <w:pStyle w:val="31"/>
       </w:pPr>
-      <w:bookmarkStart w:id="24" w:name="_Toc243319688"/>
+      <w:bookmarkStart w:id="24" w:name="_Toc243476296"/>
       <w:r>
         <w:t>4.1.7 Требования к эксплуатации и техническому обслуживанию</w:t>
       </w:r>
@@ -7357,7 +7357,7 @@
       <w:pPr>
         <w:pStyle w:val="31"/>
       </w:pPr>
-      <w:bookmarkStart w:id="25" w:name="_Toc243319689"/>
+      <w:bookmarkStart w:id="25" w:name="_Toc243476297"/>
       <w:r>
         <w:t>4.1.8 Требования к защите информации от несанкционированного доступа</w:t>
       </w:r>
@@ -7428,7 +7428,7 @@
       <w:pPr>
         <w:pStyle w:val="31"/>
       </w:pPr>
-      <w:bookmarkStart w:id="26" w:name="_Toc243319690"/>
+      <w:bookmarkStart w:id="26" w:name="_Toc243476298"/>
       <w:r>
         <w:t>4.1.9 Требования по сохранности информации при авариях</w:t>
       </w:r>
@@ -7449,7 +7449,7 @@
       <w:pPr>
         <w:pStyle w:val="31"/>
       </w:pPr>
-      <w:bookmarkStart w:id="27" w:name="_Toc243319691"/>
+      <w:bookmarkStart w:id="27" w:name="_Toc243476299"/>
       <w:r>
         <w:t>4.1.10 Требования к защите от влияния внешних воздействий</w:t>
       </w:r>
@@ -7464,7 +7464,7 @@
       <w:pPr>
         <w:pStyle w:val="31"/>
       </w:pPr>
-      <w:bookmarkStart w:id="28" w:name="_Toc243319692"/>
+      <w:bookmarkStart w:id="28" w:name="_Toc243476300"/>
       <w:r>
         <w:t>4.1.11 Требования к патентной чистоте</w:t>
       </w:r>
@@ -7482,7 +7482,7 @@
       <w:pPr>
         <w:pStyle w:val="31"/>
       </w:pPr>
-      <w:bookmarkStart w:id="29" w:name="_Toc243319693"/>
+      <w:bookmarkStart w:id="29" w:name="_Toc243476301"/>
       <w:r>
         <w:t>4.1.12 Требования по стандартизации и унификации</w:t>
       </w:r>
@@ -7497,7 +7497,7 @@
       <w:pPr>
         <w:pStyle w:val="31"/>
       </w:pPr>
-      <w:bookmarkStart w:id="30" w:name="_Toc243319694"/>
+      <w:bookmarkStart w:id="30" w:name="_Toc243476302"/>
       <w:r>
         <w:t>4.1.13 Дополнительные требования</w:t>
       </w:r>
@@ -7517,7 +7517,7 @@
       <w:pPr>
         <w:pStyle w:val="21"/>
       </w:pPr>
-      <w:bookmarkStart w:id="31" w:name="_Toc243319695"/>
+      <w:bookmarkStart w:id="31" w:name="_Toc243476303"/>
       <w:r>
         <w:lastRenderedPageBreak/>
         <w:t>4.2 Требования к функциям, выполняемым системой</w:t>
@@ -7533,7 +7533,7 @@
       <w:pPr>
         <w:pStyle w:val="31"/>
       </w:pPr>
-      <w:bookmarkStart w:id="32" w:name="_Toc243319696"/>
+      <w:bookmarkStart w:id="32" w:name="_Toc243476304"/>
       <w:r>
         <w:t>4.2.1 Подсистема «Организационная структура и права доступа»</w:t>
       </w:r>
@@ -7583,7 +7583,7 @@
       <w:pPr>
         <w:pStyle w:val="31"/>
       </w:pPr>
-      <w:bookmarkStart w:id="33" w:name="_Toc243319697"/>
+      <w:bookmarkStart w:id="33" w:name="_Toc243476305"/>
       <w:r>
         <w:t>4.2.2 Подсистема «Каталог недвижимости»</w:t>
       </w:r>
@@ -7634,7 +7634,7 @@
       <w:pPr>
         <w:pStyle w:val="31"/>
       </w:pPr>
-      <w:bookmarkStart w:id="34" w:name="_Toc243319698"/>
+      <w:bookmarkStart w:id="34" w:name="_Toc243476306"/>
       <w:r>
         <w:t>4.2.3 Подсистема «Работа с клиентами»</w:t>
       </w:r>
@@ -7674,7 +7674,7 @@
       <w:pPr>
         <w:pStyle w:val="31"/>
       </w:pPr>
-      <w:bookmarkStart w:id="35" w:name="_Toc243319699"/>
+      <w:bookmarkStart w:id="35" w:name="_Toc243476307"/>
       <w:r>
         <w:t>4.2.4 Подсистема «Сделки»</w:t>
       </w:r>
@@ -7723,6 +7723,11 @@
     </w:p>
     <w:p>
       <w:r>
+        <w:t>– замену скана подписанного документа и скана документа о расторжении, в том числе у закрытой и расторгнутой сделки, без изменения остальных данных сделки и с записью в журнал сделки;</w:t>
+      </w:r>
+    </w:p>
+    <w:p>
+      <w:r>
         <w:t>– отмену сделки без платежей и подписи клиента с указанием причины и расторжение сделки с документом-основанием при наличии платежей или подписи; перевод оплаченных платежей в статус «К возврату»; освобождение объекта после завершения возвратов; возврат связанной заявки в работу.</w:t>
       </w:r>
     </w:p>
@@ -7730,7 +7735,7 @@
       <w:pPr>
         <w:pStyle w:val="31"/>
       </w:pPr>
-      <w:bookmarkStart w:id="36" w:name="_Toc243319700"/>
+      <w:bookmarkStart w:id="36" w:name="_Toc243476308"/>
       <w:r>
         <w:t>4.2.5 Подсистема «Финансы»</w:t>
       </w:r>
@@ -7783,11 +7788,8 @@
     </w:p>
     <w:p>
       <w:r>
-        <w:t xml:space="preserve">– ведение планов оплаты как типов платежей: вид плана (полная оплата; первый взнос и ежемесячные платежи; первый взнос и остаток одним платежом), срок, минимальный первоначальный взнос (своей скидки у плана нет: скидки ведутся в каталоге и могут ограничиваться планами); расчёт и печать вариантов оплаты объекта для клиента с учётом </w:t>
-      </w:r>
-      <w:r>
         <w:lastRenderedPageBreak/>
-        <w:t>отмеченных скидок; создание графика платежей сделки по выбранному плану одной операцией с последующей ручной правкой;</w:t>
+        <w:t>– ведение планов оплаты как типов платежей: вид плана (полная оплата; первый взнос и ежемесячные платежи; первый взнос и остаток одним платежом), срок, минимальный первоначальный взнос (своей скидки у плана нет: скидки ведутся в каталоге и могут ограничиваться планами); расчёт и печать вариантов оплаты объекта для клиента с учётом отмеченных скидок; создание графика платежей сделки по выбранному плану одной операцией с последующей ручной правкой;</w:t>
       </w:r>
     </w:p>
     <w:p>
@@ -7799,7 +7801,7 @@
       <w:pPr>
         <w:pStyle w:val="31"/>
       </w:pPr>
-      <w:bookmarkStart w:id="37" w:name="_Toc243319701"/>
+      <w:bookmarkStart w:id="37" w:name="_Toc243476309"/>
       <w:r>
         <w:t>4.2.6 Подсистема «Шаблоны документов»</w:t>
       </w:r>
@@ -7814,7 +7816,7 @@
       <w:pPr>
         <w:pStyle w:val="31"/>
       </w:pPr>
-      <w:bookmarkStart w:id="38" w:name="_Toc243319702"/>
+      <w:bookmarkStart w:id="38" w:name="_Toc243476310"/>
       <w:r>
         <w:t>4.2.7 Подсистема «Задачи»</w:t>
       </w:r>
@@ -7829,7 +7831,7 @@
       <w:pPr>
         <w:pStyle w:val="31"/>
       </w:pPr>
-      <w:bookmarkStart w:id="39" w:name="_Toc243319703"/>
+      <w:bookmarkStart w:id="39" w:name="_Toc243476311"/>
       <w:r>
         <w:t>4.2.8 Подсистема «Аналитика и отчётность»</w:t>
       </w:r>
@@ -7862,6 +7864,7 @@
     </w:p>
     <w:p>
       <w:r>
+        <w:lastRenderedPageBreak/>
         <w:t>– приведение денежных показателей дашборда, общего итога финансов и денежного факта отчётов «план-факт» к валюте сделок компании по курсу на дату события; предупреждение о валютах, для которых нет курса и суммы которых поэтому не учтены.</w:t>
       </w:r>
     </w:p>
@@ -7869,7 +7872,7 @@
       <w:pPr>
         <w:pStyle w:val="31"/>
       </w:pPr>
-      <w:bookmarkStart w:id="40" w:name="_Toc243319704"/>
+      <w:bookmarkStart w:id="40" w:name="_Toc243476312"/>
       <w:r>
         <w:t>4.2.9 Подсистема «Интеграция с партнёрами»</w:t>
       </w:r>
@@ -7877,174 +7880,174 @@
     </w:p>
     <w:p>
       <w:r>
-        <w:t xml:space="preserve">Подсистема должна обеспечивать выдачу партнёрам по API-ключу сведений о проектах, домах и планировках и приём заявок; отказ от создания дубля заявки при повторной </w:t>
-      </w:r>
+        <w:t>Подсистема должна обеспечивать выдачу партнёрам по API-ключу сведений о проектах, домах и планировках и приём заявок; отказ от создания дубля заявки при повторной отправке формы в течение 24 ч; управление API-ключами (создание, изменение, отключение, перевыпуск, показ ключа один раз при выдаче).</w:t>
+      </w:r>
+    </w:p>
+    <w:p>
+      <w:pPr>
+        <w:pStyle w:val="31"/>
+      </w:pPr>
+      <w:bookmarkStart w:id="41" w:name="_Toc243476313"/>
+      <w:r>
+        <w:t>4.2.10 Подсистема «Регламентные задания»</w:t>
+      </w:r>
+      <w:bookmarkEnd w:id="41"/>
+    </w:p>
+    <w:p>
+      <w:r>
+        <w:t>Подсистема должна не реже одного раза в час выполнять: перевод неоплаченных платежей с прошедшим сроком в статус «Просрочен»; отмену сделок в статусе «Бронь» с истёкшей датой окончания брони и возврат объектов в продажу; закрытие встреч, просроченных более чем на 7 дней, результатом «Не состоялась»; загрузку курсов валют ЦБ Узбекистана.</w:t>
+      </w:r>
+    </w:p>
+    <w:p>
+      <w:pPr>
+        <w:pStyle w:val="21"/>
+      </w:pPr>
+      <w:bookmarkStart w:id="42" w:name="_Toc243476314"/>
+      <w:r>
+        <w:t>4.3 Требования к видам обеспечения</w:t>
+      </w:r>
+      <w:bookmarkEnd w:id="42"/>
+    </w:p>
+    <w:p>
+      <w:pPr>
+        <w:pStyle w:val="31"/>
+      </w:pPr>
+      <w:bookmarkStart w:id="43" w:name="_Toc243476315"/>
+      <w:r>
+        <w:t>4.3.1 Требования к математическому обеспечению</w:t>
+      </w:r>
+      <w:bookmarkEnd w:id="43"/>
+    </w:p>
+    <w:p>
+      <w:r>
+        <w:t>Специальные математические методы не применяются. Расчёт показателей выполняется по правилам:</w:t>
+      </w:r>
+    </w:p>
+    <w:p>
+      <w:r>
+        <w:t>– процент выполнения плана: факт / план × 100;</w:t>
+      </w:r>
+    </w:p>
+    <w:p>
+      <w:r>
+        <w:t>– прогноз к концу периода: факт / число прошедших дней периода × число дней периода; процент прогноза: прогноз / план × 100;</w:t>
+      </w:r>
+    </w:p>
+    <w:p>
+      <w:r>
+        <w:t>– продажи месяца учитываются по дате закрытия сделки;</w:t>
+      </w:r>
+    </w:p>
+    <w:p>
+      <w:r>
+        <w:t>– пересчёт суммы из одной валюты в другую выполняется через узбекский сум: сумма × курс исходной валюты / курс валюты назначения, где курс — число сумов за единицу валюты; кросс-курс в вычислении не округляется, результат округляется до 0,01 по правилу «половина вверх»;</w:t>
+      </w:r>
+    </w:p>
+    <w:p>
+      <w:r>
+        <w:t>– источник курсов выбирает компания: курсы ЦБ Узбекистана или только её ручные курсы; источники не смешиваются; для пересчёта на дату берётся последний курс выбранного источника не позже этой даты.</w:t>
+      </w:r>
+    </w:p>
+    <w:p>
+      <w:pPr>
+        <w:pStyle w:val="31"/>
+      </w:pPr>
+      <w:bookmarkStart w:id="44" w:name="_Toc243476316"/>
       <w:r>
         <w:lastRenderedPageBreak/>
-        <w:t>отправке формы в течение 24 ч; управление API-ключами (создание, изменение, отключение, перевыпуск, показ ключа один раз при выдаче).</w:t>
+        <w:t>4.3.2 Требования к информационному обеспечению</w:t>
+      </w:r>
+      <w:bookmarkEnd w:id="44"/>
+    </w:p>
+    <w:p>
+      <w:r>
+        <w:t>Данные системы должны храниться в одной реляционной БД. Структура БД должна изменяться только миграциями, хранящимися вместе с исходными текстами. Классификаторы (статусы, типы, валюты) должны задаваться в программе кодами латиницей; наименования для пользователя — через файлы локализации. Состав и структура данных приводятся в документе «Описание информационного обеспечения системы».</w:t>
       </w:r>
     </w:p>
     <w:p>
       <w:pPr>
         <w:pStyle w:val="31"/>
       </w:pPr>
-      <w:bookmarkStart w:id="41" w:name="_Toc243319705"/>
-      <w:r>
-        <w:t>4.2.10 Подсистема «Регламентные задания»</w:t>
-      </w:r>
-      <w:bookmarkEnd w:id="41"/>
-    </w:p>
-    <w:p>
-      <w:r>
-        <w:t>Подсистема должна не реже одного раза в час выполнять: перевод неоплаченных платежей с прошедшим сроком в статус «Просрочен»; отмену сделок в статусе «Бронь» с истёкшей датой окончания брони и возврат объектов в продажу; закрытие встреч, просроченных более чем на 7 дней, результатом «Не состоялась»; загрузку курсов валют ЦБ Узбекистана.</w:t>
-      </w:r>
-    </w:p>
-    <w:p>
-      <w:pPr>
-        <w:pStyle w:val="21"/>
-      </w:pPr>
-      <w:bookmarkStart w:id="42" w:name="_Toc243319706"/>
-      <w:r>
-        <w:t>4.3 Требования к видам обеспечения</w:t>
-      </w:r>
-      <w:bookmarkEnd w:id="42"/>
+      <w:bookmarkStart w:id="45" w:name="_Toc243476317"/>
+      <w:r>
+        <w:t>4.3.3 Требования к лингвистическому обеспечению</w:t>
+      </w:r>
+      <w:bookmarkEnd w:id="45"/>
+    </w:p>
+    <w:p>
+      <w:r>
+        <w:t>Языки программирования: Python (серверная часть), TypeScript (клиентская часть), SQL (через средства отображения моделей). Интерфейс пользователя — на русском, английском и узбекском языках; все надписи интерфейса должны браться из файлов локализации.</w:t>
+      </w:r>
     </w:p>
     <w:p>
       <w:pPr>
         <w:pStyle w:val="31"/>
       </w:pPr>
-      <w:bookmarkStart w:id="43" w:name="_Toc243319707"/>
-      <w:r>
-        <w:t>4.3.1 Требования к математическому обеспечению</w:t>
-      </w:r>
-      <w:bookmarkEnd w:id="43"/>
-    </w:p>
-    <w:p>
-      <w:r>
-        <w:t>Специальные математические методы не применяются. Расчёт показателей выполняется по правилам:</w:t>
-      </w:r>
-    </w:p>
-    <w:p>
-      <w:r>
-        <w:t>– процент выполнения плана: факт / план × 100;</w:t>
-      </w:r>
-    </w:p>
-    <w:p>
-      <w:r>
-        <w:t>– прогноз к концу периода: факт / число прошедших дней периода × число дней периода; процент прогноза: прогноз / план × 100;</w:t>
-      </w:r>
-    </w:p>
-    <w:p>
-      <w:r>
-        <w:t>– продажи месяца учитываются по дате закрытия сделки;</w:t>
-      </w:r>
-    </w:p>
-    <w:p>
-      <w:r>
-        <w:t>– пересчёт суммы из одной валюты в другую выполняется через узбекский сум: сумма × курс исходной валюты / курс валюты назначения, где курс — число сумов за единицу валюты; кросс-курс в вычислении не округляется, результат округляется до 0,01 по правилу «половина вверх»;</w:t>
-      </w:r>
-    </w:p>
-    <w:p>
-      <w:r>
-        <w:t>– источник курсов выбирает компания: курсы ЦБ Узбекистана или только её ручные курсы; источники не смешиваются; для пересчёта на дату берётся последний курс выбранного источника не позже этой даты.</w:t>
+      <w:bookmarkStart w:id="46" w:name="_Toc243476318"/>
+      <w:r>
+        <w:t>4.3.4 Требования к программному обеспечению</w:t>
+      </w:r>
+      <w:bookmarkEnd w:id="46"/>
+    </w:p>
+    <w:p>
+      <w:r>
+        <w:t>Система должна функционировать на следующем ПО: ОС семейства Linux на сервере, Docker и Docker Compose, PostgreSQL 16, Redis 7, nginx; в серверной части — Python 3.12, Django 5.2, Django REST framework; клиентская часть — React 19, MUI, TypeScript. На рабочих местах — актуальные версии браузеров Google Chrome, Microsoft Edge, Mozilla Firefox, Safari. Состав ПО приводится в документе «Описание программного обеспечения».</w:t>
       </w:r>
     </w:p>
     <w:p>
       <w:pPr>
         <w:pStyle w:val="31"/>
       </w:pPr>
-      <w:bookmarkStart w:id="44" w:name="_Toc243319708"/>
-      <w:r>
-        <w:t>4.3.2 Требования к информационному обеспечению</w:t>
-      </w:r>
-      <w:bookmarkEnd w:id="44"/>
-    </w:p>
-    <w:p>
-      <w:r>
-        <w:t>Данные системы должны храниться в одной реляционной БД. Структура БД должна изменяться только миграциями, хранящимися вместе с исходными текстами. Классификаторы (статусы, типы, валюты) должны задаваться в программе кодами латиницей; наименования для пользователя — через файлы локализации. Состав и структура данных приводятся в документе «Описание информационного обеспечения системы».</w:t>
+      <w:bookmarkStart w:id="47" w:name="_Toc243476319"/>
+      <w:r>
+        <w:t>4.3.5 Требования к техническому обеспечению</w:t>
+      </w:r>
+      <w:bookmarkEnd w:id="47"/>
+    </w:p>
+    <w:p>
+      <w:r>
+        <w:t>Минимальная конфигурация сервера: 2 процессорных ядра, 4 ГБ оперативной памяти, 40 ГБ дискового пространства плюс объём для файлов и резервных копий; постоянный IP-адрес или доменное имя; доступ из сети Интернет по портам 80 и 443. Рабочее место пользователя — любое устройство с современным браузером и доступом к сети Интернет.</w:t>
       </w:r>
     </w:p>
     <w:p>
       <w:pPr>
         <w:pStyle w:val="31"/>
       </w:pPr>
-      <w:bookmarkStart w:id="45" w:name="_Toc243319709"/>
+      <w:bookmarkStart w:id="48" w:name="_Toc243476320"/>
+      <w:r>
+        <w:t>4.3.6 Требования к метрологическому обеспечению</w:t>
+      </w:r>
+      <w:bookmarkEnd w:id="48"/>
+    </w:p>
+    <w:p>
+      <w:r>
+        <w:t>Требования не предъявляются.</w:t>
+      </w:r>
+    </w:p>
+    <w:p>
+      <w:pPr>
+        <w:pStyle w:val="31"/>
+      </w:pPr>
+      <w:bookmarkStart w:id="49" w:name="_Toc243476321"/>
+      <w:r>
+        <w:t>4.3.7 Требования к организационному обеспечению</w:t>
+      </w:r>
+      <w:bookmarkEnd w:id="49"/>
+    </w:p>
+    <w:p>
+      <w:r>
+        <w:t xml:space="preserve">Заказчик назначает администратора системы в каждой компании и ответственного за сервер. Порядок выдачи прав доступа, увольнения сотрудников и выдачи API-ключей </w:t>
+      </w:r>
       <w:r>
         <w:lastRenderedPageBreak/>
-        <w:t>4.3.3 Требования к лингвистическому обеспечению</w:t>
-      </w:r>
-      <w:bookmarkEnd w:id="45"/>
-    </w:p>
-    <w:p>
-      <w:r>
-        <w:t>Языки программирования: Python (серверная часть), TypeScript (клиентская часть), SQL (через средства отображения моделей). Интерфейс пользователя — на русском, английском и узбекском языках; все надписи интерфейса должны браться из файлов локализации.</w:t>
+        <w:t>партнёрам устанавливается распорядительным документом заказчика с учётом рекомендаций руководства администратора.</w:t>
       </w:r>
     </w:p>
     <w:p>
       <w:pPr>
         <w:pStyle w:val="31"/>
       </w:pPr>
-      <w:bookmarkStart w:id="46" w:name="_Toc243319710"/>
-      <w:r>
-        <w:t>4.3.4 Требования к программному обеспечению</w:t>
-      </w:r>
-      <w:bookmarkEnd w:id="46"/>
-    </w:p>
-    <w:p>
-      <w:r>
-        <w:t>Система должна функционировать на следующем ПО: ОС семейства Linux на сервере, Docker и Docker Compose, PostgreSQL 16, Redis 7, nginx; в серверной части — Python 3.12, Django 5.2, Django REST framework; клиентская часть — React 19, MUI, TypeScript. На рабочих местах — актуальные версии браузеров Google Chrome, Microsoft Edge, Mozilla Firefox, Safari. Состав ПО приводится в документе «Описание программного обеспечения».</w:t>
-      </w:r>
-    </w:p>
-    <w:p>
-      <w:pPr>
-        <w:pStyle w:val="31"/>
-      </w:pPr>
-      <w:bookmarkStart w:id="47" w:name="_Toc243319711"/>
-      <w:r>
-        <w:t>4.3.5 Требования к техническому обеспечению</w:t>
-      </w:r>
-      <w:bookmarkEnd w:id="47"/>
-    </w:p>
-    <w:p>
-      <w:r>
-        <w:t>Минимальная конфигурация сервера: 2 процессорных ядра, 4 ГБ оперативной памяти, 40 ГБ дискового пространства плюс объём для файлов и резервных копий; постоянный IP-адрес или доменное имя; доступ из сети Интернет по портам 80 и 443. Рабочее место пользователя — любое устройство с современным браузером и доступом к сети Интернет.</w:t>
-      </w:r>
-    </w:p>
-    <w:p>
-      <w:pPr>
-        <w:pStyle w:val="31"/>
-      </w:pPr>
-      <w:bookmarkStart w:id="48" w:name="_Toc243319712"/>
-      <w:r>
-        <w:t>4.3.6 Требования к метрологическому обеспечению</w:t>
-      </w:r>
-      <w:bookmarkEnd w:id="48"/>
-    </w:p>
-    <w:p>
-      <w:r>
-        <w:t>Требования не предъявляются.</w:t>
-      </w:r>
-    </w:p>
-    <w:p>
-      <w:pPr>
-        <w:pStyle w:val="31"/>
-      </w:pPr>
-      <w:bookmarkStart w:id="49" w:name="_Toc243319713"/>
-      <w:r>
-        <w:t>4.3.7 Требования к организационному обеспечению</w:t>
-      </w:r>
-      <w:bookmarkEnd w:id="49"/>
-    </w:p>
-    <w:p>
-      <w:r>
-        <w:t>Заказчик назначает администратора системы в каждой компании и ответственного за сервер. Порядок выдачи прав доступа, увольнения сотрудников и выдачи API-ключей партнёрам устанавливается распорядительным документом заказчика с учётом рекомендаций руководства администратора.</w:t>
-      </w:r>
-    </w:p>
-    <w:p>
-      <w:pPr>
-        <w:pStyle w:val="31"/>
-      </w:pPr>
-      <w:bookmarkStart w:id="50" w:name="_Toc243319714"/>
+      <w:bookmarkStart w:id="50" w:name="_Toc243476322"/>
       <w:r>
         <w:t>4.3.8 Требования к методическому обеспечению</w:t>
       </w:r>
@@ -8060,7 +8063,7 @@
         <w:pStyle w:val="1"/>
         <w:pageBreakBefore/>
       </w:pPr>
-      <w:bookmarkStart w:id="51" w:name="_Toc243319715"/>
+      <w:bookmarkStart w:id="51" w:name="_Toc243476323"/>
       <w:r>
         <w:lastRenderedPageBreak/>
         <w:t>5 Состав и содержание работ по созданию системы</w:t>
@@ -8382,7 +8385,7 @@
         <w:pStyle w:val="1"/>
         <w:pageBreakBefore/>
       </w:pPr>
-      <w:bookmarkStart w:id="52" w:name="_Toc243319716"/>
+      <w:bookmarkStart w:id="52" w:name="_Toc243476324"/>
       <w:r>
         <w:lastRenderedPageBreak/>
         <w:t>6 Порядок разработки автоматизированной системы</w:t>
@@ -8429,7 +8432,7 @@
         <w:pStyle w:val="1"/>
         <w:pageBreakBefore/>
       </w:pPr>
-      <w:bookmarkStart w:id="53" w:name="_Toc243319717"/>
+      <w:bookmarkStart w:id="53" w:name="_Toc243476325"/>
       <w:r>
         <w:lastRenderedPageBreak/>
         <w:t>7 Порядок контроля и приёмки автоматизированной системы</w:t>
@@ -8446,7 +8449,7 @@
         <w:pStyle w:val="1"/>
         <w:pageBreakBefore/>
       </w:pPr>
-      <w:bookmarkStart w:id="54" w:name="_Toc243319718"/>
+      <w:bookmarkStart w:id="54" w:name="_Toc243476326"/>
       <w:r>
         <w:lastRenderedPageBreak/>
         <w:t>8 Требования к составу и содержанию работ по подготовке объекта автоматизации к вводу системы в действие</w:t>
@@ -8508,7 +8511,7 @@
         <w:pStyle w:val="1"/>
         <w:pageBreakBefore/>
       </w:pPr>
-      <w:bookmarkStart w:id="55" w:name="_Toc243319719"/>
+      <w:bookmarkStart w:id="55" w:name="_Toc243476327"/>
       <w:r>
         <w:lastRenderedPageBreak/>
         <w:t>9 Требования к документированию</w:t>
@@ -9150,7 +9153,7 @@
         <w:pStyle w:val="1"/>
         <w:pageBreakBefore/>
       </w:pPr>
-      <w:bookmarkStart w:id="56" w:name="_Toc243319720"/>
+      <w:bookmarkStart w:id="56" w:name="_Toc243476328"/>
       <w:r>
         <w:lastRenderedPageBreak/>
         <w:t>10 Источники разработки</w:t>
@@ -9189,7 +9192,7 @@
         <w:ind w:firstLine="0"/>
         <w:jc w:val="center"/>
       </w:pPr>
-      <w:bookmarkStart w:id="57" w:name="_Toc243319721"/>
+      <w:bookmarkStart w:id="57" w:name="_Toc243476329"/>
       <w:r>
         <w:lastRenderedPageBreak/>
         <w:t>ЛИСТ РЕГИСТРАЦИИ ИЗМЕНЕНИЙ</w:t>
@@ -11251,31 +11254,31 @@
       </w:rPr>
     </w:lvl>
   </w:abstractNum>
-  <w:num w:numId="1" w16cid:durableId="668486542">
+  <w:num w:numId="1" w16cid:durableId="604927043">
     <w:abstractNumId w:val="8"/>
   </w:num>
-  <w:num w:numId="2" w16cid:durableId="1275165687">
+  <w:num w:numId="2" w16cid:durableId="783768118">
     <w:abstractNumId w:val="6"/>
   </w:num>
-  <w:num w:numId="3" w16cid:durableId="140117724">
+  <w:num w:numId="3" w16cid:durableId="95178275">
     <w:abstractNumId w:val="5"/>
   </w:num>
-  <w:num w:numId="4" w16cid:durableId="47461268">
+  <w:num w:numId="4" w16cid:durableId="2021278091">
     <w:abstractNumId w:val="4"/>
   </w:num>
-  <w:num w:numId="5" w16cid:durableId="1404176451">
+  <w:num w:numId="5" w16cid:durableId="450589520">
     <w:abstractNumId w:val="7"/>
   </w:num>
-  <w:num w:numId="6" w16cid:durableId="557546451">
+  <w:num w:numId="6" w16cid:durableId="1642420207">
     <w:abstractNumId w:val="3"/>
   </w:num>
-  <w:num w:numId="7" w16cid:durableId="1175219565">
+  <w:num w:numId="7" w16cid:durableId="617686947">
     <w:abstractNumId w:val="2"/>
   </w:num>
-  <w:num w:numId="8" w16cid:durableId="576792559">
+  <w:num w:numId="8" w16cid:durableId="142816738">
     <w:abstractNumId w:val="1"/>
   </w:num>
-  <w:num w:numId="9" w16cid:durableId="1630889676">
+  <w:num w:numId="9" w16cid:durableId="17237555">
     <w:abstractNumId w:val="0"/>
   </w:num>
 </w:numbering>
@@ -22808,7 +22811,7 @@
     <w:autoRedefine/>
     <w:uiPriority w:val="39"/>
     <w:unhideWhenUsed/>
-    <w:rsid w:val="002C2973"/>
+    <w:rsid w:val="00566C36"/>
     <w:pPr>
       <w:spacing w:after="100"/>
     </w:pPr>
@@ -22820,7 +22823,7 @@
     <w:autoRedefine/>
     <w:uiPriority w:val="39"/>
     <w:unhideWhenUsed/>
-    <w:rsid w:val="002C2973"/>
+    <w:rsid w:val="00566C36"/>
     <w:pPr>
       <w:spacing w:after="100"/>
       <w:ind w:left="240"/>
@@ -22833,7 +22836,7 @@
     <w:autoRedefine/>
     <w:uiPriority w:val="39"/>
     <w:unhideWhenUsed/>
-    <w:rsid w:val="002C2973"/>
+    <w:rsid w:val="00566C36"/>
     <w:pPr>
       <w:spacing w:after="100"/>
       <w:ind w:left="480"/>
@@ -22844,7 +22847,7 @@
     <w:basedOn w:val="a2"/>
     <w:uiPriority w:val="99"/>
     <w:unhideWhenUsed/>
-    <w:rsid w:val="002C2973"/>
+    <w:rsid w:val="00566C36"/>
     <w:rPr>
       <w:color w:val="0000FF" w:themeColor="hyperlink"/>
       <w:u w:val="single"/>

</xml_diff>

<commit_message>
Add deals in progress to dashboard and reports
</commit_message>
<xml_diff>
--- a/docs/gost/out/01_ТЗ_Техническое_задание.docx
+++ b/docs/gost/out/01_ТЗ_Техническое_задание.docx
@@ -306,7 +306,7 @@
       <w:r>
         <w:fldChar w:fldCharType="separate"/>
       </w:r>
-      <w:hyperlink w:anchor="_Toc243476272" w:history="1">
+      <w:hyperlink w:anchor="_Toc243987243" w:history="1">
         <w:r>
           <w:rPr>
             <w:rStyle w:val="aff8"/>
@@ -333,7 +333,7 @@
             <w:noProof/>
             <w:webHidden/>
           </w:rPr>
-          <w:instrText xml:space="preserve"> PAGEREF _Toc243476272 \h </w:instrText>
+          <w:instrText xml:space="preserve"> PAGEREF _Toc243987243 \h </w:instrText>
         </w:r>
         <w:r>
           <w:rPr>
@@ -379,7 +379,7 @@
           <w14:ligatures w14:val="standardContextual"/>
         </w:rPr>
       </w:pPr>
-      <w:hyperlink w:anchor="_Toc243476273" w:history="1">
+      <w:hyperlink w:anchor="_Toc243987244" w:history="1">
         <w:r>
           <w:rPr>
             <w:rStyle w:val="aff8"/>
@@ -406,7 +406,7 @@
             <w:noProof/>
             <w:webHidden/>
           </w:rPr>
-          <w:instrText xml:space="preserve"> PAGEREF _Toc243476273 \h </w:instrText>
+          <w:instrText xml:space="preserve"> PAGEREF _Toc243987244 \h </w:instrText>
         </w:r>
         <w:r>
           <w:rPr>
@@ -452,7 +452,7 @@
           <w14:ligatures w14:val="standardContextual"/>
         </w:rPr>
       </w:pPr>
-      <w:hyperlink w:anchor="_Toc243476274" w:history="1">
+      <w:hyperlink w:anchor="_Toc243987245" w:history="1">
         <w:r>
           <w:rPr>
             <w:rStyle w:val="aff8"/>
@@ -479,7 +479,7 @@
             <w:noProof/>
             <w:webHidden/>
           </w:rPr>
-          <w:instrText xml:space="preserve"> PAGEREF _Toc243476274 \h </w:instrText>
+          <w:instrText xml:space="preserve"> PAGEREF _Toc243987245 \h </w:instrText>
         </w:r>
         <w:r>
           <w:rPr>
@@ -525,7 +525,7 @@
           <w14:ligatures w14:val="standardContextual"/>
         </w:rPr>
       </w:pPr>
-      <w:hyperlink w:anchor="_Toc243476275" w:history="1">
+      <w:hyperlink w:anchor="_Toc243987246" w:history="1">
         <w:r>
           <w:rPr>
             <w:rStyle w:val="aff8"/>
@@ -552,7 +552,7 @@
             <w:noProof/>
             <w:webHidden/>
           </w:rPr>
-          <w:instrText xml:space="preserve"> PAGEREF _Toc243476275 \h </w:instrText>
+          <w:instrText xml:space="preserve"> PAGEREF _Toc243987246 \h </w:instrText>
         </w:r>
         <w:r>
           <w:rPr>
@@ -598,7 +598,7 @@
           <w14:ligatures w14:val="standardContextual"/>
         </w:rPr>
       </w:pPr>
-      <w:hyperlink w:anchor="_Toc243476276" w:history="1">
+      <w:hyperlink w:anchor="_Toc243987247" w:history="1">
         <w:r>
           <w:rPr>
             <w:rStyle w:val="aff8"/>
@@ -625,7 +625,7 @@
             <w:noProof/>
             <w:webHidden/>
           </w:rPr>
-          <w:instrText xml:space="preserve"> PAGEREF _Toc243476276 \h </w:instrText>
+          <w:instrText xml:space="preserve"> PAGEREF _Toc243987247 \h </w:instrText>
         </w:r>
         <w:r>
           <w:rPr>
@@ -671,7 +671,7 @@
           <w14:ligatures w14:val="standardContextual"/>
         </w:rPr>
       </w:pPr>
-      <w:hyperlink w:anchor="_Toc243476277" w:history="1">
+      <w:hyperlink w:anchor="_Toc243987248" w:history="1">
         <w:r>
           <w:rPr>
             <w:rStyle w:val="aff8"/>
@@ -698,7 +698,7 @@
             <w:noProof/>
             <w:webHidden/>
           </w:rPr>
-          <w:instrText xml:space="preserve"> PAGEREF _Toc243476277 \h </w:instrText>
+          <w:instrText xml:space="preserve"> PAGEREF _Toc243987248 \h </w:instrText>
         </w:r>
         <w:r>
           <w:rPr>
@@ -744,7 +744,7 @@
           <w14:ligatures w14:val="standardContextual"/>
         </w:rPr>
       </w:pPr>
-      <w:hyperlink w:anchor="_Toc243476278" w:history="1">
+      <w:hyperlink w:anchor="_Toc243987249" w:history="1">
         <w:r>
           <w:rPr>
             <w:rStyle w:val="aff8"/>
@@ -771,7 +771,7 @@
             <w:noProof/>
             <w:webHidden/>
           </w:rPr>
-          <w:instrText xml:space="preserve"> PAGEREF _Toc243476278 \h </w:instrText>
+          <w:instrText xml:space="preserve"> PAGEREF _Toc243987249 \h </w:instrText>
         </w:r>
         <w:r>
           <w:rPr>
@@ -817,7 +817,7 @@
           <w14:ligatures w14:val="standardContextual"/>
         </w:rPr>
       </w:pPr>
-      <w:hyperlink w:anchor="_Toc243476279" w:history="1">
+      <w:hyperlink w:anchor="_Toc243987250" w:history="1">
         <w:r>
           <w:rPr>
             <w:rStyle w:val="aff8"/>
@@ -844,7 +844,7 @@
             <w:noProof/>
             <w:webHidden/>
           </w:rPr>
-          <w:instrText xml:space="preserve"> PAGEREF _Toc243476279 \h </w:instrText>
+          <w:instrText xml:space="preserve"> PAGEREF _Toc243987250 \h </w:instrText>
         </w:r>
         <w:r>
           <w:rPr>
@@ -890,7 +890,7 @@
           <w14:ligatures w14:val="standardContextual"/>
         </w:rPr>
       </w:pPr>
-      <w:hyperlink w:anchor="_Toc243476280" w:history="1">
+      <w:hyperlink w:anchor="_Toc243987251" w:history="1">
         <w:r>
           <w:rPr>
             <w:rStyle w:val="aff8"/>
@@ -917,7 +917,7 @@
             <w:noProof/>
             <w:webHidden/>
           </w:rPr>
-          <w:instrText xml:space="preserve"> PAGEREF _Toc243476280 \h </w:instrText>
+          <w:instrText xml:space="preserve"> PAGEREF _Toc243987251 \h </w:instrText>
         </w:r>
         <w:r>
           <w:rPr>
@@ -963,7 +963,7 @@
           <w14:ligatures w14:val="standardContextual"/>
         </w:rPr>
       </w:pPr>
-      <w:hyperlink w:anchor="_Toc243476281" w:history="1">
+      <w:hyperlink w:anchor="_Toc243987252" w:history="1">
         <w:r>
           <w:rPr>
             <w:rStyle w:val="aff8"/>
@@ -990,7 +990,7 @@
             <w:noProof/>
             <w:webHidden/>
           </w:rPr>
-          <w:instrText xml:space="preserve"> PAGEREF _Toc243476281 \h </w:instrText>
+          <w:instrText xml:space="preserve"> PAGEREF _Toc243987252 \h </w:instrText>
         </w:r>
         <w:r>
           <w:rPr>
@@ -1036,7 +1036,7 @@
           <w14:ligatures w14:val="standardContextual"/>
         </w:rPr>
       </w:pPr>
-      <w:hyperlink w:anchor="_Toc243476282" w:history="1">
+      <w:hyperlink w:anchor="_Toc243987253" w:history="1">
         <w:r>
           <w:rPr>
             <w:rStyle w:val="aff8"/>
@@ -1063,7 +1063,7 @@
             <w:noProof/>
             <w:webHidden/>
           </w:rPr>
-          <w:instrText xml:space="preserve"> PAGEREF _Toc243476282 \h </w:instrText>
+          <w:instrText xml:space="preserve"> PAGEREF _Toc243987253 \h </w:instrText>
         </w:r>
         <w:r>
           <w:rPr>
@@ -1109,7 +1109,7 @@
           <w14:ligatures w14:val="standardContextual"/>
         </w:rPr>
       </w:pPr>
-      <w:hyperlink w:anchor="_Toc243476283" w:history="1">
+      <w:hyperlink w:anchor="_Toc243987254" w:history="1">
         <w:r>
           <w:rPr>
             <w:rStyle w:val="aff8"/>
@@ -1136,7 +1136,7 @@
             <w:noProof/>
             <w:webHidden/>
           </w:rPr>
-          <w:instrText xml:space="preserve"> PAGEREF _Toc243476283 \h </w:instrText>
+          <w:instrText xml:space="preserve"> PAGEREF _Toc243987254 \h </w:instrText>
         </w:r>
         <w:r>
           <w:rPr>
@@ -1182,7 +1182,7 @@
           <w14:ligatures w14:val="standardContextual"/>
         </w:rPr>
       </w:pPr>
-      <w:hyperlink w:anchor="_Toc243476284" w:history="1">
+      <w:hyperlink w:anchor="_Toc243987255" w:history="1">
         <w:r>
           <w:rPr>
             <w:rStyle w:val="aff8"/>
@@ -1209,7 +1209,7 @@
             <w:noProof/>
             <w:webHidden/>
           </w:rPr>
-          <w:instrText xml:space="preserve"> PAGEREF _Toc243476284 \h </w:instrText>
+          <w:instrText xml:space="preserve"> PAGEREF _Toc243987255 \h </w:instrText>
         </w:r>
         <w:r>
           <w:rPr>
@@ -1255,7 +1255,7 @@
           <w14:ligatures w14:val="standardContextual"/>
         </w:rPr>
       </w:pPr>
-      <w:hyperlink w:anchor="_Toc243476285" w:history="1">
+      <w:hyperlink w:anchor="_Toc243987256" w:history="1">
         <w:r>
           <w:rPr>
             <w:rStyle w:val="aff8"/>
@@ -1282,7 +1282,7 @@
             <w:noProof/>
             <w:webHidden/>
           </w:rPr>
-          <w:instrText xml:space="preserve"> PAGEREF _Toc243476285 \h </w:instrText>
+          <w:instrText xml:space="preserve"> PAGEREF _Toc243987256 \h </w:instrText>
         </w:r>
         <w:r>
           <w:rPr>
@@ -1328,7 +1328,7 @@
           <w14:ligatures w14:val="standardContextual"/>
         </w:rPr>
       </w:pPr>
-      <w:hyperlink w:anchor="_Toc243476286" w:history="1">
+      <w:hyperlink w:anchor="_Toc243987257" w:history="1">
         <w:r>
           <w:rPr>
             <w:rStyle w:val="aff8"/>
@@ -1355,7 +1355,7 @@
             <w:noProof/>
             <w:webHidden/>
           </w:rPr>
-          <w:instrText xml:space="preserve"> PAGEREF _Toc243476286 \h </w:instrText>
+          <w:instrText xml:space="preserve"> PAGEREF _Toc243987257 \h </w:instrText>
         </w:r>
         <w:r>
           <w:rPr>
@@ -1401,7 +1401,7 @@
           <w14:ligatures w14:val="standardContextual"/>
         </w:rPr>
       </w:pPr>
-      <w:hyperlink w:anchor="_Toc243476287" w:history="1">
+      <w:hyperlink w:anchor="_Toc243987258" w:history="1">
         <w:r>
           <w:rPr>
             <w:rStyle w:val="aff8"/>
@@ -1428,7 +1428,7 @@
             <w:noProof/>
             <w:webHidden/>
           </w:rPr>
-          <w:instrText xml:space="preserve"> PAGEREF _Toc243476287 \h </w:instrText>
+          <w:instrText xml:space="preserve"> PAGEREF _Toc243987258 \h </w:instrText>
         </w:r>
         <w:r>
           <w:rPr>
@@ -1474,7 +1474,7 @@
           <w14:ligatures w14:val="standardContextual"/>
         </w:rPr>
       </w:pPr>
-      <w:hyperlink w:anchor="_Toc243476288" w:history="1">
+      <w:hyperlink w:anchor="_Toc243987259" w:history="1">
         <w:r>
           <w:rPr>
             <w:rStyle w:val="aff8"/>
@@ -1501,7 +1501,7 @@
             <w:noProof/>
             <w:webHidden/>
           </w:rPr>
-          <w:instrText xml:space="preserve"> PAGEREF _Toc243476288 \h </w:instrText>
+          <w:instrText xml:space="preserve"> PAGEREF _Toc243987259 \h </w:instrText>
         </w:r>
         <w:r>
           <w:rPr>
@@ -1547,7 +1547,7 @@
           <w14:ligatures w14:val="standardContextual"/>
         </w:rPr>
       </w:pPr>
-      <w:hyperlink w:anchor="_Toc243476289" w:history="1">
+      <w:hyperlink w:anchor="_Toc243987260" w:history="1">
         <w:r>
           <w:rPr>
             <w:rStyle w:val="aff8"/>
@@ -1574,7 +1574,7 @@
             <w:noProof/>
             <w:webHidden/>
           </w:rPr>
-          <w:instrText xml:space="preserve"> PAGEREF _Toc243476289 \h </w:instrText>
+          <w:instrText xml:space="preserve"> PAGEREF _Toc243987260 \h </w:instrText>
         </w:r>
         <w:r>
           <w:rPr>
@@ -1620,7 +1620,7 @@
           <w14:ligatures w14:val="standardContextual"/>
         </w:rPr>
       </w:pPr>
-      <w:hyperlink w:anchor="_Toc243476290" w:history="1">
+      <w:hyperlink w:anchor="_Toc243987261" w:history="1">
         <w:r>
           <w:rPr>
             <w:rStyle w:val="aff8"/>
@@ -1647,7 +1647,7 @@
             <w:noProof/>
             <w:webHidden/>
           </w:rPr>
-          <w:instrText xml:space="preserve"> PAGEREF _Toc243476290 \h </w:instrText>
+          <w:instrText xml:space="preserve"> PAGEREF _Toc243987261 \h </w:instrText>
         </w:r>
         <w:r>
           <w:rPr>
@@ -1693,7 +1693,7 @@
           <w14:ligatures w14:val="standardContextual"/>
         </w:rPr>
       </w:pPr>
-      <w:hyperlink w:anchor="_Toc243476291" w:history="1">
+      <w:hyperlink w:anchor="_Toc243987262" w:history="1">
         <w:r>
           <w:rPr>
             <w:rStyle w:val="aff8"/>
@@ -1720,7 +1720,7 @@
             <w:noProof/>
             <w:webHidden/>
           </w:rPr>
-          <w:instrText xml:space="preserve"> PAGEREF _Toc243476291 \h </w:instrText>
+          <w:instrText xml:space="preserve"> PAGEREF _Toc243987262 \h </w:instrText>
         </w:r>
         <w:r>
           <w:rPr>
@@ -1766,7 +1766,7 @@
           <w14:ligatures w14:val="standardContextual"/>
         </w:rPr>
       </w:pPr>
-      <w:hyperlink w:anchor="_Toc243476292" w:history="1">
+      <w:hyperlink w:anchor="_Toc243987263" w:history="1">
         <w:r>
           <w:rPr>
             <w:rStyle w:val="aff8"/>
@@ -1793,7 +1793,7 @@
             <w:noProof/>
             <w:webHidden/>
           </w:rPr>
-          <w:instrText xml:space="preserve"> PAGEREF _Toc243476292 \h </w:instrText>
+          <w:instrText xml:space="preserve"> PAGEREF _Toc243987263 \h </w:instrText>
         </w:r>
         <w:r>
           <w:rPr>
@@ -1839,7 +1839,7 @@
           <w14:ligatures w14:val="standardContextual"/>
         </w:rPr>
       </w:pPr>
-      <w:hyperlink w:anchor="_Toc243476293" w:history="1">
+      <w:hyperlink w:anchor="_Toc243987264" w:history="1">
         <w:r>
           <w:rPr>
             <w:rStyle w:val="aff8"/>
@@ -1866,7 +1866,7 @@
             <w:noProof/>
             <w:webHidden/>
           </w:rPr>
-          <w:instrText xml:space="preserve"> PAGEREF _Toc243476293 \h </w:instrText>
+          <w:instrText xml:space="preserve"> PAGEREF _Toc243987264 \h </w:instrText>
         </w:r>
         <w:r>
           <w:rPr>
@@ -1912,7 +1912,7 @@
           <w14:ligatures w14:val="standardContextual"/>
         </w:rPr>
       </w:pPr>
-      <w:hyperlink w:anchor="_Toc243476294" w:history="1">
+      <w:hyperlink w:anchor="_Toc243987265" w:history="1">
         <w:r>
           <w:rPr>
             <w:rStyle w:val="aff8"/>
@@ -1939,7 +1939,7 @@
             <w:noProof/>
             <w:webHidden/>
           </w:rPr>
-          <w:instrText xml:space="preserve"> PAGEREF _Toc243476294 \h </w:instrText>
+          <w:instrText xml:space="preserve"> PAGEREF _Toc243987265 \h </w:instrText>
         </w:r>
         <w:r>
           <w:rPr>
@@ -1985,7 +1985,7 @@
           <w14:ligatures w14:val="standardContextual"/>
         </w:rPr>
       </w:pPr>
-      <w:hyperlink w:anchor="_Toc243476295" w:history="1">
+      <w:hyperlink w:anchor="_Toc243987266" w:history="1">
         <w:r>
           <w:rPr>
             <w:rStyle w:val="aff8"/>
@@ -2012,7 +2012,7 @@
             <w:noProof/>
             <w:webHidden/>
           </w:rPr>
-          <w:instrText xml:space="preserve"> PAGEREF _Toc243476295 \h </w:instrText>
+          <w:instrText xml:space="preserve"> PAGEREF _Toc243987266 \h </w:instrText>
         </w:r>
         <w:r>
           <w:rPr>
@@ -2058,7 +2058,7 @@
           <w14:ligatures w14:val="standardContextual"/>
         </w:rPr>
       </w:pPr>
-      <w:hyperlink w:anchor="_Toc243476296" w:history="1">
+      <w:hyperlink w:anchor="_Toc243987267" w:history="1">
         <w:r>
           <w:rPr>
             <w:rStyle w:val="aff8"/>
@@ -2085,7 +2085,7 @@
             <w:noProof/>
             <w:webHidden/>
           </w:rPr>
-          <w:instrText xml:space="preserve"> PAGEREF _Toc243476296 \h </w:instrText>
+          <w:instrText xml:space="preserve"> PAGEREF _Toc243987267 \h </w:instrText>
         </w:r>
         <w:r>
           <w:rPr>
@@ -2131,7 +2131,7 @@
           <w14:ligatures w14:val="standardContextual"/>
         </w:rPr>
       </w:pPr>
-      <w:hyperlink w:anchor="_Toc243476297" w:history="1">
+      <w:hyperlink w:anchor="_Toc243987268" w:history="1">
         <w:r>
           <w:rPr>
             <w:rStyle w:val="aff8"/>
@@ -2158,7 +2158,7 @@
             <w:noProof/>
             <w:webHidden/>
           </w:rPr>
-          <w:instrText xml:space="preserve"> PAGEREF _Toc243476297 \h </w:instrText>
+          <w:instrText xml:space="preserve"> PAGEREF _Toc243987268 \h </w:instrText>
         </w:r>
         <w:r>
           <w:rPr>
@@ -2204,7 +2204,7 @@
           <w14:ligatures w14:val="standardContextual"/>
         </w:rPr>
       </w:pPr>
-      <w:hyperlink w:anchor="_Toc243476298" w:history="1">
+      <w:hyperlink w:anchor="_Toc243987269" w:history="1">
         <w:r>
           <w:rPr>
             <w:rStyle w:val="aff8"/>
@@ -2231,7 +2231,7 @@
             <w:noProof/>
             <w:webHidden/>
           </w:rPr>
-          <w:instrText xml:space="preserve"> PAGEREF _Toc243476298 \h </w:instrText>
+          <w:instrText xml:space="preserve"> PAGEREF _Toc243987269 \h </w:instrText>
         </w:r>
         <w:r>
           <w:rPr>
@@ -2277,7 +2277,7 @@
           <w14:ligatures w14:val="standardContextual"/>
         </w:rPr>
       </w:pPr>
-      <w:hyperlink w:anchor="_Toc243476299" w:history="1">
+      <w:hyperlink w:anchor="_Toc243987270" w:history="1">
         <w:r>
           <w:rPr>
             <w:rStyle w:val="aff8"/>
@@ -2304,7 +2304,7 @@
             <w:noProof/>
             <w:webHidden/>
           </w:rPr>
-          <w:instrText xml:space="preserve"> PAGEREF _Toc243476299 \h </w:instrText>
+          <w:instrText xml:space="preserve"> PAGEREF _Toc243987270 \h </w:instrText>
         </w:r>
         <w:r>
           <w:rPr>
@@ -2350,7 +2350,7 @@
           <w14:ligatures w14:val="standardContextual"/>
         </w:rPr>
       </w:pPr>
-      <w:hyperlink w:anchor="_Toc243476300" w:history="1">
+      <w:hyperlink w:anchor="_Toc243987271" w:history="1">
         <w:r>
           <w:rPr>
             <w:rStyle w:val="aff8"/>
@@ -2377,7 +2377,7 @@
             <w:noProof/>
             <w:webHidden/>
           </w:rPr>
-          <w:instrText xml:space="preserve"> PAGEREF _Toc243476300 \h </w:instrText>
+          <w:instrText xml:space="preserve"> PAGEREF _Toc243987271 \h </w:instrText>
         </w:r>
         <w:r>
           <w:rPr>
@@ -2423,7 +2423,7 @@
           <w14:ligatures w14:val="standardContextual"/>
         </w:rPr>
       </w:pPr>
-      <w:hyperlink w:anchor="_Toc243476301" w:history="1">
+      <w:hyperlink w:anchor="_Toc243987272" w:history="1">
         <w:r>
           <w:rPr>
             <w:rStyle w:val="aff8"/>
@@ -2450,7 +2450,7 @@
             <w:noProof/>
             <w:webHidden/>
           </w:rPr>
-          <w:instrText xml:space="preserve"> PAGEREF _Toc243476301 \h </w:instrText>
+          <w:instrText xml:space="preserve"> PAGEREF _Toc243987272 \h </w:instrText>
         </w:r>
         <w:r>
           <w:rPr>
@@ -2496,7 +2496,7 @@
           <w14:ligatures w14:val="standardContextual"/>
         </w:rPr>
       </w:pPr>
-      <w:hyperlink w:anchor="_Toc243476302" w:history="1">
+      <w:hyperlink w:anchor="_Toc243987273" w:history="1">
         <w:r>
           <w:rPr>
             <w:rStyle w:val="aff8"/>
@@ -2523,7 +2523,7 @@
             <w:noProof/>
             <w:webHidden/>
           </w:rPr>
-          <w:instrText xml:space="preserve"> PAGEREF _Toc243476302 \h </w:instrText>
+          <w:instrText xml:space="preserve"> PAGEREF _Toc243987273 \h </w:instrText>
         </w:r>
         <w:r>
           <w:rPr>
@@ -2569,7 +2569,7 @@
           <w14:ligatures w14:val="standardContextual"/>
         </w:rPr>
       </w:pPr>
-      <w:hyperlink w:anchor="_Toc243476303" w:history="1">
+      <w:hyperlink w:anchor="_Toc243987274" w:history="1">
         <w:r>
           <w:rPr>
             <w:rStyle w:val="aff8"/>
@@ -2596,7 +2596,7 @@
             <w:noProof/>
             <w:webHidden/>
           </w:rPr>
-          <w:instrText xml:space="preserve"> PAGEREF _Toc243476303 \h </w:instrText>
+          <w:instrText xml:space="preserve"> PAGEREF _Toc243987274 \h </w:instrText>
         </w:r>
         <w:r>
           <w:rPr>
@@ -2642,7 +2642,7 @@
           <w14:ligatures w14:val="standardContextual"/>
         </w:rPr>
       </w:pPr>
-      <w:hyperlink w:anchor="_Toc243476304" w:history="1">
+      <w:hyperlink w:anchor="_Toc243987275" w:history="1">
         <w:r>
           <w:rPr>
             <w:rStyle w:val="aff8"/>
@@ -2669,7 +2669,7 @@
             <w:noProof/>
             <w:webHidden/>
           </w:rPr>
-          <w:instrText xml:space="preserve"> PAGEREF _Toc243476304 \h </w:instrText>
+          <w:instrText xml:space="preserve"> PAGEREF _Toc243987275 \h </w:instrText>
         </w:r>
         <w:r>
           <w:rPr>
@@ -2715,7 +2715,7 @@
           <w14:ligatures w14:val="standardContextual"/>
         </w:rPr>
       </w:pPr>
-      <w:hyperlink w:anchor="_Toc243476305" w:history="1">
+      <w:hyperlink w:anchor="_Toc243987276" w:history="1">
         <w:r>
           <w:rPr>
             <w:rStyle w:val="aff8"/>
@@ -2742,7 +2742,7 @@
             <w:noProof/>
             <w:webHidden/>
           </w:rPr>
-          <w:instrText xml:space="preserve"> PAGEREF _Toc243476305 \h </w:instrText>
+          <w:instrText xml:space="preserve"> PAGEREF _Toc243987276 \h </w:instrText>
         </w:r>
         <w:r>
           <w:rPr>
@@ -2788,7 +2788,7 @@
           <w14:ligatures w14:val="standardContextual"/>
         </w:rPr>
       </w:pPr>
-      <w:hyperlink w:anchor="_Toc243476306" w:history="1">
+      <w:hyperlink w:anchor="_Toc243987277" w:history="1">
         <w:r>
           <w:rPr>
             <w:rStyle w:val="aff8"/>
@@ -2815,7 +2815,7 @@
             <w:noProof/>
             <w:webHidden/>
           </w:rPr>
-          <w:instrText xml:space="preserve"> PAGEREF _Toc243476306 \h </w:instrText>
+          <w:instrText xml:space="preserve"> PAGEREF _Toc243987277 \h </w:instrText>
         </w:r>
         <w:r>
           <w:rPr>
@@ -2861,7 +2861,7 @@
           <w14:ligatures w14:val="standardContextual"/>
         </w:rPr>
       </w:pPr>
-      <w:hyperlink w:anchor="_Toc243476307" w:history="1">
+      <w:hyperlink w:anchor="_Toc243987278" w:history="1">
         <w:r>
           <w:rPr>
             <w:rStyle w:val="aff8"/>
@@ -2888,7 +2888,7 @@
             <w:noProof/>
             <w:webHidden/>
           </w:rPr>
-          <w:instrText xml:space="preserve"> PAGEREF _Toc243476307 \h </w:instrText>
+          <w:instrText xml:space="preserve"> PAGEREF _Toc243987278 \h </w:instrText>
         </w:r>
         <w:r>
           <w:rPr>
@@ -2934,7 +2934,7 @@
           <w14:ligatures w14:val="standardContextual"/>
         </w:rPr>
       </w:pPr>
-      <w:hyperlink w:anchor="_Toc243476308" w:history="1">
+      <w:hyperlink w:anchor="_Toc243987279" w:history="1">
         <w:r>
           <w:rPr>
             <w:rStyle w:val="aff8"/>
@@ -2961,7 +2961,7 @@
             <w:noProof/>
             <w:webHidden/>
           </w:rPr>
-          <w:instrText xml:space="preserve"> PAGEREF _Toc243476308 \h </w:instrText>
+          <w:instrText xml:space="preserve"> PAGEREF _Toc243987279 \h </w:instrText>
         </w:r>
         <w:r>
           <w:rPr>
@@ -3007,7 +3007,7 @@
           <w14:ligatures w14:val="standardContextual"/>
         </w:rPr>
       </w:pPr>
-      <w:hyperlink w:anchor="_Toc243476309" w:history="1">
+      <w:hyperlink w:anchor="_Toc243987280" w:history="1">
         <w:r>
           <w:rPr>
             <w:rStyle w:val="aff8"/>
@@ -3034,7 +3034,7 @@
             <w:noProof/>
             <w:webHidden/>
           </w:rPr>
-          <w:instrText xml:space="preserve"> PAGEREF _Toc243476309 \h </w:instrText>
+          <w:instrText xml:space="preserve"> PAGEREF _Toc243987280 \h </w:instrText>
         </w:r>
         <w:r>
           <w:rPr>
@@ -3080,7 +3080,7 @@
           <w14:ligatures w14:val="standardContextual"/>
         </w:rPr>
       </w:pPr>
-      <w:hyperlink w:anchor="_Toc243476310" w:history="1">
+      <w:hyperlink w:anchor="_Toc243987281" w:history="1">
         <w:r>
           <w:rPr>
             <w:rStyle w:val="aff8"/>
@@ -3107,7 +3107,7 @@
             <w:noProof/>
             <w:webHidden/>
           </w:rPr>
-          <w:instrText xml:space="preserve"> PAGEREF _Toc243476310 \h </w:instrText>
+          <w:instrText xml:space="preserve"> PAGEREF _Toc243987281 \h </w:instrText>
         </w:r>
         <w:r>
           <w:rPr>
@@ -3153,7 +3153,7 @@
           <w14:ligatures w14:val="standardContextual"/>
         </w:rPr>
       </w:pPr>
-      <w:hyperlink w:anchor="_Toc243476311" w:history="1">
+      <w:hyperlink w:anchor="_Toc243987282" w:history="1">
         <w:r>
           <w:rPr>
             <w:rStyle w:val="aff8"/>
@@ -3180,7 +3180,7 @@
             <w:noProof/>
             <w:webHidden/>
           </w:rPr>
-          <w:instrText xml:space="preserve"> PAGEREF _Toc243476311 \h </w:instrText>
+          <w:instrText xml:space="preserve"> PAGEREF _Toc243987282 \h </w:instrText>
         </w:r>
         <w:r>
           <w:rPr>
@@ -3226,7 +3226,7 @@
           <w14:ligatures w14:val="standardContextual"/>
         </w:rPr>
       </w:pPr>
-      <w:hyperlink w:anchor="_Toc243476312" w:history="1">
+      <w:hyperlink w:anchor="_Toc243987283" w:history="1">
         <w:r>
           <w:rPr>
             <w:rStyle w:val="aff8"/>
@@ -3253,7 +3253,7 @@
             <w:noProof/>
             <w:webHidden/>
           </w:rPr>
-          <w:instrText xml:space="preserve"> PAGEREF _Toc243476312 \h </w:instrText>
+          <w:instrText xml:space="preserve"> PAGEREF _Toc243987283 \h </w:instrText>
         </w:r>
         <w:r>
           <w:rPr>
@@ -3299,7 +3299,7 @@
           <w14:ligatures w14:val="standardContextual"/>
         </w:rPr>
       </w:pPr>
-      <w:hyperlink w:anchor="_Toc243476313" w:history="1">
+      <w:hyperlink w:anchor="_Toc243987284" w:history="1">
         <w:r>
           <w:rPr>
             <w:rStyle w:val="aff8"/>
@@ -3326,7 +3326,7 @@
             <w:noProof/>
             <w:webHidden/>
           </w:rPr>
-          <w:instrText xml:space="preserve"> PAGEREF _Toc243476313 \h </w:instrText>
+          <w:instrText xml:space="preserve"> PAGEREF _Toc243987284 \h </w:instrText>
         </w:r>
         <w:r>
           <w:rPr>
@@ -3372,7 +3372,7 @@
           <w14:ligatures w14:val="standardContextual"/>
         </w:rPr>
       </w:pPr>
-      <w:hyperlink w:anchor="_Toc243476314" w:history="1">
+      <w:hyperlink w:anchor="_Toc243987285" w:history="1">
         <w:r>
           <w:rPr>
             <w:rStyle w:val="aff8"/>
@@ -3399,7 +3399,7 @@
             <w:noProof/>
             <w:webHidden/>
           </w:rPr>
-          <w:instrText xml:space="preserve"> PAGEREF _Toc243476314 \h </w:instrText>
+          <w:instrText xml:space="preserve"> PAGEREF _Toc243987285 \h </w:instrText>
         </w:r>
         <w:r>
           <w:rPr>
@@ -3445,7 +3445,7 @@
           <w14:ligatures w14:val="standardContextual"/>
         </w:rPr>
       </w:pPr>
-      <w:hyperlink w:anchor="_Toc243476315" w:history="1">
+      <w:hyperlink w:anchor="_Toc243987286" w:history="1">
         <w:r>
           <w:rPr>
             <w:rStyle w:val="aff8"/>
@@ -3472,7 +3472,7 @@
             <w:noProof/>
             <w:webHidden/>
           </w:rPr>
-          <w:instrText xml:space="preserve"> PAGEREF _Toc243476315 \h </w:instrText>
+          <w:instrText xml:space="preserve"> PAGEREF _Toc243987286 \h </w:instrText>
         </w:r>
         <w:r>
           <w:rPr>
@@ -3518,7 +3518,7 @@
           <w14:ligatures w14:val="standardContextual"/>
         </w:rPr>
       </w:pPr>
-      <w:hyperlink w:anchor="_Toc243476316" w:history="1">
+      <w:hyperlink w:anchor="_Toc243987287" w:history="1">
         <w:r>
           <w:rPr>
             <w:rStyle w:val="aff8"/>
@@ -3545,7 +3545,7 @@
             <w:noProof/>
             <w:webHidden/>
           </w:rPr>
-          <w:instrText xml:space="preserve"> PAGEREF _Toc243476316 \h </w:instrText>
+          <w:instrText xml:space="preserve"> PAGEREF _Toc243987287 \h </w:instrText>
         </w:r>
         <w:r>
           <w:rPr>
@@ -3591,7 +3591,7 @@
           <w14:ligatures w14:val="standardContextual"/>
         </w:rPr>
       </w:pPr>
-      <w:hyperlink w:anchor="_Toc243476317" w:history="1">
+      <w:hyperlink w:anchor="_Toc243987288" w:history="1">
         <w:r>
           <w:rPr>
             <w:rStyle w:val="aff8"/>
@@ -3618,7 +3618,7 @@
             <w:noProof/>
             <w:webHidden/>
           </w:rPr>
-          <w:instrText xml:space="preserve"> PAGEREF _Toc243476317 \h </w:instrText>
+          <w:instrText xml:space="preserve"> PAGEREF _Toc243987288 \h </w:instrText>
         </w:r>
         <w:r>
           <w:rPr>
@@ -3664,7 +3664,7 @@
           <w14:ligatures w14:val="standardContextual"/>
         </w:rPr>
       </w:pPr>
-      <w:hyperlink w:anchor="_Toc243476318" w:history="1">
+      <w:hyperlink w:anchor="_Toc243987289" w:history="1">
         <w:r>
           <w:rPr>
             <w:rStyle w:val="aff8"/>
@@ -3691,7 +3691,7 @@
             <w:noProof/>
             <w:webHidden/>
           </w:rPr>
-          <w:instrText xml:space="preserve"> PAGEREF _Toc243476318 \h </w:instrText>
+          <w:instrText xml:space="preserve"> PAGEREF _Toc243987289 \h </w:instrText>
         </w:r>
         <w:r>
           <w:rPr>
@@ -3737,7 +3737,7 @@
           <w14:ligatures w14:val="standardContextual"/>
         </w:rPr>
       </w:pPr>
-      <w:hyperlink w:anchor="_Toc243476319" w:history="1">
+      <w:hyperlink w:anchor="_Toc243987290" w:history="1">
         <w:r>
           <w:rPr>
             <w:rStyle w:val="aff8"/>
@@ -3764,7 +3764,7 @@
             <w:noProof/>
             <w:webHidden/>
           </w:rPr>
-          <w:instrText xml:space="preserve"> PAGEREF _Toc243476319 \h </w:instrText>
+          <w:instrText xml:space="preserve"> PAGEREF _Toc243987290 \h </w:instrText>
         </w:r>
         <w:r>
           <w:rPr>
@@ -3810,7 +3810,7 @@
           <w14:ligatures w14:val="standardContextual"/>
         </w:rPr>
       </w:pPr>
-      <w:hyperlink w:anchor="_Toc243476320" w:history="1">
+      <w:hyperlink w:anchor="_Toc243987291" w:history="1">
         <w:r>
           <w:rPr>
             <w:rStyle w:val="aff8"/>
@@ -3837,7 +3837,7 @@
             <w:noProof/>
             <w:webHidden/>
           </w:rPr>
-          <w:instrText xml:space="preserve"> PAGEREF _Toc243476320 \h </w:instrText>
+          <w:instrText xml:space="preserve"> PAGEREF _Toc243987291 \h </w:instrText>
         </w:r>
         <w:r>
           <w:rPr>
@@ -3883,7 +3883,7 @@
           <w14:ligatures w14:val="standardContextual"/>
         </w:rPr>
       </w:pPr>
-      <w:hyperlink w:anchor="_Toc243476321" w:history="1">
+      <w:hyperlink w:anchor="_Toc243987292" w:history="1">
         <w:r>
           <w:rPr>
             <w:rStyle w:val="aff8"/>
@@ -3910,7 +3910,7 @@
             <w:noProof/>
             <w:webHidden/>
           </w:rPr>
-          <w:instrText xml:space="preserve"> PAGEREF _Toc243476321 \h </w:instrText>
+          <w:instrText xml:space="preserve"> PAGEREF _Toc243987292 \h </w:instrText>
         </w:r>
         <w:r>
           <w:rPr>
@@ -3956,7 +3956,7 @@
           <w14:ligatures w14:val="standardContextual"/>
         </w:rPr>
       </w:pPr>
-      <w:hyperlink w:anchor="_Toc243476322" w:history="1">
+      <w:hyperlink w:anchor="_Toc243987293" w:history="1">
         <w:r>
           <w:rPr>
             <w:rStyle w:val="aff8"/>
@@ -3983,7 +3983,7 @@
             <w:noProof/>
             <w:webHidden/>
           </w:rPr>
-          <w:instrText xml:space="preserve"> PAGEREF _Toc243476322 \h </w:instrText>
+          <w:instrText xml:space="preserve"> PAGEREF _Toc243987293 \h </w:instrText>
         </w:r>
         <w:r>
           <w:rPr>
@@ -4029,7 +4029,7 @@
           <w14:ligatures w14:val="standardContextual"/>
         </w:rPr>
       </w:pPr>
-      <w:hyperlink w:anchor="_Toc243476323" w:history="1">
+      <w:hyperlink w:anchor="_Toc243987294" w:history="1">
         <w:r>
           <w:rPr>
             <w:rStyle w:val="aff8"/>
@@ -4056,7 +4056,7 @@
             <w:noProof/>
             <w:webHidden/>
           </w:rPr>
-          <w:instrText xml:space="preserve"> PAGEREF _Toc243476323 \h </w:instrText>
+          <w:instrText xml:space="preserve"> PAGEREF _Toc243987294 \h </w:instrText>
         </w:r>
         <w:r>
           <w:rPr>
@@ -4102,7 +4102,7 @@
           <w14:ligatures w14:val="standardContextual"/>
         </w:rPr>
       </w:pPr>
-      <w:hyperlink w:anchor="_Toc243476324" w:history="1">
+      <w:hyperlink w:anchor="_Toc243987295" w:history="1">
         <w:r>
           <w:rPr>
             <w:rStyle w:val="aff8"/>
@@ -4129,7 +4129,7 @@
             <w:noProof/>
             <w:webHidden/>
           </w:rPr>
-          <w:instrText xml:space="preserve"> PAGEREF _Toc243476324 \h </w:instrText>
+          <w:instrText xml:space="preserve"> PAGEREF _Toc243987295 \h </w:instrText>
         </w:r>
         <w:r>
           <w:rPr>
@@ -4175,7 +4175,7 @@
           <w14:ligatures w14:val="standardContextual"/>
         </w:rPr>
       </w:pPr>
-      <w:hyperlink w:anchor="_Toc243476325" w:history="1">
+      <w:hyperlink w:anchor="_Toc243987296" w:history="1">
         <w:r>
           <w:rPr>
             <w:rStyle w:val="aff8"/>
@@ -4202,7 +4202,7 @@
             <w:noProof/>
             <w:webHidden/>
           </w:rPr>
-          <w:instrText xml:space="preserve"> PAGEREF _Toc243476325 \h </w:instrText>
+          <w:instrText xml:space="preserve"> PAGEREF _Toc243987296 \h </w:instrText>
         </w:r>
         <w:r>
           <w:rPr>
@@ -4248,7 +4248,7 @@
           <w14:ligatures w14:val="standardContextual"/>
         </w:rPr>
       </w:pPr>
-      <w:hyperlink w:anchor="_Toc243476326" w:history="1">
+      <w:hyperlink w:anchor="_Toc243987297" w:history="1">
         <w:r>
           <w:rPr>
             <w:rStyle w:val="aff8"/>
@@ -4275,7 +4275,7 @@
             <w:noProof/>
             <w:webHidden/>
           </w:rPr>
-          <w:instrText xml:space="preserve"> PAGEREF _Toc243476326 \h </w:instrText>
+          <w:instrText xml:space="preserve"> PAGEREF _Toc243987297 \h </w:instrText>
         </w:r>
         <w:r>
           <w:rPr>
@@ -4321,7 +4321,7 @@
           <w14:ligatures w14:val="standardContextual"/>
         </w:rPr>
       </w:pPr>
-      <w:hyperlink w:anchor="_Toc243476327" w:history="1">
+      <w:hyperlink w:anchor="_Toc243987298" w:history="1">
         <w:r>
           <w:rPr>
             <w:rStyle w:val="aff8"/>
@@ -4348,7 +4348,7 @@
             <w:noProof/>
             <w:webHidden/>
           </w:rPr>
-          <w:instrText xml:space="preserve"> PAGEREF _Toc243476327 \h </w:instrText>
+          <w:instrText xml:space="preserve"> PAGEREF _Toc243987298 \h </w:instrText>
         </w:r>
         <w:r>
           <w:rPr>
@@ -4394,7 +4394,7 @@
           <w14:ligatures w14:val="standardContextual"/>
         </w:rPr>
       </w:pPr>
-      <w:hyperlink w:anchor="_Toc243476328" w:history="1">
+      <w:hyperlink w:anchor="_Toc243987299" w:history="1">
         <w:r>
           <w:rPr>
             <w:rStyle w:val="aff8"/>
@@ -4421,7 +4421,7 @@
             <w:noProof/>
             <w:webHidden/>
           </w:rPr>
-          <w:instrText xml:space="preserve"> PAGEREF _Toc243476328 \h </w:instrText>
+          <w:instrText xml:space="preserve"> PAGEREF _Toc243987299 \h </w:instrText>
         </w:r>
         <w:r>
           <w:rPr>
@@ -4467,7 +4467,7 @@
           <w14:ligatures w14:val="standardContextual"/>
         </w:rPr>
       </w:pPr>
-      <w:hyperlink w:anchor="_Toc243476329" w:history="1">
+      <w:hyperlink w:anchor="_Toc243987300" w:history="1">
         <w:r>
           <w:rPr>
             <w:rStyle w:val="aff8"/>
@@ -4494,7 +4494,7 @@
             <w:noProof/>
             <w:webHidden/>
           </w:rPr>
-          <w:instrText xml:space="preserve"> PAGEREF _Toc243476329 \h </w:instrText>
+          <w:instrText xml:space="preserve"> PAGEREF _Toc243987300 \h </w:instrText>
         </w:r>
         <w:r>
           <w:rPr>
@@ -4540,7 +4540,7 @@
         <w:ind w:firstLine="0"/>
         <w:jc w:val="center"/>
       </w:pPr>
-      <w:bookmarkStart w:id="0" w:name="_Toc243476272"/>
+      <w:bookmarkStart w:id="0" w:name="_Toc243987243"/>
       <w:r>
         <w:lastRenderedPageBreak/>
         <w:t>ПЕРЕЧЕНЬ ТЕРМИНОВ И СОКРАЩЕНИЙ</w:t>
@@ -5802,7 +5802,7 @@
         <w:pStyle w:val="1"/>
         <w:pageBreakBefore/>
       </w:pPr>
-      <w:bookmarkStart w:id="1" w:name="_Toc243476273"/>
+      <w:bookmarkStart w:id="1" w:name="_Toc243987244"/>
       <w:r>
         <w:lastRenderedPageBreak/>
         <w:t>1 Общие сведения</w:t>
@@ -5813,7 +5813,7 @@
       <w:pPr>
         <w:pStyle w:val="21"/>
       </w:pPr>
-      <w:bookmarkStart w:id="2" w:name="_Toc243476274"/>
+      <w:bookmarkStart w:id="2" w:name="_Toc243987245"/>
       <w:r>
         <w:t>1.1 Полное наименование системы и её условное обозначение</w:t>
       </w:r>
@@ -5833,7 +5833,7 @@
       <w:pPr>
         <w:pStyle w:val="21"/>
       </w:pPr>
-      <w:bookmarkStart w:id="3" w:name="_Toc243476275"/>
+      <w:bookmarkStart w:id="3" w:name="_Toc243987246"/>
       <w:r>
         <w:t>1.2 Шифр темы и номер договора</w:t>
       </w:r>
@@ -5848,7 +5848,7 @@
       <w:pPr>
         <w:pStyle w:val="21"/>
       </w:pPr>
-      <w:bookmarkStart w:id="4" w:name="_Toc243476276"/>
+      <w:bookmarkStart w:id="4" w:name="_Toc243987247"/>
       <w:r>
         <w:t>1.3 Наименования организаций заказчика и разработчика</w:t>
       </w:r>
@@ -5868,7 +5868,7 @@
       <w:pPr>
         <w:pStyle w:val="21"/>
       </w:pPr>
-      <w:bookmarkStart w:id="5" w:name="_Toc243476277"/>
+      <w:bookmarkStart w:id="5" w:name="_Toc243987248"/>
       <w:r>
         <w:t>1.4 Основания для создания системы</w:t>
       </w:r>
@@ -5893,7 +5893,7 @@
       <w:pPr>
         <w:pStyle w:val="21"/>
       </w:pPr>
-      <w:bookmarkStart w:id="6" w:name="_Toc243476278"/>
+      <w:bookmarkStart w:id="6" w:name="_Toc243987249"/>
       <w:r>
         <w:t>1.5 Плановые сроки начала и окончания работ</w:t>
       </w:r>
@@ -5908,7 +5908,7 @@
       <w:pPr>
         <w:pStyle w:val="21"/>
       </w:pPr>
-      <w:bookmarkStart w:id="7" w:name="_Toc243476279"/>
+      <w:bookmarkStart w:id="7" w:name="_Toc243987250"/>
       <w:r>
         <w:t>1.6 Сведения об источниках и порядке финансирования</w:t>
       </w:r>
@@ -5923,7 +5923,7 @@
       <w:pPr>
         <w:pStyle w:val="21"/>
       </w:pPr>
-      <w:bookmarkStart w:id="8" w:name="_Toc243476280"/>
+      <w:bookmarkStart w:id="8" w:name="_Toc243987251"/>
       <w:r>
         <w:lastRenderedPageBreak/>
         <w:t>1.7 Порядок оформления и предъявления результатов работ</w:t>
@@ -5939,7 +5939,7 @@
       <w:pPr>
         <w:pStyle w:val="21"/>
       </w:pPr>
-      <w:bookmarkStart w:id="9" w:name="_Toc243476281"/>
+      <w:bookmarkStart w:id="9" w:name="_Toc243987252"/>
       <w:r>
         <w:t>1.8 Перечень нормативно-технических документов</w:t>
       </w:r>
@@ -6003,7 +6003,7 @@
         <w:pStyle w:val="1"/>
         <w:pageBreakBefore/>
       </w:pPr>
-      <w:bookmarkStart w:id="10" w:name="_Toc243476282"/>
+      <w:bookmarkStart w:id="10" w:name="_Toc243987253"/>
       <w:r>
         <w:lastRenderedPageBreak/>
         <w:t>2 Цели и назначение создания автоматизированной системы</w:t>
@@ -6014,7 +6014,7 @@
       <w:pPr>
         <w:pStyle w:val="21"/>
       </w:pPr>
-      <w:bookmarkStart w:id="11" w:name="_Toc243476283"/>
+      <w:bookmarkStart w:id="11" w:name="_Toc243987254"/>
       <w:r>
         <w:t>2.1 Назначение системы</w:t>
       </w:r>
@@ -6074,7 +6074,7 @@
       <w:pPr>
         <w:pStyle w:val="21"/>
       </w:pPr>
-      <w:bookmarkStart w:id="12" w:name="_Toc243476284"/>
+      <w:bookmarkStart w:id="12" w:name="_Toc243987255"/>
       <w:r>
         <w:t>2.2 Цели создания системы</w:t>
       </w:r>
@@ -6120,7 +6120,7 @@
         <w:pStyle w:val="1"/>
         <w:pageBreakBefore/>
       </w:pPr>
-      <w:bookmarkStart w:id="13" w:name="_Toc243476285"/>
+      <w:bookmarkStart w:id="13" w:name="_Toc243987256"/>
       <w:r>
         <w:lastRenderedPageBreak/>
         <w:t>3 Характеристика объекта автоматизации</w:t>
@@ -6131,7 +6131,7 @@
       <w:pPr>
         <w:pStyle w:val="21"/>
       </w:pPr>
-      <w:bookmarkStart w:id="14" w:name="_Toc243476286"/>
+      <w:bookmarkStart w:id="14" w:name="_Toc243987257"/>
       <w:r>
         <w:t>3.1 Краткие сведения об объекте автоматизации</w:t>
       </w:r>
@@ -6221,7 +6221,7 @@
       <w:pPr>
         <w:pStyle w:val="21"/>
       </w:pPr>
-      <w:bookmarkStart w:id="15" w:name="_Toc243476287"/>
+      <w:bookmarkStart w:id="15" w:name="_Toc243987258"/>
       <w:r>
         <w:t>3.2 Сведения об условиях эксплуатации</w:t>
       </w:r>
@@ -6237,7 +6237,7 @@
         <w:pStyle w:val="1"/>
         <w:pageBreakBefore/>
       </w:pPr>
-      <w:bookmarkStart w:id="16" w:name="_Toc243476288"/>
+      <w:bookmarkStart w:id="16" w:name="_Toc243987259"/>
       <w:r>
         <w:lastRenderedPageBreak/>
         <w:t>4 Требования к автоматизированной системе</w:t>
@@ -6248,7 +6248,7 @@
       <w:pPr>
         <w:pStyle w:val="21"/>
       </w:pPr>
-      <w:bookmarkStart w:id="17" w:name="_Toc243476289"/>
+      <w:bookmarkStart w:id="17" w:name="_Toc243987260"/>
       <w:r>
         <w:t>4.1 Требования к системе в целом</w:t>
       </w:r>
@@ -6258,7 +6258,7 @@
       <w:pPr>
         <w:pStyle w:val="31"/>
       </w:pPr>
-      <w:bookmarkStart w:id="18" w:name="_Toc243476290"/>
+      <w:bookmarkStart w:id="18" w:name="_Toc243987261"/>
       <w:r>
         <w:t>4.1.1 Требования к структуре и функционированию системы</w:t>
       </w:r>
@@ -6904,7 +6904,7 @@
       <w:pPr>
         <w:pStyle w:val="31"/>
       </w:pPr>
-      <w:bookmarkStart w:id="19" w:name="_Toc243476291"/>
+      <w:bookmarkStart w:id="19" w:name="_Toc243987262"/>
       <w:r>
         <w:t>4.1.2 Требования к численности и квалификации персонала</w:t>
       </w:r>
@@ -7185,7 +7185,7 @@
       <w:pPr>
         <w:pStyle w:val="31"/>
       </w:pPr>
-      <w:bookmarkStart w:id="20" w:name="_Toc243476292"/>
+      <w:bookmarkStart w:id="20" w:name="_Toc243987263"/>
       <w:r>
         <w:t>4.1.3 Показатели назначения</w:t>
       </w:r>
@@ -7233,7 +7233,7 @@
       <w:pPr>
         <w:pStyle w:val="31"/>
       </w:pPr>
-      <w:bookmarkStart w:id="21" w:name="_Toc243476293"/>
+      <w:bookmarkStart w:id="21" w:name="_Toc243987264"/>
       <w:r>
         <w:t>4.1.4 Требования к надёжности</w:t>
       </w:r>
@@ -7267,7 +7267,7 @@
       <w:pPr>
         <w:pStyle w:val="31"/>
       </w:pPr>
-      <w:bookmarkStart w:id="22" w:name="_Toc243476294"/>
+      <w:bookmarkStart w:id="22" w:name="_Toc243987265"/>
       <w:r>
         <w:t>4.1.5 Требования к безопасности</w:t>
       </w:r>
@@ -7282,7 +7282,7 @@
       <w:pPr>
         <w:pStyle w:val="31"/>
       </w:pPr>
-      <w:bookmarkStart w:id="23" w:name="_Toc243476295"/>
+      <w:bookmarkStart w:id="23" w:name="_Toc243987266"/>
       <w:r>
         <w:t>4.1.6 Требования к эргономике и технической эстетике</w:t>
       </w:r>
@@ -7327,7 +7327,7 @@
       <w:pPr>
         <w:pStyle w:val="31"/>
       </w:pPr>
-      <w:bookmarkStart w:id="24" w:name="_Toc243476296"/>
+      <w:bookmarkStart w:id="24" w:name="_Toc243987267"/>
       <w:r>
         <w:t>4.1.7 Требования к эксплуатации и техническому обслуживанию</w:t>
       </w:r>
@@ -7357,7 +7357,7 @@
       <w:pPr>
         <w:pStyle w:val="31"/>
       </w:pPr>
-      <w:bookmarkStart w:id="25" w:name="_Toc243476297"/>
+      <w:bookmarkStart w:id="25" w:name="_Toc243987268"/>
       <w:r>
         <w:t>4.1.8 Требования к защите информации от несанкционированного доступа</w:t>
       </w:r>
@@ -7428,7 +7428,7 @@
       <w:pPr>
         <w:pStyle w:val="31"/>
       </w:pPr>
-      <w:bookmarkStart w:id="26" w:name="_Toc243476298"/>
+      <w:bookmarkStart w:id="26" w:name="_Toc243987269"/>
       <w:r>
         <w:t>4.1.9 Требования по сохранности информации при авариях</w:t>
       </w:r>
@@ -7449,7 +7449,7 @@
       <w:pPr>
         <w:pStyle w:val="31"/>
       </w:pPr>
-      <w:bookmarkStart w:id="27" w:name="_Toc243476299"/>
+      <w:bookmarkStart w:id="27" w:name="_Toc243987270"/>
       <w:r>
         <w:t>4.1.10 Требования к защите от влияния внешних воздействий</w:t>
       </w:r>
@@ -7464,7 +7464,7 @@
       <w:pPr>
         <w:pStyle w:val="31"/>
       </w:pPr>
-      <w:bookmarkStart w:id="28" w:name="_Toc243476300"/>
+      <w:bookmarkStart w:id="28" w:name="_Toc243987271"/>
       <w:r>
         <w:t>4.1.11 Требования к патентной чистоте</w:t>
       </w:r>
@@ -7482,7 +7482,7 @@
       <w:pPr>
         <w:pStyle w:val="31"/>
       </w:pPr>
-      <w:bookmarkStart w:id="29" w:name="_Toc243476301"/>
+      <w:bookmarkStart w:id="29" w:name="_Toc243987272"/>
       <w:r>
         <w:t>4.1.12 Требования по стандартизации и унификации</w:t>
       </w:r>
@@ -7497,7 +7497,7 @@
       <w:pPr>
         <w:pStyle w:val="31"/>
       </w:pPr>
-      <w:bookmarkStart w:id="30" w:name="_Toc243476302"/>
+      <w:bookmarkStart w:id="30" w:name="_Toc243987273"/>
       <w:r>
         <w:t>4.1.13 Дополнительные требования</w:t>
       </w:r>
@@ -7517,7 +7517,7 @@
       <w:pPr>
         <w:pStyle w:val="21"/>
       </w:pPr>
-      <w:bookmarkStart w:id="31" w:name="_Toc243476303"/>
+      <w:bookmarkStart w:id="31" w:name="_Toc243987274"/>
       <w:r>
         <w:lastRenderedPageBreak/>
         <w:t>4.2 Требования к функциям, выполняемым системой</w:t>
@@ -7533,7 +7533,7 @@
       <w:pPr>
         <w:pStyle w:val="31"/>
       </w:pPr>
-      <w:bookmarkStart w:id="32" w:name="_Toc243476304"/>
+      <w:bookmarkStart w:id="32" w:name="_Toc243987275"/>
       <w:r>
         <w:t>4.2.1 Подсистема «Организационная структура и права доступа»</w:t>
       </w:r>
@@ -7583,7 +7583,7 @@
       <w:pPr>
         <w:pStyle w:val="31"/>
       </w:pPr>
-      <w:bookmarkStart w:id="33" w:name="_Toc243476305"/>
+      <w:bookmarkStart w:id="33" w:name="_Toc243987276"/>
       <w:r>
         <w:t>4.2.2 Подсистема «Каталог недвижимости»</w:t>
       </w:r>
@@ -7634,7 +7634,7 @@
       <w:pPr>
         <w:pStyle w:val="31"/>
       </w:pPr>
-      <w:bookmarkStart w:id="34" w:name="_Toc243476306"/>
+      <w:bookmarkStart w:id="34" w:name="_Toc243987277"/>
       <w:r>
         <w:t>4.2.3 Подсистема «Работа с клиентами»</w:t>
       </w:r>
@@ -7674,7 +7674,7 @@
       <w:pPr>
         <w:pStyle w:val="31"/>
       </w:pPr>
-      <w:bookmarkStart w:id="35" w:name="_Toc243476307"/>
+      <w:bookmarkStart w:id="35" w:name="_Toc243987278"/>
       <w:r>
         <w:t>4.2.4 Подсистема «Сделки»</w:t>
       </w:r>
@@ -7735,7 +7735,7 @@
       <w:pPr>
         <w:pStyle w:val="31"/>
       </w:pPr>
-      <w:bookmarkStart w:id="36" w:name="_Toc243476308"/>
+      <w:bookmarkStart w:id="36" w:name="_Toc243987279"/>
       <w:r>
         <w:t>4.2.5 Подсистема «Финансы»</w:t>
       </w:r>
@@ -7801,7 +7801,7 @@
       <w:pPr>
         <w:pStyle w:val="31"/>
       </w:pPr>
-      <w:bookmarkStart w:id="37" w:name="_Toc243476309"/>
+      <w:bookmarkStart w:id="37" w:name="_Toc243987280"/>
       <w:r>
         <w:t>4.2.6 Подсистема «Шаблоны документов»</w:t>
       </w:r>
@@ -7816,7 +7816,7 @@
       <w:pPr>
         <w:pStyle w:val="31"/>
       </w:pPr>
-      <w:bookmarkStart w:id="38" w:name="_Toc243476310"/>
+      <w:bookmarkStart w:id="38" w:name="_Toc243987281"/>
       <w:r>
         <w:t>4.2.7 Подсистема «Задачи»</w:t>
       </w:r>
@@ -7831,7 +7831,7 @@
       <w:pPr>
         <w:pStyle w:val="31"/>
       </w:pPr>
-      <w:bookmarkStart w:id="39" w:name="_Toc243476311"/>
+      <w:bookmarkStart w:id="39" w:name="_Toc243987282"/>
       <w:r>
         <w:t>4.2.8 Подсистема «Аналитика и отчётность»</w:t>
       </w:r>
@@ -7844,7 +7844,7 @@
     </w:p>
     <w:p>
       <w:r>
-        <w:t>– дашборд с показателями дня и месяца в пределах области видимости пользователя;</w:t>
+        <w:t>– дашборд с показателями дня и месяца в пределах области видимости пользователя, в том числе числом клиентов со сделкой «В работе», контрактацией за месяц (сколько клиенты согласились заплатить) и поступлениями за месяц (сколько реально оплачено);</w:t>
       </w:r>
     </w:p>
     <w:p>
@@ -7859,7 +7859,7 @@
     </w:p>
     <w:p>
       <w:r>
-        <w:t>– отчёты «план-факт» по количеству, контрактации и поступлениям с процентом выполнения и прогнозом выполнения к концу периода;</w:t>
+        <w:t>– отчёты «план-факт» по количеству, контрактации и поступлениям с процентом выполнения и прогнозом выполнения к концу периода; контрактация учитывает сделки «В работе» и «Успешно закрыта» по дате договора;</w:t>
       </w:r>
     </w:p>
     <w:p>
@@ -7872,7 +7872,7 @@
       <w:pPr>
         <w:pStyle w:val="31"/>
       </w:pPr>
-      <w:bookmarkStart w:id="40" w:name="_Toc243476312"/>
+      <w:bookmarkStart w:id="40" w:name="_Toc243987283"/>
       <w:r>
         <w:t>4.2.9 Подсистема «Интеграция с партнёрами»</w:t>
       </w:r>
@@ -7887,7 +7887,7 @@
       <w:pPr>
         <w:pStyle w:val="31"/>
       </w:pPr>
-      <w:bookmarkStart w:id="41" w:name="_Toc243476313"/>
+      <w:bookmarkStart w:id="41" w:name="_Toc243987284"/>
       <w:r>
         <w:t>4.2.10 Подсистема «Регламентные задания»</w:t>
       </w:r>
@@ -7902,7 +7902,7 @@
       <w:pPr>
         <w:pStyle w:val="21"/>
       </w:pPr>
-      <w:bookmarkStart w:id="42" w:name="_Toc243476314"/>
+      <w:bookmarkStart w:id="42" w:name="_Toc243987285"/>
       <w:r>
         <w:t>4.3 Требования к видам обеспечения</w:t>
       </w:r>
@@ -7912,7 +7912,7 @@
       <w:pPr>
         <w:pStyle w:val="31"/>
       </w:pPr>
-      <w:bookmarkStart w:id="43" w:name="_Toc243476315"/>
+      <w:bookmarkStart w:id="43" w:name="_Toc243987286"/>
       <w:r>
         <w:t>4.3.1 Требования к математическому обеспечению</w:t>
       </w:r>
@@ -7952,7 +7952,7 @@
       <w:pPr>
         <w:pStyle w:val="31"/>
       </w:pPr>
-      <w:bookmarkStart w:id="44" w:name="_Toc243476316"/>
+      <w:bookmarkStart w:id="44" w:name="_Toc243987287"/>
       <w:r>
         <w:lastRenderedPageBreak/>
         <w:t>4.3.2 Требования к информационному обеспечению</w:t>
@@ -7968,7 +7968,7 @@
       <w:pPr>
         <w:pStyle w:val="31"/>
       </w:pPr>
-      <w:bookmarkStart w:id="45" w:name="_Toc243476317"/>
+      <w:bookmarkStart w:id="45" w:name="_Toc243987288"/>
       <w:r>
         <w:t>4.3.3 Требования к лингвистическому обеспечению</w:t>
       </w:r>
@@ -7983,7 +7983,7 @@
       <w:pPr>
         <w:pStyle w:val="31"/>
       </w:pPr>
-      <w:bookmarkStart w:id="46" w:name="_Toc243476318"/>
+      <w:bookmarkStart w:id="46" w:name="_Toc243987289"/>
       <w:r>
         <w:t>4.3.4 Требования к программному обеспечению</w:t>
       </w:r>
@@ -7998,7 +7998,7 @@
       <w:pPr>
         <w:pStyle w:val="31"/>
       </w:pPr>
-      <w:bookmarkStart w:id="47" w:name="_Toc243476319"/>
+      <w:bookmarkStart w:id="47" w:name="_Toc243987290"/>
       <w:r>
         <w:t>4.3.5 Требования к техническому обеспечению</w:t>
       </w:r>
@@ -8013,7 +8013,7 @@
       <w:pPr>
         <w:pStyle w:val="31"/>
       </w:pPr>
-      <w:bookmarkStart w:id="48" w:name="_Toc243476320"/>
+      <w:bookmarkStart w:id="48" w:name="_Toc243987291"/>
       <w:r>
         <w:t>4.3.6 Требования к метрологическому обеспечению</w:t>
       </w:r>
@@ -8028,7 +8028,7 @@
       <w:pPr>
         <w:pStyle w:val="31"/>
       </w:pPr>
-      <w:bookmarkStart w:id="49" w:name="_Toc243476321"/>
+      <w:bookmarkStart w:id="49" w:name="_Toc243987292"/>
       <w:r>
         <w:t>4.3.7 Требования к организационному обеспечению</w:t>
       </w:r>
@@ -8047,7 +8047,7 @@
       <w:pPr>
         <w:pStyle w:val="31"/>
       </w:pPr>
-      <w:bookmarkStart w:id="50" w:name="_Toc243476322"/>
+      <w:bookmarkStart w:id="50" w:name="_Toc243987293"/>
       <w:r>
         <w:t>4.3.8 Требования к методическому обеспечению</w:t>
       </w:r>
@@ -8063,7 +8063,7 @@
         <w:pStyle w:val="1"/>
         <w:pageBreakBefore/>
       </w:pPr>
-      <w:bookmarkStart w:id="51" w:name="_Toc243476323"/>
+      <w:bookmarkStart w:id="51" w:name="_Toc243987294"/>
       <w:r>
         <w:lastRenderedPageBreak/>
         <w:t>5 Состав и содержание работ по созданию системы</w:t>
@@ -8385,7 +8385,7 @@
         <w:pStyle w:val="1"/>
         <w:pageBreakBefore/>
       </w:pPr>
-      <w:bookmarkStart w:id="52" w:name="_Toc243476324"/>
+      <w:bookmarkStart w:id="52" w:name="_Toc243987295"/>
       <w:r>
         <w:lastRenderedPageBreak/>
         <w:t>6 Порядок разработки автоматизированной системы</w:t>
@@ -8432,7 +8432,7 @@
         <w:pStyle w:val="1"/>
         <w:pageBreakBefore/>
       </w:pPr>
-      <w:bookmarkStart w:id="53" w:name="_Toc243476325"/>
+      <w:bookmarkStart w:id="53" w:name="_Toc243987296"/>
       <w:r>
         <w:lastRenderedPageBreak/>
         <w:t>7 Порядок контроля и приёмки автоматизированной системы</w:t>
@@ -8449,7 +8449,7 @@
         <w:pStyle w:val="1"/>
         <w:pageBreakBefore/>
       </w:pPr>
-      <w:bookmarkStart w:id="54" w:name="_Toc243476326"/>
+      <w:bookmarkStart w:id="54" w:name="_Toc243987297"/>
       <w:r>
         <w:lastRenderedPageBreak/>
         <w:t>8 Требования к составу и содержанию работ по подготовке объекта автоматизации к вводу системы в действие</w:t>
@@ -8511,7 +8511,7 @@
         <w:pStyle w:val="1"/>
         <w:pageBreakBefore/>
       </w:pPr>
-      <w:bookmarkStart w:id="55" w:name="_Toc243476327"/>
+      <w:bookmarkStart w:id="55" w:name="_Toc243987298"/>
       <w:r>
         <w:lastRenderedPageBreak/>
         <w:t>9 Требования к документированию</w:t>
@@ -9153,7 +9153,7 @@
         <w:pStyle w:val="1"/>
         <w:pageBreakBefore/>
       </w:pPr>
-      <w:bookmarkStart w:id="56" w:name="_Toc243476328"/>
+      <w:bookmarkStart w:id="56" w:name="_Toc243987299"/>
       <w:r>
         <w:lastRenderedPageBreak/>
         <w:t>10 Источники разработки</w:t>
@@ -9192,7 +9192,7 @@
         <w:ind w:firstLine="0"/>
         <w:jc w:val="center"/>
       </w:pPr>
-      <w:bookmarkStart w:id="57" w:name="_Toc243476329"/>
+      <w:bookmarkStart w:id="57" w:name="_Toc243987300"/>
       <w:r>
         <w:lastRenderedPageBreak/>
         <w:t>ЛИСТ РЕГИСТРАЦИИ ИЗМЕНЕНИЙ</w:t>
@@ -11254,31 +11254,31 @@
       </w:rPr>
     </w:lvl>
   </w:abstractNum>
-  <w:num w:numId="1" w16cid:durableId="604927043">
+  <w:num w:numId="1" w16cid:durableId="1383335427">
     <w:abstractNumId w:val="8"/>
   </w:num>
-  <w:num w:numId="2" w16cid:durableId="783768118">
+  <w:num w:numId="2" w16cid:durableId="262887095">
     <w:abstractNumId w:val="6"/>
   </w:num>
-  <w:num w:numId="3" w16cid:durableId="95178275">
+  <w:num w:numId="3" w16cid:durableId="2092046146">
     <w:abstractNumId w:val="5"/>
   </w:num>
-  <w:num w:numId="4" w16cid:durableId="2021278091">
+  <w:num w:numId="4" w16cid:durableId="1235747057">
     <w:abstractNumId w:val="4"/>
   </w:num>
-  <w:num w:numId="5" w16cid:durableId="450589520">
+  <w:num w:numId="5" w16cid:durableId="775446519">
     <w:abstractNumId w:val="7"/>
   </w:num>
-  <w:num w:numId="6" w16cid:durableId="1642420207">
+  <w:num w:numId="6" w16cid:durableId="716389656">
     <w:abstractNumId w:val="3"/>
   </w:num>
-  <w:num w:numId="7" w16cid:durableId="617686947">
+  <w:num w:numId="7" w16cid:durableId="1726678461">
     <w:abstractNumId w:val="2"/>
   </w:num>
-  <w:num w:numId="8" w16cid:durableId="142816738">
+  <w:num w:numId="8" w16cid:durableId="790243315">
     <w:abstractNumId w:val="1"/>
   </w:num>
-  <w:num w:numId="9" w16cid:durableId="17237555">
+  <w:num w:numId="9" w16cid:durableId="92825225">
     <w:abstractNumId w:val="0"/>
   </w:num>
 </w:numbering>
@@ -22811,7 +22811,7 @@
     <w:autoRedefine/>
     <w:uiPriority w:val="39"/>
     <w:unhideWhenUsed/>
-    <w:rsid w:val="00566C36"/>
+    <w:rsid w:val="0095150B"/>
     <w:pPr>
       <w:spacing w:after="100"/>
     </w:pPr>
@@ -22823,7 +22823,7 @@
     <w:autoRedefine/>
     <w:uiPriority w:val="39"/>
     <w:unhideWhenUsed/>
-    <w:rsid w:val="00566C36"/>
+    <w:rsid w:val="0095150B"/>
     <w:pPr>
       <w:spacing w:after="100"/>
       <w:ind w:left="240"/>
@@ -22836,7 +22836,7 @@
     <w:autoRedefine/>
     <w:uiPriority w:val="39"/>
     <w:unhideWhenUsed/>
-    <w:rsid w:val="00566C36"/>
+    <w:rsid w:val="0095150B"/>
     <w:pPr>
       <w:spacing w:after="100"/>
       <w:ind w:left="480"/>
@@ -22847,7 +22847,7 @@
     <w:basedOn w:val="a2"/>
     <w:uiPriority w:val="99"/>
     <w:unhideWhenUsed/>
-    <w:rsid w:val="00566C36"/>
+    <w:rsid w:val="0095150B"/>
     <w:rPr>
       <w:color w:val="0000FF" w:themeColor="hyperlink"/>
       <w:u w:val="single"/>

</xml_diff>